<commit_message>
Funcionalidad de actualizar fotos + campos editables añadidos al manual
</commit_message>
<xml_diff>
--- a/doc/Manual De Usuario.docx
+++ b/doc/Manual De Usuario.docx
@@ -1341,16 +1341,13 @@
       </w:pPr>
       <w:r>
         <w:rPr>
-          <w:rFonts w:cstheme="minorHAnsi"/>
           <w:noProof/>
-          <w:sz w:val="24"/>
-          <w:szCs w:val="24"/>
         </w:rPr>
         <w:drawing>
-          <wp:inline distT="0" distB="0" distL="0" distR="0" wp14:anchorId="3DD5CB06" wp14:editId="7FE0514F">
-            <wp:extent cx="5400040" cy="3136265"/>
-            <wp:effectExtent l="0" t="0" r="0" b="6985"/>
-            <wp:docPr id="79005190" name="Imagen 1"/>
+          <wp:inline distT="0" distB="0" distL="0" distR="0" wp14:anchorId="17F610E8" wp14:editId="0FB883C1">
+            <wp:extent cx="5400040" cy="2903855"/>
+            <wp:effectExtent l="0" t="0" r="0" b="0"/>
+            <wp:docPr id="144660786" name="Imagen 2"/>
             <wp:cNvGraphicFramePr>
               <a:graphicFrameLocks xmlns:a="http://schemas.openxmlformats.org/drawingml/2006/main" noChangeAspect="1"/>
             </wp:cNvGraphicFramePr>
@@ -1358,23 +1355,36 @@
               <a:graphicData uri="http://schemas.openxmlformats.org/drawingml/2006/picture">
                 <pic:pic xmlns:pic="http://schemas.openxmlformats.org/drawingml/2006/picture">
                   <pic:nvPicPr>
-                    <pic:cNvPr id="79005190" name=""/>
-                    <pic:cNvPicPr/>
+                    <pic:cNvPr id="0" name="Picture 3"/>
+                    <pic:cNvPicPr>
+                      <a:picLocks noChangeAspect="1" noChangeArrowheads="1"/>
+                    </pic:cNvPicPr>
                   </pic:nvPicPr>
                   <pic:blipFill>
-                    <a:blip r:embed="rId12"/>
+                    <a:blip r:embed="rId12" cstate="print">
+                      <a:extLst>
+                        <a:ext uri="{28A0092B-C50C-407E-A947-70E740481C1C}">
+                          <a14:useLocalDpi xmlns:a14="http://schemas.microsoft.com/office/drawing/2010/main" val="0"/>
+                        </a:ext>
+                      </a:extLst>
+                    </a:blip>
+                    <a:srcRect/>
                     <a:stretch>
                       <a:fillRect/>
                     </a:stretch>
                   </pic:blipFill>
-                  <pic:spPr>
+                  <pic:spPr bwMode="auto">
                     <a:xfrm>
                       <a:off x="0" y="0"/>
-                      <a:ext cx="5400040" cy="3136265"/>
+                      <a:ext cx="5400040" cy="2903855"/>
                     </a:xfrm>
                     <a:prstGeom prst="rect">
                       <a:avLst/>
                     </a:prstGeom>
+                    <a:noFill/>
+                    <a:ln>
+                      <a:noFill/>
+                    </a:ln>
                   </pic:spPr>
                 </pic:pic>
               </a:graphicData>
@@ -1414,7 +1424,729 @@
           <w:sz w:val="32"/>
           <w:szCs w:val="32"/>
         </w:rPr>
-        <w:t>Paso 3: Realizar Tests automatizados</w:t>
+        <w:t xml:space="preserve">Paso </w:t>
+      </w:r>
+      <w:r>
+        <w:rPr>
+          <w:color w:val="002060"/>
+          <w:sz w:val="32"/>
+          <w:szCs w:val="32"/>
+        </w:rPr>
+        <w:t>3</w:t>
+      </w:r>
+      <w:r>
+        <w:rPr>
+          <w:color w:val="002060"/>
+          <w:sz w:val="32"/>
+          <w:szCs w:val="32"/>
+        </w:rPr>
+        <w:t>:</w:t>
+      </w:r>
+      <w:r>
+        <w:rPr>
+          <w:color w:val="002060"/>
+          <w:sz w:val="32"/>
+          <w:szCs w:val="32"/>
+        </w:rPr>
+        <w:t xml:space="preserve"> Editar desde la ficha técnica</w:t>
+      </w:r>
+    </w:p>
+    <w:p>
+      <w:pPr>
+        <w:tabs>
+          <w:tab w:val="left" w:pos="1215"/>
+        </w:tabs>
+        <w:jc w:val="both"/>
+        <w:rPr>
+          <w:color w:val="002060"/>
+          <w:sz w:val="32"/>
+          <w:szCs w:val="32"/>
+        </w:rPr>
+      </w:pPr>
+      <w:r>
+        <w:rPr>
+          <w:color w:val="0070C0"/>
+          <w:sz w:val="26"/>
+          <w:szCs w:val="26"/>
+        </w:rPr>
+        <w:t xml:space="preserve">- </w:t>
+      </w:r>
+      <w:r>
+        <w:rPr>
+          <w:color w:val="0070C0"/>
+          <w:sz w:val="26"/>
+          <w:szCs w:val="26"/>
+        </w:rPr>
+        <w:t>Editar campos.</w:t>
+      </w:r>
+    </w:p>
+    <w:p>
+      <w:pPr>
+        <w:tabs>
+          <w:tab w:val="left" w:pos="1215"/>
+        </w:tabs>
+        <w:jc w:val="both"/>
+        <w:rPr>
+          <w:sz w:val="24"/>
+          <w:szCs w:val="24"/>
+        </w:rPr>
+      </w:pPr>
+      <w:r>
+        <w:rPr>
+          <w:sz w:val="24"/>
+          <w:szCs w:val="24"/>
+        </w:rPr>
+        <w:t>Algunos atributos tienen un botón de editar, con el icono de un lapiz, enlazado a ellos.</w:t>
+      </w:r>
+    </w:p>
+    <w:p>
+      <w:pPr>
+        <w:tabs>
+          <w:tab w:val="left" w:pos="1215"/>
+        </w:tabs>
+        <w:jc w:val="both"/>
+        <w:rPr>
+          <w:sz w:val="24"/>
+          <w:szCs w:val="24"/>
+        </w:rPr>
+      </w:pPr>
+      <w:r>
+        <w:rPr>
+          <w:noProof/>
+          <w:sz w:val="24"/>
+          <w:szCs w:val="24"/>
+        </w:rPr>
+        <w:drawing>
+          <wp:inline distT="0" distB="0" distL="0" distR="0" wp14:anchorId="3E0F2617" wp14:editId="7FC8554B">
+            <wp:extent cx="3894776" cy="3848986"/>
+            <wp:effectExtent l="0" t="0" r="0" b="0"/>
+            <wp:docPr id="2129079308" name="Imagen 1"/>
+            <wp:cNvGraphicFramePr>
+              <a:graphicFrameLocks xmlns:a="http://schemas.openxmlformats.org/drawingml/2006/main" noChangeAspect="1"/>
+            </wp:cNvGraphicFramePr>
+            <a:graphic xmlns:a="http://schemas.openxmlformats.org/drawingml/2006/main">
+              <a:graphicData uri="http://schemas.openxmlformats.org/drawingml/2006/picture">
+                <pic:pic xmlns:pic="http://schemas.openxmlformats.org/drawingml/2006/picture">
+                  <pic:nvPicPr>
+                    <pic:cNvPr id="0" name="Picture 2"/>
+                    <pic:cNvPicPr>
+                      <a:picLocks noChangeAspect="1" noChangeArrowheads="1"/>
+                    </pic:cNvPicPr>
+                  </pic:nvPicPr>
+                  <pic:blipFill>
+                    <a:blip r:embed="rId13">
+                      <a:extLst>
+                        <a:ext uri="{28A0092B-C50C-407E-A947-70E740481C1C}">
+                          <a14:useLocalDpi xmlns:a14="http://schemas.microsoft.com/office/drawing/2010/main" val="0"/>
+                        </a:ext>
+                      </a:extLst>
+                    </a:blip>
+                    <a:srcRect/>
+                    <a:stretch>
+                      <a:fillRect/>
+                    </a:stretch>
+                  </pic:blipFill>
+                  <pic:spPr bwMode="auto">
+                    <a:xfrm>
+                      <a:off x="0" y="0"/>
+                      <a:ext cx="3945487" cy="3899101"/>
+                    </a:xfrm>
+                    <a:prstGeom prst="rect">
+                      <a:avLst/>
+                    </a:prstGeom>
+                    <a:noFill/>
+                    <a:ln>
+                      <a:noFill/>
+                    </a:ln>
+                  </pic:spPr>
+                </pic:pic>
+              </a:graphicData>
+            </a:graphic>
+          </wp:inline>
+        </w:drawing>
+      </w:r>
+    </w:p>
+    <w:p>
+      <w:pPr>
+        <w:tabs>
+          <w:tab w:val="left" w:pos="1215"/>
+        </w:tabs>
+        <w:jc w:val="both"/>
+        <w:rPr>
+          <w:sz w:val="24"/>
+          <w:szCs w:val="24"/>
+        </w:rPr>
+      </w:pPr>
+      <w:r>
+        <w:rPr>
+          <w:sz w:val="24"/>
+          <w:szCs w:val="24"/>
+        </w:rPr>
+        <w:lastRenderedPageBreak/>
+        <w:t>Con darle click al botón se activará el modo edición sobre ese campo, una vez escrita la nueva información del campo bastará con pulsar la tecla enter para guardar el nuevo valor</w:t>
+      </w:r>
+      <w:r>
+        <w:rPr>
+          <w:sz w:val="24"/>
+          <w:szCs w:val="24"/>
+        </w:rPr>
+        <w:t xml:space="preserve">, y para cancelar la edición habría que volver a clickar sobre </w:t>
+      </w:r>
+      <w:r>
+        <w:rPr>
+          <w:sz w:val="24"/>
+          <w:szCs w:val="24"/>
+        </w:rPr>
+        <w:t>el mismo botón que ahora aparece representado con un X.</w:t>
+      </w:r>
+    </w:p>
+    <w:p>
+      <w:pPr>
+        <w:tabs>
+          <w:tab w:val="left" w:pos="1215"/>
+        </w:tabs>
+        <w:jc w:val="both"/>
+        <w:rPr>
+          <w:sz w:val="24"/>
+          <w:szCs w:val="24"/>
+        </w:rPr>
+      </w:pPr>
+      <w:r>
+        <w:rPr>
+          <w:noProof/>
+          <w:sz w:val="24"/>
+          <w:szCs w:val="24"/>
+        </w:rPr>
+        <w:drawing>
+          <wp:inline distT="0" distB="0" distL="0" distR="0" wp14:anchorId="4B785611" wp14:editId="4D69E59D">
+            <wp:extent cx="3838575" cy="1095375"/>
+            <wp:effectExtent l="0" t="0" r="9525" b="9525"/>
+            <wp:docPr id="1719757404" name="Imagen 3"/>
+            <wp:cNvGraphicFramePr>
+              <a:graphicFrameLocks xmlns:a="http://schemas.openxmlformats.org/drawingml/2006/main" noChangeAspect="1"/>
+            </wp:cNvGraphicFramePr>
+            <a:graphic xmlns:a="http://schemas.openxmlformats.org/drawingml/2006/main">
+              <a:graphicData uri="http://schemas.openxmlformats.org/drawingml/2006/picture">
+                <pic:pic xmlns:pic="http://schemas.openxmlformats.org/drawingml/2006/picture">
+                  <pic:nvPicPr>
+                    <pic:cNvPr id="0" name="Picture 5"/>
+                    <pic:cNvPicPr>
+                      <a:picLocks noChangeAspect="1" noChangeArrowheads="1"/>
+                    </pic:cNvPicPr>
+                  </pic:nvPicPr>
+                  <pic:blipFill>
+                    <a:blip r:embed="rId14">
+                      <a:extLst>
+                        <a:ext uri="{28A0092B-C50C-407E-A947-70E740481C1C}">
+                          <a14:useLocalDpi xmlns:a14="http://schemas.microsoft.com/office/drawing/2010/main" val="0"/>
+                        </a:ext>
+                      </a:extLst>
+                    </a:blip>
+                    <a:srcRect/>
+                    <a:stretch>
+                      <a:fillRect/>
+                    </a:stretch>
+                  </pic:blipFill>
+                  <pic:spPr bwMode="auto">
+                    <a:xfrm>
+                      <a:off x="0" y="0"/>
+                      <a:ext cx="3838575" cy="1095375"/>
+                    </a:xfrm>
+                    <a:prstGeom prst="rect">
+                      <a:avLst/>
+                    </a:prstGeom>
+                    <a:noFill/>
+                    <a:ln>
+                      <a:noFill/>
+                    </a:ln>
+                  </pic:spPr>
+                </pic:pic>
+              </a:graphicData>
+            </a:graphic>
+          </wp:inline>
+        </w:drawing>
+      </w:r>
+      <w:r>
+        <w:rPr>
+          <w:sz w:val="24"/>
+          <w:szCs w:val="24"/>
+        </w:rPr>
+        <w:t xml:space="preserve"> </w:t>
+      </w:r>
+    </w:p>
+    <w:p>
+      <w:pPr>
+        <w:tabs>
+          <w:tab w:val="left" w:pos="1215"/>
+        </w:tabs>
+        <w:jc w:val="both"/>
+        <w:rPr>
+          <w:sz w:val="24"/>
+          <w:szCs w:val="24"/>
+        </w:rPr>
+      </w:pPr>
+      <w:r>
+        <w:rPr>
+          <w:sz w:val="24"/>
+          <w:szCs w:val="24"/>
+        </w:rPr>
+        <w:t xml:space="preserve">Con excepción del campo notas, que </w:t>
+      </w:r>
+      <w:r>
+        <w:rPr>
+          <w:sz w:val="24"/>
+          <w:szCs w:val="24"/>
+        </w:rPr>
+        <w:t xml:space="preserve">este </w:t>
+      </w:r>
+      <w:r>
+        <w:rPr>
+          <w:sz w:val="24"/>
+          <w:szCs w:val="24"/>
+        </w:rPr>
+        <w:t xml:space="preserve">al poder añadir saltos de línea </w:t>
+      </w:r>
+      <w:r>
+        <w:rPr>
+          <w:sz w:val="24"/>
+          <w:szCs w:val="24"/>
+        </w:rPr>
+        <w:t>con la tecla enter guarda los valores de una forma distinta, mediante un botón verde con el símbolo de un check.</w:t>
+      </w:r>
+      <w:r>
+        <w:rPr>
+          <w:sz w:val="24"/>
+          <w:szCs w:val="24"/>
+        </w:rPr>
+        <w:t xml:space="preserve"> </w:t>
+      </w:r>
+      <w:r>
+        <w:rPr>
+          <w:sz w:val="24"/>
+          <w:szCs w:val="24"/>
+        </w:rPr>
+        <w:t xml:space="preserve"> </w:t>
+      </w:r>
+    </w:p>
+    <w:p>
+      <w:pPr>
+        <w:tabs>
+          <w:tab w:val="left" w:pos="1215"/>
+        </w:tabs>
+        <w:jc w:val="both"/>
+        <w:rPr>
+          <w:sz w:val="24"/>
+          <w:szCs w:val="24"/>
+        </w:rPr>
+      </w:pPr>
+      <w:r>
+        <w:rPr>
+          <w:noProof/>
+          <w:sz w:val="24"/>
+          <w:szCs w:val="24"/>
+        </w:rPr>
+        <w:drawing>
+          <wp:inline distT="0" distB="0" distL="0" distR="0" wp14:anchorId="5DF2DC95" wp14:editId="0420DF3F">
+            <wp:extent cx="5390515" cy="1212215"/>
+            <wp:effectExtent l="0" t="0" r="635" b="6985"/>
+            <wp:docPr id="1189706324" name="Imagen 4"/>
+            <wp:cNvGraphicFramePr>
+              <a:graphicFrameLocks xmlns:a="http://schemas.openxmlformats.org/drawingml/2006/main" noChangeAspect="1"/>
+            </wp:cNvGraphicFramePr>
+            <a:graphic xmlns:a="http://schemas.openxmlformats.org/drawingml/2006/main">
+              <a:graphicData uri="http://schemas.openxmlformats.org/drawingml/2006/picture">
+                <pic:pic xmlns:pic="http://schemas.openxmlformats.org/drawingml/2006/picture">
+                  <pic:nvPicPr>
+                    <pic:cNvPr id="0" name="Picture 6"/>
+                    <pic:cNvPicPr>
+                      <a:picLocks noChangeAspect="1" noChangeArrowheads="1"/>
+                    </pic:cNvPicPr>
+                  </pic:nvPicPr>
+                  <pic:blipFill>
+                    <a:blip r:embed="rId15">
+                      <a:extLst>
+                        <a:ext uri="{28A0092B-C50C-407E-A947-70E740481C1C}">
+                          <a14:useLocalDpi xmlns:a14="http://schemas.microsoft.com/office/drawing/2010/main" val="0"/>
+                        </a:ext>
+                      </a:extLst>
+                    </a:blip>
+                    <a:srcRect/>
+                    <a:stretch>
+                      <a:fillRect/>
+                    </a:stretch>
+                  </pic:blipFill>
+                  <pic:spPr bwMode="auto">
+                    <a:xfrm>
+                      <a:off x="0" y="0"/>
+                      <a:ext cx="5390515" cy="1212215"/>
+                    </a:xfrm>
+                    <a:prstGeom prst="rect">
+                      <a:avLst/>
+                    </a:prstGeom>
+                    <a:noFill/>
+                    <a:ln>
+                      <a:noFill/>
+                    </a:ln>
+                  </pic:spPr>
+                </pic:pic>
+              </a:graphicData>
+            </a:graphic>
+          </wp:inline>
+        </w:drawing>
+      </w:r>
+    </w:p>
+    <w:p>
+      <w:pPr>
+        <w:tabs>
+          <w:tab w:val="left" w:pos="1215"/>
+        </w:tabs>
+        <w:jc w:val="both"/>
+        <w:rPr>
+          <w:color w:val="002060"/>
+          <w:sz w:val="32"/>
+          <w:szCs w:val="32"/>
+        </w:rPr>
+      </w:pPr>
+      <w:r>
+        <w:rPr>
+          <w:color w:val="0070C0"/>
+          <w:sz w:val="26"/>
+          <w:szCs w:val="26"/>
+        </w:rPr>
+        <w:t xml:space="preserve">- </w:t>
+      </w:r>
+      <w:r>
+        <w:rPr>
+          <w:color w:val="0070C0"/>
+          <w:sz w:val="26"/>
+          <w:szCs w:val="26"/>
+        </w:rPr>
+        <w:t xml:space="preserve">Editar </w:t>
+      </w:r>
+      <w:r>
+        <w:rPr>
+          <w:color w:val="0070C0"/>
+          <w:sz w:val="26"/>
+          <w:szCs w:val="26"/>
+        </w:rPr>
+        <w:t>foto del modelo</w:t>
+      </w:r>
+      <w:r>
+        <w:rPr>
+          <w:color w:val="0070C0"/>
+          <w:sz w:val="26"/>
+          <w:szCs w:val="26"/>
+        </w:rPr>
+        <w:t>.</w:t>
+      </w:r>
+    </w:p>
+    <w:p>
+      <w:pPr>
+        <w:tabs>
+          <w:tab w:val="left" w:pos="1215"/>
+        </w:tabs>
+        <w:jc w:val="both"/>
+        <w:rPr>
+          <w:sz w:val="24"/>
+          <w:szCs w:val="24"/>
+        </w:rPr>
+      </w:pPr>
+      <w:r>
+        <w:rPr>
+          <w:sz w:val="24"/>
+          <w:szCs w:val="24"/>
+        </w:rPr>
+        <w:t>Si pasamos el ratón por encima de la foto, veremos que nos da la opción de cambiarla, si le hacemos click se nos abrirá el explorador de archivos y nos pedirá que seleccionemos una nueva foto.</w:t>
+      </w:r>
+    </w:p>
+    <w:p>
+      <w:pPr>
+        <w:tabs>
+          <w:tab w:val="left" w:pos="1215"/>
+        </w:tabs>
+        <w:jc w:val="both"/>
+        <w:rPr>
+          <w:b/>
+          <w:bCs/>
+          <w:sz w:val="24"/>
+          <w:szCs w:val="24"/>
+        </w:rPr>
+      </w:pPr>
+      <w:r>
+        <w:rPr>
+          <w:b/>
+          <w:bCs/>
+          <w:sz w:val="24"/>
+          <w:szCs w:val="24"/>
+        </w:rPr>
+        <w:t>*Esto cambiará la foto del modelo</w:t>
+      </w:r>
+      <w:r>
+        <w:rPr>
+          <w:b/>
+          <w:bCs/>
+          <w:sz w:val="24"/>
+          <w:szCs w:val="24"/>
+        </w:rPr>
+        <w:t>.</w:t>
+      </w:r>
+      <w:r>
+        <w:rPr>
+          <w:b/>
+          <w:bCs/>
+          <w:sz w:val="24"/>
+          <w:szCs w:val="24"/>
+        </w:rPr>
+        <w:t xml:space="preserve"> </w:t>
+      </w:r>
+      <w:r>
+        <w:rPr>
+          <w:b/>
+          <w:bCs/>
+          <w:sz w:val="24"/>
+          <w:szCs w:val="24"/>
+        </w:rPr>
+        <w:t>A</w:t>
+      </w:r>
+      <w:r>
+        <w:rPr>
+          <w:b/>
+          <w:bCs/>
+          <w:sz w:val="24"/>
+          <w:szCs w:val="24"/>
+        </w:rPr>
+        <w:t>fectará a todos los dispositivos de ese mismo modelo.</w:t>
+      </w:r>
+    </w:p>
+    <w:p>
+      <w:pPr>
+        <w:tabs>
+          <w:tab w:val="left" w:pos="1215"/>
+        </w:tabs>
+        <w:jc w:val="both"/>
+        <w:rPr>
+          <w:b/>
+          <w:bCs/>
+          <w:sz w:val="24"/>
+          <w:szCs w:val="24"/>
+        </w:rPr>
+      </w:pPr>
+      <w:r>
+        <w:rPr>
+          <w:b/>
+          <w:bCs/>
+          <w:noProof/>
+          <w:sz w:val="24"/>
+          <w:szCs w:val="24"/>
+        </w:rPr>
+        <w:drawing>
+          <wp:anchor distT="0" distB="0" distL="114300" distR="114300" simplePos="0" relativeHeight="251684864" behindDoc="1" locked="0" layoutInCell="1" allowOverlap="1" wp14:anchorId="3CC181B4" wp14:editId="33D6CADE">
+            <wp:simplePos x="0" y="0"/>
+            <wp:positionH relativeFrom="page">
+              <wp:posOffset>2976910</wp:posOffset>
+            </wp:positionH>
+            <wp:positionV relativeFrom="paragraph">
+              <wp:posOffset>16732</wp:posOffset>
+            </wp:positionV>
+            <wp:extent cx="4051004" cy="2280773"/>
+            <wp:effectExtent l="0" t="0" r="6985" b="5715"/>
+            <wp:wrapNone/>
+            <wp:docPr id="1811975734" name="Imagen 6"/>
+            <wp:cNvGraphicFramePr>
+              <a:graphicFrameLocks xmlns:a="http://schemas.openxmlformats.org/drawingml/2006/main" noChangeAspect="1"/>
+            </wp:cNvGraphicFramePr>
+            <a:graphic xmlns:a="http://schemas.openxmlformats.org/drawingml/2006/main">
+              <a:graphicData uri="http://schemas.openxmlformats.org/drawingml/2006/picture">
+                <pic:pic xmlns:pic="http://schemas.openxmlformats.org/drawingml/2006/picture">
+                  <pic:nvPicPr>
+                    <pic:cNvPr id="0" name="Picture 8"/>
+                    <pic:cNvPicPr>
+                      <a:picLocks noChangeAspect="1" noChangeArrowheads="1"/>
+                    </pic:cNvPicPr>
+                  </pic:nvPicPr>
+                  <pic:blipFill>
+                    <a:blip r:embed="rId16">
+                      <a:extLst>
+                        <a:ext uri="{28A0092B-C50C-407E-A947-70E740481C1C}">
+                          <a14:useLocalDpi xmlns:a14="http://schemas.microsoft.com/office/drawing/2010/main" val="0"/>
+                        </a:ext>
+                      </a:extLst>
+                    </a:blip>
+                    <a:srcRect/>
+                    <a:stretch>
+                      <a:fillRect/>
+                    </a:stretch>
+                  </pic:blipFill>
+                  <pic:spPr bwMode="auto">
+                    <a:xfrm>
+                      <a:off x="0" y="0"/>
+                      <a:ext cx="4051004" cy="2280773"/>
+                    </a:xfrm>
+                    <a:prstGeom prst="rect">
+                      <a:avLst/>
+                    </a:prstGeom>
+                    <a:noFill/>
+                    <a:ln>
+                      <a:noFill/>
+                    </a:ln>
+                  </pic:spPr>
+                </pic:pic>
+              </a:graphicData>
+            </a:graphic>
+            <wp14:sizeRelH relativeFrom="margin">
+              <wp14:pctWidth>0</wp14:pctWidth>
+            </wp14:sizeRelH>
+            <wp14:sizeRelV relativeFrom="margin">
+              <wp14:pctHeight>0</wp14:pctHeight>
+            </wp14:sizeRelV>
+          </wp:anchor>
+        </w:drawing>
+      </w:r>
+      <w:r>
+        <w:rPr>
+          <w:b/>
+          <w:bCs/>
+          <w:noProof/>
+          <w:sz w:val="24"/>
+          <w:szCs w:val="24"/>
+        </w:rPr>
+        <w:drawing>
+          <wp:inline distT="0" distB="0" distL="0" distR="0" wp14:anchorId="63A943BF" wp14:editId="0C358A39">
+            <wp:extent cx="1676556" cy="1445568"/>
+            <wp:effectExtent l="0" t="0" r="0" b="2540"/>
+            <wp:docPr id="1527892532" name="Imagen 5"/>
+            <wp:cNvGraphicFramePr>
+              <a:graphicFrameLocks xmlns:a="http://schemas.openxmlformats.org/drawingml/2006/main" noChangeAspect="1"/>
+            </wp:cNvGraphicFramePr>
+            <a:graphic xmlns:a="http://schemas.openxmlformats.org/drawingml/2006/main">
+              <a:graphicData uri="http://schemas.openxmlformats.org/drawingml/2006/picture">
+                <pic:pic xmlns:pic="http://schemas.openxmlformats.org/drawingml/2006/picture">
+                  <pic:nvPicPr>
+                    <pic:cNvPr id="0" name="Picture 7"/>
+                    <pic:cNvPicPr>
+                      <a:picLocks noChangeAspect="1" noChangeArrowheads="1"/>
+                    </pic:cNvPicPr>
+                  </pic:nvPicPr>
+                  <pic:blipFill>
+                    <a:blip r:embed="rId17">
+                      <a:extLst>
+                        <a:ext uri="{28A0092B-C50C-407E-A947-70E740481C1C}">
+                          <a14:useLocalDpi xmlns:a14="http://schemas.microsoft.com/office/drawing/2010/main" val="0"/>
+                        </a:ext>
+                      </a:extLst>
+                    </a:blip>
+                    <a:srcRect/>
+                    <a:stretch>
+                      <a:fillRect/>
+                    </a:stretch>
+                  </pic:blipFill>
+                  <pic:spPr bwMode="auto">
+                    <a:xfrm>
+                      <a:off x="0" y="0"/>
+                      <a:ext cx="1683781" cy="1451797"/>
+                    </a:xfrm>
+                    <a:prstGeom prst="rect">
+                      <a:avLst/>
+                    </a:prstGeom>
+                    <a:noFill/>
+                    <a:ln>
+                      <a:noFill/>
+                    </a:ln>
+                  </pic:spPr>
+                </pic:pic>
+              </a:graphicData>
+            </a:graphic>
+          </wp:inline>
+        </w:drawing>
+      </w:r>
+    </w:p>
+    <w:p>
+      <w:pPr>
+        <w:tabs>
+          <w:tab w:val="left" w:pos="1215"/>
+        </w:tabs>
+        <w:jc w:val="both"/>
+        <w:rPr>
+          <w:sz w:val="24"/>
+          <w:szCs w:val="24"/>
+        </w:rPr>
+      </w:pPr>
+    </w:p>
+    <w:p>
+      <w:pPr>
+        <w:tabs>
+          <w:tab w:val="left" w:pos="1215"/>
+        </w:tabs>
+        <w:jc w:val="both"/>
+        <w:rPr>
+          <w:color w:val="002060"/>
+          <w:sz w:val="32"/>
+          <w:szCs w:val="32"/>
+        </w:rPr>
+      </w:pPr>
+    </w:p>
+    <w:p>
+      <w:pPr>
+        <w:tabs>
+          <w:tab w:val="left" w:pos="1215"/>
+        </w:tabs>
+        <w:jc w:val="both"/>
+        <w:rPr>
+          <w:color w:val="002060"/>
+          <w:sz w:val="32"/>
+          <w:szCs w:val="32"/>
+        </w:rPr>
+      </w:pPr>
+    </w:p>
+    <w:p>
+      <w:pPr>
+        <w:tabs>
+          <w:tab w:val="left" w:pos="1215"/>
+        </w:tabs>
+        <w:jc w:val="both"/>
+        <w:rPr>
+          <w:color w:val="002060"/>
+          <w:sz w:val="32"/>
+          <w:szCs w:val="32"/>
+        </w:rPr>
+      </w:pPr>
+    </w:p>
+    <w:p>
+      <w:pPr>
+        <w:tabs>
+          <w:tab w:val="left" w:pos="1215"/>
+        </w:tabs>
+        <w:jc w:val="both"/>
+        <w:rPr>
+          <w:color w:val="002060"/>
+          <w:sz w:val="32"/>
+          <w:szCs w:val="32"/>
+        </w:rPr>
+      </w:pPr>
+      <w:r>
+        <w:rPr>
+          <w:color w:val="002060"/>
+          <w:sz w:val="32"/>
+          <w:szCs w:val="32"/>
+        </w:rPr>
+        <w:lastRenderedPageBreak/>
+        <w:t xml:space="preserve">Paso </w:t>
+      </w:r>
+      <w:r>
+        <w:rPr>
+          <w:color w:val="002060"/>
+          <w:sz w:val="32"/>
+          <w:szCs w:val="32"/>
+        </w:rPr>
+        <w:t>4</w:t>
+      </w:r>
+      <w:r>
+        <w:rPr>
+          <w:color w:val="002060"/>
+          <w:sz w:val="32"/>
+          <w:szCs w:val="32"/>
+        </w:rPr>
+        <w:t>: Realizar Tests automatizados</w:t>
       </w:r>
     </w:p>
     <w:p>
@@ -1538,7 +2270,7 @@
                     <pic:cNvPicPr/>
                   </pic:nvPicPr>
                   <pic:blipFill>
-                    <a:blip r:embed="rId13">
+                    <a:blip r:embed="rId18">
                       <a:extLst>
                         <a:ext uri="{28A0092B-C50C-407E-A947-70E740481C1C}">
                           <a14:useLocalDpi xmlns:a14="http://schemas.microsoft.com/office/drawing/2010/main" val="0"/>
@@ -1654,7 +2386,6 @@
           <w:sz w:val="24"/>
           <w:szCs w:val="24"/>
         </w:rPr>
-        <w:lastRenderedPageBreak/>
         <w:t xml:space="preserve">b) Debe darle clic al botón de ejecutar </w:t>
       </w:r>
     </w:p>
@@ -1698,7 +2429,7 @@
                     <pic:cNvPicPr/>
                   </pic:nvPicPr>
                   <pic:blipFill rotWithShape="1">
-                    <a:blip r:embed="rId14">
+                    <a:blip r:embed="rId19">
                       <a:extLst>
                         <a:ext uri="{28A0092B-C50C-407E-A947-70E740481C1C}">
                           <a14:useLocalDpi xmlns:a14="http://schemas.microsoft.com/office/drawing/2010/main" val="0"/>
@@ -1831,7 +2562,7 @@
                     <pic:cNvPicPr/>
                   </pic:nvPicPr>
                   <pic:blipFill>
-                    <a:blip r:embed="rId15">
+                    <a:blip r:embed="rId20">
                       <a:extLst>
                         <a:ext uri="{28A0092B-C50C-407E-A947-70E740481C1C}">
                           <a14:useLocalDpi xmlns:a14="http://schemas.microsoft.com/office/drawing/2010/main" val="0"/>
@@ -1921,7 +2652,7 @@
                     <pic:cNvPicPr/>
                   </pic:nvPicPr>
                   <pic:blipFill>
-                    <a:blip r:embed="rId16">
+                    <a:blip r:embed="rId21">
                       <a:extLst>
                         <a:ext uri="{28A0092B-C50C-407E-A947-70E740481C1C}">
                           <a14:useLocalDpi xmlns:a14="http://schemas.microsoft.com/office/drawing/2010/main" val="0"/>
@@ -1977,6 +2708,9 @@
     </w:p>
     <w:p>
       <w:pPr>
+        <w:tabs>
+          <w:tab w:val="left" w:pos="1215"/>
+        </w:tabs>
         <w:jc w:val="both"/>
         <w:rPr>
           <w:rFonts w:cstheme="minorHAnsi"/>
@@ -1988,32 +2722,6 @@
     </w:p>
     <w:p>
       <w:pPr>
-        <w:jc w:val="both"/>
-        <w:rPr>
-          <w:rFonts w:cstheme="minorHAnsi"/>
-          <w:b/>
-          <w:bCs/>
-          <w:noProof/>
-          <w:sz w:val="28"/>
-          <w:szCs w:val="28"/>
-        </w:rPr>
-      </w:pPr>
-    </w:p>
-    <w:p>
-      <w:pPr>
-        <w:jc w:val="both"/>
-        <w:rPr>
-          <w:rFonts w:cstheme="minorHAnsi"/>
-          <w:b/>
-          <w:bCs/>
-          <w:noProof/>
-          <w:sz w:val="28"/>
-          <w:szCs w:val="28"/>
-        </w:rPr>
-      </w:pPr>
-    </w:p>
-    <w:p>
-      <w:pPr>
         <w:tabs>
           <w:tab w:val="left" w:pos="1215"/>
         </w:tabs>
@@ -2030,6 +2738,7 @@
           <w:sz w:val="32"/>
           <w:szCs w:val="32"/>
         </w:rPr>
+        <w:lastRenderedPageBreak/>
         <w:t>Herramienta</w:t>
       </w:r>
       <w:r>
@@ -2148,7 +2857,7 @@
                     <pic:cNvPicPr/>
                   </pic:nvPicPr>
                   <pic:blipFill>
-                    <a:blip r:embed="rId17">
+                    <a:blip r:embed="rId22">
                       <a:extLst>
                         <a:ext uri="{28A0092B-C50C-407E-A947-70E740481C1C}">
                           <a14:useLocalDpi xmlns:a14="http://schemas.microsoft.com/office/drawing/2010/main" val="0"/>
@@ -2260,7 +2969,6 @@
           <w:sz w:val="26"/>
           <w:szCs w:val="26"/>
         </w:rPr>
-        <w:lastRenderedPageBreak/>
         <w:t>Paso 2: Ajustes Rápidos</w:t>
       </w:r>
     </w:p>
@@ -2366,76 +3074,20 @@
       <w:r>
         <w:rPr>
           <w:rFonts w:cstheme="minorHAnsi"/>
-          <w:b/>
-          <w:bCs/>
-          <w:sz w:val="24"/>
-          <w:szCs w:val="24"/>
-        </w:rPr>
-        <w:t xml:space="preserve">¡¡Importante!! Para probar que el modo Avión realmente funcione, asegúrese </w:t>
-      </w:r>
-      <w:r>
-        <w:rPr>
-          <w:rFonts w:cstheme="minorHAnsi"/>
-          <w:b/>
-          <w:bCs/>
-          <w:sz w:val="24"/>
-          <w:szCs w:val="24"/>
-        </w:rPr>
-        <w:t>de tener</w:t>
-      </w:r>
-      <w:r>
-        <w:rPr>
-          <w:rFonts w:cstheme="minorHAnsi"/>
-          <w:b/>
-          <w:bCs/>
-          <w:sz w:val="24"/>
-          <w:szCs w:val="24"/>
-        </w:rPr>
-        <w:t xml:space="preserve"> el dispositivo en root.</w:t>
-      </w:r>
-    </w:p>
-    <w:p>
-      <w:pPr>
-        <w:jc w:val="both"/>
-        <w:rPr>
-          <w:sz w:val="24"/>
-          <w:szCs w:val="24"/>
-        </w:rPr>
-      </w:pPr>
-      <w:r>
-        <w:rPr>
-          <w:sz w:val="24"/>
-          <w:szCs w:val="24"/>
-        </w:rPr>
-        <w:t>*Vista desde la interfaz con ubicación activa</w:t>
-      </w:r>
-    </w:p>
-    <w:p>
-      <w:pPr>
-        <w:jc w:val="both"/>
-        <w:rPr>
-          <w:rFonts w:cstheme="minorHAnsi"/>
-          <w:sz w:val="24"/>
-          <w:szCs w:val="24"/>
-        </w:rPr>
-      </w:pPr>
-      <w:r>
-        <w:rPr>
-          <w:rFonts w:cstheme="minorHAnsi"/>
           <w:noProof/>
           <w:sz w:val="24"/>
           <w:szCs w:val="24"/>
         </w:rPr>
         <w:drawing>
-          <wp:anchor distT="0" distB="0" distL="114300" distR="114300" simplePos="0" relativeHeight="251668480" behindDoc="0" locked="0" layoutInCell="1" allowOverlap="1" wp14:anchorId="5DE7E0B8" wp14:editId="49EBBA29">
+          <wp:anchor distT="0" distB="0" distL="114300" distR="114300" simplePos="0" relativeHeight="251668480" behindDoc="0" locked="0" layoutInCell="1" allowOverlap="1" wp14:anchorId="5DE7E0B8" wp14:editId="391A806B">
             <wp:simplePos x="0" y="0"/>
             <wp:positionH relativeFrom="margin">
-              <wp:posOffset>1005840</wp:posOffset>
+              <wp:posOffset>2928339</wp:posOffset>
             </wp:positionH>
             <wp:positionV relativeFrom="paragraph">
-              <wp:posOffset>43815</wp:posOffset>
+              <wp:posOffset>387083</wp:posOffset>
             </wp:positionV>
-            <wp:extent cx="3551555" cy="6115050"/>
+            <wp:extent cx="2179675" cy="3752953"/>
             <wp:effectExtent l="0" t="0" r="0" b="0"/>
             <wp:wrapNone/>
             <wp:docPr id="531779554" name="Imagen 1"/>
@@ -2450,7 +3102,7 @@
                     <pic:cNvPicPr/>
                   </pic:nvPicPr>
                   <pic:blipFill rotWithShape="1">
-                    <a:blip r:embed="rId18">
+                    <a:blip r:embed="rId23">
                       <a:extLst>
                         <a:ext uri="{28A0092B-C50C-407E-A947-70E740481C1C}">
                           <a14:useLocalDpi xmlns:a14="http://schemas.microsoft.com/office/drawing/2010/main" val="0"/>
@@ -2465,7 +3117,7 @@
                   <pic:spPr bwMode="auto">
                     <a:xfrm>
                       <a:off x="0" y="0"/>
-                      <a:ext cx="3551555" cy="6115050"/>
+                      <a:ext cx="2183721" cy="3759919"/>
                     </a:xfrm>
                     <a:prstGeom prst="rect">
                       <a:avLst/>
@@ -2491,126 +3143,52 @@
           </wp:anchor>
         </w:drawing>
       </w:r>
-    </w:p>
-    <w:p>
-      <w:pPr>
-        <w:jc w:val="both"/>
-        <w:rPr>
-          <w:rFonts w:cstheme="minorHAnsi"/>
-          <w:sz w:val="24"/>
-          <w:szCs w:val="24"/>
-        </w:rPr>
-      </w:pPr>
-    </w:p>
-    <w:p>
-      <w:pPr>
-        <w:jc w:val="both"/>
-        <w:rPr>
-          <w:rFonts w:cstheme="minorHAnsi"/>
-          <w:sz w:val="24"/>
-          <w:szCs w:val="24"/>
-        </w:rPr>
-      </w:pPr>
-    </w:p>
-    <w:p>
-      <w:pPr>
-        <w:jc w:val="both"/>
-        <w:rPr>
-          <w:rFonts w:cstheme="minorHAnsi"/>
-          <w:sz w:val="24"/>
-          <w:szCs w:val="24"/>
-        </w:rPr>
-      </w:pPr>
-    </w:p>
-    <w:p>
-      <w:pPr>
-        <w:jc w:val="both"/>
-        <w:rPr>
-          <w:rFonts w:cstheme="minorHAnsi"/>
-          <w:sz w:val="24"/>
-          <w:szCs w:val="24"/>
-        </w:rPr>
-      </w:pPr>
-    </w:p>
-    <w:p>
-      <w:pPr>
-        <w:jc w:val="both"/>
-        <w:rPr>
-          <w:rFonts w:cstheme="minorHAnsi"/>
-          <w:sz w:val="24"/>
-          <w:szCs w:val="24"/>
-        </w:rPr>
-      </w:pPr>
-    </w:p>
-    <w:p>
-      <w:pPr>
-        <w:jc w:val="both"/>
-        <w:rPr>
-          <w:rFonts w:cstheme="minorHAnsi"/>
-          <w:sz w:val="24"/>
-          <w:szCs w:val="24"/>
-        </w:rPr>
-      </w:pPr>
-    </w:p>
-    <w:p>
-      <w:pPr>
-        <w:jc w:val="both"/>
-        <w:rPr>
-          <w:rFonts w:cstheme="minorHAnsi"/>
-          <w:sz w:val="24"/>
-          <w:szCs w:val="24"/>
-        </w:rPr>
-      </w:pPr>
-    </w:p>
-    <w:p>
-      <w:pPr>
-        <w:jc w:val="both"/>
-        <w:rPr>
-          <w:rFonts w:cstheme="minorHAnsi"/>
-          <w:sz w:val="24"/>
-          <w:szCs w:val="24"/>
-        </w:rPr>
-      </w:pPr>
-    </w:p>
-    <w:p>
-      <w:pPr>
-        <w:jc w:val="both"/>
-        <w:rPr>
-          <w:rFonts w:cstheme="minorHAnsi"/>
-          <w:sz w:val="24"/>
-          <w:szCs w:val="24"/>
-        </w:rPr>
-      </w:pPr>
-    </w:p>
-    <w:p>
-      <w:pPr>
-        <w:jc w:val="both"/>
-        <w:rPr>
-          <w:rFonts w:cstheme="minorHAnsi"/>
-          <w:sz w:val="24"/>
-          <w:szCs w:val="24"/>
-        </w:rPr>
-      </w:pPr>
-    </w:p>
-    <w:p>
-      <w:pPr>
-        <w:jc w:val="both"/>
-        <w:rPr>
-          <w:rFonts w:cstheme="minorHAnsi"/>
-          <w:sz w:val="24"/>
-          <w:szCs w:val="24"/>
-        </w:rPr>
-      </w:pPr>
-    </w:p>
-    <w:p>
-      <w:pPr>
-        <w:jc w:val="both"/>
-        <w:rPr>
-          <w:rFonts w:cstheme="minorHAnsi"/>
-          <w:sz w:val="24"/>
-          <w:szCs w:val="24"/>
-        </w:rPr>
-      </w:pPr>
+      <w:r>
+        <w:rPr>
+          <w:rFonts w:cstheme="minorHAnsi"/>
+          <w:b/>
+          <w:bCs/>
+          <w:sz w:val="24"/>
+          <w:szCs w:val="24"/>
+        </w:rPr>
+        <w:t xml:space="preserve">¡¡Importante!! Para probar que el modo Avión realmente funcione, asegúrese </w:t>
+      </w:r>
+      <w:r>
+        <w:rPr>
+          <w:rFonts w:cstheme="minorHAnsi"/>
+          <w:b/>
+          <w:bCs/>
+          <w:sz w:val="24"/>
+          <w:szCs w:val="24"/>
+        </w:rPr>
+        <w:t>de tener</w:t>
+      </w:r>
+      <w:r>
+        <w:rPr>
+          <w:rFonts w:cstheme="minorHAnsi"/>
+          <w:b/>
+          <w:bCs/>
+          <w:sz w:val="24"/>
+          <w:szCs w:val="24"/>
+        </w:rPr>
+        <w:t xml:space="preserve"> el dispositivo en root.</w:t>
+      </w:r>
+    </w:p>
+    <w:p>
+      <w:pPr>
+        <w:jc w:val="both"/>
+        <w:rPr>
+          <w:sz w:val="24"/>
+          <w:szCs w:val="24"/>
+        </w:rPr>
+      </w:pPr>
+      <w:r>
+        <w:rPr>
+          <w:sz w:val="24"/>
+          <w:szCs w:val="24"/>
+        </w:rPr>
+        <w:t>*Vista desde la interfaz con ubicación activa</w:t>
+      </w:r>
     </w:p>
     <w:p>
       <w:pPr>
@@ -2749,7 +3327,7 @@
                     <pic:cNvPicPr/>
                   </pic:nvPicPr>
                   <pic:blipFill>
-                    <a:blip r:embed="rId19">
+                    <a:blip r:embed="rId24">
                       <a:extLst>
                         <a:ext uri="{28A0092B-C50C-407E-A947-70E740481C1C}">
                           <a14:useLocalDpi xmlns:a14="http://schemas.microsoft.com/office/drawing/2010/main" val="0"/>
@@ -2999,7 +3577,7 @@
                     <pic:cNvPicPr/>
                   </pic:nvPicPr>
                   <pic:blipFill>
-                    <a:blip r:embed="rId20">
+                    <a:blip r:embed="rId25">
                       <a:extLst>
                         <a:ext uri="{28A0092B-C50C-407E-A947-70E740481C1C}">
                           <a14:useLocalDpi xmlns:a14="http://schemas.microsoft.com/office/drawing/2010/main" val="0"/>
@@ -3164,7 +3742,7 @@
                     <pic:cNvPicPr/>
                   </pic:nvPicPr>
                   <pic:blipFill>
-                    <a:blip r:embed="rId21">
+                    <a:blip r:embed="rId26">
                       <a:extLst>
                         <a:ext uri="{28A0092B-C50C-407E-A947-70E740481C1C}">
                           <a14:useLocalDpi xmlns:a14="http://schemas.microsoft.com/office/drawing/2010/main" val="0"/>
@@ -3366,7 +3944,7 @@
                     <pic:cNvPicPr/>
                   </pic:nvPicPr>
                   <pic:blipFill>
-                    <a:blip r:embed="rId22">
+                    <a:blip r:embed="rId27">
                       <a:extLst>
                         <a:ext uri="{28A0092B-C50C-407E-A947-70E740481C1C}">
                           <a14:useLocalDpi xmlns:a14="http://schemas.microsoft.com/office/drawing/2010/main" val="0"/>
@@ -3674,7 +4252,7 @@
                     <pic:cNvPicPr/>
                   </pic:nvPicPr>
                   <pic:blipFill>
-                    <a:blip r:embed="rId23">
+                    <a:blip r:embed="rId28">
                       <a:extLst>
                         <a:ext uri="{28A0092B-C50C-407E-A947-70E740481C1C}">
                           <a14:useLocalDpi xmlns:a14="http://schemas.microsoft.com/office/drawing/2010/main" val="0"/>
@@ -4164,7 +4742,7 @@
                     <pic:cNvPicPr/>
                   </pic:nvPicPr>
                   <pic:blipFill>
-                    <a:blip r:embed="rId24">
+                    <a:blip r:embed="rId29">
                       <a:extLst>
                         <a:ext uri="{28A0092B-C50C-407E-A947-70E740481C1C}">
                           <a14:useLocalDpi xmlns:a14="http://schemas.microsoft.com/office/drawing/2010/main" val="0"/>
@@ -4276,7 +4854,7 @@
                     <pic:cNvPicPr/>
                   </pic:nvPicPr>
                   <pic:blipFill>
-                    <a:blip r:embed="rId25">
+                    <a:blip r:embed="rId30">
                       <a:extLst>
                         <a:ext uri="{28A0092B-C50C-407E-A947-70E740481C1C}">
                           <a14:useLocalDpi xmlns:a14="http://schemas.microsoft.com/office/drawing/2010/main" val="0"/>
@@ -4369,7 +4947,7 @@
                     <pic:cNvPicPr/>
                   </pic:nvPicPr>
                   <pic:blipFill rotWithShape="1">
-                    <a:blip r:embed="rId26">
+                    <a:blip r:embed="rId31">
                       <a:extLst>
                         <a:ext uri="{28A0092B-C50C-407E-A947-70E740481C1C}">
                           <a14:useLocalDpi xmlns:a14="http://schemas.microsoft.com/office/drawing/2010/main" val="0"/>
@@ -4723,7 +5301,7 @@
                     <pic:cNvPicPr/>
                   </pic:nvPicPr>
                   <pic:blipFill>
-                    <a:blip r:embed="rId27">
+                    <a:blip r:embed="rId32">
                       <a:extLst>
                         <a:ext uri="{28A0092B-C50C-407E-A947-70E740481C1C}">
                           <a14:useLocalDpi xmlns:a14="http://schemas.microsoft.com/office/drawing/2010/main" val="0"/>
@@ -5154,7 +5732,7 @@
                     <pic:cNvPicPr/>
                   </pic:nvPicPr>
                   <pic:blipFill>
-                    <a:blip r:embed="rId28">
+                    <a:blip r:embed="rId33">
                       <a:extLst>
                         <a:ext uri="{28A0092B-C50C-407E-A947-70E740481C1C}">
                           <a14:useLocalDpi xmlns:a14="http://schemas.microsoft.com/office/drawing/2010/main" val="0"/>
@@ -5563,7 +6141,7 @@
                     <pic:cNvPicPr/>
                   </pic:nvPicPr>
                   <pic:blipFill>
-                    <a:blip r:embed="rId29">
+                    <a:blip r:embed="rId34">
                       <a:extLst>
                         <a:ext uri="{28A0092B-C50C-407E-A947-70E740481C1C}">
                           <a14:useLocalDpi xmlns:a14="http://schemas.microsoft.com/office/drawing/2010/main" val="0"/>
@@ -5697,7 +6275,7 @@
                     <pic:cNvPicPr/>
                   </pic:nvPicPr>
                   <pic:blipFill>
-                    <a:blip r:embed="rId30"/>
+                    <a:blip r:embed="rId35"/>
                     <a:stretch>
                       <a:fillRect/>
                     </a:stretch>
@@ -5942,7 +6520,7 @@
                     <pic:cNvPicPr/>
                   </pic:nvPicPr>
                   <pic:blipFill>
-                    <a:blip r:embed="rId31">
+                    <a:blip r:embed="rId36">
                       <a:extLst>
                         <a:ext uri="{28A0092B-C50C-407E-A947-70E740481C1C}">
                           <a14:useLocalDpi xmlns:a14="http://schemas.microsoft.com/office/drawing/2010/main" val="0"/>
@@ -6105,7 +6683,7 @@
                     <pic:cNvPicPr/>
                   </pic:nvPicPr>
                   <pic:blipFill>
-                    <a:blip r:embed="rId32">
+                    <a:blip r:embed="rId37">
                       <a:extLst>
                         <a:ext uri="{28A0092B-C50C-407E-A947-70E740481C1C}">
                           <a14:useLocalDpi xmlns:a14="http://schemas.microsoft.com/office/drawing/2010/main" val="0"/>
@@ -6418,7 +6996,7 @@
                     <pic:cNvPicPr/>
                   </pic:nvPicPr>
                   <pic:blipFill>
-                    <a:blip r:embed="rId33">
+                    <a:blip r:embed="rId38">
                       <a:extLst>
                         <a:ext uri="{28A0092B-C50C-407E-A947-70E740481C1C}">
                           <a14:useLocalDpi xmlns:a14="http://schemas.microsoft.com/office/drawing/2010/main" val="0"/>
@@ -6591,7 +7169,7 @@
                     <pic:cNvPicPr/>
                   </pic:nvPicPr>
                   <pic:blipFill>
-                    <a:blip r:embed="rId34">
+                    <a:blip r:embed="rId39">
                       <a:extLst>
                         <a:ext uri="{28A0092B-C50C-407E-A947-70E740481C1C}">
                           <a14:useLocalDpi xmlns:a14="http://schemas.microsoft.com/office/drawing/2010/main" val="0"/>
@@ -6695,6 +7273,120 @@
 <file path=word/numbering.xml><?xml version="1.0" encoding="utf-8"?>
 <w:numbering xmlns:wpc="http://schemas.microsoft.com/office/word/2010/wordprocessingCanvas" xmlns:cx="http://schemas.microsoft.com/office/drawing/2014/chartex" xmlns:cx1="http://schemas.microsoft.com/office/drawing/2015/9/8/chartex" xmlns:cx2="http://schemas.microsoft.com/office/drawing/2015/10/21/chartex" xmlns:cx3="http://schemas.microsoft.com/office/drawing/2016/5/9/chartex" xmlns:cx4="http://schemas.microsoft.com/office/drawing/2016/5/10/chartex" xmlns:cx5="http://schemas.microsoft.com/office/drawing/2016/5/11/chartex" xmlns:cx6="http://schemas.microsoft.com/office/drawing/2016/5/12/chartex" xmlns:cx7="http://schemas.microsoft.com/office/drawing/2016/5/13/chartex" xmlns:cx8="http://schemas.microsoft.com/office/drawing/2016/5/14/chartex" xmlns:mc="http://schemas.openxmlformats.org/markup-compatibility/2006" xmlns:aink="http://schemas.microsoft.com/office/drawing/2016/ink" xmlns:am3d="http://schemas.microsoft.com/office/drawing/2017/model3d" xmlns:o="urn:schemas-microsoft-com:office:office" xmlns:oel="http://schemas.microsoft.com/office/2019/extlst" xmlns:r="http://schemas.openxmlformats.org/officeDocument/2006/relationships" xmlns:m="http://schemas.openxmlformats.org/officeDocument/2006/math" xmlns:v="urn:schemas-microsoft-com:vml" xmlns:wp14="http://schemas.microsoft.com/office/word/2010/wordprocessingDrawing" xmlns:wp="http://schemas.openxmlformats.org/drawingml/2006/wordprocessingDrawing" xmlns:w10="urn:schemas-microsoft-com:office:word" xmlns:w="http://schemas.openxmlformats.org/wordprocessingml/2006/main" xmlns:w14="http://schemas.microsoft.com/office/word/2010/wordml" xmlns:w15="http://schemas.microsoft.com/office/word/2012/wordml" xmlns:w16cex="http://schemas.microsoft.com/office/word/2018/wordml/cex" xmlns:w16cid="http://schemas.microsoft.com/office/word/2016/wordml/cid" xmlns:w16="http://schemas.microsoft.com/office/word/2018/wordml" xmlns:w16du="http://schemas.microsoft.com/office/word/2023/wordml/word16du" xmlns:w16sdtdh="http://schemas.microsoft.com/office/word/2020/wordml/sdtdatahash" xmlns:w16sdtfl="http://schemas.microsoft.com/office/word/2024/wordml/sdtformatlock" xmlns:w16se="http://schemas.microsoft.com/office/word/2015/wordml/symex" xmlns:wpg="http://schemas.microsoft.com/office/word/2010/wordprocessingGroup" xmlns:wpi="http://schemas.microsoft.com/office/word/2010/wordprocessingInk" xmlns:wne="http://schemas.microsoft.com/office/word/2006/wordml" xmlns:wps="http://schemas.microsoft.com/office/word/2010/wordprocessingShape" mc:Ignorable="w14 w15 w16se w16cid w16 w16cex w16sdtdh w16sdtfl w16du wp14">
   <w:abstractNum w:abstractNumId="0" w15:restartNumberingAfterBreak="0">
+    <w:nsid w:val="04B77F7F"/>
+    <w:multiLevelType w:val="hybridMultilevel"/>
+    <w:tmpl w:val="9A8A0D6C"/>
+    <w:lvl w:ilvl="0" w:tplc="BD5046E2">
+      <w:numFmt w:val="bullet"/>
+      <w:lvlText w:val="-"/>
+      <w:lvlJc w:val="left"/>
+      <w:pPr>
+        <w:ind w:left="720" w:hanging="360"/>
+      </w:pPr>
+      <w:rPr>
+        <w:rFonts w:ascii="Calibri" w:eastAsiaTheme="minorHAnsi" w:hAnsi="Calibri" w:cs="Calibri" w:hint="default"/>
+        <w:color w:val="0070C0"/>
+        <w:sz w:val="26"/>
+      </w:rPr>
+    </w:lvl>
+    <w:lvl w:ilvl="1" w:tplc="0C0A0003" w:tentative="1">
+      <w:start w:val="1"/>
+      <w:numFmt w:val="bullet"/>
+      <w:lvlText w:val="o"/>
+      <w:lvlJc w:val="left"/>
+      <w:pPr>
+        <w:ind w:left="1440" w:hanging="360"/>
+      </w:pPr>
+      <w:rPr>
+        <w:rFonts w:ascii="Courier New" w:hAnsi="Courier New" w:cs="Courier New" w:hint="default"/>
+      </w:rPr>
+    </w:lvl>
+    <w:lvl w:ilvl="2" w:tplc="0C0A0005" w:tentative="1">
+      <w:start w:val="1"/>
+      <w:numFmt w:val="bullet"/>
+      <w:lvlText w:val=""/>
+      <w:lvlJc w:val="left"/>
+      <w:pPr>
+        <w:ind w:left="2160" w:hanging="360"/>
+      </w:pPr>
+      <w:rPr>
+        <w:rFonts w:ascii="Wingdings" w:hAnsi="Wingdings" w:hint="default"/>
+      </w:rPr>
+    </w:lvl>
+    <w:lvl w:ilvl="3" w:tplc="0C0A0001" w:tentative="1">
+      <w:start w:val="1"/>
+      <w:numFmt w:val="bullet"/>
+      <w:lvlText w:val=""/>
+      <w:lvlJc w:val="left"/>
+      <w:pPr>
+        <w:ind w:left="2880" w:hanging="360"/>
+      </w:pPr>
+      <w:rPr>
+        <w:rFonts w:ascii="Symbol" w:hAnsi="Symbol" w:hint="default"/>
+      </w:rPr>
+    </w:lvl>
+    <w:lvl w:ilvl="4" w:tplc="0C0A0003" w:tentative="1">
+      <w:start w:val="1"/>
+      <w:numFmt w:val="bullet"/>
+      <w:lvlText w:val="o"/>
+      <w:lvlJc w:val="left"/>
+      <w:pPr>
+        <w:ind w:left="3600" w:hanging="360"/>
+      </w:pPr>
+      <w:rPr>
+        <w:rFonts w:ascii="Courier New" w:hAnsi="Courier New" w:cs="Courier New" w:hint="default"/>
+      </w:rPr>
+    </w:lvl>
+    <w:lvl w:ilvl="5" w:tplc="0C0A0005" w:tentative="1">
+      <w:start w:val="1"/>
+      <w:numFmt w:val="bullet"/>
+      <w:lvlText w:val=""/>
+      <w:lvlJc w:val="left"/>
+      <w:pPr>
+        <w:ind w:left="4320" w:hanging="360"/>
+      </w:pPr>
+      <w:rPr>
+        <w:rFonts w:ascii="Wingdings" w:hAnsi="Wingdings" w:hint="default"/>
+      </w:rPr>
+    </w:lvl>
+    <w:lvl w:ilvl="6" w:tplc="0C0A0001" w:tentative="1">
+      <w:start w:val="1"/>
+      <w:numFmt w:val="bullet"/>
+      <w:lvlText w:val=""/>
+      <w:lvlJc w:val="left"/>
+      <w:pPr>
+        <w:ind w:left="5040" w:hanging="360"/>
+      </w:pPr>
+      <w:rPr>
+        <w:rFonts w:ascii="Symbol" w:hAnsi="Symbol" w:hint="default"/>
+      </w:rPr>
+    </w:lvl>
+    <w:lvl w:ilvl="7" w:tplc="0C0A0003" w:tentative="1">
+      <w:start w:val="1"/>
+      <w:numFmt w:val="bullet"/>
+      <w:lvlText w:val="o"/>
+      <w:lvlJc w:val="left"/>
+      <w:pPr>
+        <w:ind w:left="5760" w:hanging="360"/>
+      </w:pPr>
+      <w:rPr>
+        <w:rFonts w:ascii="Courier New" w:hAnsi="Courier New" w:cs="Courier New" w:hint="default"/>
+      </w:rPr>
+    </w:lvl>
+    <w:lvl w:ilvl="8" w:tplc="0C0A0005" w:tentative="1">
+      <w:start w:val="1"/>
+      <w:numFmt w:val="bullet"/>
+      <w:lvlText w:val=""/>
+      <w:lvlJc w:val="left"/>
+      <w:pPr>
+        <w:ind w:left="6480" w:hanging="360"/>
+      </w:pPr>
+      <w:rPr>
+        <w:rFonts w:ascii="Wingdings" w:hAnsi="Wingdings" w:hint="default"/>
+      </w:rPr>
+    </w:lvl>
+  </w:abstractNum>
+  <w:abstractNum w:abstractNumId="1" w15:restartNumberingAfterBreak="0">
     <w:nsid w:val="24ED41D8"/>
     <w:multiLevelType w:val="hybridMultilevel"/>
     <w:tmpl w:val="E43C59EA"/>
@@ -6783,7 +7475,7 @@
       </w:pPr>
     </w:lvl>
   </w:abstractNum>
-  <w:abstractNum w:abstractNumId="1" w15:restartNumberingAfterBreak="0">
+  <w:abstractNum w:abstractNumId="2" w15:restartNumberingAfterBreak="0">
     <w:nsid w:val="257D5A47"/>
     <w:multiLevelType w:val="hybridMultilevel"/>
     <w:tmpl w:val="834ECAD0"/>
@@ -6872,7 +7564,7 @@
       </w:pPr>
     </w:lvl>
   </w:abstractNum>
-  <w:abstractNum w:abstractNumId="2" w15:restartNumberingAfterBreak="0">
+  <w:abstractNum w:abstractNumId="3" w15:restartNumberingAfterBreak="0">
     <w:nsid w:val="40264331"/>
     <w:multiLevelType w:val="hybridMultilevel"/>
     <w:tmpl w:val="2794BEE4"/>
@@ -6961,7 +7653,7 @@
       </w:pPr>
     </w:lvl>
   </w:abstractNum>
-  <w:abstractNum w:abstractNumId="3" w15:restartNumberingAfterBreak="0">
+  <w:abstractNum w:abstractNumId="4" w15:restartNumberingAfterBreak="0">
     <w:nsid w:val="42F86083"/>
     <w:multiLevelType w:val="hybridMultilevel"/>
     <w:tmpl w:val="D3A02BD8"/>
@@ -7050,7 +7742,7 @@
       </w:pPr>
     </w:lvl>
   </w:abstractNum>
-  <w:abstractNum w:abstractNumId="4" w15:restartNumberingAfterBreak="0">
+  <w:abstractNum w:abstractNumId="5" w15:restartNumberingAfterBreak="0">
     <w:nsid w:val="48D01429"/>
     <w:multiLevelType w:val="multilevel"/>
     <w:tmpl w:val="89A8868C"/>
@@ -7170,7 +7862,7 @@
       </w:pPr>
     </w:lvl>
   </w:abstractNum>
-  <w:abstractNum w:abstractNumId="5" w15:restartNumberingAfterBreak="0">
+  <w:abstractNum w:abstractNumId="6" w15:restartNumberingAfterBreak="0">
     <w:nsid w:val="77D61963"/>
     <w:multiLevelType w:val="multilevel"/>
     <w:tmpl w:val="55843CEA"/>
@@ -7288,22 +7980,25 @@
     </w:lvl>
   </w:abstractNum>
   <w:num w:numId="1" w16cid:durableId="1672754455">
-    <w:abstractNumId w:val="0"/>
+    <w:abstractNumId w:val="1"/>
   </w:num>
   <w:num w:numId="2" w16cid:durableId="668366141">
+    <w:abstractNumId w:val="6"/>
+  </w:num>
+  <w:num w:numId="3" w16cid:durableId="397171839">
     <w:abstractNumId w:val="5"/>
   </w:num>
-  <w:num w:numId="3" w16cid:durableId="397171839">
+  <w:num w:numId="4" w16cid:durableId="429129892">
+    <w:abstractNumId w:val="2"/>
+  </w:num>
+  <w:num w:numId="5" w16cid:durableId="1610549897">
     <w:abstractNumId w:val="4"/>
   </w:num>
-  <w:num w:numId="4" w16cid:durableId="429129892">
-    <w:abstractNumId w:val="1"/>
-  </w:num>
-  <w:num w:numId="5" w16cid:durableId="1610549897">
+  <w:num w:numId="6" w16cid:durableId="1742755612">
     <w:abstractNumId w:val="3"/>
   </w:num>
-  <w:num w:numId="6" w16cid:durableId="1742755612">
-    <w:abstractNumId w:val="2"/>
+  <w:num w:numId="7" w16cid:durableId="1509641366">
+    <w:abstractNumId w:val="0"/>
   </w:num>
 </w:numbering>
 </file>

</xml_diff>

<commit_message>
doc manual de usuario modificado,se agrego pasos para instalacion de apps
</commit_message>
<xml_diff>
--- a/doc/Manual De Usuario.docx
+++ b/doc/Manual De Usuario.docx
@@ -593,7 +593,23 @@
           <w:sz w:val="24"/>
           <w:szCs w:val="24"/>
         </w:rPr>
-        <w:t xml:space="preserve"> ram y procesador.</w:t>
+        <w:t xml:space="preserve"> </w:t>
+      </w:r>
+      <w:proofErr w:type="spellStart"/>
+      <w:r>
+        <w:rPr>
+          <w:sz w:val="24"/>
+          <w:szCs w:val="24"/>
+        </w:rPr>
+        <w:t>ram</w:t>
+      </w:r>
+      <w:proofErr w:type="spellEnd"/>
+      <w:r>
+        <w:rPr>
+          <w:sz w:val="24"/>
+          <w:szCs w:val="24"/>
+        </w:rPr>
+        <w:t xml:space="preserve"> y procesador.</w:t>
       </w:r>
     </w:p>
     <w:p>
@@ -1341,13 +1357,15 @@
       </w:pPr>
       <w:r>
         <w:rPr>
-          <w:noProof/>
+          <w:rFonts w:cstheme="minorHAnsi"/>
+          <w:sz w:val="24"/>
+          <w:szCs w:val="24"/>
         </w:rPr>
         <w:drawing>
-          <wp:inline distT="0" distB="0" distL="0" distR="0" wp14:anchorId="17F610E8" wp14:editId="0FB883C1">
-            <wp:extent cx="5400040" cy="2903855"/>
+          <wp:inline distT="0" distB="0" distL="0" distR="0" wp14:anchorId="4D3ABE41" wp14:editId="073F4E8F">
+            <wp:extent cx="5400040" cy="3133090"/>
             <wp:effectExtent l="0" t="0" r="0" b="0"/>
-            <wp:docPr id="144660786" name="Imagen 2"/>
+            <wp:docPr id="1156678090" name="Imagen 1"/>
             <wp:cNvGraphicFramePr>
               <a:graphicFrameLocks xmlns:a="http://schemas.openxmlformats.org/drawingml/2006/main" noChangeAspect="1"/>
             </wp:cNvGraphicFramePr>
@@ -1355,36 +1373,23 @@
               <a:graphicData uri="http://schemas.openxmlformats.org/drawingml/2006/picture">
                 <pic:pic xmlns:pic="http://schemas.openxmlformats.org/drawingml/2006/picture">
                   <pic:nvPicPr>
-                    <pic:cNvPr id="0" name="Picture 3"/>
-                    <pic:cNvPicPr>
-                      <a:picLocks noChangeAspect="1" noChangeArrowheads="1"/>
-                    </pic:cNvPicPr>
+                    <pic:cNvPr id="1156678090" name=""/>
+                    <pic:cNvPicPr/>
                   </pic:nvPicPr>
                   <pic:blipFill>
-                    <a:blip r:embed="rId12" cstate="print">
-                      <a:extLst>
-                        <a:ext uri="{28A0092B-C50C-407E-A947-70E740481C1C}">
-                          <a14:useLocalDpi xmlns:a14="http://schemas.microsoft.com/office/drawing/2010/main" val="0"/>
-                        </a:ext>
-                      </a:extLst>
-                    </a:blip>
-                    <a:srcRect/>
+                    <a:blip r:embed="rId12"/>
                     <a:stretch>
                       <a:fillRect/>
                     </a:stretch>
                   </pic:blipFill>
-                  <pic:spPr bwMode="auto">
+                  <pic:spPr>
                     <a:xfrm>
                       <a:off x="0" y="0"/>
-                      <a:ext cx="5400040" cy="2903855"/>
+                      <a:ext cx="5400040" cy="3133090"/>
                     </a:xfrm>
                     <a:prstGeom prst="rect">
                       <a:avLst/>
                     </a:prstGeom>
-                    <a:noFill/>
-                    <a:ln>
-                      <a:noFill/>
-                    </a:ln>
                   </pic:spPr>
                 </pic:pic>
               </a:graphicData>
@@ -1496,7 +1501,23 @@
           <w:sz w:val="24"/>
           <w:szCs w:val="24"/>
         </w:rPr>
-        <w:t>Algunos atributos tienen un botón de editar, con el icono de un lapiz, enlazado a ellos.</w:t>
+        <w:t xml:space="preserve">Algunos atributos tienen un botón de editar, con el icono de un </w:t>
+      </w:r>
+      <w:proofErr w:type="spellStart"/>
+      <w:r>
+        <w:rPr>
+          <w:sz w:val="24"/>
+          <w:szCs w:val="24"/>
+        </w:rPr>
+        <w:t>lapiz</w:t>
+      </w:r>
+      <w:proofErr w:type="spellEnd"/>
+      <w:r>
+        <w:rPr>
+          <w:sz w:val="24"/>
+          <w:szCs w:val="24"/>
+        </w:rPr>
+        <w:t>, enlazado a ellos.</w:t>
       </w:r>
     </w:p>
     <w:p>
@@ -1504,7 +1525,7 @@
         <w:tabs>
           <w:tab w:val="left" w:pos="1215"/>
         </w:tabs>
-        <w:jc w:val="both"/>
+        <w:jc w:val="center"/>
         <w:rPr>
           <w:sz w:val="24"/>
           <w:szCs w:val="24"/>
@@ -1517,9 +1538,9 @@
           <w:szCs w:val="24"/>
         </w:rPr>
         <w:drawing>
-          <wp:inline distT="0" distB="0" distL="0" distR="0" wp14:anchorId="3E0F2617" wp14:editId="7FC8554B">
-            <wp:extent cx="3894776" cy="3848986"/>
-            <wp:effectExtent l="0" t="0" r="0" b="0"/>
+          <wp:inline distT="0" distB="0" distL="0" distR="0" wp14:anchorId="3E0F2617" wp14:editId="40AF891A">
+            <wp:extent cx="4097215" cy="3635765"/>
+            <wp:effectExtent l="0" t="0" r="0" b="3175"/>
             <wp:docPr id="2129079308" name="Imagen 1"/>
             <wp:cNvGraphicFramePr>
               <a:graphicFrameLocks xmlns:a="http://schemas.openxmlformats.org/drawingml/2006/main" noChangeAspect="1"/>
@@ -1549,7 +1570,7 @@
                   <pic:spPr bwMode="auto">
                     <a:xfrm>
                       <a:off x="0" y="0"/>
-                      <a:ext cx="3945487" cy="3899101"/>
+                      <a:ext cx="4179230" cy="3708543"/>
                     </a:xfrm>
                     <a:prstGeom prst="rect">
                       <a:avLst/>
@@ -1583,14 +1604,58 @@
           <w:szCs w:val="24"/>
         </w:rPr>
         <w:lastRenderedPageBreak/>
-        <w:t>Con darle click al botón se activará el modo edición sobre ese campo, una vez escrita la nueva información del campo bastará con pulsar la tecla enter para guardar el nuevo valor</w:t>
-      </w:r>
-      <w:r>
-        <w:rPr>
-          <w:sz w:val="24"/>
-          <w:szCs w:val="24"/>
-        </w:rPr>
-        <w:t xml:space="preserve">, y para cancelar la edición habría que volver a clickar sobre </w:t>
+        <w:t xml:space="preserve">Con darle </w:t>
+      </w:r>
+      <w:r>
+        <w:rPr>
+          <w:sz w:val="24"/>
+          <w:szCs w:val="24"/>
+        </w:rPr>
+        <w:t>clic</w:t>
+      </w:r>
+      <w:r>
+        <w:rPr>
+          <w:sz w:val="24"/>
+          <w:szCs w:val="24"/>
+        </w:rPr>
+        <w:t xml:space="preserve"> al botón se activará el modo edición sobre ese campo, una vez escrita la nueva información del campo bastará con pulsar la tecla </w:t>
+      </w:r>
+      <w:proofErr w:type="spellStart"/>
+      <w:r>
+        <w:rPr>
+          <w:sz w:val="24"/>
+          <w:szCs w:val="24"/>
+        </w:rPr>
+        <w:t>enter</w:t>
+      </w:r>
+      <w:proofErr w:type="spellEnd"/>
+      <w:r>
+        <w:rPr>
+          <w:sz w:val="24"/>
+          <w:szCs w:val="24"/>
+        </w:rPr>
+        <w:t xml:space="preserve"> para guardar el nuevo valor</w:t>
+      </w:r>
+      <w:r>
+        <w:rPr>
+          <w:sz w:val="24"/>
+          <w:szCs w:val="24"/>
+        </w:rPr>
+        <w:t xml:space="preserve">, y para cancelar la edición habría que volver a </w:t>
+      </w:r>
+      <w:r>
+        <w:rPr>
+          <w:sz w:val="24"/>
+          <w:szCs w:val="24"/>
+        </w:rPr>
+        <w:t>clicar</w:t>
+      </w:r>
+      <w:r>
+        <w:rPr>
+          <w:sz w:val="24"/>
+          <w:szCs w:val="24"/>
+        </w:rPr>
+        <w:t xml:space="preserve"> sobre </w:t>
       </w:r>
       <w:r>
         <w:rPr>
@@ -1711,7 +1776,39 @@
           <w:sz w:val="24"/>
           <w:szCs w:val="24"/>
         </w:rPr>
-        <w:t>con la tecla enter guarda los valores de una forma distinta, mediante un botón verde con el símbolo de un check.</w:t>
+        <w:t xml:space="preserve">con la tecla </w:t>
+      </w:r>
+      <w:proofErr w:type="spellStart"/>
+      <w:r>
+        <w:rPr>
+          <w:sz w:val="24"/>
+          <w:szCs w:val="24"/>
+        </w:rPr>
+        <w:t>enter</w:t>
+      </w:r>
+      <w:proofErr w:type="spellEnd"/>
+      <w:r>
+        <w:rPr>
+          <w:sz w:val="24"/>
+          <w:szCs w:val="24"/>
+        </w:rPr>
+        <w:t xml:space="preserve"> guarda los valores de una forma distinta, mediante un botón verde con el símbolo de un </w:t>
+      </w:r>
+      <w:proofErr w:type="spellStart"/>
+      <w:r>
+        <w:rPr>
+          <w:sz w:val="24"/>
+          <w:szCs w:val="24"/>
+        </w:rPr>
+        <w:t>check</w:t>
+      </w:r>
+      <w:proofErr w:type="spellEnd"/>
+      <w:r>
+        <w:rPr>
+          <w:sz w:val="24"/>
+          <w:szCs w:val="24"/>
+        </w:rPr>
+        <w:t>.</w:t>
       </w:r>
       <w:r>
         <w:rPr>
@@ -1856,7 +1953,21 @@
           <w:sz w:val="24"/>
           <w:szCs w:val="24"/>
         </w:rPr>
-        <w:t>Si pasamos el ratón por encima de la foto, veremos que nos da la opción de cambiarla, si le hacemos click se nos abrirá el explorador de archivos y nos pedirá que seleccionemos una nueva foto.</w:t>
+        <w:t xml:space="preserve">Si pasamos el ratón por encima de la foto, veremos que nos da la opción de cambiarla, si le hacemos </w:t>
+      </w:r>
+      <w:r>
+        <w:rPr>
+          <w:sz w:val="24"/>
+          <w:szCs w:val="24"/>
+        </w:rPr>
+        <w:t>clic</w:t>
+      </w:r>
+      <w:r>
+        <w:rPr>
+          <w:sz w:val="24"/>
+          <w:szCs w:val="24"/>
+        </w:rPr>
+        <w:t xml:space="preserve"> se nos abrirá el explorador de archivos y nos pedirá que seleccionemos una nueva foto.</w:t>
       </w:r>
     </w:p>
     <w:p>
@@ -2146,7 +2257,25 @@
           <w:sz w:val="32"/>
           <w:szCs w:val="32"/>
         </w:rPr>
-        <w:t>: Realizar Tests automatizados</w:t>
+        <w:t xml:space="preserve">: Realizar </w:t>
+      </w:r>
+      <w:proofErr w:type="spellStart"/>
+      <w:r>
+        <w:rPr>
+          <w:color w:val="002060"/>
+          <w:sz w:val="32"/>
+          <w:szCs w:val="32"/>
+        </w:rPr>
+        <w:t>Tests</w:t>
+      </w:r>
+      <w:proofErr w:type="spellEnd"/>
+      <w:r>
+        <w:rPr>
+          <w:color w:val="002060"/>
+          <w:sz w:val="32"/>
+          <w:szCs w:val="32"/>
+        </w:rPr>
+        <w:t xml:space="preserve"> automatizados</w:t>
       </w:r>
     </w:p>
     <w:p>
@@ -2165,7 +2294,23 @@
           <w:sz w:val="24"/>
           <w:szCs w:val="24"/>
         </w:rPr>
-        <w:t>Para este paso debemos fijarnos que, en lado derecho casi pegado al borde, se encuentra el panel de Pruebas el cual nos ayudará a realizar Tests automatizados al dispositivo conectado en ese momento. En la lista de pasos podremos ver algunas que vienen por defecto para hacer una prueba rápida, si desea puede quitar los pasos por defecto haciendo clic en el botón de limpiar que se encuentra debajo de la lista.</w:t>
+        <w:t xml:space="preserve">Para este paso debemos fijarnos que, en lado derecho casi pegado al borde, se encuentra el panel de Pruebas el cual nos ayudará a realizar </w:t>
+      </w:r>
+      <w:proofErr w:type="spellStart"/>
+      <w:r>
+        <w:rPr>
+          <w:sz w:val="24"/>
+          <w:szCs w:val="24"/>
+        </w:rPr>
+        <w:t>Tests</w:t>
+      </w:r>
+      <w:proofErr w:type="spellEnd"/>
+      <w:r>
+        <w:rPr>
+          <w:sz w:val="24"/>
+          <w:szCs w:val="24"/>
+        </w:rPr>
+        <w:t xml:space="preserve"> automatizados al dispositivo conectado en ese momento. En la lista de pasos podremos ver algunas que vienen por defecto para hacer una prueba rápida, si desea puede quitar los pasos por defecto haciendo clic en el botón de limpiar que se encuentra debajo de la lista.</w:t>
       </w:r>
     </w:p>
     <w:p>
@@ -2216,6 +2361,7 @@
           <w:szCs w:val="24"/>
         </w:rPr>
       </w:pPr>
+      <w:proofErr w:type="gramStart"/>
       <w:r>
         <w:rPr>
           <w:rFonts w:cstheme="minorHAnsi"/>
@@ -2224,7 +2370,40 @@
           <w:sz w:val="24"/>
           <w:szCs w:val="24"/>
         </w:rPr>
-        <w:t>Importante!! Para probar la vibración del dispositivo, éste debe ser root.</w:t>
+        <w:t>Importante!!</w:t>
+      </w:r>
+      <w:proofErr w:type="gramEnd"/>
+      <w:r>
+        <w:rPr>
+          <w:rFonts w:cstheme="minorHAnsi"/>
+          <w:b/>
+          <w:bCs/>
+          <w:sz w:val="24"/>
+          <w:szCs w:val="24"/>
+        </w:rPr>
+        <w:t xml:space="preserve"> Para probar la vibración del dispositivo, éste debe ser </w:t>
+      </w:r>
+      <w:proofErr w:type="spellStart"/>
+      <w:r>
+        <w:rPr>
+          <w:rFonts w:cstheme="minorHAnsi"/>
+          <w:b/>
+          <w:bCs/>
+          <w:sz w:val="24"/>
+          <w:szCs w:val="24"/>
+        </w:rPr>
+        <w:t>root</w:t>
+      </w:r>
+      <w:proofErr w:type="spellEnd"/>
+      <w:r>
+        <w:rPr>
+          <w:rFonts w:cstheme="minorHAnsi"/>
+          <w:b/>
+          <w:bCs/>
+          <w:sz w:val="24"/>
+          <w:szCs w:val="24"/>
+        </w:rPr>
+        <w:t>.</w:t>
       </w:r>
     </w:p>
     <w:p>
@@ -2504,7 +2683,23 @@
           <w:sz w:val="24"/>
           <w:szCs w:val="24"/>
         </w:rPr>
-        <w:t>c) Al finalizar las pruebas puede exportarlas a pdf dando clic en el botón Informe</w:t>
+        <w:t xml:space="preserve">c) Al finalizar las pruebas puede exportarlas a </w:t>
+      </w:r>
+      <w:proofErr w:type="spellStart"/>
+      <w:r>
+        <w:rPr>
+          <w:sz w:val="24"/>
+          <w:szCs w:val="24"/>
+        </w:rPr>
+        <w:t>pdf</w:t>
+      </w:r>
+      <w:proofErr w:type="spellEnd"/>
+      <w:r>
+        <w:rPr>
+          <w:sz w:val="24"/>
+          <w:szCs w:val="24"/>
+        </w:rPr>
+        <w:t xml:space="preserve"> dando clic en el botón Informe</w:t>
       </w:r>
     </w:p>
     <w:p>
@@ -2747,7 +2942,25 @@
           <w:sz w:val="32"/>
           <w:szCs w:val="32"/>
         </w:rPr>
-        <w:t>s de Gestión y configuracion del móvil</w:t>
+        <w:t xml:space="preserve">s de Gestión y </w:t>
+      </w:r>
+      <w:proofErr w:type="spellStart"/>
+      <w:r>
+        <w:rPr>
+          <w:color w:val="002060"/>
+          <w:sz w:val="32"/>
+          <w:szCs w:val="32"/>
+        </w:rPr>
+        <w:t>configuracion</w:t>
+      </w:r>
+      <w:proofErr w:type="spellEnd"/>
+      <w:r>
+        <w:rPr>
+          <w:color w:val="002060"/>
+          <w:sz w:val="32"/>
+          <w:szCs w:val="32"/>
+        </w:rPr>
+        <w:t xml:space="preserve"> del móvil</w:t>
       </w:r>
     </w:p>
     <w:p>
@@ -3050,14 +3263,46 @@
           <w:sz w:val="24"/>
           <w:szCs w:val="24"/>
         </w:rPr>
-        <w:t xml:space="preserve"> o arrastrando el indicador circular del slider, </w:t>
-      </w:r>
-      <w:r>
-        <w:rPr>
-          <w:sz w:val="24"/>
-          <w:szCs w:val="24"/>
-        </w:rPr>
-        <w:t>véase por ejemplo el botón de ubicación activado el cual activa el gps del móvil conectado en ese momento.</w:t>
+        <w:t xml:space="preserve"> o arrastrando el indicador circular </w:t>
+      </w:r>
+      <w:proofErr w:type="gramStart"/>
+      <w:r>
+        <w:rPr>
+          <w:sz w:val="24"/>
+          <w:szCs w:val="24"/>
+        </w:rPr>
+        <w:t>del slider</w:t>
+      </w:r>
+      <w:proofErr w:type="gramEnd"/>
+      <w:r>
+        <w:rPr>
+          <w:sz w:val="24"/>
+          <w:szCs w:val="24"/>
+        </w:rPr>
+        <w:t xml:space="preserve">, </w:t>
+      </w:r>
+      <w:r>
+        <w:rPr>
+          <w:sz w:val="24"/>
+          <w:szCs w:val="24"/>
+        </w:rPr>
+        <w:t xml:space="preserve">véase por ejemplo el botón de ubicación activado el cual activa el </w:t>
+      </w:r>
+      <w:proofErr w:type="spellStart"/>
+      <w:r>
+        <w:rPr>
+          <w:sz w:val="24"/>
+          <w:szCs w:val="24"/>
+        </w:rPr>
+        <w:t>gps</w:t>
+      </w:r>
+      <w:proofErr w:type="spellEnd"/>
+      <w:r>
+        <w:rPr>
+          <w:sz w:val="24"/>
+          <w:szCs w:val="24"/>
+        </w:rPr>
+        <w:t xml:space="preserve"> del móvil conectado en ese momento.</w:t>
       </w:r>
     </w:p>
     <w:p>
@@ -3171,7 +3416,29 @@
           <w:sz w:val="24"/>
           <w:szCs w:val="24"/>
         </w:rPr>
-        <w:t xml:space="preserve"> el dispositivo en root.</w:t>
+        <w:t xml:space="preserve"> el dispositivo en </w:t>
+      </w:r>
+      <w:proofErr w:type="spellStart"/>
+      <w:r>
+        <w:rPr>
+          <w:rFonts w:cstheme="minorHAnsi"/>
+          <w:b/>
+          <w:bCs/>
+          <w:sz w:val="24"/>
+          <w:szCs w:val="24"/>
+        </w:rPr>
+        <w:t>root</w:t>
+      </w:r>
+      <w:proofErr w:type="spellEnd"/>
+      <w:r>
+        <w:rPr>
+          <w:rFonts w:cstheme="minorHAnsi"/>
+          <w:b/>
+          <w:bCs/>
+          <w:sz w:val="24"/>
+          <w:szCs w:val="24"/>
+        </w:rPr>
+        <w:t>.</w:t>
       </w:r>
     </w:p>
     <w:p>
@@ -3527,14 +3794,46 @@
           <w:sz w:val="24"/>
           <w:szCs w:val="24"/>
         </w:rPr>
-        <w:t xml:space="preserve">Para instalar una apk deberá hacer </w:t>
-      </w:r>
-      <w:r>
-        <w:rPr>
-          <w:sz w:val="24"/>
-          <w:szCs w:val="24"/>
-        </w:rPr>
-        <w:t>doble clic sobre una de las mostradas en la lista de apks y seleccionar la ruta donde desee extraerla.</w:t>
+        <w:t xml:space="preserve">Para instalar una </w:t>
+      </w:r>
+      <w:proofErr w:type="spellStart"/>
+      <w:r>
+        <w:rPr>
+          <w:sz w:val="24"/>
+          <w:szCs w:val="24"/>
+        </w:rPr>
+        <w:t>apk</w:t>
+      </w:r>
+      <w:proofErr w:type="spellEnd"/>
+      <w:r>
+        <w:rPr>
+          <w:sz w:val="24"/>
+          <w:szCs w:val="24"/>
+        </w:rPr>
+        <w:t xml:space="preserve"> deberá hacer </w:t>
+      </w:r>
+      <w:r>
+        <w:rPr>
+          <w:sz w:val="24"/>
+          <w:szCs w:val="24"/>
+        </w:rPr>
+        <w:t xml:space="preserve">doble clic sobre una de las mostradas en la lista de </w:t>
+      </w:r>
+      <w:proofErr w:type="spellStart"/>
+      <w:r>
+        <w:rPr>
+          <w:sz w:val="24"/>
+          <w:szCs w:val="24"/>
+        </w:rPr>
+        <w:t>apks</w:t>
+      </w:r>
+      <w:proofErr w:type="spellEnd"/>
+      <w:r>
+        <w:rPr>
+          <w:sz w:val="24"/>
+          <w:szCs w:val="24"/>
+        </w:rPr>
+        <w:t xml:space="preserve"> y seleccionar la ruta donde desee extraerla.</w:t>
       </w:r>
     </w:p>
     <w:p>
@@ -3699,7 +3998,23 @@
           <w:szCs w:val="24"/>
         </w:rPr>
         <w:lastRenderedPageBreak/>
-        <w:t>*Ejemplo de Apk extraída en el escritorio.</w:t>
+        <w:t xml:space="preserve">*Ejemplo de </w:t>
+      </w:r>
+      <w:proofErr w:type="spellStart"/>
+      <w:r>
+        <w:rPr>
+          <w:sz w:val="24"/>
+          <w:szCs w:val="24"/>
+        </w:rPr>
+        <w:t>Apk</w:t>
+      </w:r>
+      <w:proofErr w:type="spellEnd"/>
+      <w:r>
+        <w:rPr>
+          <w:sz w:val="24"/>
+          <w:szCs w:val="24"/>
+        </w:rPr>
+        <w:t xml:space="preserve"> extraída en el escritorio.</w:t>
       </w:r>
     </w:p>
     <w:p>
@@ -4609,7 +4924,25 @@
           <w:sz w:val="24"/>
           <w:szCs w:val="24"/>
         </w:rPr>
-        <w:t xml:space="preserve"> una app que permita la rotación de pantalla, ejemplo: YouTube, play store, etc.</w:t>
+        <w:t xml:space="preserve"> una app que permita la rotación de pantalla, ejemplo: YouTube, </w:t>
+      </w:r>
+      <w:proofErr w:type="spellStart"/>
+      <w:r>
+        <w:rPr>
+          <w:rFonts w:cstheme="minorHAnsi"/>
+          <w:sz w:val="24"/>
+          <w:szCs w:val="24"/>
+        </w:rPr>
+        <w:t>play</w:t>
+      </w:r>
+      <w:proofErr w:type="spellEnd"/>
+      <w:r>
+        <w:rPr>
+          <w:rFonts w:cstheme="minorHAnsi"/>
+          <w:sz w:val="24"/>
+          <w:szCs w:val="24"/>
+        </w:rPr>
+        <w:t xml:space="preserve"> store, etc.</w:t>
       </w:r>
     </w:p>
     <w:p>
@@ -5210,7 +5543,25 @@
           <w:sz w:val="24"/>
           <w:szCs w:val="24"/>
         </w:rPr>
-        <w:t xml:space="preserve">En este paso podemos leer APN activa, operador de red y el estado de registro Volte </w:t>
+        <w:t xml:space="preserve">En este paso podemos leer APN activa, operador de red y el estado de registro </w:t>
+      </w:r>
+      <w:proofErr w:type="spellStart"/>
+      <w:r>
+        <w:rPr>
+          <w:rFonts w:cstheme="minorHAnsi"/>
+          <w:sz w:val="24"/>
+          <w:szCs w:val="24"/>
+        </w:rPr>
+        <w:t>Volte</w:t>
+      </w:r>
+      <w:proofErr w:type="spellEnd"/>
+      <w:r>
+        <w:rPr>
+          <w:rFonts w:cstheme="minorHAnsi"/>
+          <w:sz w:val="24"/>
+          <w:szCs w:val="24"/>
+        </w:rPr>
+        <w:t xml:space="preserve"> </w:t>
       </w:r>
       <w:r>
         <w:rPr>
@@ -6357,7 +6708,25 @@
           <w:sz w:val="24"/>
           <w:szCs w:val="24"/>
         </w:rPr>
-        <w:t xml:space="preserve">Introducir un numero de teléfono para realizar la medición de la batería durante una </w:t>
+        <w:t xml:space="preserve">Introducir un </w:t>
+      </w:r>
+      <w:proofErr w:type="spellStart"/>
+      <w:r>
+        <w:rPr>
+          <w:rFonts w:cstheme="minorHAnsi"/>
+          <w:sz w:val="24"/>
+          <w:szCs w:val="24"/>
+        </w:rPr>
+        <w:t>numero</w:t>
+      </w:r>
+      <w:proofErr w:type="spellEnd"/>
+      <w:r>
+        <w:rPr>
+          <w:rFonts w:cstheme="minorHAnsi"/>
+          <w:sz w:val="24"/>
+          <w:szCs w:val="24"/>
+        </w:rPr>
+        <w:t xml:space="preserve"> de teléfono para realizar la medición de la batería durante una </w:t>
       </w:r>
       <w:r>
         <w:rPr>
@@ -6604,7 +6973,25 @@
           <w:sz w:val="24"/>
           <w:szCs w:val="24"/>
         </w:rPr>
-        <w:t>Si desea ver solo los warnings y errores marque la casilla que se encuentra justo arriba de la lista de logs y pruebe p</w:t>
+        <w:t xml:space="preserve">Si desea ver solo los </w:t>
+      </w:r>
+      <w:proofErr w:type="spellStart"/>
+      <w:r>
+        <w:rPr>
+          <w:rFonts w:cstheme="minorHAnsi"/>
+          <w:sz w:val="24"/>
+          <w:szCs w:val="24"/>
+        </w:rPr>
+        <w:t>warnings</w:t>
+      </w:r>
+      <w:proofErr w:type="spellEnd"/>
+      <w:r>
+        <w:rPr>
+          <w:rFonts w:cstheme="minorHAnsi"/>
+          <w:sz w:val="24"/>
+          <w:szCs w:val="24"/>
+        </w:rPr>
+        <w:t xml:space="preserve"> y errores marque la casilla que se encuentra justo arriba de la lista de logs y pruebe p</w:t>
       </w:r>
       <w:r>
         <w:rPr>
@@ -6628,8 +7015,18 @@
           <w:sz w:val="24"/>
           <w:szCs w:val="24"/>
         </w:rPr>
-        <w:t xml:space="preserve"> package</w:t>
-      </w:r>
+        <w:t xml:space="preserve"> </w:t>
+      </w:r>
+      <w:proofErr w:type="spellStart"/>
+      <w:r>
+        <w:rPr>
+          <w:rFonts w:cstheme="minorHAnsi"/>
+          <w:sz w:val="24"/>
+          <w:szCs w:val="24"/>
+        </w:rPr>
+        <w:t>package</w:t>
+      </w:r>
+      <w:proofErr w:type="spellEnd"/>
       <w:r>
         <w:rPr>
           <w:rFonts w:cstheme="minorHAnsi"/>
@@ -6973,7 +7370,7 @@
           <w:szCs w:val="24"/>
         </w:rPr>
         <w:drawing>
-          <wp:anchor distT="0" distB="0" distL="114300" distR="114300" simplePos="0" relativeHeight="251681792" behindDoc="0" locked="0" layoutInCell="1" allowOverlap="1" wp14:anchorId="09810F09" wp14:editId="4189138E">
+          <wp:anchor distT="0" distB="0" distL="114300" distR="114300" simplePos="0" relativeHeight="251681792" behindDoc="0" locked="0" layoutInCell="1" allowOverlap="1" wp14:anchorId="09810F09" wp14:editId="17E8F8C2">
             <wp:simplePos x="0" y="0"/>
             <wp:positionH relativeFrom="column">
               <wp:posOffset>423301</wp:posOffset>
@@ -7210,6 +7607,1643 @@
         </w:rPr>
       </w:pPr>
     </w:p>
+    <w:p>
+      <w:pPr>
+        <w:pStyle w:val="Prrafodelista"/>
+        <w:tabs>
+          <w:tab w:val="left" w:pos="1329"/>
+        </w:tabs>
+        <w:jc w:val="both"/>
+        <w:rPr>
+          <w:rFonts w:cstheme="minorHAnsi"/>
+          <w:sz w:val="24"/>
+          <w:szCs w:val="24"/>
+        </w:rPr>
+      </w:pPr>
+    </w:p>
+    <w:p>
+      <w:pPr>
+        <w:pStyle w:val="Prrafodelista"/>
+        <w:tabs>
+          <w:tab w:val="left" w:pos="1329"/>
+        </w:tabs>
+        <w:jc w:val="both"/>
+        <w:rPr>
+          <w:rFonts w:cstheme="minorHAnsi"/>
+          <w:sz w:val="24"/>
+          <w:szCs w:val="24"/>
+        </w:rPr>
+      </w:pPr>
+    </w:p>
+    <w:p>
+      <w:pPr>
+        <w:tabs>
+          <w:tab w:val="left" w:pos="1021"/>
+        </w:tabs>
+        <w:jc w:val="both"/>
+        <w:rPr>
+          <w:color w:val="002060"/>
+          <w:sz w:val="32"/>
+          <w:szCs w:val="32"/>
+        </w:rPr>
+      </w:pPr>
+      <w:r>
+        <w:rPr>
+          <w:color w:val="002060"/>
+          <w:sz w:val="32"/>
+          <w:szCs w:val="32"/>
+        </w:rPr>
+        <w:t xml:space="preserve">Herramienta de </w:t>
+      </w:r>
+      <w:r>
+        <w:rPr>
+          <w:color w:val="002060"/>
+          <w:sz w:val="32"/>
+          <w:szCs w:val="32"/>
+        </w:rPr>
+        <w:t>Instalación masiva de apps</w:t>
+      </w:r>
+    </w:p>
+    <w:p>
+      <w:pPr>
+        <w:tabs>
+          <w:tab w:val="left" w:pos="1021"/>
+        </w:tabs>
+        <w:jc w:val="both"/>
+        <w:rPr>
+          <w:color w:val="4472C4" w:themeColor="accent1"/>
+          <w:sz w:val="28"/>
+          <w:szCs w:val="28"/>
+        </w:rPr>
+      </w:pPr>
+      <w:r>
+        <w:rPr>
+          <w:color w:val="4472C4" w:themeColor="accent1"/>
+          <w:sz w:val="28"/>
+          <w:szCs w:val="28"/>
+        </w:rPr>
+        <w:t>Paso 1</w:t>
+      </w:r>
+      <w:r>
+        <w:rPr>
+          <w:color w:val="4472C4" w:themeColor="accent1"/>
+          <w:sz w:val="28"/>
+          <w:szCs w:val="28"/>
+        </w:rPr>
+        <w:t>:</w:t>
+      </w:r>
+      <w:r>
+        <w:rPr>
+          <w:color w:val="4472C4" w:themeColor="accent1"/>
+          <w:sz w:val="24"/>
+          <w:szCs w:val="24"/>
+        </w:rPr>
+        <w:t xml:space="preserve"> Hacer clic en el botón de la parte inferior de la lista de dispositivos para entrar en la vista de “Instalación masiva”</w:t>
+      </w:r>
+    </w:p>
+    <w:p>
+      <w:pPr>
+        <w:tabs>
+          <w:tab w:val="left" w:pos="1021"/>
+        </w:tabs>
+        <w:jc w:val="both"/>
+        <w:rPr>
+          <w:color w:val="4472C4" w:themeColor="accent1"/>
+          <w:sz w:val="28"/>
+          <w:szCs w:val="28"/>
+        </w:rPr>
+      </w:pPr>
+      <w:r>
+        <w:rPr>
+          <w:color w:val="4472C4" w:themeColor="accent1"/>
+          <w:sz w:val="28"/>
+          <w:szCs w:val="28"/>
+        </w:rPr>
+        <w:drawing>
+          <wp:anchor distT="0" distB="0" distL="114300" distR="114300" simplePos="0" relativeHeight="251685888" behindDoc="0" locked="0" layoutInCell="1" allowOverlap="1" wp14:anchorId="3F26DAB3" wp14:editId="2943BF34">
+            <wp:simplePos x="0" y="0"/>
+            <wp:positionH relativeFrom="margin">
+              <wp:posOffset>1072710</wp:posOffset>
+            </wp:positionH>
+            <wp:positionV relativeFrom="paragraph">
+              <wp:posOffset>142484</wp:posOffset>
+            </wp:positionV>
+            <wp:extent cx="2762636" cy="819264"/>
+            <wp:effectExtent l="0" t="0" r="0" b="0"/>
+            <wp:wrapNone/>
+            <wp:docPr id="1552398845" name="Imagen 1"/>
+            <wp:cNvGraphicFramePr>
+              <a:graphicFrameLocks xmlns:a="http://schemas.openxmlformats.org/drawingml/2006/main" noChangeAspect="1"/>
+            </wp:cNvGraphicFramePr>
+            <a:graphic xmlns:a="http://schemas.openxmlformats.org/drawingml/2006/main">
+              <a:graphicData uri="http://schemas.openxmlformats.org/drawingml/2006/picture">
+                <pic:pic xmlns:pic="http://schemas.openxmlformats.org/drawingml/2006/picture">
+                  <pic:nvPicPr>
+                    <pic:cNvPr id="1552398845" name=""/>
+                    <pic:cNvPicPr/>
+                  </pic:nvPicPr>
+                  <pic:blipFill>
+                    <a:blip r:embed="rId40">
+                      <a:extLst>
+                        <a:ext uri="{28A0092B-C50C-407E-A947-70E740481C1C}">
+                          <a14:useLocalDpi xmlns:a14="http://schemas.microsoft.com/office/drawing/2010/main" val="0"/>
+                        </a:ext>
+                      </a:extLst>
+                    </a:blip>
+                    <a:stretch>
+                      <a:fillRect/>
+                    </a:stretch>
+                  </pic:blipFill>
+                  <pic:spPr>
+                    <a:xfrm>
+                      <a:off x="0" y="0"/>
+                      <a:ext cx="2762636" cy="819264"/>
+                    </a:xfrm>
+                    <a:prstGeom prst="rect">
+                      <a:avLst/>
+                    </a:prstGeom>
+                  </pic:spPr>
+                </pic:pic>
+              </a:graphicData>
+            </a:graphic>
+          </wp:anchor>
+        </w:drawing>
+      </w:r>
+    </w:p>
+    <w:p>
+      <w:pPr>
+        <w:tabs>
+          <w:tab w:val="left" w:pos="1021"/>
+        </w:tabs>
+        <w:jc w:val="both"/>
+        <w:rPr>
+          <w:color w:val="4472C4" w:themeColor="accent1"/>
+          <w:sz w:val="28"/>
+          <w:szCs w:val="28"/>
+        </w:rPr>
+      </w:pPr>
+    </w:p>
+    <w:p>
+      <w:pPr>
+        <w:tabs>
+          <w:tab w:val="left" w:pos="1329"/>
+        </w:tabs>
+        <w:jc w:val="both"/>
+        <w:rPr>
+          <w:rFonts w:cstheme="minorHAnsi"/>
+          <w:sz w:val="24"/>
+          <w:szCs w:val="24"/>
+        </w:rPr>
+      </w:pPr>
+    </w:p>
+    <w:p>
+      <w:pPr>
+        <w:tabs>
+          <w:tab w:val="left" w:pos="1329"/>
+        </w:tabs>
+        <w:jc w:val="both"/>
+        <w:rPr>
+          <w:rFonts w:cstheme="minorHAnsi"/>
+          <w:sz w:val="24"/>
+          <w:szCs w:val="24"/>
+        </w:rPr>
+      </w:pPr>
+    </w:p>
+    <w:p>
+      <w:pPr>
+        <w:tabs>
+          <w:tab w:val="left" w:pos="1329"/>
+        </w:tabs>
+        <w:jc w:val="both"/>
+        <w:rPr>
+          <w:rFonts w:cstheme="minorHAnsi"/>
+          <w:sz w:val="24"/>
+          <w:szCs w:val="24"/>
+        </w:rPr>
+      </w:pPr>
+    </w:p>
+    <w:p>
+      <w:pPr>
+        <w:tabs>
+          <w:tab w:val="left" w:pos="1329"/>
+        </w:tabs>
+        <w:jc w:val="both"/>
+        <w:rPr>
+          <w:rFonts w:cstheme="minorHAnsi"/>
+          <w:color w:val="4472C4" w:themeColor="accent1"/>
+          <w:sz w:val="24"/>
+          <w:szCs w:val="24"/>
+        </w:rPr>
+      </w:pPr>
+      <w:r>
+        <w:rPr>
+          <w:rFonts w:cstheme="minorHAnsi"/>
+          <w:b/>
+          <w:bCs/>
+          <w:color w:val="4472C4" w:themeColor="accent1"/>
+          <w:sz w:val="24"/>
+          <w:szCs w:val="24"/>
+        </w:rPr>
+        <w:t>Paso 2:</w:t>
+      </w:r>
+      <w:r>
+        <w:rPr>
+          <w:rFonts w:cstheme="minorHAnsi"/>
+          <w:color w:val="4472C4" w:themeColor="accent1"/>
+          <w:sz w:val="24"/>
+          <w:szCs w:val="24"/>
+        </w:rPr>
+        <w:t xml:space="preserve"> Arrastrar un archivo tipo .</w:t>
+      </w:r>
+      <w:proofErr w:type="spellStart"/>
+      <w:r>
+        <w:rPr>
+          <w:rFonts w:cstheme="minorHAnsi"/>
+          <w:color w:val="4472C4" w:themeColor="accent1"/>
+          <w:sz w:val="24"/>
+          <w:szCs w:val="24"/>
+        </w:rPr>
+        <w:t>apk</w:t>
+      </w:r>
+      <w:proofErr w:type="spellEnd"/>
+      <w:r>
+        <w:rPr>
+          <w:rFonts w:cstheme="minorHAnsi"/>
+          <w:color w:val="4472C4" w:themeColor="accent1"/>
+          <w:sz w:val="24"/>
+          <w:szCs w:val="24"/>
+        </w:rPr>
+        <w:t xml:space="preserve"> </w:t>
+      </w:r>
+      <w:proofErr w:type="gramStart"/>
+      <w:r>
+        <w:rPr>
+          <w:rFonts w:cstheme="minorHAnsi"/>
+          <w:color w:val="4472C4" w:themeColor="accent1"/>
+          <w:sz w:val="24"/>
+          <w:szCs w:val="24"/>
+        </w:rPr>
+        <w:t>/ .</w:t>
+      </w:r>
+      <w:proofErr w:type="spellStart"/>
+      <w:r>
+        <w:rPr>
+          <w:rFonts w:cstheme="minorHAnsi"/>
+          <w:color w:val="4472C4" w:themeColor="accent1"/>
+          <w:sz w:val="24"/>
+          <w:szCs w:val="24"/>
+        </w:rPr>
+        <w:t>apkm</w:t>
+      </w:r>
+      <w:proofErr w:type="spellEnd"/>
+      <w:proofErr w:type="gramEnd"/>
+      <w:r>
+        <w:rPr>
+          <w:rFonts w:cstheme="minorHAnsi"/>
+          <w:color w:val="4472C4" w:themeColor="accent1"/>
+          <w:sz w:val="24"/>
+          <w:szCs w:val="24"/>
+        </w:rPr>
+        <w:t xml:space="preserve"> </w:t>
+      </w:r>
+      <w:proofErr w:type="gramStart"/>
+      <w:r>
+        <w:rPr>
+          <w:rFonts w:cstheme="minorHAnsi"/>
+          <w:color w:val="4472C4" w:themeColor="accent1"/>
+          <w:sz w:val="24"/>
+          <w:szCs w:val="24"/>
+        </w:rPr>
+        <w:t>/ .</w:t>
+      </w:r>
+      <w:proofErr w:type="spellStart"/>
+      <w:r>
+        <w:rPr>
+          <w:rFonts w:cstheme="minorHAnsi"/>
+          <w:color w:val="4472C4" w:themeColor="accent1"/>
+          <w:sz w:val="24"/>
+          <w:szCs w:val="24"/>
+        </w:rPr>
+        <w:t>xapk</w:t>
+      </w:r>
+      <w:proofErr w:type="spellEnd"/>
+      <w:proofErr w:type="gramEnd"/>
+    </w:p>
+    <w:p>
+      <w:pPr>
+        <w:tabs>
+          <w:tab w:val="left" w:pos="1329"/>
+        </w:tabs>
+        <w:jc w:val="both"/>
+        <w:rPr>
+          <w:rFonts w:cstheme="minorHAnsi"/>
+          <w:sz w:val="24"/>
+          <w:szCs w:val="24"/>
+        </w:rPr>
+      </w:pPr>
+      <w:r>
+        <w:rPr>
+          <w:rFonts w:cstheme="minorHAnsi"/>
+          <w:sz w:val="24"/>
+          <w:szCs w:val="24"/>
+        </w:rPr>
+        <w:t>Arrastra uno o varios archivos de instalación al área punteada. La herramienta acepta tres formatos:</w:t>
+      </w:r>
+    </w:p>
+    <w:p>
+      <w:pPr>
+        <w:numPr>
+          <w:ilvl w:val="0"/>
+          <w:numId w:val="8"/>
+        </w:numPr>
+        <w:tabs>
+          <w:tab w:val="left" w:pos="1329"/>
+        </w:tabs>
+        <w:jc w:val="both"/>
+        <w:rPr>
+          <w:rFonts w:cstheme="minorHAnsi"/>
+          <w:sz w:val="24"/>
+          <w:szCs w:val="24"/>
+        </w:rPr>
+      </w:pPr>
+      <w:r>
+        <w:rPr>
+          <w:rFonts w:cstheme="minorHAnsi"/>
+          <w:b/>
+          <w:bCs/>
+          <w:sz w:val="24"/>
+          <w:szCs w:val="24"/>
+        </w:rPr>
+        <w:t>.</w:t>
+      </w:r>
+      <w:proofErr w:type="spellStart"/>
+      <w:r>
+        <w:rPr>
+          <w:rFonts w:cstheme="minorHAnsi"/>
+          <w:b/>
+          <w:bCs/>
+          <w:sz w:val="24"/>
+          <w:szCs w:val="24"/>
+        </w:rPr>
+        <w:t>apk</w:t>
+      </w:r>
+      <w:proofErr w:type="spellEnd"/>
+      <w:r>
+        <w:rPr>
+          <w:rFonts w:cstheme="minorHAnsi"/>
+          <w:sz w:val="24"/>
+          <w:szCs w:val="24"/>
+        </w:rPr>
+        <w:t xml:space="preserve"> — APK estándar de una sola pieza. Compatible con la mayoría de apps pequeñas y medianas.</w:t>
+      </w:r>
+    </w:p>
+    <w:p>
+      <w:pPr>
+        <w:numPr>
+          <w:ilvl w:val="0"/>
+          <w:numId w:val="8"/>
+        </w:numPr>
+        <w:tabs>
+          <w:tab w:val="left" w:pos="1329"/>
+        </w:tabs>
+        <w:jc w:val="both"/>
+        <w:rPr>
+          <w:rFonts w:cstheme="minorHAnsi"/>
+          <w:sz w:val="24"/>
+          <w:szCs w:val="24"/>
+        </w:rPr>
+      </w:pPr>
+      <w:proofErr w:type="gramStart"/>
+      <w:r>
+        <w:rPr>
+          <w:rFonts w:cstheme="minorHAnsi"/>
+          <w:b/>
+          <w:bCs/>
+          <w:sz w:val="24"/>
+          <w:szCs w:val="24"/>
+        </w:rPr>
+        <w:t>.</w:t>
+      </w:r>
+      <w:proofErr w:type="spellStart"/>
+      <w:r>
+        <w:rPr>
+          <w:rFonts w:cstheme="minorHAnsi"/>
+          <w:b/>
+          <w:bCs/>
+          <w:sz w:val="24"/>
+          <w:szCs w:val="24"/>
+        </w:rPr>
+        <w:t>xapk</w:t>
+      </w:r>
+      <w:proofErr w:type="spellEnd"/>
+      <w:proofErr w:type="gramEnd"/>
+      <w:r>
+        <w:rPr>
+          <w:rFonts w:cstheme="minorHAnsi"/>
+          <w:sz w:val="24"/>
+          <w:szCs w:val="24"/>
+        </w:rPr>
+        <w:t xml:space="preserve"> — Formato de </w:t>
+      </w:r>
+      <w:proofErr w:type="spellStart"/>
+      <w:r>
+        <w:rPr>
+          <w:rFonts w:cstheme="minorHAnsi"/>
+          <w:sz w:val="24"/>
+          <w:szCs w:val="24"/>
+        </w:rPr>
+        <w:t>APKPure</w:t>
+      </w:r>
+      <w:proofErr w:type="spellEnd"/>
+      <w:r>
+        <w:rPr>
+          <w:rFonts w:cstheme="minorHAnsi"/>
+          <w:sz w:val="24"/>
+          <w:szCs w:val="24"/>
+        </w:rPr>
+        <w:t xml:space="preserve">. Contiene el APK base más los </w:t>
+      </w:r>
+      <w:proofErr w:type="spellStart"/>
+      <w:r>
+        <w:rPr>
+          <w:rFonts w:cstheme="minorHAnsi"/>
+          <w:sz w:val="24"/>
+          <w:szCs w:val="24"/>
+        </w:rPr>
+        <w:t>splits</w:t>
+      </w:r>
+      <w:proofErr w:type="spellEnd"/>
+      <w:r>
+        <w:rPr>
+          <w:rFonts w:cstheme="minorHAnsi"/>
+          <w:sz w:val="24"/>
+          <w:szCs w:val="24"/>
+        </w:rPr>
+        <w:t xml:space="preserve"> necesarios (idiomas, densidad, arquitectura).</w:t>
+      </w:r>
+    </w:p>
+    <w:p>
+      <w:pPr>
+        <w:numPr>
+          <w:ilvl w:val="0"/>
+          <w:numId w:val="8"/>
+        </w:numPr>
+        <w:tabs>
+          <w:tab w:val="left" w:pos="1329"/>
+        </w:tabs>
+        <w:jc w:val="both"/>
+        <w:rPr>
+          <w:rFonts w:cstheme="minorHAnsi"/>
+          <w:sz w:val="24"/>
+          <w:szCs w:val="24"/>
+        </w:rPr>
+      </w:pPr>
+      <w:proofErr w:type="gramStart"/>
+      <w:r>
+        <w:rPr>
+          <w:rFonts w:cstheme="minorHAnsi"/>
+          <w:b/>
+          <w:bCs/>
+          <w:sz w:val="24"/>
+          <w:szCs w:val="24"/>
+        </w:rPr>
+        <w:lastRenderedPageBreak/>
+        <w:t>.</w:t>
+      </w:r>
+      <w:proofErr w:type="spellStart"/>
+      <w:r>
+        <w:rPr>
+          <w:rFonts w:cstheme="minorHAnsi"/>
+          <w:b/>
+          <w:bCs/>
+          <w:sz w:val="24"/>
+          <w:szCs w:val="24"/>
+        </w:rPr>
+        <w:t>apkm</w:t>
+      </w:r>
+      <w:proofErr w:type="spellEnd"/>
+      <w:proofErr w:type="gramEnd"/>
+      <w:r>
+        <w:rPr>
+          <w:rFonts w:cstheme="minorHAnsi"/>
+          <w:sz w:val="24"/>
+          <w:szCs w:val="24"/>
+        </w:rPr>
+        <w:t xml:space="preserve"> — Formato de </w:t>
+      </w:r>
+      <w:proofErr w:type="spellStart"/>
+      <w:r>
+        <w:rPr>
+          <w:rFonts w:cstheme="minorHAnsi"/>
+          <w:sz w:val="24"/>
+          <w:szCs w:val="24"/>
+        </w:rPr>
+        <w:t>APKMirror</w:t>
+      </w:r>
+      <w:proofErr w:type="spellEnd"/>
+      <w:r>
+        <w:rPr>
+          <w:rFonts w:cstheme="minorHAnsi"/>
+          <w:sz w:val="24"/>
+          <w:szCs w:val="24"/>
+        </w:rPr>
+        <w:t xml:space="preserve">. Equivalente al anterior, empaquetado como </w:t>
+      </w:r>
+      <w:proofErr w:type="spellStart"/>
+      <w:r>
+        <w:rPr>
+          <w:rFonts w:cstheme="minorHAnsi"/>
+          <w:sz w:val="24"/>
+          <w:szCs w:val="24"/>
+        </w:rPr>
+        <w:t>bundle</w:t>
+      </w:r>
+      <w:proofErr w:type="spellEnd"/>
+      <w:r>
+        <w:rPr>
+          <w:rFonts w:cstheme="minorHAnsi"/>
+          <w:sz w:val="24"/>
+          <w:szCs w:val="24"/>
+        </w:rPr>
+        <w:t xml:space="preserve"> descargado directamente desde esa plataforma.</w:t>
+      </w:r>
+    </w:p>
+    <w:p>
+      <w:pPr>
+        <w:tabs>
+          <w:tab w:val="left" w:pos="1329"/>
+        </w:tabs>
+        <w:jc w:val="both"/>
+        <w:rPr>
+          <w:rFonts w:cstheme="minorHAnsi"/>
+          <w:color w:val="4472C4" w:themeColor="accent1"/>
+          <w:sz w:val="24"/>
+          <w:szCs w:val="24"/>
+        </w:rPr>
+      </w:pPr>
+    </w:p>
+    <w:p>
+      <w:pPr>
+        <w:tabs>
+          <w:tab w:val="left" w:pos="1329"/>
+        </w:tabs>
+        <w:jc w:val="both"/>
+        <w:rPr>
+          <w:rFonts w:cstheme="minorHAnsi"/>
+          <w:color w:val="4472C4" w:themeColor="accent1"/>
+          <w:sz w:val="24"/>
+          <w:szCs w:val="24"/>
+        </w:rPr>
+      </w:pPr>
+      <w:r>
+        <w:rPr>
+          <w:rFonts w:cstheme="minorHAnsi"/>
+          <w:color w:val="4472C4" w:themeColor="accent1"/>
+          <w:sz w:val="24"/>
+          <w:szCs w:val="24"/>
+        </w:rPr>
+        <w:drawing>
+          <wp:anchor distT="0" distB="0" distL="114300" distR="114300" simplePos="0" relativeHeight="251686912" behindDoc="0" locked="0" layoutInCell="1" allowOverlap="1" wp14:anchorId="0B163B7E" wp14:editId="1EF17329">
+            <wp:simplePos x="0" y="0"/>
+            <wp:positionH relativeFrom="column">
+              <wp:posOffset>739140</wp:posOffset>
+            </wp:positionH>
+            <wp:positionV relativeFrom="paragraph">
+              <wp:posOffset>10893</wp:posOffset>
+            </wp:positionV>
+            <wp:extent cx="4241263" cy="2276971"/>
+            <wp:effectExtent l="0" t="0" r="6985" b="9525"/>
+            <wp:wrapNone/>
+            <wp:docPr id="654317317" name="Imagen 1"/>
+            <wp:cNvGraphicFramePr>
+              <a:graphicFrameLocks xmlns:a="http://schemas.openxmlformats.org/drawingml/2006/main" noChangeAspect="1"/>
+            </wp:cNvGraphicFramePr>
+            <a:graphic xmlns:a="http://schemas.openxmlformats.org/drawingml/2006/main">
+              <a:graphicData uri="http://schemas.openxmlformats.org/drawingml/2006/picture">
+                <pic:pic xmlns:pic="http://schemas.openxmlformats.org/drawingml/2006/picture">
+                  <pic:nvPicPr>
+                    <pic:cNvPr id="654317317" name=""/>
+                    <pic:cNvPicPr/>
+                  </pic:nvPicPr>
+                  <pic:blipFill rotWithShape="1">
+                    <a:blip r:embed="rId41">
+                      <a:extLst>
+                        <a:ext uri="{28A0092B-C50C-407E-A947-70E740481C1C}">
+                          <a14:useLocalDpi xmlns:a14="http://schemas.microsoft.com/office/drawing/2010/main" val="0"/>
+                        </a:ext>
+                      </a:extLst>
+                    </a:blip>
+                    <a:srcRect l="12035"/>
+                    <a:stretch>
+                      <a:fillRect/>
+                    </a:stretch>
+                  </pic:blipFill>
+                  <pic:spPr bwMode="auto">
+                    <a:xfrm>
+                      <a:off x="0" y="0"/>
+                      <a:ext cx="4241263" cy="2276971"/>
+                    </a:xfrm>
+                    <a:prstGeom prst="rect">
+                      <a:avLst/>
+                    </a:prstGeom>
+                    <a:ln>
+                      <a:noFill/>
+                    </a:ln>
+                    <a:extLst>
+                      <a:ext uri="{53640926-AAD7-44D8-BBD7-CCE9431645EC}">
+                        <a14:shadowObscured xmlns:a14="http://schemas.microsoft.com/office/drawing/2010/main"/>
+                      </a:ext>
+                    </a:extLst>
+                  </pic:spPr>
+                </pic:pic>
+              </a:graphicData>
+            </a:graphic>
+            <wp14:sizeRelH relativeFrom="margin">
+              <wp14:pctWidth>0</wp14:pctWidth>
+            </wp14:sizeRelH>
+            <wp14:sizeRelV relativeFrom="margin">
+              <wp14:pctHeight>0</wp14:pctHeight>
+            </wp14:sizeRelV>
+          </wp:anchor>
+        </w:drawing>
+      </w:r>
+    </w:p>
+    <w:p>
+      <w:pPr>
+        <w:tabs>
+          <w:tab w:val="left" w:pos="1329"/>
+        </w:tabs>
+        <w:jc w:val="both"/>
+        <w:rPr>
+          <w:rFonts w:cstheme="minorHAnsi"/>
+          <w:color w:val="4472C4" w:themeColor="accent1"/>
+          <w:sz w:val="24"/>
+          <w:szCs w:val="24"/>
+        </w:rPr>
+      </w:pPr>
+    </w:p>
+    <w:p>
+      <w:pPr>
+        <w:tabs>
+          <w:tab w:val="left" w:pos="1329"/>
+        </w:tabs>
+        <w:jc w:val="both"/>
+        <w:rPr>
+          <w:rFonts w:cstheme="minorHAnsi"/>
+          <w:color w:val="4472C4" w:themeColor="accent1"/>
+          <w:sz w:val="24"/>
+          <w:szCs w:val="24"/>
+        </w:rPr>
+      </w:pPr>
+    </w:p>
+    <w:p>
+      <w:pPr>
+        <w:tabs>
+          <w:tab w:val="left" w:pos="1329"/>
+        </w:tabs>
+        <w:jc w:val="both"/>
+        <w:rPr>
+          <w:rFonts w:cstheme="minorHAnsi"/>
+          <w:color w:val="4472C4" w:themeColor="accent1"/>
+          <w:sz w:val="24"/>
+          <w:szCs w:val="24"/>
+        </w:rPr>
+      </w:pPr>
+    </w:p>
+    <w:p>
+      <w:pPr>
+        <w:tabs>
+          <w:tab w:val="left" w:pos="1329"/>
+        </w:tabs>
+        <w:jc w:val="both"/>
+        <w:rPr>
+          <w:rFonts w:cstheme="minorHAnsi"/>
+          <w:color w:val="4472C4" w:themeColor="accent1"/>
+          <w:sz w:val="24"/>
+          <w:szCs w:val="24"/>
+        </w:rPr>
+      </w:pPr>
+    </w:p>
+    <w:p>
+      <w:pPr>
+        <w:tabs>
+          <w:tab w:val="left" w:pos="1329"/>
+        </w:tabs>
+        <w:jc w:val="both"/>
+        <w:rPr>
+          <w:rFonts w:cstheme="minorHAnsi"/>
+          <w:color w:val="4472C4" w:themeColor="accent1"/>
+          <w:sz w:val="24"/>
+          <w:szCs w:val="24"/>
+        </w:rPr>
+      </w:pPr>
+    </w:p>
+    <w:p>
+      <w:pPr>
+        <w:tabs>
+          <w:tab w:val="left" w:pos="1329"/>
+        </w:tabs>
+        <w:jc w:val="both"/>
+        <w:rPr>
+          <w:rFonts w:cstheme="minorHAnsi"/>
+          <w:color w:val="4472C4" w:themeColor="accent1"/>
+          <w:sz w:val="24"/>
+          <w:szCs w:val="24"/>
+        </w:rPr>
+      </w:pPr>
+    </w:p>
+    <w:p>
+      <w:pPr>
+        <w:tabs>
+          <w:tab w:val="left" w:pos="1329"/>
+        </w:tabs>
+        <w:jc w:val="both"/>
+        <w:rPr>
+          <w:rFonts w:cstheme="minorHAnsi"/>
+          <w:color w:val="4472C4" w:themeColor="accent1"/>
+          <w:sz w:val="24"/>
+          <w:szCs w:val="24"/>
+        </w:rPr>
+      </w:pPr>
+    </w:p>
+    <w:p>
+      <w:pPr>
+        <w:tabs>
+          <w:tab w:val="left" w:pos="1329"/>
+        </w:tabs>
+        <w:jc w:val="both"/>
+        <w:rPr>
+          <w:rFonts w:cstheme="minorHAnsi"/>
+          <w:color w:val="4472C4" w:themeColor="accent1"/>
+          <w:sz w:val="24"/>
+          <w:szCs w:val="24"/>
+        </w:rPr>
+      </w:pPr>
+    </w:p>
+    <w:p>
+      <w:pPr>
+        <w:tabs>
+          <w:tab w:val="left" w:pos="1329"/>
+        </w:tabs>
+        <w:jc w:val="both"/>
+        <w:rPr>
+          <w:rFonts w:cstheme="minorHAnsi"/>
+          <w:color w:val="4472C4" w:themeColor="accent1"/>
+          <w:sz w:val="24"/>
+          <w:szCs w:val="24"/>
+        </w:rPr>
+      </w:pPr>
+      <w:r>
+        <w:rPr>
+          <w:rFonts w:cstheme="minorHAnsi"/>
+          <w:color w:val="4472C4" w:themeColor="accent1"/>
+          <w:sz w:val="24"/>
+          <w:szCs w:val="24"/>
+        </w:rPr>
+        <w:t>*ejemplo de archivo seleccionado</w:t>
+      </w:r>
+    </w:p>
+    <w:p>
+      <w:pPr>
+        <w:tabs>
+          <w:tab w:val="left" w:pos="1329"/>
+        </w:tabs>
+        <w:jc w:val="both"/>
+        <w:rPr>
+          <w:rFonts w:cstheme="minorHAnsi"/>
+          <w:color w:val="4472C4" w:themeColor="accent1"/>
+          <w:sz w:val="24"/>
+          <w:szCs w:val="24"/>
+        </w:rPr>
+      </w:pPr>
+      <w:r>
+        <w:rPr>
+          <w:rFonts w:cstheme="minorHAnsi"/>
+          <w:color w:val="4472C4" w:themeColor="accent1"/>
+          <w:sz w:val="24"/>
+          <w:szCs w:val="24"/>
+        </w:rPr>
+        <w:drawing>
+          <wp:anchor distT="0" distB="0" distL="114300" distR="114300" simplePos="0" relativeHeight="251691008" behindDoc="0" locked="0" layoutInCell="1" allowOverlap="1" wp14:anchorId="67B333DC" wp14:editId="5146A0C1">
+            <wp:simplePos x="0" y="0"/>
+            <wp:positionH relativeFrom="column">
+              <wp:posOffset>1671809</wp:posOffset>
+            </wp:positionH>
+            <wp:positionV relativeFrom="paragraph">
+              <wp:posOffset>203639</wp:posOffset>
+            </wp:positionV>
+            <wp:extent cx="2419688" cy="724001"/>
+            <wp:effectExtent l="0" t="0" r="0" b="0"/>
+            <wp:wrapNone/>
+            <wp:docPr id="172015839" name="Imagen 1"/>
+            <wp:cNvGraphicFramePr>
+              <a:graphicFrameLocks xmlns:a="http://schemas.openxmlformats.org/drawingml/2006/main" noChangeAspect="1"/>
+            </wp:cNvGraphicFramePr>
+            <a:graphic xmlns:a="http://schemas.openxmlformats.org/drawingml/2006/main">
+              <a:graphicData uri="http://schemas.openxmlformats.org/drawingml/2006/picture">
+                <pic:pic xmlns:pic="http://schemas.openxmlformats.org/drawingml/2006/picture">
+                  <pic:nvPicPr>
+                    <pic:cNvPr id="172015839" name=""/>
+                    <pic:cNvPicPr/>
+                  </pic:nvPicPr>
+                  <pic:blipFill>
+                    <a:blip r:embed="rId42">
+                      <a:extLst>
+                        <a:ext uri="{28A0092B-C50C-407E-A947-70E740481C1C}">
+                          <a14:useLocalDpi xmlns:a14="http://schemas.microsoft.com/office/drawing/2010/main" val="0"/>
+                        </a:ext>
+                      </a:extLst>
+                    </a:blip>
+                    <a:stretch>
+                      <a:fillRect/>
+                    </a:stretch>
+                  </pic:blipFill>
+                  <pic:spPr>
+                    <a:xfrm>
+                      <a:off x="0" y="0"/>
+                      <a:ext cx="2419688" cy="724001"/>
+                    </a:xfrm>
+                    <a:prstGeom prst="rect">
+                      <a:avLst/>
+                    </a:prstGeom>
+                  </pic:spPr>
+                </pic:pic>
+              </a:graphicData>
+            </a:graphic>
+          </wp:anchor>
+        </w:drawing>
+      </w:r>
+    </w:p>
+    <w:p>
+      <w:pPr>
+        <w:tabs>
+          <w:tab w:val="left" w:pos="1329"/>
+        </w:tabs>
+        <w:jc w:val="both"/>
+        <w:rPr>
+          <w:rFonts w:cstheme="minorHAnsi"/>
+          <w:color w:val="4472C4" w:themeColor="accent1"/>
+          <w:sz w:val="24"/>
+          <w:szCs w:val="24"/>
+        </w:rPr>
+      </w:pPr>
+    </w:p>
+    <w:p>
+      <w:pPr>
+        <w:tabs>
+          <w:tab w:val="left" w:pos="1329"/>
+        </w:tabs>
+        <w:jc w:val="both"/>
+        <w:rPr>
+          <w:rFonts w:cstheme="minorHAnsi"/>
+          <w:color w:val="4472C4" w:themeColor="accent1"/>
+          <w:sz w:val="24"/>
+          <w:szCs w:val="24"/>
+        </w:rPr>
+      </w:pPr>
+    </w:p>
+    <w:p>
+      <w:pPr>
+        <w:tabs>
+          <w:tab w:val="left" w:pos="1329"/>
+        </w:tabs>
+        <w:jc w:val="both"/>
+        <w:rPr>
+          <w:rFonts w:cstheme="minorHAnsi"/>
+          <w:color w:val="4472C4" w:themeColor="accent1"/>
+          <w:sz w:val="24"/>
+          <w:szCs w:val="24"/>
+        </w:rPr>
+      </w:pPr>
+    </w:p>
+    <w:p>
+      <w:pPr>
+        <w:tabs>
+          <w:tab w:val="left" w:pos="1329"/>
+        </w:tabs>
+        <w:jc w:val="both"/>
+        <w:rPr>
+          <w:rFonts w:cstheme="minorHAnsi"/>
+          <w:color w:val="4472C4" w:themeColor="accent1"/>
+          <w:sz w:val="24"/>
+          <w:szCs w:val="24"/>
+        </w:rPr>
+      </w:pPr>
+      <w:r>
+        <w:rPr>
+          <w:rFonts w:cstheme="minorHAnsi"/>
+          <w:color w:val="4472C4" w:themeColor="accent1"/>
+          <w:sz w:val="24"/>
+          <w:szCs w:val="24"/>
+        </w:rPr>
+        <w:t>Paso 3: Seleccionar uno o varios dispositivos:</w:t>
+      </w:r>
+    </w:p>
+    <w:p>
+      <w:pPr>
+        <w:tabs>
+          <w:tab w:val="left" w:pos="1329"/>
+        </w:tabs>
+        <w:jc w:val="both"/>
+        <w:rPr>
+          <w:rFonts w:cstheme="minorHAnsi"/>
+          <w:color w:val="4472C4" w:themeColor="accent1"/>
+          <w:sz w:val="24"/>
+          <w:szCs w:val="24"/>
+        </w:rPr>
+      </w:pPr>
+      <w:r>
+        <w:rPr>
+          <w:rFonts w:cstheme="minorHAnsi"/>
+          <w:color w:val="4472C4" w:themeColor="accent1"/>
+          <w:sz w:val="24"/>
+          <w:szCs w:val="24"/>
+        </w:rPr>
+        <w:t xml:space="preserve"> </w:t>
+      </w:r>
+      <w:r>
+        <w:rPr>
+          <w:rFonts w:cstheme="minorHAnsi"/>
+          <w:sz w:val="24"/>
+          <w:szCs w:val="24"/>
+        </w:rPr>
+        <w:t>Puedes</w:t>
+      </w:r>
+      <w:r>
+        <w:rPr>
+          <w:rFonts w:cstheme="minorHAnsi"/>
+          <w:color w:val="4472C4" w:themeColor="accent1"/>
+          <w:sz w:val="24"/>
+          <w:szCs w:val="24"/>
+        </w:rPr>
+        <w:t xml:space="preserve"> </w:t>
+      </w:r>
+      <w:r>
+        <w:rPr>
+          <w:rFonts w:cstheme="minorHAnsi"/>
+          <w:sz w:val="24"/>
+          <w:szCs w:val="24"/>
+        </w:rPr>
+        <w:t>seleccionar un dispositivo haciendo clic</w:t>
+      </w:r>
+      <w:r>
+        <w:rPr>
+          <w:rFonts w:cstheme="minorHAnsi"/>
+          <w:sz w:val="24"/>
+          <w:szCs w:val="24"/>
+        </w:rPr>
+        <w:t xml:space="preserve">, si desea seleccionar varios deberá usar </w:t>
+      </w:r>
+      <w:proofErr w:type="spellStart"/>
+      <w:r>
+        <w:rPr>
+          <w:rFonts w:cstheme="minorHAnsi"/>
+          <w:sz w:val="24"/>
+          <w:szCs w:val="24"/>
+        </w:rPr>
+        <w:t>ctrl</w:t>
+      </w:r>
+      <w:proofErr w:type="spellEnd"/>
+      <w:r>
+        <w:rPr>
+          <w:rFonts w:cstheme="minorHAnsi"/>
+          <w:sz w:val="24"/>
+          <w:szCs w:val="24"/>
+        </w:rPr>
+        <w:t xml:space="preserve"> + clic y para </w:t>
+      </w:r>
+      <w:r>
+        <w:rPr>
+          <w:rFonts w:cstheme="minorHAnsi"/>
+          <w:sz w:val="24"/>
+          <w:szCs w:val="24"/>
+        </w:rPr>
+        <w:t>desmarcar</w:t>
+      </w:r>
+      <w:r>
+        <w:rPr>
+          <w:rFonts w:cstheme="minorHAnsi"/>
+          <w:sz w:val="24"/>
+          <w:szCs w:val="24"/>
+        </w:rPr>
+        <w:t xml:space="preserve"> todos los dispositivos hacer clic en Desmarcar todos, si conecta un dispositivo mientras está en la ventana de </w:t>
+      </w:r>
+      <w:r>
+        <w:rPr>
+          <w:rFonts w:cstheme="minorHAnsi"/>
+          <w:sz w:val="24"/>
+          <w:szCs w:val="24"/>
+        </w:rPr>
+        <w:t>instalación</w:t>
+      </w:r>
+      <w:r>
+        <w:rPr>
+          <w:rFonts w:cstheme="minorHAnsi"/>
+          <w:sz w:val="24"/>
+          <w:szCs w:val="24"/>
+        </w:rPr>
+        <w:t xml:space="preserve"> masiva, deberá hacer </w:t>
+      </w:r>
+      <w:r>
+        <w:rPr>
+          <w:rFonts w:cstheme="minorHAnsi"/>
+          <w:sz w:val="24"/>
+          <w:szCs w:val="24"/>
+        </w:rPr>
+        <w:t>clic</w:t>
+      </w:r>
+      <w:r>
+        <w:rPr>
+          <w:rFonts w:cstheme="minorHAnsi"/>
+          <w:sz w:val="24"/>
+          <w:szCs w:val="24"/>
+        </w:rPr>
+        <w:t xml:space="preserve"> </w:t>
+      </w:r>
+      <w:r>
+        <w:rPr>
+          <w:rFonts w:cstheme="minorHAnsi"/>
+          <w:sz w:val="24"/>
+          <w:szCs w:val="24"/>
+        </w:rPr>
+        <w:t>para actualizar la lista de dispositivos.</w:t>
+      </w:r>
+    </w:p>
+    <w:p>
+      <w:pPr>
+        <w:tabs>
+          <w:tab w:val="left" w:pos="1329"/>
+        </w:tabs>
+        <w:jc w:val="both"/>
+        <w:rPr>
+          <w:rFonts w:cstheme="minorHAnsi"/>
+          <w:color w:val="4472C4" w:themeColor="accent1"/>
+          <w:sz w:val="24"/>
+          <w:szCs w:val="24"/>
+        </w:rPr>
+      </w:pPr>
+      <w:r>
+        <w:rPr>
+          <w:rFonts w:cstheme="minorHAnsi"/>
+          <w:color w:val="4472C4" w:themeColor="accent1"/>
+          <w:sz w:val="24"/>
+          <w:szCs w:val="24"/>
+        </w:rPr>
+        <w:drawing>
+          <wp:anchor distT="0" distB="0" distL="114300" distR="114300" simplePos="0" relativeHeight="251687936" behindDoc="0" locked="0" layoutInCell="1" allowOverlap="1" wp14:anchorId="638B25B8" wp14:editId="25F4E7D5">
+            <wp:simplePos x="0" y="0"/>
+            <wp:positionH relativeFrom="column">
+              <wp:posOffset>1302385</wp:posOffset>
+            </wp:positionH>
+            <wp:positionV relativeFrom="paragraph">
+              <wp:posOffset>100770</wp:posOffset>
+            </wp:positionV>
+            <wp:extent cx="3238952" cy="2543530"/>
+            <wp:effectExtent l="0" t="0" r="0" b="9525"/>
+            <wp:wrapNone/>
+            <wp:docPr id="1046643995" name="Imagen 1"/>
+            <wp:cNvGraphicFramePr>
+              <a:graphicFrameLocks xmlns:a="http://schemas.openxmlformats.org/drawingml/2006/main" noChangeAspect="1"/>
+            </wp:cNvGraphicFramePr>
+            <a:graphic xmlns:a="http://schemas.openxmlformats.org/drawingml/2006/main">
+              <a:graphicData uri="http://schemas.openxmlformats.org/drawingml/2006/picture">
+                <pic:pic xmlns:pic="http://schemas.openxmlformats.org/drawingml/2006/picture">
+                  <pic:nvPicPr>
+                    <pic:cNvPr id="1046643995" name=""/>
+                    <pic:cNvPicPr/>
+                  </pic:nvPicPr>
+                  <pic:blipFill>
+                    <a:blip r:embed="rId43">
+                      <a:extLst>
+                        <a:ext uri="{28A0092B-C50C-407E-A947-70E740481C1C}">
+                          <a14:useLocalDpi xmlns:a14="http://schemas.microsoft.com/office/drawing/2010/main" val="0"/>
+                        </a:ext>
+                      </a:extLst>
+                    </a:blip>
+                    <a:stretch>
+                      <a:fillRect/>
+                    </a:stretch>
+                  </pic:blipFill>
+                  <pic:spPr>
+                    <a:xfrm>
+                      <a:off x="0" y="0"/>
+                      <a:ext cx="3238952" cy="2543530"/>
+                    </a:xfrm>
+                    <a:prstGeom prst="rect">
+                      <a:avLst/>
+                    </a:prstGeom>
+                  </pic:spPr>
+                </pic:pic>
+              </a:graphicData>
+            </a:graphic>
+          </wp:anchor>
+        </w:drawing>
+      </w:r>
+    </w:p>
+    <w:p>
+      <w:pPr>
+        <w:tabs>
+          <w:tab w:val="left" w:pos="1329"/>
+        </w:tabs>
+        <w:jc w:val="both"/>
+        <w:rPr>
+          <w:rFonts w:cstheme="minorHAnsi"/>
+          <w:color w:val="4472C4" w:themeColor="accent1"/>
+          <w:sz w:val="24"/>
+          <w:szCs w:val="24"/>
+        </w:rPr>
+      </w:pPr>
+    </w:p>
+    <w:p>
+      <w:pPr>
+        <w:tabs>
+          <w:tab w:val="left" w:pos="1329"/>
+        </w:tabs>
+        <w:jc w:val="both"/>
+        <w:rPr>
+          <w:rFonts w:cstheme="minorHAnsi"/>
+          <w:color w:val="4472C4" w:themeColor="accent1"/>
+          <w:sz w:val="24"/>
+          <w:szCs w:val="24"/>
+        </w:rPr>
+      </w:pPr>
+    </w:p>
+    <w:p>
+      <w:pPr>
+        <w:tabs>
+          <w:tab w:val="left" w:pos="1329"/>
+        </w:tabs>
+        <w:jc w:val="both"/>
+        <w:rPr>
+          <w:rFonts w:cstheme="minorHAnsi"/>
+          <w:color w:val="4472C4" w:themeColor="accent1"/>
+          <w:sz w:val="24"/>
+          <w:szCs w:val="24"/>
+        </w:rPr>
+      </w:pPr>
+    </w:p>
+    <w:p>
+      <w:pPr>
+        <w:tabs>
+          <w:tab w:val="left" w:pos="1329"/>
+        </w:tabs>
+        <w:jc w:val="both"/>
+        <w:rPr>
+          <w:rFonts w:cstheme="minorHAnsi"/>
+          <w:color w:val="4472C4" w:themeColor="accent1"/>
+          <w:sz w:val="24"/>
+          <w:szCs w:val="24"/>
+        </w:rPr>
+      </w:pPr>
+    </w:p>
+    <w:p>
+      <w:pPr>
+        <w:tabs>
+          <w:tab w:val="left" w:pos="1329"/>
+        </w:tabs>
+        <w:jc w:val="both"/>
+        <w:rPr>
+          <w:rFonts w:cstheme="minorHAnsi"/>
+          <w:color w:val="4472C4" w:themeColor="accent1"/>
+          <w:sz w:val="24"/>
+          <w:szCs w:val="24"/>
+        </w:rPr>
+      </w:pPr>
+    </w:p>
+    <w:p>
+      <w:pPr>
+        <w:tabs>
+          <w:tab w:val="left" w:pos="1329"/>
+        </w:tabs>
+        <w:jc w:val="both"/>
+        <w:rPr>
+          <w:rFonts w:cstheme="minorHAnsi"/>
+          <w:color w:val="4472C4" w:themeColor="accent1"/>
+          <w:sz w:val="24"/>
+          <w:szCs w:val="24"/>
+        </w:rPr>
+      </w:pPr>
+    </w:p>
+    <w:p>
+      <w:pPr>
+        <w:tabs>
+          <w:tab w:val="left" w:pos="1329"/>
+        </w:tabs>
+        <w:jc w:val="both"/>
+        <w:rPr>
+          <w:rFonts w:cstheme="minorHAnsi"/>
+          <w:color w:val="4472C4" w:themeColor="accent1"/>
+          <w:sz w:val="24"/>
+          <w:szCs w:val="24"/>
+        </w:rPr>
+      </w:pPr>
+    </w:p>
+    <w:p>
+      <w:pPr>
+        <w:tabs>
+          <w:tab w:val="left" w:pos="1329"/>
+        </w:tabs>
+        <w:jc w:val="both"/>
+        <w:rPr>
+          <w:rFonts w:cstheme="minorHAnsi"/>
+          <w:color w:val="4472C4" w:themeColor="accent1"/>
+          <w:sz w:val="24"/>
+          <w:szCs w:val="24"/>
+        </w:rPr>
+      </w:pPr>
+    </w:p>
+    <w:p>
+      <w:pPr>
+        <w:tabs>
+          <w:tab w:val="left" w:pos="1329"/>
+        </w:tabs>
+        <w:jc w:val="both"/>
+        <w:rPr>
+          <w:rFonts w:cstheme="minorHAnsi"/>
+          <w:color w:val="4472C4" w:themeColor="accent1"/>
+          <w:sz w:val="24"/>
+          <w:szCs w:val="24"/>
+        </w:rPr>
+      </w:pPr>
+    </w:p>
+    <w:p>
+      <w:pPr>
+        <w:tabs>
+          <w:tab w:val="left" w:pos="1329"/>
+        </w:tabs>
+        <w:jc w:val="both"/>
+        <w:rPr>
+          <w:rFonts w:cstheme="minorHAnsi"/>
+          <w:color w:val="4472C4" w:themeColor="accent1"/>
+          <w:sz w:val="24"/>
+          <w:szCs w:val="24"/>
+        </w:rPr>
+      </w:pPr>
+      <w:r>
+        <w:rPr>
+          <w:rFonts w:cstheme="minorHAnsi"/>
+          <w:color w:val="4472C4" w:themeColor="accent1"/>
+          <w:sz w:val="24"/>
+          <w:szCs w:val="24"/>
+        </w:rPr>
+        <w:t>Paso 4: Realizar la instalación;</w:t>
+      </w:r>
+    </w:p>
+    <w:p>
+      <w:pPr>
+        <w:tabs>
+          <w:tab w:val="left" w:pos="1329"/>
+        </w:tabs>
+        <w:jc w:val="both"/>
+        <w:rPr>
+          <w:rFonts w:cstheme="minorHAnsi"/>
+          <w:sz w:val="24"/>
+          <w:szCs w:val="24"/>
+        </w:rPr>
+      </w:pPr>
+      <w:r>
+        <w:rPr>
+          <w:rFonts w:cstheme="minorHAnsi"/>
+          <w:sz w:val="24"/>
+          <w:szCs w:val="24"/>
+        </w:rPr>
+        <w:t>Una vez seleccionado el archivo .</w:t>
+      </w:r>
+      <w:proofErr w:type="spellStart"/>
+      <w:r>
+        <w:rPr>
+          <w:rFonts w:cstheme="minorHAnsi"/>
+          <w:sz w:val="24"/>
+          <w:szCs w:val="24"/>
+        </w:rPr>
+        <w:t>apk</w:t>
+      </w:r>
+      <w:proofErr w:type="spellEnd"/>
+      <w:r>
+        <w:rPr>
+          <w:rFonts w:cstheme="minorHAnsi"/>
+          <w:sz w:val="24"/>
+          <w:szCs w:val="24"/>
+        </w:rPr>
+        <w:t>/</w:t>
+      </w:r>
+      <w:proofErr w:type="spellStart"/>
+      <w:r>
+        <w:rPr>
+          <w:rFonts w:cstheme="minorHAnsi"/>
+          <w:sz w:val="24"/>
+          <w:szCs w:val="24"/>
+        </w:rPr>
+        <w:t>apkm</w:t>
+      </w:r>
+      <w:proofErr w:type="spellEnd"/>
+      <w:r>
+        <w:rPr>
+          <w:rFonts w:cstheme="minorHAnsi"/>
+          <w:sz w:val="24"/>
+          <w:szCs w:val="24"/>
+        </w:rPr>
+        <w:t>/</w:t>
+      </w:r>
+      <w:proofErr w:type="spellStart"/>
+      <w:r>
+        <w:rPr>
+          <w:rFonts w:cstheme="minorHAnsi"/>
+          <w:sz w:val="24"/>
+          <w:szCs w:val="24"/>
+        </w:rPr>
+        <w:t>apk</w:t>
+      </w:r>
+      <w:proofErr w:type="spellEnd"/>
+      <w:r>
+        <w:rPr>
+          <w:rFonts w:cstheme="minorHAnsi"/>
+          <w:sz w:val="24"/>
+          <w:szCs w:val="24"/>
+        </w:rPr>
+        <w:t xml:space="preserve"> deberá h</w:t>
+      </w:r>
+      <w:r>
+        <w:rPr>
+          <w:rFonts w:cstheme="minorHAnsi"/>
+          <w:sz w:val="24"/>
+          <w:szCs w:val="24"/>
+        </w:rPr>
+        <w:t>acer clic en Iniciar Instalación</w:t>
+      </w:r>
+      <w:r>
+        <w:rPr>
+          <w:rFonts w:cstheme="minorHAnsi"/>
+          <w:sz w:val="24"/>
+          <w:szCs w:val="24"/>
+        </w:rPr>
+        <w:t>.</w:t>
+      </w:r>
+    </w:p>
+    <w:p>
+      <w:pPr>
+        <w:tabs>
+          <w:tab w:val="left" w:pos="1329"/>
+        </w:tabs>
+        <w:jc w:val="both"/>
+        <w:rPr>
+          <w:rFonts w:cstheme="minorHAnsi"/>
+          <w:sz w:val="24"/>
+          <w:szCs w:val="24"/>
+        </w:rPr>
+      </w:pPr>
+      <w:r>
+        <w:rPr>
+          <w:rFonts w:cstheme="minorHAnsi"/>
+          <w:color w:val="4472C4" w:themeColor="accent1"/>
+          <w:sz w:val="24"/>
+          <w:szCs w:val="24"/>
+        </w:rPr>
+        <w:drawing>
+          <wp:anchor distT="0" distB="0" distL="114300" distR="114300" simplePos="0" relativeHeight="251688960" behindDoc="0" locked="0" layoutInCell="1" allowOverlap="1" wp14:anchorId="79732D67" wp14:editId="70CC7EFF">
+            <wp:simplePos x="0" y="0"/>
+            <wp:positionH relativeFrom="column">
+              <wp:posOffset>35658</wp:posOffset>
+            </wp:positionH>
+            <wp:positionV relativeFrom="paragraph">
+              <wp:posOffset>96227</wp:posOffset>
+            </wp:positionV>
+            <wp:extent cx="1800476" cy="543001"/>
+            <wp:effectExtent l="0" t="0" r="0" b="9525"/>
+            <wp:wrapNone/>
+            <wp:docPr id="55881268" name="Imagen 1"/>
+            <wp:cNvGraphicFramePr>
+              <a:graphicFrameLocks xmlns:a="http://schemas.openxmlformats.org/drawingml/2006/main" noChangeAspect="1"/>
+            </wp:cNvGraphicFramePr>
+            <a:graphic xmlns:a="http://schemas.openxmlformats.org/drawingml/2006/main">
+              <a:graphicData uri="http://schemas.openxmlformats.org/drawingml/2006/picture">
+                <pic:pic xmlns:pic="http://schemas.openxmlformats.org/drawingml/2006/picture">
+                  <pic:nvPicPr>
+                    <pic:cNvPr id="55881268" name=""/>
+                    <pic:cNvPicPr/>
+                  </pic:nvPicPr>
+                  <pic:blipFill>
+                    <a:blip r:embed="rId44">
+                      <a:extLst>
+                        <a:ext uri="{28A0092B-C50C-407E-A947-70E740481C1C}">
+                          <a14:useLocalDpi xmlns:a14="http://schemas.microsoft.com/office/drawing/2010/main" val="0"/>
+                        </a:ext>
+                      </a:extLst>
+                    </a:blip>
+                    <a:stretch>
+                      <a:fillRect/>
+                    </a:stretch>
+                  </pic:blipFill>
+                  <pic:spPr>
+                    <a:xfrm>
+                      <a:off x="0" y="0"/>
+                      <a:ext cx="1800476" cy="543001"/>
+                    </a:xfrm>
+                    <a:prstGeom prst="rect">
+                      <a:avLst/>
+                    </a:prstGeom>
+                  </pic:spPr>
+                </pic:pic>
+              </a:graphicData>
+            </a:graphic>
+          </wp:anchor>
+        </w:drawing>
+      </w:r>
+    </w:p>
+    <w:p>
+      <w:pPr>
+        <w:tabs>
+          <w:tab w:val="left" w:pos="1329"/>
+        </w:tabs>
+        <w:jc w:val="both"/>
+        <w:rPr>
+          <w:rFonts w:cstheme="minorHAnsi"/>
+          <w:sz w:val="24"/>
+          <w:szCs w:val="24"/>
+        </w:rPr>
+      </w:pPr>
+    </w:p>
+    <w:p>
+      <w:pPr>
+        <w:tabs>
+          <w:tab w:val="left" w:pos="1329"/>
+        </w:tabs>
+        <w:jc w:val="both"/>
+        <w:rPr>
+          <w:rFonts w:cstheme="minorHAnsi"/>
+          <w:sz w:val="24"/>
+          <w:szCs w:val="24"/>
+        </w:rPr>
+      </w:pPr>
+    </w:p>
+    <w:p>
+      <w:pPr>
+        <w:tabs>
+          <w:tab w:val="left" w:pos="1329"/>
+        </w:tabs>
+        <w:jc w:val="both"/>
+        <w:rPr>
+          <w:rFonts w:cstheme="minorHAnsi"/>
+          <w:sz w:val="24"/>
+          <w:szCs w:val="24"/>
+        </w:rPr>
+      </w:pPr>
+      <w:r>
+        <w:rPr>
+          <w:rFonts w:cstheme="minorHAnsi"/>
+          <w:sz w:val="24"/>
+          <w:szCs w:val="24"/>
+        </w:rPr>
+        <w:t>Esperar que se termine la instalación en el o los dispositivos seleccionados.</w:t>
+      </w:r>
+    </w:p>
+    <w:p>
+      <w:pPr>
+        <w:tabs>
+          <w:tab w:val="left" w:pos="1329"/>
+        </w:tabs>
+        <w:jc w:val="both"/>
+        <w:rPr>
+          <w:rFonts w:cstheme="minorHAnsi"/>
+          <w:sz w:val="24"/>
+          <w:szCs w:val="24"/>
+        </w:rPr>
+      </w:pPr>
+      <w:r>
+        <w:rPr>
+          <w:rFonts w:cstheme="minorHAnsi"/>
+          <w:sz w:val="24"/>
+          <w:szCs w:val="24"/>
+        </w:rPr>
+        <w:drawing>
+          <wp:anchor distT="0" distB="0" distL="114300" distR="114300" simplePos="0" relativeHeight="251689984" behindDoc="0" locked="0" layoutInCell="1" allowOverlap="1" wp14:anchorId="7EF8602D" wp14:editId="7E2147B9">
+            <wp:simplePos x="0" y="0"/>
+            <wp:positionH relativeFrom="column">
+              <wp:posOffset>194603</wp:posOffset>
+            </wp:positionH>
+            <wp:positionV relativeFrom="paragraph">
+              <wp:posOffset>134326</wp:posOffset>
+            </wp:positionV>
+            <wp:extent cx="5400040" cy="1112520"/>
+            <wp:effectExtent l="0" t="0" r="0" b="0"/>
+            <wp:wrapNone/>
+            <wp:docPr id="121190131" name="Imagen 1"/>
+            <wp:cNvGraphicFramePr>
+              <a:graphicFrameLocks xmlns:a="http://schemas.openxmlformats.org/drawingml/2006/main" noChangeAspect="1"/>
+            </wp:cNvGraphicFramePr>
+            <a:graphic xmlns:a="http://schemas.openxmlformats.org/drawingml/2006/main">
+              <a:graphicData uri="http://schemas.openxmlformats.org/drawingml/2006/picture">
+                <pic:pic xmlns:pic="http://schemas.openxmlformats.org/drawingml/2006/picture">
+                  <pic:nvPicPr>
+                    <pic:cNvPr id="121190131" name=""/>
+                    <pic:cNvPicPr/>
+                  </pic:nvPicPr>
+                  <pic:blipFill>
+                    <a:blip r:embed="rId45">
+                      <a:extLst>
+                        <a:ext uri="{28A0092B-C50C-407E-A947-70E740481C1C}">
+                          <a14:useLocalDpi xmlns:a14="http://schemas.microsoft.com/office/drawing/2010/main" val="0"/>
+                        </a:ext>
+                      </a:extLst>
+                    </a:blip>
+                    <a:stretch>
+                      <a:fillRect/>
+                    </a:stretch>
+                  </pic:blipFill>
+                  <pic:spPr>
+                    <a:xfrm>
+                      <a:off x="0" y="0"/>
+                      <a:ext cx="5400040" cy="1112520"/>
+                    </a:xfrm>
+                    <a:prstGeom prst="rect">
+                      <a:avLst/>
+                    </a:prstGeom>
+                  </pic:spPr>
+                </pic:pic>
+              </a:graphicData>
+            </a:graphic>
+          </wp:anchor>
+        </w:drawing>
+      </w:r>
+    </w:p>
+    <w:p>
+      <w:pPr>
+        <w:tabs>
+          <w:tab w:val="left" w:pos="1329"/>
+        </w:tabs>
+        <w:jc w:val="both"/>
+        <w:rPr>
+          <w:rFonts w:cstheme="minorHAnsi"/>
+          <w:sz w:val="24"/>
+          <w:szCs w:val="24"/>
+        </w:rPr>
+      </w:pPr>
+    </w:p>
+    <w:p>
+      <w:pPr>
+        <w:tabs>
+          <w:tab w:val="left" w:pos="1329"/>
+        </w:tabs>
+        <w:jc w:val="both"/>
+        <w:rPr>
+          <w:rFonts w:cstheme="minorHAnsi"/>
+          <w:sz w:val="24"/>
+          <w:szCs w:val="24"/>
+        </w:rPr>
+      </w:pPr>
+    </w:p>
+    <w:p>
+      <w:pPr>
+        <w:tabs>
+          <w:tab w:val="left" w:pos="1329"/>
+        </w:tabs>
+        <w:jc w:val="both"/>
+        <w:rPr>
+          <w:rFonts w:cstheme="minorHAnsi"/>
+          <w:sz w:val="24"/>
+          <w:szCs w:val="24"/>
+        </w:rPr>
+      </w:pPr>
+    </w:p>
+    <w:p>
+      <w:pPr>
+        <w:tabs>
+          <w:tab w:val="left" w:pos="1329"/>
+        </w:tabs>
+        <w:jc w:val="both"/>
+        <w:rPr>
+          <w:rFonts w:cstheme="minorHAnsi"/>
+          <w:sz w:val="24"/>
+          <w:szCs w:val="24"/>
+        </w:rPr>
+      </w:pPr>
+    </w:p>
+    <w:p>
+      <w:pPr>
+        <w:tabs>
+          <w:tab w:val="left" w:pos="1329"/>
+        </w:tabs>
+        <w:jc w:val="both"/>
+        <w:rPr>
+          <w:rFonts w:cstheme="minorHAnsi"/>
+          <w:sz w:val="24"/>
+          <w:szCs w:val="24"/>
+        </w:rPr>
+      </w:pPr>
+    </w:p>
+    <w:p>
+      <w:pPr>
+        <w:tabs>
+          <w:tab w:val="left" w:pos="1329"/>
+        </w:tabs>
+        <w:jc w:val="both"/>
+        <w:rPr>
+          <w:rFonts w:cstheme="minorHAnsi"/>
+          <w:sz w:val="24"/>
+          <w:szCs w:val="24"/>
+        </w:rPr>
+      </w:pPr>
+    </w:p>
     <w:sectPr>
       <w:pgSz w:w="11906" w:h="16838"/>
       <w:pgMar w:top="1417" w:right="1701" w:bottom="1417" w:left="1701" w:header="708" w:footer="708" w:gutter="0"/>
@@ -7863,6 +9897,155 @@
     </w:lvl>
   </w:abstractNum>
   <w:abstractNum w:abstractNumId="6" w15:restartNumberingAfterBreak="0">
+    <w:nsid w:val="526655A1"/>
+    <w:multiLevelType w:val="multilevel"/>
+    <w:tmpl w:val="7F0EB89C"/>
+    <w:lvl w:ilvl="0">
+      <w:start w:val="1"/>
+      <w:numFmt w:val="bullet"/>
+      <w:lvlText w:val=""/>
+      <w:lvlJc w:val="left"/>
+      <w:pPr>
+        <w:tabs>
+          <w:tab w:val="num" w:pos="720"/>
+        </w:tabs>
+        <w:ind w:left="720" w:hanging="360"/>
+      </w:pPr>
+      <w:rPr>
+        <w:rFonts w:ascii="Symbol" w:hAnsi="Symbol" w:hint="default"/>
+        <w:sz w:val="20"/>
+      </w:rPr>
+    </w:lvl>
+    <w:lvl w:ilvl="1" w:tentative="1">
+      <w:start w:val="1"/>
+      <w:numFmt w:val="bullet"/>
+      <w:lvlText w:val="o"/>
+      <w:lvlJc w:val="left"/>
+      <w:pPr>
+        <w:tabs>
+          <w:tab w:val="num" w:pos="1440"/>
+        </w:tabs>
+        <w:ind w:left="1440" w:hanging="360"/>
+      </w:pPr>
+      <w:rPr>
+        <w:rFonts w:ascii="Courier New" w:hAnsi="Courier New" w:hint="default"/>
+        <w:sz w:val="20"/>
+      </w:rPr>
+    </w:lvl>
+    <w:lvl w:ilvl="2" w:tentative="1">
+      <w:start w:val="1"/>
+      <w:numFmt w:val="bullet"/>
+      <w:lvlText w:val=""/>
+      <w:lvlJc w:val="left"/>
+      <w:pPr>
+        <w:tabs>
+          <w:tab w:val="num" w:pos="2160"/>
+        </w:tabs>
+        <w:ind w:left="2160" w:hanging="360"/>
+      </w:pPr>
+      <w:rPr>
+        <w:rFonts w:ascii="Wingdings" w:hAnsi="Wingdings" w:hint="default"/>
+        <w:sz w:val="20"/>
+      </w:rPr>
+    </w:lvl>
+    <w:lvl w:ilvl="3" w:tentative="1">
+      <w:start w:val="1"/>
+      <w:numFmt w:val="bullet"/>
+      <w:lvlText w:val=""/>
+      <w:lvlJc w:val="left"/>
+      <w:pPr>
+        <w:tabs>
+          <w:tab w:val="num" w:pos="2880"/>
+        </w:tabs>
+        <w:ind w:left="2880" w:hanging="360"/>
+      </w:pPr>
+      <w:rPr>
+        <w:rFonts w:ascii="Wingdings" w:hAnsi="Wingdings" w:hint="default"/>
+        <w:sz w:val="20"/>
+      </w:rPr>
+    </w:lvl>
+    <w:lvl w:ilvl="4" w:tentative="1">
+      <w:start w:val="1"/>
+      <w:numFmt w:val="bullet"/>
+      <w:lvlText w:val=""/>
+      <w:lvlJc w:val="left"/>
+      <w:pPr>
+        <w:tabs>
+          <w:tab w:val="num" w:pos="3600"/>
+        </w:tabs>
+        <w:ind w:left="3600" w:hanging="360"/>
+      </w:pPr>
+      <w:rPr>
+        <w:rFonts w:ascii="Wingdings" w:hAnsi="Wingdings" w:hint="default"/>
+        <w:sz w:val="20"/>
+      </w:rPr>
+    </w:lvl>
+    <w:lvl w:ilvl="5" w:tentative="1">
+      <w:start w:val="1"/>
+      <w:numFmt w:val="bullet"/>
+      <w:lvlText w:val=""/>
+      <w:lvlJc w:val="left"/>
+      <w:pPr>
+        <w:tabs>
+          <w:tab w:val="num" w:pos="4320"/>
+        </w:tabs>
+        <w:ind w:left="4320" w:hanging="360"/>
+      </w:pPr>
+      <w:rPr>
+        <w:rFonts w:ascii="Wingdings" w:hAnsi="Wingdings" w:hint="default"/>
+        <w:sz w:val="20"/>
+      </w:rPr>
+    </w:lvl>
+    <w:lvl w:ilvl="6" w:tentative="1">
+      <w:start w:val="1"/>
+      <w:numFmt w:val="bullet"/>
+      <w:lvlText w:val=""/>
+      <w:lvlJc w:val="left"/>
+      <w:pPr>
+        <w:tabs>
+          <w:tab w:val="num" w:pos="5040"/>
+        </w:tabs>
+        <w:ind w:left="5040" w:hanging="360"/>
+      </w:pPr>
+      <w:rPr>
+        <w:rFonts w:ascii="Wingdings" w:hAnsi="Wingdings" w:hint="default"/>
+        <w:sz w:val="20"/>
+      </w:rPr>
+    </w:lvl>
+    <w:lvl w:ilvl="7" w:tentative="1">
+      <w:start w:val="1"/>
+      <w:numFmt w:val="bullet"/>
+      <w:lvlText w:val=""/>
+      <w:lvlJc w:val="left"/>
+      <w:pPr>
+        <w:tabs>
+          <w:tab w:val="num" w:pos="5760"/>
+        </w:tabs>
+        <w:ind w:left="5760" w:hanging="360"/>
+      </w:pPr>
+      <w:rPr>
+        <w:rFonts w:ascii="Wingdings" w:hAnsi="Wingdings" w:hint="default"/>
+        <w:sz w:val="20"/>
+      </w:rPr>
+    </w:lvl>
+    <w:lvl w:ilvl="8" w:tentative="1">
+      <w:start w:val="1"/>
+      <w:numFmt w:val="bullet"/>
+      <w:lvlText w:val=""/>
+      <w:lvlJc w:val="left"/>
+      <w:pPr>
+        <w:tabs>
+          <w:tab w:val="num" w:pos="6480"/>
+        </w:tabs>
+        <w:ind w:left="6480" w:hanging="360"/>
+      </w:pPr>
+      <w:rPr>
+        <w:rFonts w:ascii="Wingdings" w:hAnsi="Wingdings" w:hint="default"/>
+        <w:sz w:val="20"/>
+      </w:rPr>
+    </w:lvl>
+  </w:abstractNum>
+  <w:abstractNum w:abstractNumId="7" w15:restartNumberingAfterBreak="0">
     <w:nsid w:val="77D61963"/>
     <w:multiLevelType w:val="multilevel"/>
     <w:tmpl w:val="55843CEA"/>
@@ -7983,7 +10166,7 @@
     <w:abstractNumId w:val="1"/>
   </w:num>
   <w:num w:numId="2" w16cid:durableId="668366141">
-    <w:abstractNumId w:val="6"/>
+    <w:abstractNumId w:val="7"/>
   </w:num>
   <w:num w:numId="3" w16cid:durableId="397171839">
     <w:abstractNumId w:val="5"/>
@@ -7999,6 +10182,9 @@
   </w:num>
   <w:num w:numId="7" w16cid:durableId="1509641366">
     <w:abstractNumId w:val="0"/>
+  </w:num>
+  <w:num w:numId="8" w16cid:durableId="1838882890">
+    <w:abstractNumId w:val="6"/>
   </w:num>
 </w:numbering>
 </file>
@@ -8606,7 +10792,6 @@
   <w:style w:type="character" w:default="1" w:styleId="Fuentedeprrafopredeter">
     <w:name w:val="Default Paragraph Font"/>
     <w:uiPriority w:val="1"/>
-    <w:semiHidden/>
     <w:unhideWhenUsed/>
   </w:style>
   <w:style w:type="table" w:default="1" w:styleId="Tablanormal">

</xml_diff>

<commit_message>
creación de más hilos secundarios + gestion de cierre de procesos ADB
</commit_message>
<xml_diff>
--- a/doc/Manual De Usuario.docx
+++ b/doc/Manual De Usuario.docx
@@ -1358,6 +1358,7 @@
       <w:r>
         <w:rPr>
           <w:rFonts w:cstheme="minorHAnsi"/>
+          <w:noProof/>
           <w:sz w:val="24"/>
           <w:szCs w:val="24"/>
         </w:rPr>
@@ -7672,49 +7673,34 @@
         <w:jc w:val="both"/>
         <w:rPr>
           <w:color w:val="4472C4" w:themeColor="accent1"/>
-          <w:sz w:val="28"/>
-          <w:szCs w:val="28"/>
-        </w:rPr>
-      </w:pPr>
-      <w:r>
+          <w:sz w:val="24"/>
+          <w:szCs w:val="24"/>
+        </w:rPr>
+      </w:pPr>
+      <w:r>
+        <w:rPr>
+          <w:color w:val="4472C4" w:themeColor="accent1"/>
+          <w:sz w:val="24"/>
+          <w:szCs w:val="24"/>
+        </w:rPr>
+        <w:t>Paso 1: Hacer clic en el botón de la parte inferior de la lista de dispositivos para entrar en la vista de “Instalación masiva”</w:t>
+      </w:r>
+    </w:p>
+    <w:p>
+      <w:pPr>
+        <w:tabs>
+          <w:tab w:val="left" w:pos="1021"/>
+        </w:tabs>
+        <w:jc w:val="both"/>
         <w:rPr>
           <w:color w:val="4472C4" w:themeColor="accent1"/>
           <w:sz w:val="28"/>
           <w:szCs w:val="28"/>
         </w:rPr>
-        <w:t>Paso 1</w:t>
-      </w:r>
-      <w:r>
-        <w:rPr>
-          <w:color w:val="4472C4" w:themeColor="accent1"/>
-          <w:sz w:val="28"/>
-          <w:szCs w:val="28"/>
-        </w:rPr>
-        <w:t>:</w:t>
-      </w:r>
-      <w:r>
-        <w:rPr>
-          <w:color w:val="4472C4" w:themeColor="accent1"/>
-          <w:sz w:val="24"/>
-          <w:szCs w:val="24"/>
-        </w:rPr>
-        <w:t xml:space="preserve"> Hacer clic en el botón de la parte inferior de la lista de dispositivos para entrar en la vista de “Instalación masiva”</w:t>
-      </w:r>
-    </w:p>
-    <w:p>
-      <w:pPr>
-        <w:tabs>
-          <w:tab w:val="left" w:pos="1021"/>
-        </w:tabs>
-        <w:jc w:val="both"/>
-        <w:rPr>
-          <w:color w:val="4472C4" w:themeColor="accent1"/>
-          <w:sz w:val="28"/>
-          <w:szCs w:val="28"/>
-        </w:rPr>
-      </w:pPr>
-      <w:r>
-        <w:rPr>
+      </w:pPr>
+      <w:r>
+        <w:rPr>
+          <w:noProof/>
           <w:color w:val="4472C4" w:themeColor="accent1"/>
           <w:sz w:val="28"/>
           <w:szCs w:val="28"/>
@@ -7838,13 +7824,22 @@
       <w:r>
         <w:rPr>
           <w:rFonts w:cstheme="minorHAnsi"/>
+          <w:color w:val="4472C4" w:themeColor="accent1"/>
+          <w:sz w:val="24"/>
+          <w:szCs w:val="24"/>
+        </w:rPr>
+        <w:t>Paso 2</w:t>
+      </w:r>
+      <w:r>
+        <w:rPr>
+          <w:rFonts w:cstheme="minorHAnsi"/>
           <w:b/>
           <w:bCs/>
           <w:color w:val="4472C4" w:themeColor="accent1"/>
           <w:sz w:val="24"/>
           <w:szCs w:val="24"/>
         </w:rPr>
-        <w:t>Paso 2:</w:t>
+        <w:t>:</w:t>
       </w:r>
       <w:r>
         <w:rPr>
@@ -8107,7 +8102,6 @@
           <w:sz w:val="24"/>
           <w:szCs w:val="24"/>
         </w:rPr>
-        <w:lastRenderedPageBreak/>
         <w:t>.</w:t>
       </w:r>
       <w:proofErr w:type="spellStart"/>
@@ -8198,6 +8192,7 @@
       <w:r>
         <w:rPr>
           <w:rFonts w:cstheme="minorHAnsi"/>
+          <w:noProof/>
           <w:color w:val="4472C4" w:themeColor="accent1"/>
           <w:sz w:val="24"/>
           <w:szCs w:val="24"/>
@@ -8388,6 +8383,27 @@
         <w:jc w:val="both"/>
         <w:rPr>
           <w:rFonts w:cstheme="minorHAnsi"/>
+          <w:sz w:val="24"/>
+          <w:szCs w:val="24"/>
+        </w:rPr>
+      </w:pPr>
+      <w:r>
+        <w:rPr>
+          <w:rFonts w:cstheme="minorHAnsi"/>
+          <w:sz w:val="24"/>
+          <w:szCs w:val="24"/>
+        </w:rPr>
+        <w:t>*ejemplo de archivo seleccionado</w:t>
+      </w:r>
+    </w:p>
+    <w:p>
+      <w:pPr>
+        <w:tabs>
+          <w:tab w:val="left" w:pos="1329"/>
+        </w:tabs>
+        <w:jc w:val="both"/>
+        <w:rPr>
+          <w:rFonts w:cstheme="minorHAnsi"/>
           <w:color w:val="4472C4" w:themeColor="accent1"/>
           <w:sz w:val="24"/>
           <w:szCs w:val="24"/>
@@ -8396,29 +8412,7 @@
       <w:r>
         <w:rPr>
           <w:rFonts w:cstheme="minorHAnsi"/>
-          <w:color w:val="4472C4" w:themeColor="accent1"/>
-          <w:sz w:val="24"/>
-          <w:szCs w:val="24"/>
-        </w:rPr>
-        <w:t>*ejemplo de archivo seleccionado</w:t>
-      </w:r>
-    </w:p>
-    <w:p>
-      <w:pPr>
-        <w:tabs>
-          <w:tab w:val="left" w:pos="1329"/>
-        </w:tabs>
-        <w:jc w:val="both"/>
-        <w:rPr>
-          <w:rFonts w:cstheme="minorHAnsi"/>
-          <w:color w:val="4472C4" w:themeColor="accent1"/>
-          <w:sz w:val="24"/>
-          <w:szCs w:val="24"/>
-        </w:rPr>
-      </w:pPr>
-      <w:r>
-        <w:rPr>
-          <w:rFonts w:cstheme="minorHAnsi"/>
+          <w:noProof/>
           <w:color w:val="4472C4" w:themeColor="accent1"/>
           <w:sz w:val="24"/>
           <w:szCs w:val="24"/>
@@ -8685,6 +8679,7 @@
       <w:r>
         <w:rPr>
           <w:rFonts w:cstheme="minorHAnsi"/>
+          <w:noProof/>
           <w:color w:val="4472C4" w:themeColor="accent1"/>
           <w:sz w:val="24"/>
           <w:szCs w:val="24"/>
@@ -8886,6 +8881,7 @@
           <w:sz w:val="24"/>
           <w:szCs w:val="24"/>
         </w:rPr>
+        <w:lastRenderedPageBreak/>
         <w:t>Paso 4: Realizar la instalación;</w:t>
       </w:r>
     </w:p>
@@ -8995,6 +8991,7 @@
       <w:r>
         <w:rPr>
           <w:rFonts w:cstheme="minorHAnsi"/>
+          <w:noProof/>
           <w:color w:val="4472C4" w:themeColor="accent1"/>
           <w:sz w:val="24"/>
           <w:szCs w:val="24"/>
@@ -9112,6 +9109,7 @@
       <w:r>
         <w:rPr>
           <w:rFonts w:cstheme="minorHAnsi"/>
+          <w:noProof/>
           <w:sz w:val="24"/>
           <w:szCs w:val="24"/>
         </w:rPr>
@@ -10792,6 +10790,7 @@
   <w:style w:type="character" w:default="1" w:styleId="Fuentedeprrafopredeter">
     <w:name w:val="Default Paragraph Font"/>
     <w:uiPriority w:val="1"/>
+    <w:semiHidden/>
     <w:unhideWhenUsed/>
   </w:style>
   <w:style w:type="table" w:default="1" w:styleId="Tablanormal">

</xml_diff>

<commit_message>
Manual de usuario actuallizado, con la instalación de la aplicación desde el github
</commit_message>
<xml_diff>
--- a/doc/Manual De Usuario.docx
+++ b/doc/Manual De Usuario.docx
@@ -75,23 +75,923 @@
           <w:szCs w:val="32"/>
         </w:rPr>
       </w:pPr>
-    </w:p>
-    <w:p>
-      <w:pPr>
-        <w:jc w:val="both"/>
+      <w:r>
         <w:rPr>
           <w:color w:val="002060"/>
           <w:sz w:val="32"/>
           <w:szCs w:val="32"/>
         </w:rPr>
-      </w:pPr>
-      <w:r>
+        <w:t>Paso 1: Instalación de la aplicación</w:t>
+      </w:r>
+    </w:p>
+    <w:p>
+      <w:pPr>
+        <w:jc w:val="both"/>
+        <w:rPr>
+          <w:sz w:val="24"/>
+          <w:szCs w:val="24"/>
+        </w:rPr>
+      </w:pPr>
+      <w:r>
+        <w:rPr>
+          <w:sz w:val="24"/>
+          <w:szCs w:val="24"/>
+        </w:rPr>
+        <w:t>Para instalar la aplicación, primero hay que acceder al GitHub</w:t>
+      </w:r>
+      <w:r>
+        <w:rPr>
+          <w:sz w:val="24"/>
+          <w:szCs w:val="24"/>
+        </w:rPr>
+        <w:t xml:space="preserve"> </w:t>
+      </w:r>
+      <w:r>
+        <w:rPr>
+          <w:sz w:val="24"/>
+          <w:szCs w:val="24"/>
+        </w:rPr>
+        <w:t>a través del siguiente enlace:</w:t>
+      </w:r>
+      <w:r>
+        <w:rPr>
+          <w:sz w:val="24"/>
+          <w:szCs w:val="24"/>
+        </w:rPr>
+        <w:t xml:space="preserve"> </w:t>
+      </w:r>
+      <w:hyperlink r:id="rId8" w:history="1">
+        <w:r>
+          <w:rPr>
+            <w:rStyle w:val="Hipervnculo"/>
+            <w:sz w:val="24"/>
+            <w:szCs w:val="24"/>
+          </w:rPr>
+          <w:t>https://github.com/EMARB05/proyectoADB</w:t>
+        </w:r>
+      </w:hyperlink>
+    </w:p>
+    <w:p>
+      <w:pPr>
+        <w:jc w:val="both"/>
+        <w:rPr>
+          <w:sz w:val="24"/>
+          <w:szCs w:val="24"/>
+        </w:rPr>
+      </w:pPr>
+      <w:r>
+        <w:rPr>
+          <w:sz w:val="24"/>
+          <w:szCs w:val="24"/>
+        </w:rPr>
+        <w:t xml:space="preserve">Desde ahí </w:t>
+      </w:r>
+      <w:r>
+        <w:rPr>
+          <w:sz w:val="24"/>
+          <w:szCs w:val="24"/>
+        </w:rPr>
+        <w:t xml:space="preserve">hay que acceder al apartado de </w:t>
+      </w:r>
+      <w:r>
+        <w:rPr>
+          <w:i/>
+          <w:iCs/>
+          <w:sz w:val="24"/>
+          <w:szCs w:val="24"/>
+        </w:rPr>
+        <w:t>Releases</w:t>
+      </w:r>
+      <w:r>
+        <w:rPr>
+          <w:i/>
+          <w:iCs/>
+          <w:sz w:val="24"/>
+          <w:szCs w:val="24"/>
+        </w:rPr>
+        <w:t>:</w:t>
+      </w:r>
+    </w:p>
+    <w:p>
+      <w:pPr>
+        <w:jc w:val="both"/>
+        <w:rPr>
+          <w:sz w:val="24"/>
+          <w:szCs w:val="24"/>
+        </w:rPr>
+      </w:pPr>
+      <w:r>
+        <w:rPr>
+          <w:noProof/>
+          <w:sz w:val="24"/>
+          <w:szCs w:val="24"/>
+        </w:rPr>
+        <w:drawing>
+          <wp:inline distT="0" distB="0" distL="0" distR="0" wp14:anchorId="2B8313B1" wp14:editId="68EACBC7">
+            <wp:extent cx="5390515" cy="2902585"/>
+            <wp:effectExtent l="0" t="0" r="635" b="0"/>
+            <wp:docPr id="1869362300" name="Imagen 1"/>
+            <wp:cNvGraphicFramePr>
+              <a:graphicFrameLocks xmlns:a="http://schemas.openxmlformats.org/drawingml/2006/main" noChangeAspect="1"/>
+            </wp:cNvGraphicFramePr>
+            <a:graphic xmlns:a="http://schemas.openxmlformats.org/drawingml/2006/main">
+              <a:graphicData uri="http://schemas.openxmlformats.org/drawingml/2006/picture">
+                <pic:pic xmlns:pic="http://schemas.openxmlformats.org/drawingml/2006/picture">
+                  <pic:nvPicPr>
+                    <pic:cNvPr id="0" name="Picture 2"/>
+                    <pic:cNvPicPr>
+                      <a:picLocks noChangeAspect="1" noChangeArrowheads="1"/>
+                    </pic:cNvPicPr>
+                  </pic:nvPicPr>
+                  <pic:blipFill>
+                    <a:blip r:embed="rId9" cstate="print">
+                      <a:extLst>
+                        <a:ext uri="{28A0092B-C50C-407E-A947-70E740481C1C}">
+                          <a14:useLocalDpi xmlns:a14="http://schemas.microsoft.com/office/drawing/2010/main" val="0"/>
+                        </a:ext>
+                      </a:extLst>
+                    </a:blip>
+                    <a:srcRect/>
+                    <a:stretch>
+                      <a:fillRect/>
+                    </a:stretch>
+                  </pic:blipFill>
+                  <pic:spPr bwMode="auto">
+                    <a:xfrm>
+                      <a:off x="0" y="0"/>
+                      <a:ext cx="5390515" cy="2902585"/>
+                    </a:xfrm>
+                    <a:prstGeom prst="rect">
+                      <a:avLst/>
+                    </a:prstGeom>
+                    <a:noFill/>
+                    <a:ln>
+                      <a:noFill/>
+                    </a:ln>
+                  </pic:spPr>
+                </pic:pic>
+              </a:graphicData>
+            </a:graphic>
+          </wp:inline>
+        </w:drawing>
+      </w:r>
+    </w:p>
+    <w:p>
+      <w:pPr>
+        <w:jc w:val="both"/>
+      </w:pPr>
+      <w:r>
+        <w:rPr>
+          <w:sz w:val="24"/>
+          <w:szCs w:val="24"/>
+        </w:rPr>
+        <w:t>Localice la versión más reciente (o la de su preferencia) en el listado</w:t>
+      </w:r>
+      <w:r>
+        <w:rPr>
+          <w:sz w:val="24"/>
+          <w:szCs w:val="24"/>
+        </w:rPr>
+        <w:t>,</w:t>
+      </w:r>
+      <w:r>
+        <w:rPr>
+          <w:sz w:val="24"/>
+          <w:szCs w:val="24"/>
+        </w:rPr>
+        <w:t xml:space="preserve"> después</w:t>
+      </w:r>
+      <w:r>
+        <w:t xml:space="preserve"> </w:t>
+      </w:r>
+      <w:r>
+        <w:rPr>
+          <w:sz w:val="24"/>
+          <w:szCs w:val="24"/>
+        </w:rPr>
+        <w:t>e</w:t>
+      </w:r>
+      <w:r>
+        <w:rPr>
+          <w:sz w:val="24"/>
+          <w:szCs w:val="24"/>
+        </w:rPr>
+        <w:t xml:space="preserve">n el apartado de </w:t>
+      </w:r>
+      <w:r>
+        <w:rPr>
+          <w:i/>
+          <w:iCs/>
+          <w:sz w:val="24"/>
+          <w:szCs w:val="24"/>
+        </w:rPr>
+        <w:t>Assets</w:t>
+      </w:r>
+      <w:r>
+        <w:rPr>
+          <w:sz w:val="24"/>
+          <w:szCs w:val="24"/>
+        </w:rPr>
+        <w:t>, haga clic en el archivo Setup.exe para iniciar la descarga.</w:t>
+      </w:r>
+      <w:r>
+        <w:rPr>
+          <w:noProof/>
+          <w:sz w:val="24"/>
+          <w:szCs w:val="24"/>
+        </w:rPr>
+        <w:drawing>
+          <wp:inline distT="0" distB="0" distL="0" distR="0" wp14:anchorId="698E36EB" wp14:editId="1957092D">
+            <wp:extent cx="5400040" cy="2348948"/>
+            <wp:effectExtent l="0" t="0" r="0" b="0"/>
+            <wp:docPr id="1508712064" name="Imagen 2"/>
+            <wp:cNvGraphicFramePr>
+              <a:graphicFrameLocks xmlns:a="http://schemas.openxmlformats.org/drawingml/2006/main" noChangeAspect="1"/>
+            </wp:cNvGraphicFramePr>
+            <a:graphic xmlns:a="http://schemas.openxmlformats.org/drawingml/2006/main">
+              <a:graphicData uri="http://schemas.openxmlformats.org/drawingml/2006/picture">
+                <pic:pic xmlns:pic="http://schemas.openxmlformats.org/drawingml/2006/picture">
+                  <pic:nvPicPr>
+                    <pic:cNvPr id="0" name="Picture 3"/>
+                    <pic:cNvPicPr>
+                      <a:picLocks noChangeAspect="1" noChangeArrowheads="1"/>
+                    </pic:cNvPicPr>
+                  </pic:nvPicPr>
+                  <pic:blipFill>
+                    <a:blip r:embed="rId10" cstate="print">
+                      <a:extLst>
+                        <a:ext uri="{28A0092B-C50C-407E-A947-70E740481C1C}">
+                          <a14:useLocalDpi xmlns:a14="http://schemas.microsoft.com/office/drawing/2010/main" val="0"/>
+                        </a:ext>
+                      </a:extLst>
+                    </a:blip>
+                    <a:srcRect/>
+                    <a:stretch>
+                      <a:fillRect/>
+                    </a:stretch>
+                  </pic:blipFill>
+                  <pic:spPr bwMode="auto">
+                    <a:xfrm>
+                      <a:off x="0" y="0"/>
+                      <a:ext cx="5400040" cy="2348948"/>
+                    </a:xfrm>
+                    <a:prstGeom prst="rect">
+                      <a:avLst/>
+                    </a:prstGeom>
+                    <a:noFill/>
+                    <a:ln>
+                      <a:noFill/>
+                    </a:ln>
+                  </pic:spPr>
+                </pic:pic>
+              </a:graphicData>
+            </a:graphic>
+          </wp:inline>
+        </w:drawing>
+      </w:r>
+      <w:r>
+        <w:t xml:space="preserve"> </w:t>
+      </w:r>
+    </w:p>
+    <w:p>
+      <w:pPr>
+        <w:jc w:val="both"/>
+      </w:pPr>
+    </w:p>
+    <w:p>
+      <w:pPr>
+        <w:jc w:val="both"/>
+        <w:rPr>
+          <w:sz w:val="24"/>
+          <w:szCs w:val="24"/>
+        </w:rPr>
+      </w:pPr>
+      <w:r>
+        <w:rPr>
+          <w:sz w:val="24"/>
+          <w:szCs w:val="24"/>
+        </w:rPr>
+        <w:lastRenderedPageBreak/>
+        <w:t>Una vez finalizada la descarga, abra el archivo Setup.exe</w:t>
+      </w:r>
+      <w:r>
+        <w:rPr>
+          <w:sz w:val="24"/>
+          <w:szCs w:val="24"/>
+        </w:rPr>
+        <w:t xml:space="preserve"> y</w:t>
+      </w:r>
+      <w:r>
+        <w:rPr>
+          <w:sz w:val="24"/>
+          <w:szCs w:val="24"/>
+        </w:rPr>
+        <w:t xml:space="preserve"> </w:t>
+      </w:r>
+      <w:r>
+        <w:rPr>
+          <w:sz w:val="24"/>
+          <w:szCs w:val="24"/>
+        </w:rPr>
+        <w:t>s</w:t>
+      </w:r>
+      <w:r>
+        <w:rPr>
+          <w:sz w:val="24"/>
+          <w:szCs w:val="24"/>
+        </w:rPr>
+        <w:t>ig</w:t>
+      </w:r>
+      <w:r>
+        <w:rPr>
+          <w:sz w:val="24"/>
+          <w:szCs w:val="24"/>
+        </w:rPr>
+        <w:t>ue</w:t>
+      </w:r>
+      <w:r>
+        <w:rPr>
+          <w:sz w:val="24"/>
+          <w:szCs w:val="24"/>
+        </w:rPr>
+        <w:t xml:space="preserve"> las</w:t>
+      </w:r>
+      <w:r>
+        <w:rPr>
+          <w:sz w:val="24"/>
+          <w:szCs w:val="24"/>
+        </w:rPr>
+        <w:t xml:space="preserve"> siguientes</w:t>
+      </w:r>
+      <w:r>
+        <w:rPr>
+          <w:sz w:val="24"/>
+          <w:szCs w:val="24"/>
+        </w:rPr>
+        <w:t xml:space="preserve"> instrucciones</w:t>
+      </w:r>
+      <w:r>
+        <w:rPr>
+          <w:sz w:val="24"/>
+          <w:szCs w:val="24"/>
+        </w:rPr>
+        <w:t>:</w:t>
+      </w:r>
+    </w:p>
+    <w:p>
+      <w:pPr>
+        <w:jc w:val="both"/>
+        <w:rPr>
+          <w:sz w:val="24"/>
+          <w:szCs w:val="24"/>
+        </w:rPr>
+      </w:pPr>
+    </w:p>
+    <w:p>
+      <w:pPr>
+        <w:jc w:val="both"/>
+        <w:rPr>
+          <w:sz w:val="24"/>
+          <w:szCs w:val="24"/>
+        </w:rPr>
+      </w:pPr>
+      <w:r>
+        <w:rPr>
+          <w:noProof/>
+          <w:sz w:val="24"/>
+          <w:szCs w:val="24"/>
+        </w:rPr>
+        <w:drawing>
+          <wp:anchor distT="0" distB="0" distL="114300" distR="114300" simplePos="0" relativeHeight="251692032" behindDoc="0" locked="0" layoutInCell="1" allowOverlap="1" wp14:anchorId="09329FCA" wp14:editId="18874417">
+            <wp:simplePos x="0" y="0"/>
+            <wp:positionH relativeFrom="page">
+              <wp:posOffset>3859414</wp:posOffset>
+            </wp:positionH>
+            <wp:positionV relativeFrom="paragraph">
+              <wp:posOffset>117029</wp:posOffset>
+            </wp:positionV>
+            <wp:extent cx="3239410" cy="2513260"/>
+            <wp:effectExtent l="0" t="0" r="0" b="1905"/>
+            <wp:wrapNone/>
+            <wp:docPr id="690384056" name="Imagen 1"/>
+            <wp:cNvGraphicFramePr>
+              <a:graphicFrameLocks xmlns:a="http://schemas.openxmlformats.org/drawingml/2006/main" noChangeAspect="1"/>
+            </wp:cNvGraphicFramePr>
+            <a:graphic xmlns:a="http://schemas.openxmlformats.org/drawingml/2006/main">
+              <a:graphicData uri="http://schemas.openxmlformats.org/drawingml/2006/picture">
+                <pic:pic xmlns:pic="http://schemas.openxmlformats.org/drawingml/2006/picture">
+                  <pic:nvPicPr>
+                    <pic:cNvPr id="690384056" name=""/>
+                    <pic:cNvPicPr/>
+                  </pic:nvPicPr>
+                  <pic:blipFill>
+                    <a:blip r:embed="rId11">
+                      <a:extLst>
+                        <a:ext uri="{28A0092B-C50C-407E-A947-70E740481C1C}">
+                          <a14:useLocalDpi xmlns:a14="http://schemas.microsoft.com/office/drawing/2010/main" val="0"/>
+                        </a:ext>
+                      </a:extLst>
+                    </a:blip>
+                    <a:stretch>
+                      <a:fillRect/>
+                    </a:stretch>
+                  </pic:blipFill>
+                  <pic:spPr>
+                    <a:xfrm>
+                      <a:off x="0" y="0"/>
+                      <a:ext cx="3239410" cy="2513260"/>
+                    </a:xfrm>
+                    <a:prstGeom prst="rect">
+                      <a:avLst/>
+                    </a:prstGeom>
+                  </pic:spPr>
+                </pic:pic>
+              </a:graphicData>
+            </a:graphic>
+            <wp14:sizeRelH relativeFrom="margin">
+              <wp14:pctWidth>0</wp14:pctWidth>
+            </wp14:sizeRelH>
+            <wp14:sizeRelV relativeFrom="margin">
+              <wp14:pctHeight>0</wp14:pctHeight>
+            </wp14:sizeRelV>
+          </wp:anchor>
+        </w:drawing>
+      </w:r>
+    </w:p>
+    <w:p>
+      <w:pPr>
+        <w:jc w:val="both"/>
+        <w:rPr>
+          <w:sz w:val="24"/>
+          <w:szCs w:val="24"/>
+        </w:rPr>
+      </w:pPr>
+      <w:r>
+        <w:rPr>
+          <w:noProof/>
+          <w:sz w:val="24"/>
+          <w:szCs w:val="24"/>
+        </w:rPr>
+        <w:drawing>
+          <wp:anchor distT="0" distB="0" distL="114300" distR="114300" simplePos="0" relativeHeight="251695104" behindDoc="1" locked="0" layoutInCell="1" allowOverlap="1" wp14:anchorId="619DA923" wp14:editId="3D916A03">
+            <wp:simplePos x="0" y="0"/>
+            <wp:positionH relativeFrom="column">
+              <wp:posOffset>-653036</wp:posOffset>
+            </wp:positionH>
+            <wp:positionV relativeFrom="paragraph">
+              <wp:posOffset>230596</wp:posOffset>
+            </wp:positionV>
+            <wp:extent cx="3267710" cy="1569720"/>
+            <wp:effectExtent l="0" t="0" r="0" b="0"/>
+            <wp:wrapNone/>
+            <wp:docPr id="821444619" name="Imagen 1"/>
+            <wp:cNvGraphicFramePr>
+              <a:graphicFrameLocks xmlns:a="http://schemas.openxmlformats.org/drawingml/2006/main" noChangeAspect="1"/>
+            </wp:cNvGraphicFramePr>
+            <a:graphic xmlns:a="http://schemas.openxmlformats.org/drawingml/2006/main">
+              <a:graphicData uri="http://schemas.openxmlformats.org/drawingml/2006/picture">
+                <pic:pic xmlns:pic="http://schemas.openxmlformats.org/drawingml/2006/picture">
+                  <pic:nvPicPr>
+                    <pic:cNvPr id="821444619" name=""/>
+                    <pic:cNvPicPr/>
+                  </pic:nvPicPr>
+                  <pic:blipFill>
+                    <a:blip r:embed="rId12">
+                      <a:extLst>
+                        <a:ext uri="{28A0092B-C50C-407E-A947-70E740481C1C}">
+                          <a14:useLocalDpi xmlns:a14="http://schemas.microsoft.com/office/drawing/2010/main" val="0"/>
+                        </a:ext>
+                      </a:extLst>
+                    </a:blip>
+                    <a:stretch>
+                      <a:fillRect/>
+                    </a:stretch>
+                  </pic:blipFill>
+                  <pic:spPr>
+                    <a:xfrm>
+                      <a:off x="0" y="0"/>
+                      <a:ext cx="3267710" cy="1569720"/>
+                    </a:xfrm>
+                    <a:prstGeom prst="rect">
+                      <a:avLst/>
+                    </a:prstGeom>
+                  </pic:spPr>
+                </pic:pic>
+              </a:graphicData>
+            </a:graphic>
+            <wp14:sizeRelH relativeFrom="margin">
+              <wp14:pctWidth>0</wp14:pctWidth>
+            </wp14:sizeRelH>
+            <wp14:sizeRelV relativeFrom="margin">
+              <wp14:pctHeight>0</wp14:pctHeight>
+            </wp14:sizeRelV>
+          </wp:anchor>
+        </w:drawing>
+      </w:r>
+    </w:p>
+    <w:p>
+      <w:pPr>
+        <w:jc w:val="both"/>
+        <w:rPr>
+          <w:sz w:val="24"/>
+          <w:szCs w:val="24"/>
+        </w:rPr>
+      </w:pPr>
+    </w:p>
+    <w:p>
+      <w:pPr>
+        <w:jc w:val="both"/>
+        <w:rPr>
+          <w:sz w:val="24"/>
+          <w:szCs w:val="24"/>
+        </w:rPr>
+      </w:pPr>
+    </w:p>
+    <w:p>
+      <w:pPr>
+        <w:jc w:val="both"/>
+        <w:rPr>
+          <w:sz w:val="24"/>
+          <w:szCs w:val="24"/>
+        </w:rPr>
+      </w:pPr>
+    </w:p>
+    <w:p>
+      <w:pPr>
+        <w:jc w:val="both"/>
+        <w:rPr>
+          <w:sz w:val="24"/>
+          <w:szCs w:val="24"/>
+        </w:rPr>
+      </w:pPr>
+    </w:p>
+    <w:p>
+      <w:pPr>
+        <w:jc w:val="both"/>
+        <w:rPr>
+          <w:sz w:val="24"/>
+          <w:szCs w:val="24"/>
+        </w:rPr>
+      </w:pPr>
+    </w:p>
+    <w:p>
+      <w:pPr>
+        <w:jc w:val="both"/>
+        <w:rPr>
+          <w:sz w:val="24"/>
+          <w:szCs w:val="24"/>
+        </w:rPr>
+      </w:pPr>
+    </w:p>
+    <w:p>
+      <w:pPr>
+        <w:jc w:val="both"/>
+        <w:rPr>
+          <w:sz w:val="24"/>
+          <w:szCs w:val="24"/>
+        </w:rPr>
+      </w:pPr>
+      <w:r>
+        <w:rPr>
+          <w:noProof/>
+          <w:sz w:val="24"/>
+          <w:szCs w:val="24"/>
+        </w:rPr>
+        <w:drawing>
+          <wp:anchor distT="0" distB="0" distL="114300" distR="114300" simplePos="0" relativeHeight="251693056" behindDoc="0" locked="0" layoutInCell="1" allowOverlap="1" wp14:anchorId="7EA96369" wp14:editId="22E6CD89">
+            <wp:simplePos x="0" y="0"/>
+            <wp:positionH relativeFrom="column">
+              <wp:posOffset>-759451</wp:posOffset>
+            </wp:positionH>
+            <wp:positionV relativeFrom="paragraph">
+              <wp:posOffset>311150</wp:posOffset>
+            </wp:positionV>
+            <wp:extent cx="3351805" cy="2600696"/>
+            <wp:effectExtent l="0" t="0" r="1270" b="9525"/>
+            <wp:wrapNone/>
+            <wp:docPr id="1207104213" name="Imagen 1"/>
+            <wp:cNvGraphicFramePr>
+              <a:graphicFrameLocks xmlns:a="http://schemas.openxmlformats.org/drawingml/2006/main" noChangeAspect="1"/>
+            </wp:cNvGraphicFramePr>
+            <a:graphic xmlns:a="http://schemas.openxmlformats.org/drawingml/2006/main">
+              <a:graphicData uri="http://schemas.openxmlformats.org/drawingml/2006/picture">
+                <pic:pic xmlns:pic="http://schemas.openxmlformats.org/drawingml/2006/picture">
+                  <pic:nvPicPr>
+                    <pic:cNvPr id="1207104213" name=""/>
+                    <pic:cNvPicPr/>
+                  </pic:nvPicPr>
+                  <pic:blipFill>
+                    <a:blip r:embed="rId13">
+                      <a:extLst>
+                        <a:ext uri="{28A0092B-C50C-407E-A947-70E740481C1C}">
+                          <a14:useLocalDpi xmlns:a14="http://schemas.microsoft.com/office/drawing/2010/main" val="0"/>
+                        </a:ext>
+                      </a:extLst>
+                    </a:blip>
+                    <a:stretch>
+                      <a:fillRect/>
+                    </a:stretch>
+                  </pic:blipFill>
+                  <pic:spPr>
+                    <a:xfrm>
+                      <a:off x="0" y="0"/>
+                      <a:ext cx="3351805" cy="2600696"/>
+                    </a:xfrm>
+                    <a:prstGeom prst="rect">
+                      <a:avLst/>
+                    </a:prstGeom>
+                  </pic:spPr>
+                </pic:pic>
+              </a:graphicData>
+            </a:graphic>
+            <wp14:sizeRelH relativeFrom="margin">
+              <wp14:pctWidth>0</wp14:pctWidth>
+            </wp14:sizeRelH>
+            <wp14:sizeRelV relativeFrom="margin">
+              <wp14:pctHeight>0</wp14:pctHeight>
+            </wp14:sizeRelV>
+          </wp:anchor>
+        </w:drawing>
+      </w:r>
+    </w:p>
+    <w:p>
+      <w:pPr>
+        <w:jc w:val="both"/>
+        <w:rPr>
+          <w:sz w:val="24"/>
+          <w:szCs w:val="24"/>
+        </w:rPr>
+      </w:pPr>
+      <w:r>
+        <w:rPr>
+          <w:noProof/>
+          <w:sz w:val="24"/>
+          <w:szCs w:val="24"/>
+        </w:rPr>
+        <w:drawing>
+          <wp:anchor distT="0" distB="0" distL="114300" distR="114300" simplePos="0" relativeHeight="251694080" behindDoc="0" locked="0" layoutInCell="1" allowOverlap="1" wp14:anchorId="7861E691" wp14:editId="1EBBD5B6">
+            <wp:simplePos x="0" y="0"/>
+            <wp:positionH relativeFrom="page">
+              <wp:posOffset>3823344</wp:posOffset>
+            </wp:positionH>
+            <wp:positionV relativeFrom="paragraph">
+              <wp:posOffset>8890</wp:posOffset>
+            </wp:positionV>
+            <wp:extent cx="3312795" cy="2569845"/>
+            <wp:effectExtent l="0" t="0" r="1905" b="1905"/>
+            <wp:wrapThrough wrapText="bothSides">
+              <wp:wrapPolygon edited="0">
+                <wp:start x="0" y="0"/>
+                <wp:lineTo x="0" y="21456"/>
+                <wp:lineTo x="21488" y="21456"/>
+                <wp:lineTo x="21488" y="0"/>
+                <wp:lineTo x="0" y="0"/>
+              </wp:wrapPolygon>
+            </wp:wrapThrough>
+            <wp:docPr id="1054546167" name="Imagen 1"/>
+            <wp:cNvGraphicFramePr>
+              <a:graphicFrameLocks xmlns:a="http://schemas.openxmlformats.org/drawingml/2006/main" noChangeAspect="1"/>
+            </wp:cNvGraphicFramePr>
+            <a:graphic xmlns:a="http://schemas.openxmlformats.org/drawingml/2006/main">
+              <a:graphicData uri="http://schemas.openxmlformats.org/drawingml/2006/picture">
+                <pic:pic xmlns:pic="http://schemas.openxmlformats.org/drawingml/2006/picture">
+                  <pic:nvPicPr>
+                    <pic:cNvPr id="1054546167" name=""/>
+                    <pic:cNvPicPr/>
+                  </pic:nvPicPr>
+                  <pic:blipFill>
+                    <a:blip r:embed="rId14">
+                      <a:extLst>
+                        <a:ext uri="{28A0092B-C50C-407E-A947-70E740481C1C}">
+                          <a14:useLocalDpi xmlns:a14="http://schemas.microsoft.com/office/drawing/2010/main" val="0"/>
+                        </a:ext>
+                      </a:extLst>
+                    </a:blip>
+                    <a:stretch>
+                      <a:fillRect/>
+                    </a:stretch>
+                  </pic:blipFill>
+                  <pic:spPr>
+                    <a:xfrm>
+                      <a:off x="0" y="0"/>
+                      <a:ext cx="3312795" cy="2569845"/>
+                    </a:xfrm>
+                    <a:prstGeom prst="rect">
+                      <a:avLst/>
+                    </a:prstGeom>
+                  </pic:spPr>
+                </pic:pic>
+              </a:graphicData>
+            </a:graphic>
+            <wp14:sizeRelH relativeFrom="margin">
+              <wp14:pctWidth>0</wp14:pctWidth>
+            </wp14:sizeRelH>
+            <wp14:sizeRelV relativeFrom="margin">
+              <wp14:pctHeight>0</wp14:pctHeight>
+            </wp14:sizeRelV>
+          </wp:anchor>
+        </w:drawing>
+      </w:r>
+    </w:p>
+    <w:p>
+      <w:pPr>
+        <w:jc w:val="both"/>
+        <w:rPr>
+          <w:sz w:val="24"/>
+          <w:szCs w:val="24"/>
+        </w:rPr>
+      </w:pPr>
+    </w:p>
+    <w:p>
+      <w:pPr>
+        <w:jc w:val="both"/>
+        <w:rPr>
+          <w:sz w:val="24"/>
+          <w:szCs w:val="24"/>
+        </w:rPr>
+      </w:pPr>
+    </w:p>
+    <w:p>
+      <w:pPr>
+        <w:jc w:val="both"/>
+        <w:rPr>
+          <w:sz w:val="24"/>
+          <w:szCs w:val="24"/>
+        </w:rPr>
+      </w:pPr>
+    </w:p>
+    <w:p>
+      <w:pPr>
+        <w:jc w:val="both"/>
+        <w:rPr>
+          <w:sz w:val="24"/>
+          <w:szCs w:val="24"/>
+        </w:rPr>
+      </w:pPr>
+    </w:p>
+    <w:p>
+      <w:pPr>
+        <w:jc w:val="both"/>
+        <w:rPr>
+          <w:sz w:val="24"/>
+          <w:szCs w:val="24"/>
+        </w:rPr>
+      </w:pPr>
+    </w:p>
+    <w:p>
+      <w:pPr>
+        <w:jc w:val="both"/>
+        <w:rPr>
+          <w:sz w:val="24"/>
+          <w:szCs w:val="24"/>
+        </w:rPr>
+      </w:pPr>
+    </w:p>
+    <w:p>
+      <w:pPr>
+        <w:jc w:val="both"/>
+        <w:rPr>
+          <w:sz w:val="24"/>
+          <w:szCs w:val="24"/>
+        </w:rPr>
+      </w:pPr>
+    </w:p>
+    <w:p>
+      <w:pPr>
+        <w:jc w:val="both"/>
+        <w:rPr>
+          <w:sz w:val="24"/>
+          <w:szCs w:val="24"/>
+        </w:rPr>
+      </w:pPr>
+    </w:p>
+    <w:p>
+      <w:pPr>
+        <w:jc w:val="both"/>
         <w:rPr>
           <w:color w:val="002060"/>
           <w:sz w:val="32"/>
           <w:szCs w:val="32"/>
         </w:rPr>
-        <w:t>Paso 1: Preparación del Dispositivo y Conexión</w:t>
+      </w:pPr>
+      <w:r>
+        <w:rPr>
+          <w:sz w:val="24"/>
+          <w:szCs w:val="24"/>
+        </w:rPr>
+        <w:t xml:space="preserve">Tras completar el proceso, el acceso directo a la aplicación </w:t>
+      </w:r>
+      <w:r>
+        <w:rPr>
+          <w:b/>
+          <w:bCs/>
+          <w:sz w:val="24"/>
+          <w:szCs w:val="24"/>
+        </w:rPr>
+        <w:t>Droidlab</w:t>
+      </w:r>
+      <w:r>
+        <w:rPr>
+          <w:sz w:val="24"/>
+          <w:szCs w:val="24"/>
+        </w:rPr>
+        <w:t xml:space="preserve"> aparecerá automáticamente en su escritorio.</w:t>
+      </w:r>
+    </w:p>
+    <w:p>
+      <w:pPr>
+        <w:jc w:val="both"/>
+        <w:rPr>
+          <w:color w:val="002060"/>
+          <w:sz w:val="32"/>
+          <w:szCs w:val="32"/>
+          <w:u w:val="single"/>
+        </w:rPr>
+      </w:pPr>
+    </w:p>
+    <w:p>
+      <w:pPr>
+        <w:jc w:val="both"/>
+        <w:rPr>
+          <w:color w:val="002060"/>
+          <w:sz w:val="32"/>
+          <w:szCs w:val="32"/>
+        </w:rPr>
+      </w:pPr>
+    </w:p>
+    <w:p>
+      <w:pPr>
+        <w:jc w:val="both"/>
+        <w:rPr>
+          <w:color w:val="002060"/>
+          <w:sz w:val="32"/>
+          <w:szCs w:val="32"/>
+        </w:rPr>
+      </w:pPr>
+    </w:p>
+    <w:p>
+      <w:pPr>
+        <w:jc w:val="both"/>
+        <w:rPr>
+          <w:color w:val="002060"/>
+          <w:sz w:val="32"/>
+          <w:szCs w:val="32"/>
+        </w:rPr>
+      </w:pPr>
+    </w:p>
+    <w:p>
+      <w:pPr>
+        <w:jc w:val="both"/>
+        <w:rPr>
+          <w:color w:val="002060"/>
+          <w:sz w:val="32"/>
+          <w:szCs w:val="32"/>
+        </w:rPr>
+      </w:pPr>
+    </w:p>
+    <w:p>
+      <w:pPr>
+        <w:jc w:val="both"/>
+        <w:rPr>
+          <w:color w:val="002060"/>
+          <w:sz w:val="32"/>
+          <w:szCs w:val="32"/>
+        </w:rPr>
+      </w:pPr>
+    </w:p>
+    <w:p>
+      <w:pPr>
+        <w:jc w:val="both"/>
+        <w:rPr>
+          <w:color w:val="002060"/>
+          <w:sz w:val="32"/>
+          <w:szCs w:val="32"/>
+        </w:rPr>
+      </w:pPr>
+      <w:r>
+        <w:rPr>
+          <w:color w:val="002060"/>
+          <w:sz w:val="32"/>
+          <w:szCs w:val="32"/>
+        </w:rPr>
+        <w:lastRenderedPageBreak/>
+        <w:t xml:space="preserve">Paso </w:t>
+      </w:r>
+      <w:r>
+        <w:rPr>
+          <w:color w:val="002060"/>
+          <w:sz w:val="32"/>
+          <w:szCs w:val="32"/>
+        </w:rPr>
+        <w:t>2</w:t>
+      </w:r>
+      <w:r>
+        <w:rPr>
+          <w:color w:val="002060"/>
+          <w:sz w:val="32"/>
+          <w:szCs w:val="32"/>
+        </w:rPr>
+        <w:t>: Preparación del Dispositivo y Conexión</w:t>
       </w:r>
     </w:p>
     <w:p>
@@ -377,7 +1277,7 @@
                     <pic:cNvPicPr/>
                   </pic:nvPicPr>
                   <pic:blipFill>
-                    <a:blip r:embed="rId8">
+                    <a:blip r:embed="rId15">
                       <a:extLst>
                         <a:ext uri="{28A0092B-C50C-407E-A947-70E740481C1C}">
                           <a14:useLocalDpi xmlns:a14="http://schemas.microsoft.com/office/drawing/2010/main" val="0"/>
@@ -456,16 +1356,6 @@
     </w:p>
     <w:p>
       <w:pPr>
-        <w:jc w:val="both"/>
-        <w:rPr>
-          <w:rFonts w:cstheme="minorHAnsi"/>
-          <w:sz w:val="44"/>
-          <w:szCs w:val="44"/>
-        </w:rPr>
-      </w:pPr>
-    </w:p>
-    <w:p>
-      <w:pPr>
         <w:tabs>
           <w:tab w:val="left" w:pos="1215"/>
         </w:tabs>
@@ -476,14 +1366,121 @@
           <w:szCs w:val="32"/>
         </w:rPr>
       </w:pPr>
-      <w:r>
+    </w:p>
+    <w:p>
+      <w:pPr>
+        <w:tabs>
+          <w:tab w:val="left" w:pos="1215"/>
+        </w:tabs>
+        <w:jc w:val="both"/>
         <w:rPr>
           <w:color w:val="002060"/>
           <w:sz w:val="32"/>
           <w:szCs w:val="32"/>
         </w:rPr>
+      </w:pPr>
+    </w:p>
+    <w:p>
+      <w:pPr>
+        <w:tabs>
+          <w:tab w:val="left" w:pos="1215"/>
+        </w:tabs>
+        <w:jc w:val="both"/>
+        <w:rPr>
+          <w:color w:val="002060"/>
+          <w:sz w:val="32"/>
+          <w:szCs w:val="32"/>
+        </w:rPr>
+      </w:pPr>
+    </w:p>
+    <w:p>
+      <w:pPr>
+        <w:tabs>
+          <w:tab w:val="left" w:pos="1215"/>
+        </w:tabs>
+        <w:jc w:val="both"/>
+        <w:rPr>
+          <w:color w:val="002060"/>
+          <w:sz w:val="32"/>
+          <w:szCs w:val="32"/>
+        </w:rPr>
+      </w:pPr>
+    </w:p>
+    <w:p>
+      <w:pPr>
+        <w:tabs>
+          <w:tab w:val="left" w:pos="1215"/>
+        </w:tabs>
+        <w:jc w:val="both"/>
+        <w:rPr>
+          <w:color w:val="002060"/>
+          <w:sz w:val="32"/>
+          <w:szCs w:val="32"/>
+        </w:rPr>
+      </w:pPr>
+    </w:p>
+    <w:p>
+      <w:pPr>
+        <w:tabs>
+          <w:tab w:val="left" w:pos="1215"/>
+        </w:tabs>
+        <w:jc w:val="both"/>
+        <w:rPr>
+          <w:color w:val="002060"/>
+          <w:sz w:val="32"/>
+          <w:szCs w:val="32"/>
+        </w:rPr>
+      </w:pPr>
+    </w:p>
+    <w:p>
+      <w:pPr>
+        <w:tabs>
+          <w:tab w:val="left" w:pos="1215"/>
+        </w:tabs>
+        <w:jc w:val="both"/>
+        <w:rPr>
+          <w:color w:val="002060"/>
+          <w:sz w:val="32"/>
+          <w:szCs w:val="32"/>
+        </w:rPr>
+      </w:pPr>
+    </w:p>
+    <w:p>
+      <w:pPr>
+        <w:tabs>
+          <w:tab w:val="left" w:pos="1215"/>
+        </w:tabs>
+        <w:jc w:val="both"/>
+        <w:rPr>
+          <w:color w:val="002060"/>
+          <w:sz w:val="32"/>
+          <w:szCs w:val="32"/>
+        </w:rPr>
+      </w:pPr>
+      <w:r>
+        <w:rPr>
+          <w:color w:val="002060"/>
+          <w:sz w:val="32"/>
+          <w:szCs w:val="32"/>
+        </w:rPr>
         <w:lastRenderedPageBreak/>
-        <w:t>Paso 2: Registrar el dispositivo</w:t>
+        <w:t xml:space="preserve">Paso </w:t>
+      </w:r>
+      <w:r>
+        <w:rPr>
+          <w:color w:val="002060"/>
+          <w:sz w:val="32"/>
+          <w:szCs w:val="32"/>
+        </w:rPr>
+        <w:t>3</w:t>
+      </w:r>
+      <w:r>
+        <w:rPr>
+          <w:color w:val="002060"/>
+          <w:sz w:val="32"/>
+          <w:szCs w:val="32"/>
+        </w:rPr>
+        <w:t>: Registrar el dispositivo</w:t>
       </w:r>
     </w:p>
     <w:p>
@@ -593,23 +1590,7 @@
           <w:sz w:val="24"/>
           <w:szCs w:val="24"/>
         </w:rPr>
-        <w:t xml:space="preserve"> </w:t>
-      </w:r>
-      <w:proofErr w:type="spellStart"/>
-      <w:r>
-        <w:rPr>
-          <w:sz w:val="24"/>
-          <w:szCs w:val="24"/>
-        </w:rPr>
-        <w:t>ram</w:t>
-      </w:r>
-      <w:proofErr w:type="spellEnd"/>
-      <w:r>
-        <w:rPr>
-          <w:sz w:val="24"/>
-          <w:szCs w:val="24"/>
-        </w:rPr>
-        <w:t xml:space="preserve"> y procesador.</w:t>
+        <w:t xml:space="preserve"> ram y procesador.</w:t>
       </w:r>
     </w:p>
     <w:p>
@@ -655,7 +1636,7 @@
                     <pic:cNvPicPr/>
                   </pic:nvPicPr>
                   <pic:blipFill>
-                    <a:blip r:embed="rId9">
+                    <a:blip r:embed="rId16">
                       <a:extLst>
                         <a:ext uri="{28A0092B-C50C-407E-A947-70E740481C1C}">
                           <a14:useLocalDpi xmlns:a14="http://schemas.microsoft.com/office/drawing/2010/main" val="0"/>
@@ -956,7 +1937,7 @@
                     <pic:cNvPicPr/>
                   </pic:nvPicPr>
                   <pic:blipFill>
-                    <a:blip r:embed="rId10">
+                    <a:blip r:embed="rId17">
                       <a:extLst>
                         <a:ext uri="{28A0092B-C50C-407E-A947-70E740481C1C}">
                           <a14:useLocalDpi xmlns:a14="http://schemas.microsoft.com/office/drawing/2010/main" val="0"/>
@@ -1099,7 +2080,7 @@
                     <pic:cNvPicPr/>
                   </pic:nvPicPr>
                   <pic:blipFill>
-                    <a:blip r:embed="rId11">
+                    <a:blip r:embed="rId18">
                       <a:extLst>
                         <a:ext uri="{28A0092B-C50C-407E-A947-70E740481C1C}">
                           <a14:useLocalDpi xmlns:a14="http://schemas.microsoft.com/office/drawing/2010/main" val="0"/>
@@ -1320,27 +2301,32 @@
           <w:szCs w:val="24"/>
         </w:rPr>
       </w:pPr>
+    </w:p>
+    <w:p>
+      <w:pPr>
+        <w:tabs>
+          <w:tab w:val="left" w:pos="1468"/>
+        </w:tabs>
+        <w:jc w:val="both"/>
+        <w:rPr>
+          <w:sz w:val="24"/>
+          <w:szCs w:val="24"/>
+        </w:rPr>
+      </w:pPr>
       <w:r>
         <w:rPr>
           <w:sz w:val="24"/>
           <w:szCs w:val="24"/>
         </w:rPr>
         <w:lastRenderedPageBreak/>
-        <w:t>Al hacer clic en el botón de registrar dispositivo, se debe seleccionar al</w:t>
-      </w:r>
-      <w:r>
-        <w:rPr>
-          <w:sz w:val="24"/>
-          <w:szCs w:val="24"/>
-        </w:rPr>
-        <w:t xml:space="preserve"> nuevo</w:t>
-      </w:r>
-      <w:r>
-        <w:rPr>
-          <w:sz w:val="24"/>
-          <w:szCs w:val="24"/>
-        </w:rPr>
-        <w:t xml:space="preserve"> dispositivo de la lista de dispositivos, solo así podremos ver la vista completa de la ficha técnica y el panel de pruebas.</w:t>
+        <w:t xml:space="preserve">Al hacer clic en el botón de registrar dispositivo, </w:t>
+      </w:r>
+      <w:r>
+        <w:rPr>
+          <w:sz w:val="24"/>
+          <w:szCs w:val="24"/>
+        </w:rPr>
+        <w:t>cargará directamente la vista de “ficha técnica” y pasaremos a ver la información del dispositivo de esta manera:</w:t>
       </w:r>
     </w:p>
     <w:p>
@@ -1378,7 +2364,7 @@
                     <pic:cNvPicPr/>
                   </pic:nvPicPr>
                   <pic:blipFill>
-                    <a:blip r:embed="rId12"/>
+                    <a:blip r:embed="rId19"/>
                     <a:stretch>
                       <a:fillRect/>
                     </a:stretch>
@@ -1430,44 +2416,20 @@
           <w:sz w:val="32"/>
           <w:szCs w:val="32"/>
         </w:rPr>
-        <w:t xml:space="preserve">Paso </w:t>
-      </w:r>
-      <w:r>
+        <w:t>Editar desde la ficha técnica</w:t>
+      </w:r>
+    </w:p>
+    <w:p>
+      <w:pPr>
+        <w:tabs>
+          <w:tab w:val="left" w:pos="1215"/>
+        </w:tabs>
+        <w:jc w:val="both"/>
         <w:rPr>
           <w:color w:val="002060"/>
           <w:sz w:val="32"/>
           <w:szCs w:val="32"/>
         </w:rPr>
-        <w:t>3</w:t>
-      </w:r>
-      <w:r>
-        <w:rPr>
-          <w:color w:val="002060"/>
-          <w:sz w:val="32"/>
-          <w:szCs w:val="32"/>
-        </w:rPr>
-        <w:t>:</w:t>
-      </w:r>
-      <w:r>
-        <w:rPr>
-          <w:color w:val="002060"/>
-          <w:sz w:val="32"/>
-          <w:szCs w:val="32"/>
-        </w:rPr>
-        <w:t xml:space="preserve"> Editar desde la ficha técnica</w:t>
-      </w:r>
-    </w:p>
-    <w:p>
-      <w:pPr>
-        <w:tabs>
-          <w:tab w:val="left" w:pos="1215"/>
-        </w:tabs>
-        <w:jc w:val="both"/>
-        <w:rPr>
-          <w:color w:val="002060"/>
-          <w:sz w:val="32"/>
-          <w:szCs w:val="32"/>
-        </w:rPr>
       </w:pPr>
       <w:r>
         <w:rPr>
@@ -1502,23 +2464,7 @@
           <w:sz w:val="24"/>
           <w:szCs w:val="24"/>
         </w:rPr>
-        <w:t xml:space="preserve">Algunos atributos tienen un botón de editar, con el icono de un </w:t>
-      </w:r>
-      <w:proofErr w:type="spellStart"/>
-      <w:r>
-        <w:rPr>
-          <w:sz w:val="24"/>
-          <w:szCs w:val="24"/>
-        </w:rPr>
-        <w:t>lapiz</w:t>
-      </w:r>
-      <w:proofErr w:type="spellEnd"/>
-      <w:r>
-        <w:rPr>
-          <w:sz w:val="24"/>
-          <w:szCs w:val="24"/>
-        </w:rPr>
-        <w:t>, enlazado a ellos.</w:t>
+        <w:t>Algunos atributos tienen un botón de editar, con el icono de un lapiz, enlazado a ellos.</w:t>
       </w:r>
     </w:p>
     <w:p>
@@ -1556,7 +2502,7 @@
                     </pic:cNvPicPr>
                   </pic:nvPicPr>
                   <pic:blipFill>
-                    <a:blip r:embed="rId13">
+                    <a:blip r:embed="rId20">
                       <a:extLst>
                         <a:ext uri="{28A0092B-C50C-407E-A947-70E740481C1C}">
                           <a14:useLocalDpi xmlns:a14="http://schemas.microsoft.com/office/drawing/2010/main" val="0"/>
@@ -1619,23 +2565,7 @@
           <w:sz w:val="24"/>
           <w:szCs w:val="24"/>
         </w:rPr>
-        <w:t xml:space="preserve"> al botón se activará el modo edición sobre ese campo, una vez escrita la nueva información del campo bastará con pulsar la tecla </w:t>
-      </w:r>
-      <w:proofErr w:type="spellStart"/>
-      <w:r>
-        <w:rPr>
-          <w:sz w:val="24"/>
-          <w:szCs w:val="24"/>
-        </w:rPr>
-        <w:t>enter</w:t>
-      </w:r>
-      <w:proofErr w:type="spellEnd"/>
-      <w:r>
-        <w:rPr>
-          <w:sz w:val="24"/>
-          <w:szCs w:val="24"/>
-        </w:rPr>
-        <w:t xml:space="preserve"> para guardar el nuevo valor</w:t>
+        <w:t xml:space="preserve"> al botón se activará el modo edición sobre ese campo, una vez escrita la nueva información del campo bastará con pulsar la tecla enter para guardar el nuevo valor</w:t>
       </w:r>
       <w:r>
         <w:rPr>
@@ -1701,7 +2631,7 @@
                     </pic:cNvPicPr>
                   </pic:nvPicPr>
                   <pic:blipFill>
-                    <a:blip r:embed="rId14">
+                    <a:blip r:embed="rId21">
                       <a:extLst>
                         <a:ext uri="{28A0092B-C50C-407E-A947-70E740481C1C}">
                           <a14:useLocalDpi xmlns:a14="http://schemas.microsoft.com/office/drawing/2010/main" val="0"/>
@@ -1777,39 +2707,7 @@
           <w:sz w:val="24"/>
           <w:szCs w:val="24"/>
         </w:rPr>
-        <w:t xml:space="preserve">con la tecla </w:t>
-      </w:r>
-      <w:proofErr w:type="spellStart"/>
-      <w:r>
-        <w:rPr>
-          <w:sz w:val="24"/>
-          <w:szCs w:val="24"/>
-        </w:rPr>
-        <w:t>enter</w:t>
-      </w:r>
-      <w:proofErr w:type="spellEnd"/>
-      <w:r>
-        <w:rPr>
-          <w:sz w:val="24"/>
-          <w:szCs w:val="24"/>
-        </w:rPr>
-        <w:t xml:space="preserve"> guarda los valores de una forma distinta, mediante un botón verde con el símbolo de un </w:t>
-      </w:r>
-      <w:proofErr w:type="spellStart"/>
-      <w:r>
-        <w:rPr>
-          <w:sz w:val="24"/>
-          <w:szCs w:val="24"/>
-        </w:rPr>
-        <w:t>check</w:t>
-      </w:r>
-      <w:proofErr w:type="spellEnd"/>
-      <w:r>
-        <w:rPr>
-          <w:sz w:val="24"/>
-          <w:szCs w:val="24"/>
-        </w:rPr>
-        <w:t>.</w:t>
+        <w:t>con la tecla enter guarda los valores de una forma distinta, mediante un botón verde con el símbolo de un check.</w:t>
       </w:r>
       <w:r>
         <w:rPr>
@@ -1861,7 +2759,7 @@
                     </pic:cNvPicPr>
                   </pic:nvPicPr>
                   <pic:blipFill>
-                    <a:blip r:embed="rId15">
+                    <a:blip r:embed="rId22">
                       <a:extLst>
                         <a:ext uri="{28A0092B-C50C-407E-A947-70E740481C1C}">
                           <a14:useLocalDpi xmlns:a14="http://schemas.microsoft.com/office/drawing/2010/main" val="0"/>
@@ -2077,7 +2975,7 @@
                     </pic:cNvPicPr>
                   </pic:nvPicPr>
                   <pic:blipFill>
-                    <a:blip r:embed="rId16">
+                    <a:blip r:embed="rId23">
                       <a:extLst>
                         <a:ext uri="{28A0092B-C50C-407E-A947-70E740481C1C}">
                           <a14:useLocalDpi xmlns:a14="http://schemas.microsoft.com/office/drawing/2010/main" val="0"/>
@@ -2140,7 +3038,7 @@
                     </pic:cNvPicPr>
                   </pic:nvPicPr>
                   <pic:blipFill>
-                    <a:blip r:embed="rId17">
+                    <a:blip r:embed="rId24">
                       <a:extLst>
                         <a:ext uri="{28A0092B-C50C-407E-A947-70E740481C1C}">
                           <a14:useLocalDpi xmlns:a14="http://schemas.microsoft.com/office/drawing/2010/main" val="0"/>
@@ -2242,41 +3140,7 @@
           <w:szCs w:val="32"/>
         </w:rPr>
         <w:lastRenderedPageBreak/>
-        <w:t xml:space="preserve">Paso </w:t>
-      </w:r>
-      <w:r>
-        <w:rPr>
-          <w:color w:val="002060"/>
-          <w:sz w:val="32"/>
-          <w:szCs w:val="32"/>
-        </w:rPr>
-        <w:t>4</w:t>
-      </w:r>
-      <w:r>
-        <w:rPr>
-          <w:color w:val="002060"/>
-          <w:sz w:val="32"/>
-          <w:szCs w:val="32"/>
-        </w:rPr>
-        <w:t xml:space="preserve">: Realizar </w:t>
-      </w:r>
-      <w:proofErr w:type="spellStart"/>
-      <w:r>
-        <w:rPr>
-          <w:color w:val="002060"/>
-          <w:sz w:val="32"/>
-          <w:szCs w:val="32"/>
-        </w:rPr>
-        <w:t>Tests</w:t>
-      </w:r>
-      <w:proofErr w:type="spellEnd"/>
-      <w:r>
-        <w:rPr>
-          <w:color w:val="002060"/>
-          <w:sz w:val="32"/>
-          <w:szCs w:val="32"/>
-        </w:rPr>
-        <w:t xml:space="preserve"> automatizados</w:t>
+        <w:t>Realizar Tests automatizados</w:t>
       </w:r>
     </w:p>
     <w:p>
@@ -2295,23 +3159,7 @@
           <w:sz w:val="24"/>
           <w:szCs w:val="24"/>
         </w:rPr>
-        <w:t xml:space="preserve">Para este paso debemos fijarnos que, en lado derecho casi pegado al borde, se encuentra el panel de Pruebas el cual nos ayudará a realizar </w:t>
-      </w:r>
-      <w:proofErr w:type="spellStart"/>
-      <w:r>
-        <w:rPr>
-          <w:sz w:val="24"/>
-          <w:szCs w:val="24"/>
-        </w:rPr>
-        <w:t>Tests</w:t>
-      </w:r>
-      <w:proofErr w:type="spellEnd"/>
-      <w:r>
-        <w:rPr>
-          <w:sz w:val="24"/>
-          <w:szCs w:val="24"/>
-        </w:rPr>
-        <w:t xml:space="preserve"> automatizados al dispositivo conectado en ese momento. En la lista de pasos podremos ver algunas que vienen por defecto para hacer una prueba rápida, si desea puede quitar los pasos por defecto haciendo clic en el botón de limpiar que se encuentra debajo de la lista.</w:t>
+        <w:t>Para este paso debemos fijarnos que, en lado derecho casi pegado al borde, se encuentra el panel de Pruebas el cual nos ayudará a realizar Tests automatizados al dispositivo conectado en ese momento. En la lista de pasos podremos ver algunas que vienen por defecto para hacer una prueba rápida, si desea puede quitar los pasos por defecto haciendo clic en el botón de limpiar que se encuentra debajo de la lista.</w:t>
       </w:r>
     </w:p>
     <w:p>
@@ -2362,7 +3210,6 @@
           <w:szCs w:val="24"/>
         </w:rPr>
       </w:pPr>
-      <w:proofErr w:type="gramStart"/>
       <w:r>
         <w:rPr>
           <w:rFonts w:cstheme="minorHAnsi"/>
@@ -2371,40 +3218,7 @@
           <w:sz w:val="24"/>
           <w:szCs w:val="24"/>
         </w:rPr>
-        <w:t>Importante!!</w:t>
-      </w:r>
-      <w:proofErr w:type="gramEnd"/>
-      <w:r>
-        <w:rPr>
-          <w:rFonts w:cstheme="minorHAnsi"/>
-          <w:b/>
-          <w:bCs/>
-          <w:sz w:val="24"/>
-          <w:szCs w:val="24"/>
-        </w:rPr>
-        <w:t xml:space="preserve"> Para probar la vibración del dispositivo, éste debe ser </w:t>
-      </w:r>
-      <w:proofErr w:type="spellStart"/>
-      <w:r>
-        <w:rPr>
-          <w:rFonts w:cstheme="minorHAnsi"/>
-          <w:b/>
-          <w:bCs/>
-          <w:sz w:val="24"/>
-          <w:szCs w:val="24"/>
-        </w:rPr>
-        <w:t>root</w:t>
-      </w:r>
-      <w:proofErr w:type="spellEnd"/>
-      <w:r>
-        <w:rPr>
-          <w:rFonts w:cstheme="minorHAnsi"/>
-          <w:b/>
-          <w:bCs/>
-          <w:sz w:val="24"/>
-          <w:szCs w:val="24"/>
-        </w:rPr>
-        <w:t>.</w:t>
+        <w:t>Importante!! Para probar la vibración del dispositivo, éste debe ser root.</w:t>
       </w:r>
     </w:p>
     <w:p>
@@ -2450,7 +3264,7 @@
                     <pic:cNvPicPr/>
                   </pic:nvPicPr>
                   <pic:blipFill>
-                    <a:blip r:embed="rId18">
+                    <a:blip r:embed="rId25">
                       <a:extLst>
                         <a:ext uri="{28A0092B-C50C-407E-A947-70E740481C1C}">
                           <a14:useLocalDpi xmlns:a14="http://schemas.microsoft.com/office/drawing/2010/main" val="0"/>
@@ -2609,7 +3423,7 @@
                     <pic:cNvPicPr/>
                   </pic:nvPicPr>
                   <pic:blipFill rotWithShape="1">
-                    <a:blip r:embed="rId19">
+                    <a:blip r:embed="rId26">
                       <a:extLst>
                         <a:ext uri="{28A0092B-C50C-407E-A947-70E740481C1C}">
                           <a14:useLocalDpi xmlns:a14="http://schemas.microsoft.com/office/drawing/2010/main" val="0"/>
@@ -2684,23 +3498,7 @@
           <w:sz w:val="24"/>
           <w:szCs w:val="24"/>
         </w:rPr>
-        <w:t xml:space="preserve">c) Al finalizar las pruebas puede exportarlas a </w:t>
-      </w:r>
-      <w:proofErr w:type="spellStart"/>
-      <w:r>
-        <w:rPr>
-          <w:sz w:val="24"/>
-          <w:szCs w:val="24"/>
-        </w:rPr>
-        <w:t>pdf</w:t>
-      </w:r>
-      <w:proofErr w:type="spellEnd"/>
-      <w:r>
-        <w:rPr>
-          <w:sz w:val="24"/>
-          <w:szCs w:val="24"/>
-        </w:rPr>
-        <w:t xml:space="preserve"> dando clic en el botón Informe</w:t>
+        <w:t>c) Al finalizar las pruebas puede exportarlas a pdf dando clic en el botón Informe</w:t>
       </w:r>
     </w:p>
     <w:p>
@@ -2758,7 +3556,7 @@
                     <pic:cNvPicPr/>
                   </pic:nvPicPr>
                   <pic:blipFill>
-                    <a:blip r:embed="rId20">
+                    <a:blip r:embed="rId27">
                       <a:extLst>
                         <a:ext uri="{28A0092B-C50C-407E-A947-70E740481C1C}">
                           <a14:useLocalDpi xmlns:a14="http://schemas.microsoft.com/office/drawing/2010/main" val="0"/>
@@ -2848,7 +3646,7 @@
                     <pic:cNvPicPr/>
                   </pic:nvPicPr>
                   <pic:blipFill>
-                    <a:blip r:embed="rId21">
+                    <a:blip r:embed="rId28">
                       <a:extLst>
                         <a:ext uri="{28A0092B-C50C-407E-A947-70E740481C1C}">
                           <a14:useLocalDpi xmlns:a14="http://schemas.microsoft.com/office/drawing/2010/main" val="0"/>
@@ -2943,25 +3741,7 @@
           <w:sz w:val="32"/>
           <w:szCs w:val="32"/>
         </w:rPr>
-        <w:t xml:space="preserve">s de Gestión y </w:t>
-      </w:r>
-      <w:proofErr w:type="spellStart"/>
-      <w:r>
-        <w:rPr>
-          <w:color w:val="002060"/>
-          <w:sz w:val="32"/>
-          <w:szCs w:val="32"/>
-        </w:rPr>
-        <w:t>configuracion</w:t>
-      </w:r>
-      <w:proofErr w:type="spellEnd"/>
-      <w:r>
-        <w:rPr>
-          <w:color w:val="002060"/>
-          <w:sz w:val="32"/>
-          <w:szCs w:val="32"/>
-        </w:rPr>
-        <w:t xml:space="preserve"> del móvil</w:t>
+        <w:t>s de Gestión y configuracion del móvil</w:t>
       </w:r>
     </w:p>
     <w:p>
@@ -3071,7 +3851,7 @@
                     <pic:cNvPicPr/>
                   </pic:nvPicPr>
                   <pic:blipFill>
-                    <a:blip r:embed="rId22">
+                    <a:blip r:embed="rId29">
                       <a:extLst>
                         <a:ext uri="{28A0092B-C50C-407E-A947-70E740481C1C}">
                           <a14:useLocalDpi xmlns:a14="http://schemas.microsoft.com/office/drawing/2010/main" val="0"/>
@@ -3264,46 +4044,14 @@
           <w:sz w:val="24"/>
           <w:szCs w:val="24"/>
         </w:rPr>
-        <w:t xml:space="preserve"> o arrastrando el indicador circular </w:t>
-      </w:r>
-      <w:proofErr w:type="gramStart"/>
-      <w:r>
-        <w:rPr>
-          <w:sz w:val="24"/>
-          <w:szCs w:val="24"/>
-        </w:rPr>
-        <w:t>del slider</w:t>
-      </w:r>
-      <w:proofErr w:type="gramEnd"/>
-      <w:r>
-        <w:rPr>
-          <w:sz w:val="24"/>
-          <w:szCs w:val="24"/>
-        </w:rPr>
-        <w:t xml:space="preserve">, </w:t>
-      </w:r>
-      <w:r>
-        <w:rPr>
-          <w:sz w:val="24"/>
-          <w:szCs w:val="24"/>
-        </w:rPr>
-        <w:t xml:space="preserve">véase por ejemplo el botón de ubicación activado el cual activa el </w:t>
-      </w:r>
-      <w:proofErr w:type="spellStart"/>
-      <w:r>
-        <w:rPr>
-          <w:sz w:val="24"/>
-          <w:szCs w:val="24"/>
-        </w:rPr>
-        <w:t>gps</w:t>
-      </w:r>
-      <w:proofErr w:type="spellEnd"/>
-      <w:r>
-        <w:rPr>
-          <w:sz w:val="24"/>
-          <w:szCs w:val="24"/>
-        </w:rPr>
-        <w:t xml:space="preserve"> del móvil conectado en ese momento.</w:t>
+        <w:t xml:space="preserve"> o arrastrando el indicador circular del slider, </w:t>
+      </w:r>
+      <w:r>
+        <w:rPr>
+          <w:sz w:val="24"/>
+          <w:szCs w:val="24"/>
+        </w:rPr>
+        <w:t>véase por ejemplo el botón de ubicación activado el cual activa el gps del móvil conectado en ese momento.</w:t>
       </w:r>
     </w:p>
     <w:p>
@@ -3348,7 +4096,7 @@
                     <pic:cNvPicPr/>
                   </pic:nvPicPr>
                   <pic:blipFill rotWithShape="1">
-                    <a:blip r:embed="rId23">
+                    <a:blip r:embed="rId30">
                       <a:extLst>
                         <a:ext uri="{28A0092B-C50C-407E-A947-70E740481C1C}">
                           <a14:useLocalDpi xmlns:a14="http://schemas.microsoft.com/office/drawing/2010/main" val="0"/>
@@ -3417,29 +4165,7 @@
           <w:sz w:val="24"/>
           <w:szCs w:val="24"/>
         </w:rPr>
-        <w:t xml:space="preserve"> el dispositivo en </w:t>
-      </w:r>
-      <w:proofErr w:type="spellStart"/>
-      <w:r>
-        <w:rPr>
-          <w:rFonts w:cstheme="minorHAnsi"/>
-          <w:b/>
-          <w:bCs/>
-          <w:sz w:val="24"/>
-          <w:szCs w:val="24"/>
-        </w:rPr>
-        <w:t>root</w:t>
-      </w:r>
-      <w:proofErr w:type="spellEnd"/>
-      <w:r>
-        <w:rPr>
-          <w:rFonts w:cstheme="minorHAnsi"/>
-          <w:b/>
-          <w:bCs/>
-          <w:sz w:val="24"/>
-          <w:szCs w:val="24"/>
-        </w:rPr>
-        <w:t>.</w:t>
+        <w:t xml:space="preserve"> el dispositivo en root.</w:t>
       </w:r>
     </w:p>
     <w:p>
@@ -3595,7 +4321,7 @@
                     <pic:cNvPicPr/>
                   </pic:nvPicPr>
                   <pic:blipFill>
-                    <a:blip r:embed="rId24">
+                    <a:blip r:embed="rId31">
                       <a:extLst>
                         <a:ext uri="{28A0092B-C50C-407E-A947-70E740481C1C}">
                           <a14:useLocalDpi xmlns:a14="http://schemas.microsoft.com/office/drawing/2010/main" val="0"/>
@@ -3795,46 +4521,14 @@
           <w:sz w:val="24"/>
           <w:szCs w:val="24"/>
         </w:rPr>
-        <w:t xml:space="preserve">Para instalar una </w:t>
-      </w:r>
-      <w:proofErr w:type="spellStart"/>
-      <w:r>
-        <w:rPr>
-          <w:sz w:val="24"/>
-          <w:szCs w:val="24"/>
-        </w:rPr>
-        <w:t>apk</w:t>
-      </w:r>
-      <w:proofErr w:type="spellEnd"/>
-      <w:r>
-        <w:rPr>
-          <w:sz w:val="24"/>
-          <w:szCs w:val="24"/>
-        </w:rPr>
-        <w:t xml:space="preserve"> deberá hacer </w:t>
-      </w:r>
-      <w:r>
-        <w:rPr>
-          <w:sz w:val="24"/>
-          <w:szCs w:val="24"/>
-        </w:rPr>
-        <w:t xml:space="preserve">doble clic sobre una de las mostradas en la lista de </w:t>
-      </w:r>
-      <w:proofErr w:type="spellStart"/>
-      <w:r>
-        <w:rPr>
-          <w:sz w:val="24"/>
-          <w:szCs w:val="24"/>
-        </w:rPr>
-        <w:t>apks</w:t>
-      </w:r>
-      <w:proofErr w:type="spellEnd"/>
-      <w:r>
-        <w:rPr>
-          <w:sz w:val="24"/>
-          <w:szCs w:val="24"/>
-        </w:rPr>
-        <w:t xml:space="preserve"> y seleccionar la ruta donde desee extraerla.</w:t>
+        <w:t xml:space="preserve">Para instalar una apk deberá hacer </w:t>
+      </w:r>
+      <w:r>
+        <w:rPr>
+          <w:sz w:val="24"/>
+          <w:szCs w:val="24"/>
+        </w:rPr>
+        <w:t>doble clic sobre una de las mostradas en la lista de apks y seleccionar la ruta donde desee extraerla.</w:t>
       </w:r>
     </w:p>
     <w:p>
@@ -3877,7 +4571,7 @@
                     <pic:cNvPicPr/>
                   </pic:nvPicPr>
                   <pic:blipFill>
-                    <a:blip r:embed="rId25">
+                    <a:blip r:embed="rId32">
                       <a:extLst>
                         <a:ext uri="{28A0092B-C50C-407E-A947-70E740481C1C}">
                           <a14:useLocalDpi xmlns:a14="http://schemas.microsoft.com/office/drawing/2010/main" val="0"/>
@@ -3999,23 +4693,7 @@
           <w:szCs w:val="24"/>
         </w:rPr>
         <w:lastRenderedPageBreak/>
-        <w:t xml:space="preserve">*Ejemplo de </w:t>
-      </w:r>
-      <w:proofErr w:type="spellStart"/>
-      <w:r>
-        <w:rPr>
-          <w:sz w:val="24"/>
-          <w:szCs w:val="24"/>
-        </w:rPr>
-        <w:t>Apk</w:t>
-      </w:r>
-      <w:proofErr w:type="spellEnd"/>
-      <w:r>
-        <w:rPr>
-          <w:sz w:val="24"/>
-          <w:szCs w:val="24"/>
-        </w:rPr>
-        <w:t xml:space="preserve"> extraída en el escritorio.</w:t>
+        <w:t>*Ejemplo de Apk extraída en el escritorio.</w:t>
       </w:r>
     </w:p>
     <w:p>
@@ -4058,7 +4736,7 @@
                     <pic:cNvPicPr/>
                   </pic:nvPicPr>
                   <pic:blipFill>
-                    <a:blip r:embed="rId26">
+                    <a:blip r:embed="rId33">
                       <a:extLst>
                         <a:ext uri="{28A0092B-C50C-407E-A947-70E740481C1C}">
                           <a14:useLocalDpi xmlns:a14="http://schemas.microsoft.com/office/drawing/2010/main" val="0"/>
@@ -4260,7 +4938,7 @@
                     <pic:cNvPicPr/>
                   </pic:nvPicPr>
                   <pic:blipFill>
-                    <a:blip r:embed="rId27">
+                    <a:blip r:embed="rId34">
                       <a:extLst>
                         <a:ext uri="{28A0092B-C50C-407E-A947-70E740481C1C}">
                           <a14:useLocalDpi xmlns:a14="http://schemas.microsoft.com/office/drawing/2010/main" val="0"/>
@@ -4568,7 +5246,7 @@
                     <pic:cNvPicPr/>
                   </pic:nvPicPr>
                   <pic:blipFill>
-                    <a:blip r:embed="rId28">
+                    <a:blip r:embed="rId35">
                       <a:extLst>
                         <a:ext uri="{28A0092B-C50C-407E-A947-70E740481C1C}">
                           <a14:useLocalDpi xmlns:a14="http://schemas.microsoft.com/office/drawing/2010/main" val="0"/>
@@ -4925,25 +5603,7 @@
           <w:sz w:val="24"/>
           <w:szCs w:val="24"/>
         </w:rPr>
-        <w:t xml:space="preserve"> una app que permita la rotación de pantalla, ejemplo: YouTube, </w:t>
-      </w:r>
-      <w:proofErr w:type="spellStart"/>
-      <w:r>
-        <w:rPr>
-          <w:rFonts w:cstheme="minorHAnsi"/>
-          <w:sz w:val="24"/>
-          <w:szCs w:val="24"/>
-        </w:rPr>
-        <w:t>play</w:t>
-      </w:r>
-      <w:proofErr w:type="spellEnd"/>
-      <w:r>
-        <w:rPr>
-          <w:rFonts w:cstheme="minorHAnsi"/>
-          <w:sz w:val="24"/>
-          <w:szCs w:val="24"/>
-        </w:rPr>
-        <w:t xml:space="preserve"> store, etc.</w:t>
+        <w:t xml:space="preserve"> una app que permita la rotación de pantalla, ejemplo: YouTube, play store, etc.</w:t>
       </w:r>
     </w:p>
     <w:p>
@@ -5076,7 +5736,7 @@
                     <pic:cNvPicPr/>
                   </pic:nvPicPr>
                   <pic:blipFill>
-                    <a:blip r:embed="rId29">
+                    <a:blip r:embed="rId36">
                       <a:extLst>
                         <a:ext uri="{28A0092B-C50C-407E-A947-70E740481C1C}">
                           <a14:useLocalDpi xmlns:a14="http://schemas.microsoft.com/office/drawing/2010/main" val="0"/>
@@ -5188,7 +5848,7 @@
                     <pic:cNvPicPr/>
                   </pic:nvPicPr>
                   <pic:blipFill>
-                    <a:blip r:embed="rId30">
+                    <a:blip r:embed="rId37">
                       <a:extLst>
                         <a:ext uri="{28A0092B-C50C-407E-A947-70E740481C1C}">
                           <a14:useLocalDpi xmlns:a14="http://schemas.microsoft.com/office/drawing/2010/main" val="0"/>
@@ -5281,7 +5941,7 @@
                     <pic:cNvPicPr/>
                   </pic:nvPicPr>
                   <pic:blipFill rotWithShape="1">
-                    <a:blip r:embed="rId31">
+                    <a:blip r:embed="rId38">
                       <a:extLst>
                         <a:ext uri="{28A0092B-C50C-407E-A947-70E740481C1C}">
                           <a14:useLocalDpi xmlns:a14="http://schemas.microsoft.com/office/drawing/2010/main" val="0"/>
@@ -5544,25 +6204,7 @@
           <w:sz w:val="24"/>
           <w:szCs w:val="24"/>
         </w:rPr>
-        <w:t xml:space="preserve">En este paso podemos leer APN activa, operador de red y el estado de registro </w:t>
-      </w:r>
-      <w:proofErr w:type="spellStart"/>
-      <w:r>
-        <w:rPr>
-          <w:rFonts w:cstheme="minorHAnsi"/>
-          <w:sz w:val="24"/>
-          <w:szCs w:val="24"/>
-        </w:rPr>
-        <w:t>Volte</w:t>
-      </w:r>
-      <w:proofErr w:type="spellEnd"/>
-      <w:r>
-        <w:rPr>
-          <w:rFonts w:cstheme="minorHAnsi"/>
-          <w:sz w:val="24"/>
-          <w:szCs w:val="24"/>
-        </w:rPr>
-        <w:t xml:space="preserve"> </w:t>
+        <w:t xml:space="preserve">En este paso podemos leer APN activa, operador de red y el estado de registro Volte </w:t>
       </w:r>
       <w:r>
         <w:rPr>
@@ -5653,7 +6295,7 @@
                     <pic:cNvPicPr/>
                   </pic:nvPicPr>
                   <pic:blipFill>
-                    <a:blip r:embed="rId32">
+                    <a:blip r:embed="rId39">
                       <a:extLst>
                         <a:ext uri="{28A0092B-C50C-407E-A947-70E740481C1C}">
                           <a14:useLocalDpi xmlns:a14="http://schemas.microsoft.com/office/drawing/2010/main" val="0"/>
@@ -6084,7 +6726,7 @@
                     <pic:cNvPicPr/>
                   </pic:nvPicPr>
                   <pic:blipFill>
-                    <a:blip r:embed="rId33">
+                    <a:blip r:embed="rId40">
                       <a:extLst>
                         <a:ext uri="{28A0092B-C50C-407E-A947-70E740481C1C}">
                           <a14:useLocalDpi xmlns:a14="http://schemas.microsoft.com/office/drawing/2010/main" val="0"/>
@@ -6493,7 +7135,7 @@
                     <pic:cNvPicPr/>
                   </pic:nvPicPr>
                   <pic:blipFill>
-                    <a:blip r:embed="rId34">
+                    <a:blip r:embed="rId41">
                       <a:extLst>
                         <a:ext uri="{28A0092B-C50C-407E-A947-70E740481C1C}">
                           <a14:useLocalDpi xmlns:a14="http://schemas.microsoft.com/office/drawing/2010/main" val="0"/>
@@ -6627,7 +7269,7 @@
                     <pic:cNvPicPr/>
                   </pic:nvPicPr>
                   <pic:blipFill>
-                    <a:blip r:embed="rId35"/>
+                    <a:blip r:embed="rId42"/>
                     <a:stretch>
                       <a:fillRect/>
                     </a:stretch>
@@ -6709,25 +7351,7 @@
           <w:sz w:val="24"/>
           <w:szCs w:val="24"/>
         </w:rPr>
-        <w:t xml:space="preserve">Introducir un </w:t>
-      </w:r>
-      <w:proofErr w:type="spellStart"/>
-      <w:r>
-        <w:rPr>
-          <w:rFonts w:cstheme="minorHAnsi"/>
-          <w:sz w:val="24"/>
-          <w:szCs w:val="24"/>
-        </w:rPr>
-        <w:t>numero</w:t>
-      </w:r>
-      <w:proofErr w:type="spellEnd"/>
-      <w:r>
-        <w:rPr>
-          <w:rFonts w:cstheme="minorHAnsi"/>
-          <w:sz w:val="24"/>
-          <w:szCs w:val="24"/>
-        </w:rPr>
-        <w:t xml:space="preserve"> de teléfono para realizar la medición de la batería durante una </w:t>
+        <w:t xml:space="preserve">Introducir un numero de teléfono para realizar la medición de la batería durante una </w:t>
       </w:r>
       <w:r>
         <w:rPr>
@@ -6890,7 +7514,7 @@
                     <pic:cNvPicPr/>
                   </pic:nvPicPr>
                   <pic:blipFill>
-                    <a:blip r:embed="rId36">
+                    <a:blip r:embed="rId43">
                       <a:extLst>
                         <a:ext uri="{28A0092B-C50C-407E-A947-70E740481C1C}">
                           <a14:useLocalDpi xmlns:a14="http://schemas.microsoft.com/office/drawing/2010/main" val="0"/>
@@ -6974,25 +7598,7 @@
           <w:sz w:val="24"/>
           <w:szCs w:val="24"/>
         </w:rPr>
-        <w:t xml:space="preserve">Si desea ver solo los </w:t>
-      </w:r>
-      <w:proofErr w:type="spellStart"/>
-      <w:r>
-        <w:rPr>
-          <w:rFonts w:cstheme="minorHAnsi"/>
-          <w:sz w:val="24"/>
-          <w:szCs w:val="24"/>
-        </w:rPr>
-        <w:t>warnings</w:t>
-      </w:r>
-      <w:proofErr w:type="spellEnd"/>
-      <w:r>
-        <w:rPr>
-          <w:rFonts w:cstheme="minorHAnsi"/>
-          <w:sz w:val="24"/>
-          <w:szCs w:val="24"/>
-        </w:rPr>
-        <w:t xml:space="preserve"> y errores marque la casilla que se encuentra justo arriba de la lista de logs y pruebe p</w:t>
+        <w:t>Si desea ver solo los warnings y errores marque la casilla que se encuentra justo arriba de la lista de logs y pruebe p</w:t>
       </w:r>
       <w:r>
         <w:rPr>
@@ -7016,18 +7622,8 @@
           <w:sz w:val="24"/>
           <w:szCs w:val="24"/>
         </w:rPr>
-        <w:t xml:space="preserve"> </w:t>
-      </w:r>
-      <w:proofErr w:type="spellStart"/>
-      <w:r>
-        <w:rPr>
-          <w:rFonts w:cstheme="minorHAnsi"/>
-          <w:sz w:val="24"/>
-          <w:szCs w:val="24"/>
-        </w:rPr>
-        <w:t>package</w:t>
-      </w:r>
-      <w:proofErr w:type="spellEnd"/>
+        <w:t xml:space="preserve"> package</w:t>
+      </w:r>
       <w:r>
         <w:rPr>
           <w:rFonts w:cstheme="minorHAnsi"/>
@@ -7081,7 +7677,7 @@
                     <pic:cNvPicPr/>
                   </pic:nvPicPr>
                   <pic:blipFill>
-                    <a:blip r:embed="rId37">
+                    <a:blip r:embed="rId44">
                       <a:extLst>
                         <a:ext uri="{28A0092B-C50C-407E-A947-70E740481C1C}">
                           <a14:useLocalDpi xmlns:a14="http://schemas.microsoft.com/office/drawing/2010/main" val="0"/>
@@ -7394,7 +7990,7 @@
                     <pic:cNvPicPr/>
                   </pic:nvPicPr>
                   <pic:blipFill>
-                    <a:blip r:embed="rId38">
+                    <a:blip r:embed="rId45">
                       <a:extLst>
                         <a:ext uri="{28A0092B-C50C-407E-A947-70E740481C1C}">
                           <a14:useLocalDpi xmlns:a14="http://schemas.microsoft.com/office/drawing/2010/main" val="0"/>
@@ -7567,7 +8163,7 @@
                     <pic:cNvPicPr/>
                   </pic:nvPicPr>
                   <pic:blipFill>
-                    <a:blip r:embed="rId39">
+                    <a:blip r:embed="rId46">
                       <a:extLst>
                         <a:ext uri="{28A0092B-C50C-407E-A947-70E740481C1C}">
                           <a14:useLocalDpi xmlns:a14="http://schemas.microsoft.com/office/drawing/2010/main" val="0"/>
@@ -7729,7 +8325,7 @@
                     <pic:cNvPicPr/>
                   </pic:nvPicPr>
                   <pic:blipFill>
-                    <a:blip r:embed="rId40">
+                    <a:blip r:embed="rId47">
                       <a:extLst>
                         <a:ext uri="{28A0092B-C50C-407E-A947-70E740481C1C}">
                           <a14:useLocalDpi xmlns:a14="http://schemas.microsoft.com/office/drawing/2010/main" val="0"/>
@@ -7848,81 +8444,8 @@
           <w:sz w:val="24"/>
           <w:szCs w:val="24"/>
         </w:rPr>
-        <w:t xml:space="preserve"> Arrastrar un archivo tipo .</w:t>
-      </w:r>
-      <w:proofErr w:type="spellStart"/>
-      <w:r>
-        <w:rPr>
-          <w:rFonts w:cstheme="minorHAnsi"/>
-          <w:color w:val="4472C4" w:themeColor="accent1"/>
-          <w:sz w:val="24"/>
-          <w:szCs w:val="24"/>
-        </w:rPr>
-        <w:t>apk</w:t>
-      </w:r>
-      <w:proofErr w:type="spellEnd"/>
-      <w:r>
-        <w:rPr>
-          <w:rFonts w:cstheme="minorHAnsi"/>
-          <w:color w:val="4472C4" w:themeColor="accent1"/>
-          <w:sz w:val="24"/>
-          <w:szCs w:val="24"/>
-        </w:rPr>
-        <w:t xml:space="preserve"> </w:t>
-      </w:r>
-      <w:proofErr w:type="gramStart"/>
-      <w:r>
-        <w:rPr>
-          <w:rFonts w:cstheme="minorHAnsi"/>
-          <w:color w:val="4472C4" w:themeColor="accent1"/>
-          <w:sz w:val="24"/>
-          <w:szCs w:val="24"/>
-        </w:rPr>
-        <w:t>/ .</w:t>
-      </w:r>
-      <w:proofErr w:type="spellStart"/>
-      <w:r>
-        <w:rPr>
-          <w:rFonts w:cstheme="minorHAnsi"/>
-          <w:color w:val="4472C4" w:themeColor="accent1"/>
-          <w:sz w:val="24"/>
-          <w:szCs w:val="24"/>
-        </w:rPr>
-        <w:t>apkm</w:t>
-      </w:r>
-      <w:proofErr w:type="spellEnd"/>
-      <w:proofErr w:type="gramEnd"/>
-      <w:r>
-        <w:rPr>
-          <w:rFonts w:cstheme="minorHAnsi"/>
-          <w:color w:val="4472C4" w:themeColor="accent1"/>
-          <w:sz w:val="24"/>
-          <w:szCs w:val="24"/>
-        </w:rPr>
-        <w:t xml:space="preserve"> </w:t>
-      </w:r>
-      <w:proofErr w:type="gramStart"/>
-      <w:r>
-        <w:rPr>
-          <w:rFonts w:cstheme="minorHAnsi"/>
-          <w:color w:val="4472C4" w:themeColor="accent1"/>
-          <w:sz w:val="24"/>
-          <w:szCs w:val="24"/>
-        </w:rPr>
-        <w:t>/ .</w:t>
-      </w:r>
-      <w:proofErr w:type="spellStart"/>
-      <w:r>
-        <w:rPr>
-          <w:rFonts w:cstheme="minorHAnsi"/>
-          <w:color w:val="4472C4" w:themeColor="accent1"/>
-          <w:sz w:val="24"/>
-          <w:szCs w:val="24"/>
-        </w:rPr>
-        <w:t>xapk</w:t>
-      </w:r>
-      <w:proofErr w:type="spellEnd"/>
-      <w:proofErr w:type="gramEnd"/>
+        <w:t xml:space="preserve"> Arrastrar un archivo tipo .apk / .apkm / .xapk</w:t>
+      </w:r>
     </w:p>
     <w:p>
       <w:pPr>
@@ -7969,20 +8492,8 @@
           <w:sz w:val="24"/>
           <w:szCs w:val="24"/>
         </w:rPr>
-        <w:t>.</w:t>
-      </w:r>
-      <w:proofErr w:type="spellStart"/>
-      <w:r>
-        <w:rPr>
-          <w:rFonts w:cstheme="minorHAnsi"/>
-          <w:b/>
-          <w:bCs/>
-          <w:sz w:val="24"/>
-          <w:szCs w:val="24"/>
-        </w:rPr>
-        <w:t>apk</w:t>
-      </w:r>
-      <w:proofErr w:type="spellEnd"/>
+        <w:t>.apk</w:t>
+      </w:r>
       <w:r>
         <w:rPr>
           <w:rFonts w:cstheme="minorHAnsi"/>
@@ -8008,7 +8519,6 @@
           <w:szCs w:val="24"/>
         </w:rPr>
       </w:pPr>
-      <w:proofErr w:type="gramStart"/>
       <w:r>
         <w:rPr>
           <w:rFonts w:cstheme="minorHAnsi"/>
@@ -8017,64 +8527,15 @@
           <w:sz w:val="24"/>
           <w:szCs w:val="24"/>
         </w:rPr>
-        <w:t>.</w:t>
-      </w:r>
-      <w:proofErr w:type="spellStart"/>
-      <w:r>
-        <w:rPr>
-          <w:rFonts w:cstheme="minorHAnsi"/>
-          <w:b/>
-          <w:bCs/>
-          <w:sz w:val="24"/>
-          <w:szCs w:val="24"/>
-        </w:rPr>
-        <w:t>xapk</w:t>
-      </w:r>
-      <w:proofErr w:type="spellEnd"/>
-      <w:proofErr w:type="gramEnd"/>
-      <w:r>
-        <w:rPr>
-          <w:rFonts w:cstheme="minorHAnsi"/>
-          <w:sz w:val="24"/>
-          <w:szCs w:val="24"/>
-        </w:rPr>
-        <w:t xml:space="preserve"> — Formato de </w:t>
-      </w:r>
-      <w:proofErr w:type="spellStart"/>
-      <w:r>
-        <w:rPr>
-          <w:rFonts w:cstheme="minorHAnsi"/>
-          <w:sz w:val="24"/>
-          <w:szCs w:val="24"/>
-        </w:rPr>
-        <w:t>APKPure</w:t>
-      </w:r>
-      <w:proofErr w:type="spellEnd"/>
-      <w:r>
-        <w:rPr>
-          <w:rFonts w:cstheme="minorHAnsi"/>
-          <w:sz w:val="24"/>
-          <w:szCs w:val="24"/>
-        </w:rPr>
-        <w:t xml:space="preserve">. Contiene el APK base más los </w:t>
-      </w:r>
-      <w:proofErr w:type="spellStart"/>
-      <w:r>
-        <w:rPr>
-          <w:rFonts w:cstheme="minorHAnsi"/>
-          <w:sz w:val="24"/>
-          <w:szCs w:val="24"/>
-        </w:rPr>
-        <w:t>splits</w:t>
-      </w:r>
-      <w:proofErr w:type="spellEnd"/>
-      <w:r>
-        <w:rPr>
-          <w:rFonts w:cstheme="minorHAnsi"/>
-          <w:sz w:val="24"/>
-          <w:szCs w:val="24"/>
-        </w:rPr>
-        <w:t xml:space="preserve"> necesarios (idiomas, densidad, arquitectura).</w:t>
+        <w:t>.xapk</w:t>
+      </w:r>
+      <w:r>
+        <w:rPr>
+          <w:rFonts w:cstheme="minorHAnsi"/>
+          <w:sz w:val="24"/>
+          <w:szCs w:val="24"/>
+        </w:rPr>
+        <w:t xml:space="preserve"> — Formato de APKPure. Contiene el APK base más los splits necesarios (idiomas, densidad, arquitectura).</w:t>
       </w:r>
     </w:p>
     <w:p>
@@ -8093,7 +8554,6 @@
           <w:szCs w:val="24"/>
         </w:rPr>
       </w:pPr>
-      <w:proofErr w:type="gramStart"/>
       <w:r>
         <w:rPr>
           <w:rFonts w:cstheme="minorHAnsi"/>
@@ -8102,64 +8562,15 @@
           <w:sz w:val="24"/>
           <w:szCs w:val="24"/>
         </w:rPr>
-        <w:t>.</w:t>
-      </w:r>
-      <w:proofErr w:type="spellStart"/>
-      <w:r>
-        <w:rPr>
-          <w:rFonts w:cstheme="minorHAnsi"/>
-          <w:b/>
-          <w:bCs/>
-          <w:sz w:val="24"/>
-          <w:szCs w:val="24"/>
-        </w:rPr>
-        <w:t>apkm</w:t>
-      </w:r>
-      <w:proofErr w:type="spellEnd"/>
-      <w:proofErr w:type="gramEnd"/>
-      <w:r>
-        <w:rPr>
-          <w:rFonts w:cstheme="minorHAnsi"/>
-          <w:sz w:val="24"/>
-          <w:szCs w:val="24"/>
-        </w:rPr>
-        <w:t xml:space="preserve"> — Formato de </w:t>
-      </w:r>
-      <w:proofErr w:type="spellStart"/>
-      <w:r>
-        <w:rPr>
-          <w:rFonts w:cstheme="minorHAnsi"/>
-          <w:sz w:val="24"/>
-          <w:szCs w:val="24"/>
-        </w:rPr>
-        <w:t>APKMirror</w:t>
-      </w:r>
-      <w:proofErr w:type="spellEnd"/>
-      <w:r>
-        <w:rPr>
-          <w:rFonts w:cstheme="minorHAnsi"/>
-          <w:sz w:val="24"/>
-          <w:szCs w:val="24"/>
-        </w:rPr>
-        <w:t xml:space="preserve">. Equivalente al anterior, empaquetado como </w:t>
-      </w:r>
-      <w:proofErr w:type="spellStart"/>
-      <w:r>
-        <w:rPr>
-          <w:rFonts w:cstheme="minorHAnsi"/>
-          <w:sz w:val="24"/>
-          <w:szCs w:val="24"/>
-        </w:rPr>
-        <w:t>bundle</w:t>
-      </w:r>
-      <w:proofErr w:type="spellEnd"/>
-      <w:r>
-        <w:rPr>
-          <w:rFonts w:cstheme="minorHAnsi"/>
-          <w:sz w:val="24"/>
-          <w:szCs w:val="24"/>
-        </w:rPr>
-        <w:t xml:space="preserve"> descargado directamente desde esa plataforma.</w:t>
+        <w:t>.apkm</w:t>
+      </w:r>
+      <w:r>
+        <w:rPr>
+          <w:rFonts w:cstheme="minorHAnsi"/>
+          <w:sz w:val="24"/>
+          <w:szCs w:val="24"/>
+        </w:rPr>
+        <w:t xml:space="preserve"> — Formato de APKMirror. Equivalente al anterior, empaquetado como bundle descargado directamente desde esa plataforma.</w:t>
       </w:r>
     </w:p>
     <w:p>
@@ -8221,7 +8632,7 @@
                     <pic:cNvPicPr/>
                   </pic:nvPicPr>
                   <pic:blipFill rotWithShape="1">
-                    <a:blip r:embed="rId41">
+                    <a:blip r:embed="rId48">
                       <a:extLst>
                         <a:ext uri="{28A0092B-C50C-407E-A947-70E740481C1C}">
                           <a14:useLocalDpi xmlns:a14="http://schemas.microsoft.com/office/drawing/2010/main" val="0"/>
@@ -8441,7 +8852,7 @@
                     <pic:cNvPicPr/>
                   </pic:nvPicPr>
                   <pic:blipFill>
-                    <a:blip r:embed="rId42">
+                    <a:blip r:embed="rId49">
                       <a:extLst>
                         <a:ext uri="{28A0092B-C50C-407E-A947-70E740481C1C}">
                           <a14:useLocalDpi xmlns:a14="http://schemas.microsoft.com/office/drawing/2010/main" val="0"/>
@@ -8586,25 +8997,7 @@
           <w:sz w:val="24"/>
           <w:szCs w:val="24"/>
         </w:rPr>
-        <w:t xml:space="preserve">, si desea seleccionar varios deberá usar </w:t>
-      </w:r>
-      <w:proofErr w:type="spellStart"/>
-      <w:r>
-        <w:rPr>
-          <w:rFonts w:cstheme="minorHAnsi"/>
-          <w:sz w:val="24"/>
-          <w:szCs w:val="24"/>
-        </w:rPr>
-        <w:t>ctrl</w:t>
-      </w:r>
-      <w:proofErr w:type="spellEnd"/>
-      <w:r>
-        <w:rPr>
-          <w:rFonts w:cstheme="minorHAnsi"/>
-          <w:sz w:val="24"/>
-          <w:szCs w:val="24"/>
-        </w:rPr>
-        <w:t xml:space="preserve"> + clic y para </w:t>
+        <w:t xml:space="preserve">, si desea seleccionar varios deberá usar ctrl + clic y para </w:t>
       </w:r>
       <w:r>
         <w:rPr>
@@ -8708,7 +9101,7 @@
                     <pic:cNvPicPr/>
                   </pic:nvPicPr>
                   <pic:blipFill>
-                    <a:blip r:embed="rId43">
+                    <a:blip r:embed="rId50">
                       <a:extLst>
                         <a:ext uri="{28A0092B-C50C-407E-A947-70E740481C1C}">
                           <a14:useLocalDpi xmlns:a14="http://schemas.microsoft.com/office/drawing/2010/main" val="0"/>
@@ -8903,61 +9296,7 @@
           <w:sz w:val="24"/>
           <w:szCs w:val="24"/>
         </w:rPr>
-        <w:t>Una vez seleccionado el archivo .</w:t>
-      </w:r>
-      <w:proofErr w:type="spellStart"/>
-      <w:r>
-        <w:rPr>
-          <w:rFonts w:cstheme="minorHAnsi"/>
-          <w:sz w:val="24"/>
-          <w:szCs w:val="24"/>
-        </w:rPr>
-        <w:t>apk</w:t>
-      </w:r>
-      <w:proofErr w:type="spellEnd"/>
-      <w:r>
-        <w:rPr>
-          <w:rFonts w:cstheme="minorHAnsi"/>
-          <w:sz w:val="24"/>
-          <w:szCs w:val="24"/>
-        </w:rPr>
-        <w:t>/</w:t>
-      </w:r>
-      <w:proofErr w:type="spellStart"/>
-      <w:r>
-        <w:rPr>
-          <w:rFonts w:cstheme="minorHAnsi"/>
-          <w:sz w:val="24"/>
-          <w:szCs w:val="24"/>
-        </w:rPr>
-        <w:t>apkm</w:t>
-      </w:r>
-      <w:proofErr w:type="spellEnd"/>
-      <w:r>
-        <w:rPr>
-          <w:rFonts w:cstheme="minorHAnsi"/>
-          <w:sz w:val="24"/>
-          <w:szCs w:val="24"/>
-        </w:rPr>
-        <w:t>/</w:t>
-      </w:r>
-      <w:proofErr w:type="spellStart"/>
-      <w:r>
-        <w:rPr>
-          <w:rFonts w:cstheme="minorHAnsi"/>
-          <w:sz w:val="24"/>
-          <w:szCs w:val="24"/>
-        </w:rPr>
-        <w:t>apk</w:t>
-      </w:r>
-      <w:proofErr w:type="spellEnd"/>
-      <w:r>
-        <w:rPr>
-          <w:rFonts w:cstheme="minorHAnsi"/>
-          <w:sz w:val="24"/>
-          <w:szCs w:val="24"/>
-        </w:rPr>
-        <w:t xml:space="preserve"> deberá h</w:t>
+        <w:t>Una vez seleccionado el archivo .apk/apkm/apk deberá h</w:t>
       </w:r>
       <w:r>
         <w:rPr>
@@ -9020,7 +9359,7 @@
                     <pic:cNvPicPr/>
                   </pic:nvPicPr>
                   <pic:blipFill>
-                    <a:blip r:embed="rId44">
+                    <a:blip r:embed="rId51">
                       <a:extLst>
                         <a:ext uri="{28A0092B-C50C-407E-A947-70E740481C1C}">
                           <a14:useLocalDpi xmlns:a14="http://schemas.microsoft.com/office/drawing/2010/main" val="0"/>
@@ -9137,7 +9476,7 @@
                     <pic:cNvPicPr/>
                   </pic:nvPicPr>
                   <pic:blipFill>
-                    <a:blip r:embed="rId45">
+                    <a:blip r:embed="rId52">
                       <a:extLst>
                         <a:ext uri="{28A0092B-C50C-407E-A947-70E740481C1C}">
                           <a14:useLocalDpi xmlns:a14="http://schemas.microsoft.com/office/drawing/2010/main" val="0"/>
@@ -10790,7 +11129,6 @@
   <w:style w:type="character" w:default="1" w:styleId="Fuentedeprrafopredeter">
     <w:name w:val="Default Paragraph Font"/>
     <w:uiPriority w:val="1"/>
-    <w:semiHidden/>
     <w:unhideWhenUsed/>
   </w:style>
   <w:style w:type="table" w:default="1" w:styleId="Tablanormal">
@@ -11216,6 +11554,29 @@
       <w:szCs w:val="20"/>
     </w:rPr>
   </w:style>
+  <w:style w:type="character" w:styleId="Hipervnculo">
+    <w:name w:val="Hyperlink"/>
+    <w:basedOn w:val="Fuentedeprrafopredeter"/>
+    <w:uiPriority w:val="99"/>
+    <w:unhideWhenUsed/>
+    <w:rsid w:val="0090070F"/>
+    <w:rPr>
+      <w:color w:val="0563C1" w:themeColor="hyperlink"/>
+      <w:u w:val="single"/>
+    </w:rPr>
+  </w:style>
+  <w:style w:type="character" w:styleId="Mencinsinresolver">
+    <w:name w:val="Unresolved Mention"/>
+    <w:basedOn w:val="Fuentedeprrafopredeter"/>
+    <w:uiPriority w:val="99"/>
+    <w:semiHidden/>
+    <w:unhideWhenUsed/>
+    <w:rsid w:val="0090070F"/>
+    <w:rPr>
+      <w:color w:val="605E5C"/>
+      <w:shd w:val="clear" w:color="auto" w:fill="E1DFDD"/>
+    </w:rPr>
+  </w:style>
 </w:styles>
 </file>
 

</xml_diff>

<commit_message>
Manual de usuario actualizado
</commit_message>
<xml_diff>
--- a/doc/Manual De Usuario.docx
+++ b/doc/Manual De Usuario.docx
@@ -303,7 +303,7 @@
           <w:szCs w:val="24"/>
         </w:rPr>
         <w:drawing>
-          <wp:inline distT="0" distB="0" distL="0" distR="0" wp14:anchorId="698E36EB" wp14:editId="0026516C">
+          <wp:inline distT="0" distB="0" distL="0" distR="0" wp14:anchorId="698E36EB" wp14:editId="4FCCCA78">
             <wp:extent cx="5400040" cy="2348948"/>
             <wp:effectExtent l="0" t="0" r="0" b="0"/>
             <wp:docPr id="1508712064" name="Imagen 2"/>
@@ -2594,6 +2594,7 @@
       <w:r>
         <w:rPr>
           <w:rFonts w:cstheme="minorHAnsi"/>
+          <w:noProof/>
           <w:sz w:val="24"/>
           <w:szCs w:val="24"/>
         </w:rPr>
@@ -3557,6 +3558,7 @@
           <w:szCs w:val="24"/>
         </w:rPr>
       </w:pPr>
+      <w:proofErr w:type="gramStart"/>
       <w:r>
         <w:rPr>
           <w:rFonts w:cstheme="minorHAnsi"/>
@@ -3565,7 +3567,18 @@
           <w:sz w:val="24"/>
           <w:szCs w:val="24"/>
         </w:rPr>
-        <w:t xml:space="preserve">Importante!! Para probar la vibración del dispositivo, éste debe ser </w:t>
+        <w:t>Importante!!</w:t>
+      </w:r>
+      <w:proofErr w:type="gramEnd"/>
+      <w:r>
+        <w:rPr>
+          <w:rFonts w:cstheme="minorHAnsi"/>
+          <w:b/>
+          <w:bCs/>
+          <w:sz w:val="24"/>
+          <w:szCs w:val="24"/>
+        </w:rPr>
+        <w:t xml:space="preserve"> Para probar la vibración del dispositivo, éste debe ser </w:t>
       </w:r>
       <w:proofErr w:type="spellStart"/>
       <w:r>
@@ -4169,6 +4182,363 @@
           <w:sz w:val="28"/>
           <w:szCs w:val="28"/>
         </w:rPr>
+        <w:t>Configurar Prueba de llamada</w:t>
+      </w:r>
+    </w:p>
+    <w:p>
+      <w:pPr>
+        <w:tabs>
+          <w:tab w:val="left" w:pos="1215"/>
+        </w:tabs>
+        <w:jc w:val="both"/>
+        <w:rPr>
+          <w:rFonts w:cstheme="minorHAnsi"/>
+          <w:noProof/>
+          <w:sz w:val="24"/>
+          <w:szCs w:val="24"/>
+        </w:rPr>
+      </w:pPr>
+      <w:r>
+        <w:rPr>
+          <w:rFonts w:cstheme="minorHAnsi"/>
+          <w:noProof/>
+          <w:sz w:val="24"/>
+          <w:szCs w:val="24"/>
+        </w:rPr>
+        <w:t>Patra la prueba de llamada tenemos 2 opciones para configurar, llamada Masiva y Llamada entre 2 dispositivos:</w:t>
+      </w:r>
+    </w:p>
+    <w:p>
+      <w:pPr>
+        <w:tabs>
+          <w:tab w:val="left" w:pos="1215"/>
+        </w:tabs>
+        <w:jc w:val="center"/>
+        <w:rPr>
+          <w:rFonts w:cstheme="minorHAnsi"/>
+          <w:b/>
+          <w:bCs/>
+          <w:noProof/>
+          <w:sz w:val="24"/>
+          <w:szCs w:val="24"/>
+        </w:rPr>
+      </w:pPr>
+      <w:r>
+        <w:rPr>
+          <w:rFonts w:cstheme="minorHAnsi"/>
+          <w:b/>
+          <w:bCs/>
+          <w:noProof/>
+          <w:sz w:val="24"/>
+          <w:szCs w:val="24"/>
+        </w:rPr>
+        <w:drawing>
+          <wp:inline distT="0" distB="0" distL="0" distR="0" wp14:anchorId="54232C94" wp14:editId="64721AFB">
+            <wp:extent cx="3305175" cy="5581650"/>
+            <wp:effectExtent l="0" t="0" r="9525" b="0"/>
+            <wp:docPr id="711835372" name="Imagen 1"/>
+            <wp:cNvGraphicFramePr>
+              <a:graphicFrameLocks xmlns:a="http://schemas.openxmlformats.org/drawingml/2006/main" noChangeAspect="1"/>
+            </wp:cNvGraphicFramePr>
+            <a:graphic xmlns:a="http://schemas.openxmlformats.org/drawingml/2006/main">
+              <a:graphicData uri="http://schemas.openxmlformats.org/drawingml/2006/picture">
+                <pic:pic xmlns:pic="http://schemas.openxmlformats.org/drawingml/2006/picture">
+                  <pic:nvPicPr>
+                    <pic:cNvPr id="711835372" name=""/>
+                    <pic:cNvPicPr/>
+                  </pic:nvPicPr>
+                  <pic:blipFill>
+                    <a:blip r:embed="rId30"/>
+                    <a:stretch>
+                      <a:fillRect/>
+                    </a:stretch>
+                  </pic:blipFill>
+                  <pic:spPr>
+                    <a:xfrm>
+                      <a:off x="0" y="0"/>
+                      <a:ext cx="3317784" cy="5602944"/>
+                    </a:xfrm>
+                    <a:prstGeom prst="rect">
+                      <a:avLst/>
+                    </a:prstGeom>
+                  </pic:spPr>
+                </pic:pic>
+              </a:graphicData>
+            </a:graphic>
+          </wp:inline>
+        </w:drawing>
+      </w:r>
+    </w:p>
+    <w:p>
+      <w:pPr>
+        <w:tabs>
+          <w:tab w:val="left" w:pos="1215"/>
+        </w:tabs>
+        <w:jc w:val="both"/>
+        <w:rPr>
+          <w:rFonts w:cstheme="minorHAnsi"/>
+          <w:noProof/>
+          <w:sz w:val="28"/>
+          <w:szCs w:val="28"/>
+        </w:rPr>
+      </w:pPr>
+    </w:p>
+    <w:p>
+      <w:pPr>
+        <w:tabs>
+          <w:tab w:val="left" w:pos="1215"/>
+        </w:tabs>
+        <w:jc w:val="both"/>
+        <w:rPr>
+          <w:rFonts w:cstheme="minorHAnsi"/>
+          <w:noProof/>
+          <w:sz w:val="24"/>
+          <w:szCs w:val="24"/>
+        </w:rPr>
+      </w:pPr>
+      <w:r>
+        <w:rPr>
+          <w:rFonts w:cstheme="minorHAnsi"/>
+          <w:b/>
+          <w:bCs/>
+          <w:noProof/>
+          <w:color w:val="1F3864" w:themeColor="accent1" w:themeShade="80"/>
+          <w:sz w:val="24"/>
+          <w:szCs w:val="24"/>
+        </w:rPr>
+        <w:t>Llamada masiva:</w:t>
+      </w:r>
+      <w:r>
+        <w:rPr>
+          <w:rFonts w:cstheme="minorHAnsi"/>
+          <w:noProof/>
+          <w:color w:val="1F3864" w:themeColor="accent1" w:themeShade="80"/>
+          <w:sz w:val="24"/>
+          <w:szCs w:val="24"/>
+        </w:rPr>
+        <w:t xml:space="preserve"> </w:t>
+      </w:r>
+      <w:r>
+        <w:rPr>
+          <w:rFonts w:cstheme="minorHAnsi"/>
+          <w:noProof/>
+          <w:sz w:val="24"/>
+          <w:szCs w:val="24"/>
+        </w:rPr>
+        <w:t>Deberá añadir un número de teléfono, por ejemplo: 607454401, y pulsar en Añadir llamada masiva, al ejecutarse la prueba</w:t>
+      </w:r>
+      <w:r>
+        <w:rPr>
+          <w:rFonts w:cstheme="minorHAnsi"/>
+          <w:noProof/>
+          <w:sz w:val="24"/>
+          <w:szCs w:val="24"/>
+        </w:rPr>
+        <w:t>, todos los teléfonos conectados en ese momento llamarán al número introducido.</w:t>
+      </w:r>
+    </w:p>
+    <w:p>
+      <w:pPr>
+        <w:tabs>
+          <w:tab w:val="left" w:pos="1215"/>
+        </w:tabs>
+        <w:jc w:val="both"/>
+        <w:rPr>
+          <w:rFonts w:cstheme="minorHAnsi"/>
+          <w:noProof/>
+          <w:sz w:val="24"/>
+          <w:szCs w:val="24"/>
+        </w:rPr>
+      </w:pPr>
+      <w:r>
+        <w:rPr>
+          <w:rFonts w:cstheme="minorHAnsi"/>
+          <w:b/>
+          <w:bCs/>
+          <w:noProof/>
+          <w:color w:val="1F3864" w:themeColor="accent1" w:themeShade="80"/>
+          <w:sz w:val="24"/>
+          <w:szCs w:val="24"/>
+        </w:rPr>
+        <w:lastRenderedPageBreak/>
+        <w:t>Llamada entre 2 Dispositivos</w:t>
+      </w:r>
+      <w:r>
+        <w:rPr>
+          <w:rFonts w:cstheme="minorHAnsi"/>
+          <w:noProof/>
+          <w:sz w:val="24"/>
+          <w:szCs w:val="24"/>
+        </w:rPr>
+        <w:t>: Para esta opción tendrás que configurar el número de teléfono del que va a realizar la llamada, luego haciendo clic en el desplegable visualizarás las ips(Si está activado ADB Wifi) o número de serie(si USB está activo) de los dispositivos conectados, tendrás que seleccionar uno de ellos, ya que será el que reciba la llamada.</w:t>
+      </w:r>
+    </w:p>
+    <w:p>
+      <w:pPr>
+        <w:tabs>
+          <w:tab w:val="left" w:pos="1215"/>
+        </w:tabs>
+        <w:jc w:val="right"/>
+        <w:rPr>
+          <w:rFonts w:cstheme="minorHAnsi"/>
+          <w:noProof/>
+          <w:sz w:val="24"/>
+          <w:szCs w:val="24"/>
+        </w:rPr>
+      </w:pPr>
+      <w:r>
+        <w:rPr>
+          <w:rFonts w:cstheme="minorHAnsi"/>
+          <w:noProof/>
+          <w:sz w:val="24"/>
+          <w:szCs w:val="24"/>
+        </w:rPr>
+        <w:drawing>
+          <wp:inline distT="0" distB="0" distL="0" distR="0" wp14:anchorId="0881FAA2" wp14:editId="7D78DE75">
+            <wp:extent cx="5400040" cy="1802765"/>
+            <wp:effectExtent l="0" t="0" r="0" b="6985"/>
+            <wp:docPr id="1409969349" name="Imagen 1"/>
+            <wp:cNvGraphicFramePr>
+              <a:graphicFrameLocks xmlns:a="http://schemas.openxmlformats.org/drawingml/2006/main" noChangeAspect="1"/>
+            </wp:cNvGraphicFramePr>
+            <a:graphic xmlns:a="http://schemas.openxmlformats.org/drawingml/2006/main">
+              <a:graphicData uri="http://schemas.openxmlformats.org/drawingml/2006/picture">
+                <pic:pic xmlns:pic="http://schemas.openxmlformats.org/drawingml/2006/picture">
+                  <pic:nvPicPr>
+                    <pic:cNvPr id="1409969349" name=""/>
+                    <pic:cNvPicPr/>
+                  </pic:nvPicPr>
+                  <pic:blipFill>
+                    <a:blip r:embed="rId31"/>
+                    <a:stretch>
+                      <a:fillRect/>
+                    </a:stretch>
+                  </pic:blipFill>
+                  <pic:spPr>
+                    <a:xfrm>
+                      <a:off x="0" y="0"/>
+                      <a:ext cx="5400040" cy="1802765"/>
+                    </a:xfrm>
+                    <a:prstGeom prst="rect">
+                      <a:avLst/>
+                    </a:prstGeom>
+                  </pic:spPr>
+                </pic:pic>
+              </a:graphicData>
+            </a:graphic>
+          </wp:inline>
+        </w:drawing>
+      </w:r>
+    </w:p>
+    <w:p>
+      <w:pPr>
+        <w:tabs>
+          <w:tab w:val="left" w:pos="1215"/>
+        </w:tabs>
+        <w:jc w:val="both"/>
+        <w:rPr>
+          <w:rFonts w:cstheme="minorHAnsi"/>
+          <w:noProof/>
+          <w:sz w:val="24"/>
+          <w:szCs w:val="24"/>
+        </w:rPr>
+      </w:pPr>
+    </w:p>
+    <w:p>
+      <w:pPr>
+        <w:tabs>
+          <w:tab w:val="left" w:pos="1215"/>
+        </w:tabs>
+        <w:jc w:val="both"/>
+        <w:rPr>
+          <w:rFonts w:cstheme="minorHAnsi"/>
+          <w:b/>
+          <w:bCs/>
+          <w:noProof/>
+          <w:color w:val="1F3864" w:themeColor="accent1" w:themeShade="80"/>
+          <w:sz w:val="24"/>
+          <w:szCs w:val="24"/>
+        </w:rPr>
+      </w:pPr>
+      <w:r>
+        <w:rPr>
+          <w:rFonts w:cstheme="minorHAnsi"/>
+          <w:b/>
+          <w:bCs/>
+          <w:noProof/>
+          <w:color w:val="1F3864" w:themeColor="accent1" w:themeShade="80"/>
+          <w:sz w:val="24"/>
+          <w:szCs w:val="24"/>
+        </w:rPr>
+        <w:t>Proceso de la llamada entre 2:</w:t>
+      </w:r>
+    </w:p>
+    <w:p>
+      <w:pPr>
+        <w:tabs>
+          <w:tab w:val="left" w:pos="1215"/>
+        </w:tabs>
+        <w:jc w:val="both"/>
+        <w:rPr>
+          <w:rFonts w:cstheme="minorHAnsi"/>
+          <w:noProof/>
+          <w:sz w:val="24"/>
+          <w:szCs w:val="24"/>
+        </w:rPr>
+      </w:pPr>
+      <w:r>
+        <w:rPr>
+          <w:rFonts w:cstheme="minorHAnsi"/>
+          <w:noProof/>
+          <w:sz w:val="24"/>
+          <w:szCs w:val="24"/>
+        </w:rPr>
+        <w:t>Este proceso es automático, La llamada se realizará del teléfono 1 al teléfono 2, el teléfono 2 coje la llamada y ésta se mantiene durante 10 segundos, luego se cuelga y el teléfono 2 es el que ahora realiza la llamada, el teléfono 1 coje la llamada e igual que en la primera ronda, la llamada dura 10 segundos y se cuelga, si todo sale bien, el resultado de la prueba se marcará en verde.</w:t>
+      </w:r>
+    </w:p>
+    <w:p>
+      <w:pPr>
+        <w:tabs>
+          <w:tab w:val="left" w:pos="1215"/>
+        </w:tabs>
+        <w:jc w:val="center"/>
+        <w:rPr>
+          <w:rFonts w:cstheme="minorHAnsi"/>
+          <w:b/>
+          <w:bCs/>
+          <w:noProof/>
+          <w:color w:val="1F3864" w:themeColor="accent1" w:themeShade="80"/>
+          <w:sz w:val="28"/>
+          <w:szCs w:val="28"/>
+        </w:rPr>
+      </w:pPr>
+    </w:p>
+    <w:p>
+      <w:pPr>
+        <w:tabs>
+          <w:tab w:val="left" w:pos="1215"/>
+        </w:tabs>
+        <w:jc w:val="both"/>
+        <w:rPr>
+          <w:rFonts w:cstheme="minorHAnsi"/>
+          <w:b/>
+          <w:bCs/>
+          <w:noProof/>
+          <w:color w:val="1F3864" w:themeColor="accent1" w:themeShade="80"/>
+          <w:sz w:val="28"/>
+          <w:szCs w:val="28"/>
+        </w:rPr>
+      </w:pPr>
+      <w:r>
+        <w:rPr>
+          <w:rFonts w:cstheme="minorHAnsi"/>
+          <w:b/>
+          <w:bCs/>
+          <w:noProof/>
+          <w:color w:val="1F3864" w:themeColor="accent1" w:themeShade="80"/>
+          <w:sz w:val="28"/>
+          <w:szCs w:val="28"/>
+        </w:rPr>
         <w:t>Posible caso de conflicto al momento de exportar el pdf:</w:t>
       </w:r>
     </w:p>
@@ -4251,7 +4621,7 @@
                     <pic:cNvPicPr/>
                   </pic:nvPicPr>
                   <pic:blipFill>
-                    <a:blip r:embed="rId30"/>
+                    <a:blip r:embed="rId32"/>
                     <a:stretch>
                       <a:fillRect/>
                     </a:stretch>
@@ -4316,7 +4686,7 @@
                     <pic:cNvPicPr/>
                   </pic:nvPicPr>
                   <pic:blipFill>
-                    <a:blip r:embed="rId31">
+                    <a:blip r:embed="rId33">
                       <a:extLst>
                         <a:ext uri="{28A0092B-C50C-407E-A947-70E740481C1C}">
                           <a14:useLocalDpi xmlns:a14="http://schemas.microsoft.com/office/drawing/2010/main" val="0"/>
@@ -4517,7 +4887,7 @@
                     <pic:cNvPicPr/>
                   </pic:nvPicPr>
                   <pic:blipFill>
-                    <a:blip r:embed="rId32"/>
+                    <a:blip r:embed="rId34"/>
                     <a:stretch>
                       <a:fillRect/>
                     </a:stretch>
@@ -4726,7 +5096,7 @@
                     <pic:cNvPicPr/>
                   </pic:nvPicPr>
                   <pic:blipFill>
-                    <a:blip r:embed="rId33"/>
+                    <a:blip r:embed="rId35"/>
                     <a:stretch>
                       <a:fillRect/>
                     </a:stretch>
@@ -4811,6 +5181,7 @@
           <w:sz w:val="24"/>
           <w:szCs w:val="24"/>
         </w:rPr>
+        <w:lastRenderedPageBreak/>
         <w:drawing>
           <wp:inline distT="0" distB="0" distL="0" distR="0" wp14:anchorId="3C680BC5" wp14:editId="313D955C">
             <wp:extent cx="5364871" cy="3273425"/>
@@ -4827,7 +5198,7 @@
                     <pic:cNvPicPr/>
                   </pic:nvPicPr>
                   <pic:blipFill rotWithShape="1">
-                    <a:blip r:embed="rId34"/>
+                    <a:blip r:embed="rId36"/>
                     <a:srcRect l="652"/>
                     <a:stretch>
                       <a:fillRect/>
@@ -4924,7 +5295,7 @@
                     <pic:cNvPicPr/>
                   </pic:nvPicPr>
                   <pic:blipFill>
-                    <a:blip r:embed="rId35"/>
+                    <a:blip r:embed="rId37"/>
                     <a:stretch>
                       <a:fillRect/>
                     </a:stretch>
@@ -4991,7 +5362,6 @@
           <w:sz w:val="32"/>
           <w:szCs w:val="32"/>
         </w:rPr>
-        <w:lastRenderedPageBreak/>
         <w:t>Herramienta</w:t>
       </w:r>
       <w:r>
@@ -5118,7 +5488,7 @@
                     <pic:cNvPicPr/>
                   </pic:nvPicPr>
                   <pic:blipFill>
-                    <a:blip r:embed="rId36"/>
+                    <a:blip r:embed="rId38"/>
                     <a:stretch>
                       <a:fillRect/>
                     </a:stretch>
@@ -5180,6 +5550,7 @@
           <w:sz w:val="24"/>
           <w:szCs w:val="24"/>
         </w:rPr>
+        <w:lastRenderedPageBreak/>
         <w:t xml:space="preserve">A </w:t>
       </w:r>
       <w:r>
@@ -5403,7 +5774,7 @@
                     <pic:cNvPicPr/>
                   </pic:nvPicPr>
                   <pic:blipFill rotWithShape="1">
-                    <a:blip r:embed="rId37">
+                    <a:blip r:embed="rId39">
                       <a:extLst>
                         <a:ext uri="{28A0092B-C50C-407E-A947-70E740481C1C}">
                           <a14:useLocalDpi xmlns:a14="http://schemas.microsoft.com/office/drawing/2010/main" val="0"/>
@@ -5558,7 +5929,6 @@
           <w:sz w:val="24"/>
           <w:szCs w:val="24"/>
         </w:rPr>
-        <w:lastRenderedPageBreak/>
         <w:t>Para listar aplicaciones del sistema deberá pulsar en Listar y la aplicación detectará todas las aplicaciones que tiene instalada el dispositivo conectado.</w:t>
       </w:r>
     </w:p>
@@ -5602,7 +5972,7 @@
                     <pic:cNvPicPr/>
                   </pic:nvPicPr>
                   <pic:blipFill>
-                    <a:blip r:embed="rId38">
+                    <a:blip r:embed="rId40">
                       <a:extLst>
                         <a:ext uri="{28A0092B-C50C-407E-A947-70E740481C1C}">
                           <a14:useLocalDpi xmlns:a14="http://schemas.microsoft.com/office/drawing/2010/main" val="0"/>
@@ -5884,7 +6254,7 @@
                     <pic:cNvPicPr/>
                   </pic:nvPicPr>
                   <pic:blipFill>
-                    <a:blip r:embed="rId39">
+                    <a:blip r:embed="rId41">
                       <a:extLst>
                         <a:ext uri="{28A0092B-C50C-407E-A947-70E740481C1C}">
                           <a14:useLocalDpi xmlns:a14="http://schemas.microsoft.com/office/drawing/2010/main" val="0"/>
@@ -6005,7 +6375,6 @@
           <w:sz w:val="24"/>
           <w:szCs w:val="24"/>
         </w:rPr>
-        <w:lastRenderedPageBreak/>
         <w:t xml:space="preserve">*Ejemplo de </w:t>
       </w:r>
       <w:proofErr w:type="spellStart"/>
@@ -6065,7 +6434,7 @@
                     <pic:cNvPicPr/>
                   </pic:nvPicPr>
                   <pic:blipFill>
-                    <a:blip r:embed="rId40">
+                    <a:blip r:embed="rId42">
                       <a:extLst>
                         <a:ext uri="{28A0092B-C50C-407E-A947-70E740481C1C}">
                           <a14:useLocalDpi xmlns:a14="http://schemas.microsoft.com/office/drawing/2010/main" val="0"/>
@@ -6243,6 +6612,7 @@
           <w:sz w:val="24"/>
           <w:szCs w:val="24"/>
         </w:rPr>
+        <w:lastRenderedPageBreak/>
         <w:drawing>
           <wp:anchor distT="0" distB="0" distL="114300" distR="114300" simplePos="0" relativeHeight="251672576" behindDoc="0" locked="0" layoutInCell="1" allowOverlap="1" wp14:anchorId="7E1A0A5F" wp14:editId="1D68601C">
             <wp:simplePos x="0" y="0"/>
@@ -6267,7 +6637,7 @@
                     <pic:cNvPicPr/>
                   </pic:nvPicPr>
                   <pic:blipFill>
-                    <a:blip r:embed="rId41">
+                    <a:blip r:embed="rId43">
                       <a:extLst>
                         <a:ext uri="{28A0092B-C50C-407E-A947-70E740481C1C}">
                           <a14:useLocalDpi xmlns:a14="http://schemas.microsoft.com/office/drawing/2010/main" val="0"/>
@@ -6480,7 +6850,6 @@
           <w:sz w:val="24"/>
           <w:szCs w:val="24"/>
         </w:rPr>
-        <w:lastRenderedPageBreak/>
         <w:t xml:space="preserve">Si hacemos clic en Iniciar </w:t>
       </w:r>
       <w:r>
@@ -6575,7 +6944,7 @@
                     <pic:cNvPicPr/>
                   </pic:nvPicPr>
                   <pic:blipFill>
-                    <a:blip r:embed="rId42">
+                    <a:blip r:embed="rId44">
                       <a:extLst>
                         <a:ext uri="{28A0092B-C50C-407E-A947-70E740481C1C}">
                           <a14:useLocalDpi xmlns:a14="http://schemas.microsoft.com/office/drawing/2010/main" val="0"/>
@@ -6897,7 +7266,6 @@
           <w:sz w:val="24"/>
           <w:szCs w:val="24"/>
         </w:rPr>
-        <w:lastRenderedPageBreak/>
         <w:t xml:space="preserve">Rotación de </w:t>
       </w:r>
       <w:r>
@@ -7083,7 +7451,7 @@
                     <pic:cNvPicPr/>
                   </pic:nvPicPr>
                   <pic:blipFill>
-                    <a:blip r:embed="rId43">
+                    <a:blip r:embed="rId45">
                       <a:extLst>
                         <a:ext uri="{28A0092B-C50C-407E-A947-70E740481C1C}">
                           <a14:useLocalDpi xmlns:a14="http://schemas.microsoft.com/office/drawing/2010/main" val="0"/>
@@ -7195,7 +7563,7 @@
                     <pic:cNvPicPr/>
                   </pic:nvPicPr>
                   <pic:blipFill>
-                    <a:blip r:embed="rId44">
+                    <a:blip r:embed="rId46">
                       <a:extLst>
                         <a:ext uri="{28A0092B-C50C-407E-A947-70E740481C1C}">
                           <a14:useLocalDpi xmlns:a14="http://schemas.microsoft.com/office/drawing/2010/main" val="0"/>
@@ -7288,7 +7656,7 @@
                     <pic:cNvPicPr/>
                   </pic:nvPicPr>
                   <pic:blipFill rotWithShape="1">
-                    <a:blip r:embed="rId45">
+                    <a:blip r:embed="rId47">
                       <a:extLst>
                         <a:ext uri="{28A0092B-C50C-407E-A947-70E740481C1C}">
                           <a14:useLocalDpi xmlns:a14="http://schemas.microsoft.com/office/drawing/2010/main" val="0"/>
@@ -7529,7 +7897,6 @@
           <w:sz w:val="26"/>
           <w:szCs w:val="26"/>
         </w:rPr>
-        <w:lastRenderedPageBreak/>
         <w:t>Red e IMS:</w:t>
       </w:r>
     </w:p>
@@ -7660,7 +8027,7 @@
                     <pic:cNvPicPr/>
                   </pic:nvPicPr>
                   <pic:blipFill>
-                    <a:blip r:embed="rId46">
+                    <a:blip r:embed="rId48">
                       <a:extLst>
                         <a:ext uri="{28A0092B-C50C-407E-A947-70E740481C1C}">
                           <a14:useLocalDpi xmlns:a14="http://schemas.microsoft.com/office/drawing/2010/main" val="0"/>
@@ -8031,7 +8398,6 @@
           <w:sz w:val="24"/>
           <w:szCs w:val="24"/>
         </w:rPr>
-        <w:lastRenderedPageBreak/>
         <w:t>-Para la conexión por USB, asegúrese nuevamente que el cable USB esté correctamente conectado del móvil al pc.</w:t>
       </w:r>
     </w:p>
@@ -8091,7 +8457,7 @@
                     <pic:cNvPicPr/>
                   </pic:nvPicPr>
                   <pic:blipFill>
-                    <a:blip r:embed="rId47">
+                    <a:blip r:embed="rId49">
                       <a:extLst>
                         <a:ext uri="{28A0092B-C50C-407E-A947-70E740481C1C}">
                           <a14:useLocalDpi xmlns:a14="http://schemas.microsoft.com/office/drawing/2010/main" val="0"/>
@@ -8403,7 +8769,6 @@
           <w:sz w:val="32"/>
           <w:szCs w:val="32"/>
         </w:rPr>
-        <w:lastRenderedPageBreak/>
         <w:t>Herramienta de Análisis Energético y Rendimiento</w:t>
       </w:r>
     </w:p>
@@ -8500,7 +8865,7 @@
                     <pic:cNvPicPr/>
                   </pic:nvPicPr>
                   <pic:blipFill>
-                    <a:blip r:embed="rId48"/>
+                    <a:blip r:embed="rId50"/>
                     <a:stretch>
                       <a:fillRect/>
                     </a:stretch>
@@ -8590,6 +8955,7 @@
           <w:sz w:val="24"/>
           <w:szCs w:val="24"/>
         </w:rPr>
+        <w:lastRenderedPageBreak/>
         <w:drawing>
           <wp:inline distT="0" distB="0" distL="0" distR="0" wp14:anchorId="70646CAA" wp14:editId="08FBC507">
             <wp:extent cx="5400040" cy="4538980"/>
@@ -8606,7 +8972,7 @@
                     <pic:cNvPicPr/>
                   </pic:nvPicPr>
                   <pic:blipFill>
-                    <a:blip r:embed="rId49"/>
+                    <a:blip r:embed="rId51"/>
                     <a:stretch>
                       <a:fillRect/>
                     </a:stretch>
@@ -8688,7 +9054,6 @@
           <w:sz w:val="24"/>
           <w:szCs w:val="24"/>
         </w:rPr>
-        <w:lastRenderedPageBreak/>
         <w:t xml:space="preserve">Introducir un </w:t>
       </w:r>
       <w:r>
@@ -8899,7 +9264,7 @@
                     <pic:cNvPicPr/>
                   </pic:nvPicPr>
                   <pic:blipFill>
-                    <a:blip r:embed="rId50">
+                    <a:blip r:embed="rId52">
                       <a:extLst>
                         <a:ext uri="{28A0092B-C50C-407E-A947-70E740481C1C}">
                           <a14:useLocalDpi xmlns:a14="http://schemas.microsoft.com/office/drawing/2010/main" val="0"/>
@@ -9066,6 +9431,7 @@
           <w:sz w:val="24"/>
           <w:szCs w:val="24"/>
         </w:rPr>
+        <w:lastRenderedPageBreak/>
         <w:drawing>
           <wp:anchor distT="0" distB="0" distL="114300" distR="114300" simplePos="0" relativeHeight="251680768" behindDoc="0" locked="0" layoutInCell="1" allowOverlap="1" wp14:anchorId="7390B933" wp14:editId="1CA5E5B5">
             <wp:simplePos x="0" y="0"/>
@@ -9090,7 +9456,7 @@
                     <pic:cNvPicPr/>
                   </pic:nvPicPr>
                   <pic:blipFill>
-                    <a:blip r:embed="rId51">
+                    <a:blip r:embed="rId53">
                       <a:extLst>
                         <a:ext uri="{28A0092B-C50C-407E-A947-70E740481C1C}">
                           <a14:useLocalDpi xmlns:a14="http://schemas.microsoft.com/office/drawing/2010/main" val="0"/>
@@ -9402,7 +9768,7 @@
                     <pic:cNvPicPr/>
                   </pic:nvPicPr>
                   <pic:blipFill>
-                    <a:blip r:embed="rId52">
+                    <a:blip r:embed="rId54">
                       <a:extLst>
                         <a:ext uri="{28A0092B-C50C-407E-A947-70E740481C1C}">
                           <a14:useLocalDpi xmlns:a14="http://schemas.microsoft.com/office/drawing/2010/main" val="0"/>
@@ -9575,7 +9941,7 @@
                     <pic:cNvPicPr/>
                   </pic:nvPicPr>
                   <pic:blipFill>
-                    <a:blip r:embed="rId53">
+                    <a:blip r:embed="rId55">
                       <a:extLst>
                         <a:ext uri="{28A0092B-C50C-407E-A947-70E740481C1C}">
                           <a14:useLocalDpi xmlns:a14="http://schemas.microsoft.com/office/drawing/2010/main" val="0"/>
@@ -9737,7 +10103,7 @@
                     <pic:cNvPicPr/>
                   </pic:nvPicPr>
                   <pic:blipFill>
-                    <a:blip r:embed="rId54">
+                    <a:blip r:embed="rId56">
                       <a:extLst>
                         <a:ext uri="{28A0092B-C50C-407E-A947-70E740481C1C}">
                           <a14:useLocalDpi xmlns:a14="http://schemas.microsoft.com/office/drawing/2010/main" val="0"/>
@@ -9876,7 +10242,17 @@
           <w:sz w:val="24"/>
           <w:szCs w:val="24"/>
         </w:rPr>
-        <w:t xml:space="preserve"> / .</w:t>
+        <w:t xml:space="preserve"> </w:t>
+      </w:r>
+      <w:proofErr w:type="gramStart"/>
+      <w:r>
+        <w:rPr>
+          <w:rFonts w:cstheme="minorHAnsi"/>
+          <w:color w:val="4472C4" w:themeColor="accent1"/>
+          <w:sz w:val="24"/>
+          <w:szCs w:val="24"/>
+        </w:rPr>
+        <w:t>/ .</w:t>
       </w:r>
       <w:proofErr w:type="spellStart"/>
       <w:r>
@@ -9889,6 +10265,7 @@
         <w:t>apkm</w:t>
       </w:r>
       <w:proofErr w:type="spellEnd"/>
+      <w:proofErr w:type="gramEnd"/>
       <w:r>
         <w:rPr>
           <w:rFonts w:cstheme="minorHAnsi"/>
@@ -9896,7 +10273,17 @@
           <w:sz w:val="24"/>
           <w:szCs w:val="24"/>
         </w:rPr>
-        <w:t xml:space="preserve"> / .</w:t>
+        <w:t xml:space="preserve"> </w:t>
+      </w:r>
+      <w:proofErr w:type="gramStart"/>
+      <w:r>
+        <w:rPr>
+          <w:rFonts w:cstheme="minorHAnsi"/>
+          <w:color w:val="4472C4" w:themeColor="accent1"/>
+          <w:sz w:val="24"/>
+          <w:szCs w:val="24"/>
+        </w:rPr>
+        <w:t>/ .</w:t>
       </w:r>
       <w:proofErr w:type="spellStart"/>
       <w:r>
@@ -9909,6 +10296,7 @@
         <w:t>xapk</w:t>
       </w:r>
       <w:proofErr w:type="spellEnd"/>
+      <w:proofErr w:type="gramEnd"/>
     </w:p>
     <w:p>
       <w:pPr>
@@ -9994,6 +10382,7 @@
           <w:szCs w:val="24"/>
         </w:rPr>
       </w:pPr>
+      <w:proofErr w:type="gramStart"/>
       <w:r>
         <w:rPr>
           <w:rFonts w:cstheme="minorHAnsi"/>
@@ -10016,6 +10405,7 @@
         <w:t>xapk</w:t>
       </w:r>
       <w:proofErr w:type="spellEnd"/>
+      <w:proofErr w:type="gramEnd"/>
       <w:r>
         <w:rPr>
           <w:rFonts w:cstheme="minorHAnsi"/>
@@ -10025,6 +10415,7 @@
         <w:t xml:space="preserve"> — Formato de </w:t>
       </w:r>
       <w:proofErr w:type="spellStart"/>
+      <w:proofErr w:type="gramStart"/>
       <w:r>
         <w:rPr>
           <w:rFonts w:cstheme="minorHAnsi"/>
@@ -10040,7 +10431,16 @@
           <w:sz w:val="24"/>
           <w:szCs w:val="24"/>
         </w:rPr>
-        <w:t>(sitio web donde se consiguen este tipo de archivos)</w:t>
+        <w:t>(</w:t>
+      </w:r>
+      <w:proofErr w:type="gramEnd"/>
+      <w:r>
+        <w:rPr>
+          <w:rFonts w:cstheme="minorHAnsi"/>
+          <w:sz w:val="24"/>
+          <w:szCs w:val="24"/>
+        </w:rPr>
+        <w:t>sitio web donde se consiguen este tipo de archivos)</w:t>
       </w:r>
       <w:r>
         <w:rPr>
@@ -10085,6 +10485,7 @@
           <w:szCs w:val="24"/>
         </w:rPr>
       </w:pPr>
+      <w:proofErr w:type="gramStart"/>
       <w:r>
         <w:rPr>
           <w:rFonts w:cstheme="minorHAnsi"/>
@@ -10093,7 +10494,6 @@
           <w:sz w:val="24"/>
           <w:szCs w:val="24"/>
         </w:rPr>
-        <w:lastRenderedPageBreak/>
         <w:t>.</w:t>
       </w:r>
       <w:proofErr w:type="spellStart"/>
@@ -10108,6 +10508,7 @@
         <w:t>apkm</w:t>
       </w:r>
       <w:proofErr w:type="spellEnd"/>
+      <w:proofErr w:type="gramEnd"/>
       <w:r>
         <w:rPr>
           <w:rFonts w:cstheme="minorHAnsi"/>
@@ -10117,6 +10518,7 @@
         <w:t xml:space="preserve"> — Formato de </w:t>
       </w:r>
       <w:proofErr w:type="spellStart"/>
+      <w:proofErr w:type="gramStart"/>
       <w:r>
         <w:rPr>
           <w:rFonts w:cstheme="minorHAnsi"/>
@@ -10132,7 +10534,16 @@
           <w:sz w:val="24"/>
           <w:szCs w:val="24"/>
         </w:rPr>
-        <w:t>(sitio web donde se consiguen este tipo de archivos)</w:t>
+        <w:t>(</w:t>
+      </w:r>
+      <w:proofErr w:type="gramEnd"/>
+      <w:r>
+        <w:rPr>
+          <w:rFonts w:cstheme="minorHAnsi"/>
+          <w:sz w:val="24"/>
+          <w:szCs w:val="24"/>
+        </w:rPr>
+        <w:t>sitio web donde se consiguen este tipo de archivos)</w:t>
       </w:r>
       <w:r>
         <w:rPr>
@@ -10220,7 +10631,7 @@
                     <pic:cNvPicPr/>
                   </pic:nvPicPr>
                   <pic:blipFill rotWithShape="1">
-                    <a:blip r:embed="rId55">
+                    <a:blip r:embed="rId57">
                       <a:extLst>
                         <a:ext uri="{28A0092B-C50C-407E-A947-70E740481C1C}">
                           <a14:useLocalDpi xmlns:a14="http://schemas.microsoft.com/office/drawing/2010/main" val="0"/>
@@ -10440,7 +10851,7 @@
                     <pic:cNvPicPr/>
                   </pic:nvPicPr>
                   <pic:blipFill>
-                    <a:blip r:embed="rId56">
+                    <a:blip r:embed="rId58">
                       <a:extLst>
                         <a:ext uri="{28A0092B-C50C-407E-A947-70E740481C1C}">
                           <a14:useLocalDpi xmlns:a14="http://schemas.microsoft.com/office/drawing/2010/main" val="0"/>
@@ -10707,7 +11118,7 @@
                     <pic:cNvPicPr/>
                   </pic:nvPicPr>
                   <pic:blipFill>
-                    <a:blip r:embed="rId57">
+                    <a:blip r:embed="rId59">
                       <a:extLst>
                         <a:ext uri="{28A0092B-C50C-407E-A947-70E740481C1C}">
                           <a14:useLocalDpi xmlns:a14="http://schemas.microsoft.com/office/drawing/2010/main" val="0"/>
@@ -10845,34 +11256,6 @@
           <w:szCs w:val="24"/>
         </w:rPr>
       </w:pPr>
-    </w:p>
-    <w:p>
-      <w:pPr>
-        <w:tabs>
-          <w:tab w:val="left" w:pos="1329"/>
-        </w:tabs>
-        <w:jc w:val="both"/>
-        <w:rPr>
-          <w:rFonts w:cstheme="minorHAnsi"/>
-          <w:color w:val="4472C4" w:themeColor="accent1"/>
-          <w:sz w:val="24"/>
-          <w:szCs w:val="24"/>
-        </w:rPr>
-      </w:pPr>
-    </w:p>
-    <w:p>
-      <w:pPr>
-        <w:tabs>
-          <w:tab w:val="left" w:pos="1329"/>
-        </w:tabs>
-        <w:jc w:val="both"/>
-        <w:rPr>
-          <w:rFonts w:cstheme="minorHAnsi"/>
-          <w:color w:val="4472C4" w:themeColor="accent1"/>
-          <w:sz w:val="24"/>
-          <w:szCs w:val="24"/>
-        </w:rPr>
-      </w:pPr>
       <w:r>
         <w:rPr>
           <w:rFonts w:cstheme="minorHAnsi"/>
@@ -11018,7 +11401,7 @@
                     <pic:cNvPicPr/>
                   </pic:nvPicPr>
                   <pic:blipFill>
-                    <a:blip r:embed="rId58">
+                    <a:blip r:embed="rId60">
                       <a:extLst>
                         <a:ext uri="{28A0092B-C50C-407E-A947-70E740481C1C}">
                           <a14:useLocalDpi xmlns:a14="http://schemas.microsoft.com/office/drawing/2010/main" val="0"/>
@@ -11135,7 +11518,7 @@
                     <pic:cNvPicPr/>
                   </pic:nvPicPr>
                   <pic:blipFill>
-                    <a:blip r:embed="rId59">
+                    <a:blip r:embed="rId61">
                       <a:extLst>
                         <a:ext uri="{28A0092B-C50C-407E-A947-70E740481C1C}">
                           <a14:useLocalDpi xmlns:a14="http://schemas.microsoft.com/office/drawing/2010/main" val="0"/>
@@ -11221,6 +11604,19 @@
         </w:tabs>
         <w:jc w:val="both"/>
         <w:rPr>
+          <w:rFonts w:cstheme="minorHAnsi"/>
+          <w:sz w:val="24"/>
+          <w:szCs w:val="24"/>
+        </w:rPr>
+      </w:pPr>
+    </w:p>
+    <w:p>
+      <w:pPr>
+        <w:tabs>
+          <w:tab w:val="left" w:pos="1021"/>
+        </w:tabs>
+        <w:jc w:val="both"/>
+        <w:rPr>
           <w:color w:val="002060"/>
           <w:sz w:val="32"/>
           <w:szCs w:val="32"/>
@@ -11305,6 +11701,7 @@
       <w:r>
         <w:rPr>
           <w:rFonts w:cstheme="minorHAnsi"/>
+          <w:noProof/>
           <w:sz w:val="24"/>
           <w:szCs w:val="24"/>
         </w:rPr>
@@ -11324,7 +11721,7 @@
                     <pic:cNvPicPr/>
                   </pic:nvPicPr>
                   <pic:blipFill>
-                    <a:blip r:embed="rId60"/>
+                    <a:blip r:embed="rId62"/>
                     <a:stretch>
                       <a:fillRect/>
                     </a:stretch>
@@ -11357,6 +11754,32 @@
           <w:szCs w:val="24"/>
         </w:rPr>
       </w:pPr>
+    </w:p>
+    <w:p>
+      <w:pPr>
+        <w:tabs>
+          <w:tab w:val="left" w:pos="1329"/>
+        </w:tabs>
+        <w:jc w:val="both"/>
+        <w:rPr>
+          <w:rFonts w:cstheme="minorHAnsi"/>
+          <w:sz w:val="24"/>
+          <w:szCs w:val="24"/>
+        </w:rPr>
+      </w:pPr>
+    </w:p>
+    <w:p>
+      <w:pPr>
+        <w:tabs>
+          <w:tab w:val="left" w:pos="1329"/>
+        </w:tabs>
+        <w:jc w:val="both"/>
+        <w:rPr>
+          <w:rFonts w:cstheme="minorHAnsi"/>
+          <w:sz w:val="24"/>
+          <w:szCs w:val="24"/>
+        </w:rPr>
+      </w:pPr>
       <w:r>
         <w:rPr>
           <w:rFonts w:cstheme="minorHAnsi"/>
@@ -11397,6 +11820,7 @@
       <w:r>
         <w:rPr>
           <w:rFonts w:cstheme="minorHAnsi"/>
+          <w:noProof/>
           <w:sz w:val="24"/>
           <w:szCs w:val="24"/>
         </w:rPr>
@@ -11417,7 +11841,7 @@
                     <pic:cNvPicPr/>
                   </pic:nvPicPr>
                   <pic:blipFill>
-                    <a:blip r:embed="rId61"/>
+                    <a:blip r:embed="rId63"/>
                     <a:stretch>
                       <a:fillRect/>
                     </a:stretch>
@@ -11441,6 +11865,135 @@
     <w:p>
       <w:pPr>
         <w:tabs>
+          <w:tab w:val="left" w:pos="1021"/>
+        </w:tabs>
+        <w:jc w:val="both"/>
+        <w:rPr>
+          <w:rFonts w:cstheme="minorHAnsi"/>
+          <w:sz w:val="24"/>
+          <w:szCs w:val="24"/>
+        </w:rPr>
+      </w:pPr>
+      <w:r>
+        <w:rPr>
+          <w:rFonts w:cstheme="minorHAnsi"/>
+          <w:sz w:val="24"/>
+          <w:szCs w:val="24"/>
+        </w:rPr>
+        <w:t xml:space="preserve">Hay varias formas de comparar </w:t>
+      </w:r>
+      <w:proofErr w:type="spellStart"/>
+      <w:r>
+        <w:rPr>
+          <w:rFonts w:cstheme="minorHAnsi"/>
+          <w:sz w:val="24"/>
+          <w:szCs w:val="24"/>
+        </w:rPr>
+        <w:t>APNs</w:t>
+      </w:r>
+      <w:proofErr w:type="spellEnd"/>
+      <w:r>
+        <w:rPr>
+          <w:rFonts w:cstheme="minorHAnsi"/>
+          <w:sz w:val="24"/>
+          <w:szCs w:val="24"/>
+        </w:rPr>
+        <w:t>, cada una con su respectiva vista, podremos cambiar la forma de comparación con el selector que se encuentra en la parte superior:</w:t>
+      </w:r>
+    </w:p>
+    <w:p>
+      <w:pPr>
+        <w:tabs>
+          <w:tab w:val="left" w:pos="1021"/>
+        </w:tabs>
+        <w:jc w:val="both"/>
+        <w:rPr>
+          <w:rFonts w:cstheme="minorHAnsi"/>
+          <w:sz w:val="24"/>
+          <w:szCs w:val="24"/>
+        </w:rPr>
+      </w:pPr>
+      <w:r>
+        <w:rPr>
+          <w:rFonts w:cstheme="minorHAnsi"/>
+          <w:noProof/>
+          <w:sz w:val="24"/>
+          <w:szCs w:val="24"/>
+        </w:rPr>
+        <w:drawing>
+          <wp:inline distT="0" distB="0" distL="0" distR="0" wp14:anchorId="267B8238" wp14:editId="6B3F5E68">
+            <wp:extent cx="3801005" cy="800212"/>
+            <wp:effectExtent l="0" t="0" r="0" b="0"/>
+            <wp:docPr id="1175390081" name="Imagen 1"/>
+            <wp:cNvGraphicFramePr>
+              <a:graphicFrameLocks xmlns:a="http://schemas.openxmlformats.org/drawingml/2006/main" noChangeAspect="1"/>
+            </wp:cNvGraphicFramePr>
+            <a:graphic xmlns:a="http://schemas.openxmlformats.org/drawingml/2006/main">
+              <a:graphicData uri="http://schemas.openxmlformats.org/drawingml/2006/picture">
+                <pic:pic xmlns:pic="http://schemas.openxmlformats.org/drawingml/2006/picture">
+                  <pic:nvPicPr>
+                    <pic:cNvPr id="1175390081" name=""/>
+                    <pic:cNvPicPr/>
+                  </pic:nvPicPr>
+                  <pic:blipFill>
+                    <a:blip r:embed="rId64"/>
+                    <a:stretch>
+                      <a:fillRect/>
+                    </a:stretch>
+                  </pic:blipFill>
+                  <pic:spPr>
+                    <a:xfrm>
+                      <a:off x="0" y="0"/>
+                      <a:ext cx="3801005" cy="800212"/>
+                    </a:xfrm>
+                    <a:prstGeom prst="rect">
+                      <a:avLst/>
+                    </a:prstGeom>
+                  </pic:spPr>
+                </pic:pic>
+              </a:graphicData>
+            </a:graphic>
+          </wp:inline>
+        </w:drawing>
+      </w:r>
+    </w:p>
+    <w:p>
+      <w:pPr>
+        <w:tabs>
+          <w:tab w:val="left" w:pos="1021"/>
+        </w:tabs>
+        <w:jc w:val="both"/>
+        <w:rPr>
+          <w:rFonts w:cstheme="minorHAnsi"/>
+          <w:sz w:val="24"/>
+          <w:szCs w:val="24"/>
+        </w:rPr>
+      </w:pPr>
+    </w:p>
+    <w:p>
+      <w:pPr>
+        <w:tabs>
+          <w:tab w:val="left" w:pos="1021"/>
+        </w:tabs>
+        <w:jc w:val="both"/>
+        <w:rPr>
+          <w:color w:val="002060"/>
+          <w:sz w:val="32"/>
+          <w:szCs w:val="32"/>
+        </w:rPr>
+      </w:pPr>
+      <w:r>
+        <w:rPr>
+          <w:color w:val="0070C0"/>
+          <w:sz w:val="26"/>
+          <w:szCs w:val="26"/>
+        </w:rPr>
+        <w:t>Comparación XML + EXCEL</w:t>
+      </w:r>
+    </w:p>
+    <w:p>
+      <w:pPr>
+        <w:tabs>
           <w:tab w:val="left" w:pos="1329"/>
         </w:tabs>
         <w:jc w:val="both"/>
@@ -11495,6 +12048,7 @@
       <w:r>
         <w:rPr>
           <w:rFonts w:cstheme="minorHAnsi"/>
+          <w:noProof/>
           <w:sz w:val="24"/>
           <w:szCs w:val="24"/>
         </w:rPr>
@@ -11514,7 +12068,7 @@
                     <pic:cNvPicPr/>
                   </pic:nvPicPr>
                   <pic:blipFill>
-                    <a:blip r:embed="rId62"/>
+                    <a:blip r:embed="rId65"/>
                     <a:stretch>
                       <a:fillRect/>
                     </a:stretch>
@@ -11547,14 +12101,6 @@
           <w:szCs w:val="24"/>
         </w:rPr>
       </w:pPr>
-      <w:r>
-        <w:rPr>
-          <w:rFonts w:cstheme="minorHAnsi"/>
-          <w:sz w:val="24"/>
-          <w:szCs w:val="24"/>
-        </w:rPr>
-        <w:t>Y se nos abrirá la ventana donde tenemos que seleccionar el archivo y darle a “Abrir”</w:t>
-      </w:r>
     </w:p>
     <w:p>
       <w:pPr>
@@ -11568,12 +12114,95 @@
           <w:szCs w:val="24"/>
         </w:rPr>
       </w:pPr>
-      <w:r>
-        <w:rPr>
-          <w:rFonts w:cstheme="minorHAnsi"/>
-          <w:sz w:val="24"/>
-          <w:szCs w:val="24"/>
-        </w:rPr>
+    </w:p>
+    <w:p>
+      <w:pPr>
+        <w:tabs>
+          <w:tab w:val="left" w:pos="1329"/>
+        </w:tabs>
+        <w:jc w:val="both"/>
+        <w:rPr>
+          <w:rFonts w:cstheme="minorHAnsi"/>
+          <w:sz w:val="24"/>
+          <w:szCs w:val="24"/>
+        </w:rPr>
+      </w:pPr>
+    </w:p>
+    <w:p>
+      <w:pPr>
+        <w:tabs>
+          <w:tab w:val="left" w:pos="1329"/>
+        </w:tabs>
+        <w:jc w:val="both"/>
+        <w:rPr>
+          <w:rFonts w:cstheme="minorHAnsi"/>
+          <w:sz w:val="24"/>
+          <w:szCs w:val="24"/>
+        </w:rPr>
+      </w:pPr>
+    </w:p>
+    <w:p>
+      <w:pPr>
+        <w:tabs>
+          <w:tab w:val="left" w:pos="1329"/>
+        </w:tabs>
+        <w:jc w:val="both"/>
+        <w:rPr>
+          <w:rFonts w:cstheme="minorHAnsi"/>
+          <w:sz w:val="24"/>
+          <w:szCs w:val="24"/>
+        </w:rPr>
+      </w:pPr>
+    </w:p>
+    <w:p>
+      <w:pPr>
+        <w:tabs>
+          <w:tab w:val="left" w:pos="1329"/>
+        </w:tabs>
+        <w:jc w:val="both"/>
+        <w:rPr>
+          <w:rFonts w:cstheme="minorHAnsi"/>
+          <w:sz w:val="24"/>
+          <w:szCs w:val="24"/>
+        </w:rPr>
+      </w:pPr>
+      <w:r>
+        <w:rPr>
+          <w:rFonts w:cstheme="minorHAnsi"/>
+          <w:sz w:val="24"/>
+          <w:szCs w:val="24"/>
+        </w:rPr>
+        <w:t>S</w:t>
+      </w:r>
+      <w:r>
+        <w:rPr>
+          <w:rFonts w:cstheme="minorHAnsi"/>
+          <w:sz w:val="24"/>
+          <w:szCs w:val="24"/>
+        </w:rPr>
+        <w:t>e nos abrirá la ventana donde tenemos que seleccionar el archivo y darle a “Abrir”</w:t>
+      </w:r>
+    </w:p>
+    <w:p>
+      <w:pPr>
+        <w:tabs>
+          <w:tab w:val="left" w:pos="1329"/>
+        </w:tabs>
+        <w:jc w:val="both"/>
+        <w:rPr>
+          <w:rFonts w:cstheme="minorHAnsi"/>
+          <w:sz w:val="24"/>
+          <w:szCs w:val="24"/>
+        </w:rPr>
+      </w:pPr>
+      <w:r>
+        <w:rPr>
+          <w:rFonts w:cstheme="minorHAnsi"/>
+          <w:noProof/>
+          <w:sz w:val="24"/>
+          <w:szCs w:val="24"/>
+        </w:rPr>
+        <w:lastRenderedPageBreak/>
         <w:drawing>
           <wp:inline distT="0" distB="0" distL="0" distR="0" wp14:anchorId="3CA4F847" wp14:editId="389533CB">
             <wp:extent cx="5400040" cy="3042920"/>
@@ -11590,7 +12219,7 @@
                     <pic:cNvPicPr/>
                   </pic:nvPicPr>
                   <pic:blipFill>
-                    <a:blip r:embed="rId63"/>
+                    <a:blip r:embed="rId66"/>
                     <a:stretch>
                       <a:fillRect/>
                     </a:stretch>
@@ -11623,6 +12252,14 @@
           <w:szCs w:val="24"/>
         </w:rPr>
       </w:pPr>
+      <w:r>
+        <w:rPr>
+          <w:rFonts w:cstheme="minorHAnsi"/>
+          <w:sz w:val="24"/>
+          <w:szCs w:val="24"/>
+        </w:rPr>
+        <w:t>Una vez seleccionados los 2 archivos se nos cargarán en la vista:</w:t>
+      </w:r>
     </w:p>
     <w:p>
       <w:pPr>
@@ -11639,28 +12276,7 @@
       <w:r>
         <w:rPr>
           <w:rFonts w:cstheme="minorHAnsi"/>
-          <w:sz w:val="24"/>
-          <w:szCs w:val="24"/>
-        </w:rPr>
-        <w:lastRenderedPageBreak/>
-        <w:t>Una vez seleccionados los 2 archivos se nos cargarán en la vista:</w:t>
-      </w:r>
-    </w:p>
-    <w:p>
-      <w:pPr>
-        <w:tabs>
-          <w:tab w:val="left" w:pos="1329"/>
-        </w:tabs>
-        <w:jc w:val="both"/>
-        <w:rPr>
-          <w:rFonts w:cstheme="minorHAnsi"/>
-          <w:sz w:val="24"/>
-          <w:szCs w:val="24"/>
-        </w:rPr>
-      </w:pPr>
-      <w:r>
-        <w:rPr>
-          <w:rFonts w:cstheme="minorHAnsi"/>
+          <w:noProof/>
           <w:sz w:val="24"/>
           <w:szCs w:val="24"/>
         </w:rPr>
@@ -11680,7 +12296,7 @@
                     <pic:cNvPicPr/>
                   </pic:nvPicPr>
                   <pic:blipFill>
-                    <a:blip r:embed="rId64"/>
+                    <a:blip r:embed="rId67"/>
                     <a:stretch>
                       <a:fillRect/>
                     </a:stretch>
@@ -11755,6 +12371,7 @@
       <w:r>
         <w:rPr>
           <w:rFonts w:cstheme="minorHAnsi"/>
+          <w:noProof/>
           <w:sz w:val="24"/>
           <w:szCs w:val="24"/>
         </w:rPr>
@@ -11774,7 +12391,7 @@
                     <pic:cNvPicPr/>
                   </pic:nvPicPr>
                   <pic:blipFill>
-                    <a:blip r:embed="rId65"/>
+                    <a:blip r:embed="rId68"/>
                     <a:stretch>
                       <a:fillRect/>
                     </a:stretch>
@@ -11807,6 +12424,32 @@
           <w:szCs w:val="24"/>
         </w:rPr>
       </w:pPr>
+    </w:p>
+    <w:p>
+      <w:pPr>
+        <w:tabs>
+          <w:tab w:val="left" w:pos="1329"/>
+        </w:tabs>
+        <w:jc w:val="both"/>
+        <w:rPr>
+          <w:rFonts w:cstheme="minorHAnsi"/>
+          <w:sz w:val="24"/>
+          <w:szCs w:val="24"/>
+        </w:rPr>
+      </w:pPr>
+    </w:p>
+    <w:p>
+      <w:pPr>
+        <w:tabs>
+          <w:tab w:val="left" w:pos="1329"/>
+        </w:tabs>
+        <w:jc w:val="both"/>
+        <w:rPr>
+          <w:rFonts w:cstheme="minorHAnsi"/>
+          <w:sz w:val="24"/>
+          <w:szCs w:val="24"/>
+        </w:rPr>
+      </w:pPr>
       <w:r>
         <w:rPr>
           <w:rFonts w:cstheme="minorHAnsi"/>
@@ -11835,6 +12478,7 @@
           <w:sz w:val="24"/>
           <w:szCs w:val="24"/>
         </w:rPr>
+        <w:lastRenderedPageBreak/>
         <mc:AlternateContent>
           <mc:Choice Requires="wps">
             <w:drawing>
@@ -11883,19 +12527,7 @@
                         <w:txbxContent>
                           <w:p>
                             <w:r>
-                              <w:t xml:space="preserve">Estos datos </w:t>
-                            </w:r>
-                            <w:r>
-                              <w:t xml:space="preserve">no </w:t>
-                            </w:r>
-                            <w:r>
-                              <w:t xml:space="preserve">existen </w:t>
-                            </w:r>
-                            <w:r>
-                              <w:t xml:space="preserve">o son distintos </w:t>
-                            </w:r>
-                            <w:r>
-                              <w:t>en el XML</w:t>
+                              <w:t>Estos datos no existen o son distintos en el XML</w:t>
                             </w:r>
                           </w:p>
                         </w:txbxContent>
@@ -11922,19 +12554,7 @@
                   <w:txbxContent>
                     <w:p>
                       <w:r>
-                        <w:t xml:space="preserve">Estos datos </w:t>
-                      </w:r>
-                      <w:r>
-                        <w:t xml:space="preserve">no </w:t>
-                      </w:r>
-                      <w:r>
-                        <w:t xml:space="preserve">existen </w:t>
-                      </w:r>
-                      <w:r>
-                        <w:t xml:space="preserve">o son distintos </w:t>
-                      </w:r>
-                      <w:r>
-                        <w:t>en el XML</w:t>
+                        <w:t>Estos datos no existen o son distintos en el XML</w:t>
                       </w:r>
                     </w:p>
                   </w:txbxContent>
@@ -12041,6 +12661,7 @@
       <w:r>
         <w:rPr>
           <w:rFonts w:cstheme="minorHAnsi"/>
+          <w:noProof/>
           <w:sz w:val="24"/>
           <w:szCs w:val="24"/>
         </w:rPr>
@@ -12060,7 +12681,7 @@
                     <pic:cNvPicPr/>
                   </pic:nvPicPr>
                   <pic:blipFill>
-                    <a:blip r:embed="rId66"/>
+                    <a:blip r:embed="rId69"/>
                     <a:stretch>
                       <a:fillRect/>
                     </a:stretch>
@@ -12093,6 +12714,32 @@
           <w:szCs w:val="24"/>
         </w:rPr>
       </w:pPr>
+      <w:r>
+        <w:rPr>
+          <w:rFonts w:cstheme="minorHAnsi"/>
+          <w:sz w:val="24"/>
+          <w:szCs w:val="24"/>
+        </w:rPr>
+        <w:t xml:space="preserve">y en el panel del XML vemos como aparecen resaltados los </w:t>
+      </w:r>
+      <w:proofErr w:type="spellStart"/>
+      <w:r>
+        <w:rPr>
+          <w:rFonts w:cstheme="minorHAnsi"/>
+          <w:sz w:val="24"/>
+          <w:szCs w:val="24"/>
+        </w:rPr>
+        <w:t>APNs</w:t>
+      </w:r>
+      <w:proofErr w:type="spellEnd"/>
+      <w:r>
+        <w:rPr>
+          <w:rFonts w:cstheme="minorHAnsi"/>
+          <w:sz w:val="24"/>
+          <w:szCs w:val="24"/>
+        </w:rPr>
+        <w:t xml:space="preserve"> encontrados que coinciden con los del Excel.</w:t>
+      </w:r>
     </w:p>
     <w:p>
       <w:pPr>
@@ -12106,127 +12753,10 @@
           <w:szCs w:val="24"/>
         </w:rPr>
       </w:pPr>
-    </w:p>
-    <w:p>
-      <w:pPr>
-        <w:tabs>
-          <w:tab w:val="left" w:pos="1329"/>
-        </w:tabs>
-        <w:jc w:val="both"/>
-        <w:rPr>
-          <w:rFonts w:cstheme="minorHAnsi"/>
-          <w:sz w:val="24"/>
-          <w:szCs w:val="24"/>
-        </w:rPr>
-      </w:pPr>
-    </w:p>
-    <w:p>
-      <w:pPr>
-        <w:tabs>
-          <w:tab w:val="left" w:pos="1329"/>
-        </w:tabs>
-        <w:jc w:val="both"/>
-        <w:rPr>
-          <w:rFonts w:cstheme="minorHAnsi"/>
-          <w:sz w:val="24"/>
-          <w:szCs w:val="24"/>
-        </w:rPr>
-      </w:pPr>
-    </w:p>
-    <w:p>
-      <w:pPr>
-        <w:tabs>
-          <w:tab w:val="left" w:pos="1329"/>
-        </w:tabs>
-        <w:jc w:val="both"/>
-        <w:rPr>
-          <w:rFonts w:cstheme="minorHAnsi"/>
-          <w:sz w:val="24"/>
-          <w:szCs w:val="24"/>
-        </w:rPr>
-      </w:pPr>
-    </w:p>
-    <w:p>
-      <w:pPr>
-        <w:tabs>
-          <w:tab w:val="left" w:pos="1329"/>
-        </w:tabs>
-        <w:jc w:val="both"/>
-        <w:rPr>
-          <w:rFonts w:cstheme="minorHAnsi"/>
-          <w:sz w:val="24"/>
-          <w:szCs w:val="24"/>
-        </w:rPr>
-      </w:pPr>
-    </w:p>
-    <w:p>
-      <w:pPr>
-        <w:tabs>
-          <w:tab w:val="left" w:pos="1329"/>
-        </w:tabs>
-        <w:jc w:val="both"/>
-        <w:rPr>
-          <w:rFonts w:cstheme="minorHAnsi"/>
-          <w:sz w:val="24"/>
-          <w:szCs w:val="24"/>
-        </w:rPr>
-      </w:pPr>
-    </w:p>
-    <w:p>
-      <w:pPr>
-        <w:tabs>
-          <w:tab w:val="left" w:pos="1329"/>
-        </w:tabs>
-        <w:jc w:val="both"/>
-        <w:rPr>
-          <w:rFonts w:cstheme="minorHAnsi"/>
-          <w:sz w:val="24"/>
-          <w:szCs w:val="24"/>
-        </w:rPr>
-      </w:pPr>
-      <w:r>
-        <w:rPr>
-          <w:rFonts w:cstheme="minorHAnsi"/>
-          <w:sz w:val="24"/>
-          <w:szCs w:val="24"/>
-        </w:rPr>
-        <w:lastRenderedPageBreak/>
-        <w:t xml:space="preserve">y en el panel del XML vemos como aparecen resaltados los </w:t>
-      </w:r>
-      <w:proofErr w:type="spellStart"/>
-      <w:r>
-        <w:rPr>
-          <w:rFonts w:cstheme="minorHAnsi"/>
-          <w:sz w:val="24"/>
-          <w:szCs w:val="24"/>
-        </w:rPr>
-        <w:t>APNs</w:t>
-      </w:r>
-      <w:proofErr w:type="spellEnd"/>
-      <w:r>
-        <w:rPr>
-          <w:rFonts w:cstheme="minorHAnsi"/>
-          <w:sz w:val="24"/>
-          <w:szCs w:val="24"/>
-        </w:rPr>
-        <w:t xml:space="preserve"> encontrados que coinciden con los del Excel.</w:t>
-      </w:r>
-    </w:p>
-    <w:p>
-      <w:pPr>
-        <w:tabs>
-          <w:tab w:val="left" w:pos="1329"/>
-        </w:tabs>
-        <w:jc w:val="both"/>
-        <w:rPr>
-          <w:rFonts w:cstheme="minorHAnsi"/>
-          <w:sz w:val="24"/>
-          <w:szCs w:val="24"/>
-        </w:rPr>
-      </w:pPr>
-      <w:r>
-        <w:rPr>
-          <w:rFonts w:cstheme="minorHAnsi"/>
+      <w:r>
+        <w:rPr>
+          <w:rFonts w:cstheme="minorHAnsi"/>
+          <w:noProof/>
           <w:sz w:val="24"/>
           <w:szCs w:val="24"/>
         </w:rPr>
@@ -12246,7 +12776,7 @@
                     <pic:cNvPicPr/>
                   </pic:nvPicPr>
                   <pic:blipFill>
-                    <a:blip r:embed="rId67"/>
+                    <a:blip r:embed="rId70"/>
                     <a:stretch>
                       <a:fillRect/>
                     </a:stretch>
@@ -12370,6 +12900,14 @@
           <w:szCs w:val="24"/>
         </w:rPr>
       </w:pPr>
+      <w:r>
+        <w:rPr>
+          <w:rFonts w:cstheme="minorHAnsi"/>
+          <w:sz w:val="24"/>
+          <w:szCs w:val="24"/>
+        </w:rPr>
+        <w:t>Controlaremos la edición del archivo mediante el panel de control que aparece encima del panel del Excel</w:t>
+      </w:r>
     </w:p>
     <w:p>
       <w:pPr>
@@ -12383,86 +12921,14 @@
           <w:szCs w:val="24"/>
         </w:rPr>
       </w:pPr>
-    </w:p>
-    <w:p>
-      <w:pPr>
-        <w:tabs>
-          <w:tab w:val="left" w:pos="1329"/>
-        </w:tabs>
-        <w:jc w:val="both"/>
-        <w:rPr>
-          <w:rFonts w:cstheme="minorHAnsi"/>
-          <w:sz w:val="24"/>
-          <w:szCs w:val="24"/>
-        </w:rPr>
-      </w:pPr>
-    </w:p>
-    <w:p>
-      <w:pPr>
-        <w:tabs>
-          <w:tab w:val="left" w:pos="1329"/>
-        </w:tabs>
-        <w:jc w:val="both"/>
-        <w:rPr>
-          <w:rFonts w:cstheme="minorHAnsi"/>
-          <w:sz w:val="24"/>
-          <w:szCs w:val="24"/>
-        </w:rPr>
-      </w:pPr>
-    </w:p>
-    <w:p>
-      <w:pPr>
-        <w:tabs>
-          <w:tab w:val="left" w:pos="1329"/>
-        </w:tabs>
-        <w:jc w:val="both"/>
-        <w:rPr>
-          <w:rFonts w:cstheme="minorHAnsi"/>
-          <w:sz w:val="24"/>
-          <w:szCs w:val="24"/>
-        </w:rPr>
-      </w:pPr>
-    </w:p>
-    <w:p>
-      <w:pPr>
-        <w:tabs>
-          <w:tab w:val="left" w:pos="1329"/>
-        </w:tabs>
-        <w:jc w:val="both"/>
-        <w:rPr>
-          <w:rFonts w:cstheme="minorHAnsi"/>
-          <w:sz w:val="24"/>
-          <w:szCs w:val="24"/>
-        </w:rPr>
-      </w:pPr>
-      <w:r>
-        <w:rPr>
-          <w:rFonts w:cstheme="minorHAnsi"/>
+      <w:r>
+        <w:rPr>
+          <w:rFonts w:cstheme="minorHAnsi"/>
+          <w:noProof/>
           <w:sz w:val="24"/>
           <w:szCs w:val="24"/>
         </w:rPr>
         <w:lastRenderedPageBreak/>
-        <w:t>Controlaremos la edición del archivo mediante el panel de control que aparece encima del panel del Excel</w:t>
-      </w:r>
-    </w:p>
-    <w:p>
-      <w:pPr>
-        <w:tabs>
-          <w:tab w:val="left" w:pos="1329"/>
-        </w:tabs>
-        <w:jc w:val="both"/>
-        <w:rPr>
-          <w:rFonts w:cstheme="minorHAnsi"/>
-          <w:sz w:val="24"/>
-          <w:szCs w:val="24"/>
-        </w:rPr>
-      </w:pPr>
-      <w:r>
-        <w:rPr>
-          <w:rFonts w:cstheme="minorHAnsi"/>
-          <w:sz w:val="24"/>
-          <w:szCs w:val="24"/>
-        </w:rPr>
         <w:drawing>
           <wp:inline distT="0" distB="0" distL="0" distR="0" wp14:anchorId="42F55150" wp14:editId="0AD5FA7F">
             <wp:extent cx="4572000" cy="4558019"/>
@@ -12479,7 +12945,7 @@
                     <pic:cNvPicPr/>
                   </pic:nvPicPr>
                   <pic:blipFill>
-                    <a:blip r:embed="rId68"/>
+                    <a:blip r:embed="rId71"/>
                     <a:stretch>
                       <a:fillRect/>
                     </a:stretch>

</xml_diff>

<commit_message>
Manual de usuario + Primera estructura de los bloques IOT
</commit_message>
<xml_diff>
--- a/doc/Manual De Usuario.docx
+++ b/doc/Manual De Usuario.docx
@@ -303,7 +303,7 @@
           <w:szCs w:val="24"/>
         </w:rPr>
         <w:drawing>
-          <wp:inline distT="0" distB="0" distL="0" distR="0" wp14:anchorId="698E36EB" wp14:editId="4FCCCA78">
+          <wp:inline distT="0" distB="0" distL="0" distR="0" wp14:anchorId="698E36EB" wp14:editId="70C6A0B8">
             <wp:extent cx="5400040" cy="2348948"/>
             <wp:effectExtent l="0" t="0" r="0" b="0"/>
             <wp:docPr id="1508712064" name="Imagen 2"/>
@@ -5528,12 +5528,33 @@
           <w:szCs w:val="26"/>
         </w:rPr>
       </w:pPr>
-      <w:r>
+    </w:p>
+    <w:p>
+      <w:pPr>
+        <w:jc w:val="both"/>
         <w:rPr>
           <w:color w:val="0070C0"/>
           <w:sz w:val="26"/>
           <w:szCs w:val="26"/>
         </w:rPr>
+      </w:pPr>
+    </w:p>
+    <w:p>
+      <w:pPr>
+        <w:jc w:val="both"/>
+        <w:rPr>
+          <w:color w:val="0070C0"/>
+          <w:sz w:val="26"/>
+          <w:szCs w:val="26"/>
+        </w:rPr>
+      </w:pPr>
+      <w:r>
+        <w:rPr>
+          <w:color w:val="0070C0"/>
+          <w:sz w:val="26"/>
+          <w:szCs w:val="26"/>
+        </w:rPr>
+        <w:lastRenderedPageBreak/>
         <w:t>Ajustes Rápidos</w:t>
       </w:r>
     </w:p>
@@ -5550,7 +5571,6 @@
           <w:sz w:val="24"/>
           <w:szCs w:val="24"/>
         </w:rPr>
-        <w:lastRenderedPageBreak/>
         <w:t xml:space="preserve">A </w:t>
       </w:r>
       <w:r>
@@ -5751,16 +5771,16 @@
           <w:szCs w:val="24"/>
         </w:rPr>
         <w:drawing>
-          <wp:anchor distT="0" distB="0" distL="114300" distR="114300" simplePos="0" relativeHeight="251668480" behindDoc="0" locked="0" layoutInCell="1" allowOverlap="1" wp14:anchorId="5DE7E0B8" wp14:editId="1310EB9E">
+          <wp:anchor distT="0" distB="0" distL="114300" distR="114300" simplePos="0" relativeHeight="251668480" behindDoc="0" locked="0" layoutInCell="1" allowOverlap="1" wp14:anchorId="5DE7E0B8" wp14:editId="6C571A59">
             <wp:simplePos x="0" y="0"/>
             <wp:positionH relativeFrom="margin">
-              <wp:posOffset>1635125</wp:posOffset>
+              <wp:posOffset>1243330</wp:posOffset>
             </wp:positionH>
             <wp:positionV relativeFrom="paragraph">
-              <wp:posOffset>55538</wp:posOffset>
+              <wp:posOffset>44450</wp:posOffset>
             </wp:positionV>
-            <wp:extent cx="2179675" cy="3752953"/>
-            <wp:effectExtent l="0" t="0" r="0" b="0"/>
+            <wp:extent cx="3095625" cy="5330031"/>
+            <wp:effectExtent l="0" t="0" r="0" b="4445"/>
             <wp:wrapNone/>
             <wp:docPr id="531779554" name="Imagen 1"/>
             <wp:cNvGraphicFramePr>
@@ -5789,7 +5809,7 @@
                   <pic:spPr bwMode="auto">
                     <a:xfrm>
                       <a:off x="0" y="0"/>
-                      <a:ext cx="2179675" cy="3752953"/>
+                      <a:ext cx="3095625" cy="5330031"/>
                     </a:xfrm>
                     <a:prstGeom prst="rect">
                       <a:avLst/>
@@ -5920,15 +5940,108 @@
       <w:pPr>
         <w:jc w:val="both"/>
         <w:rPr>
-          <w:sz w:val="24"/>
-          <w:szCs w:val="24"/>
-        </w:rPr>
-      </w:pPr>
-      <w:r>
-        <w:rPr>
-          <w:sz w:val="24"/>
-          <w:szCs w:val="24"/>
-        </w:rPr>
+          <w:rFonts w:cstheme="minorHAnsi"/>
+          <w:sz w:val="24"/>
+          <w:szCs w:val="24"/>
+        </w:rPr>
+      </w:pPr>
+    </w:p>
+    <w:p>
+      <w:pPr>
+        <w:jc w:val="both"/>
+        <w:rPr>
+          <w:rFonts w:cstheme="minorHAnsi"/>
+          <w:sz w:val="24"/>
+          <w:szCs w:val="24"/>
+        </w:rPr>
+      </w:pPr>
+    </w:p>
+    <w:p>
+      <w:pPr>
+        <w:jc w:val="both"/>
+        <w:rPr>
+          <w:sz w:val="24"/>
+          <w:szCs w:val="24"/>
+        </w:rPr>
+      </w:pPr>
+    </w:p>
+    <w:p>
+      <w:pPr>
+        <w:jc w:val="both"/>
+        <w:rPr>
+          <w:sz w:val="24"/>
+          <w:szCs w:val="24"/>
+        </w:rPr>
+      </w:pPr>
+    </w:p>
+    <w:p>
+      <w:pPr>
+        <w:jc w:val="both"/>
+        <w:rPr>
+          <w:sz w:val="24"/>
+          <w:szCs w:val="24"/>
+        </w:rPr>
+      </w:pPr>
+    </w:p>
+    <w:p>
+      <w:pPr>
+        <w:jc w:val="both"/>
+        <w:rPr>
+          <w:sz w:val="24"/>
+          <w:szCs w:val="24"/>
+        </w:rPr>
+      </w:pPr>
+    </w:p>
+    <w:p>
+      <w:pPr>
+        <w:jc w:val="both"/>
+        <w:rPr>
+          <w:sz w:val="24"/>
+          <w:szCs w:val="24"/>
+        </w:rPr>
+      </w:pPr>
+    </w:p>
+    <w:p>
+      <w:pPr>
+        <w:jc w:val="both"/>
+        <w:rPr>
+          <w:sz w:val="24"/>
+          <w:szCs w:val="24"/>
+        </w:rPr>
+      </w:pPr>
+    </w:p>
+    <w:p>
+      <w:pPr>
+        <w:jc w:val="both"/>
+        <w:rPr>
+          <w:sz w:val="24"/>
+          <w:szCs w:val="24"/>
+        </w:rPr>
+      </w:pPr>
+    </w:p>
+    <w:p>
+      <w:pPr>
+        <w:jc w:val="both"/>
+        <w:rPr>
+          <w:sz w:val="24"/>
+          <w:szCs w:val="24"/>
+        </w:rPr>
+      </w:pPr>
+    </w:p>
+    <w:p>
+      <w:pPr>
+        <w:jc w:val="both"/>
+        <w:rPr>
+          <w:sz w:val="24"/>
+          <w:szCs w:val="24"/>
+        </w:rPr>
+      </w:pPr>
+      <w:r>
+        <w:rPr>
+          <w:sz w:val="24"/>
+          <w:szCs w:val="24"/>
+        </w:rPr>
+        <w:lastRenderedPageBreak/>
         <w:t>Para listar aplicaciones del sistema deberá pulsar en Listar y la aplicación detectará todas las aplicaciones que tiene instalada el dispositivo conectado.</w:t>
       </w:r>
     </w:p>
@@ -5949,13 +6062,13 @@
           <w:szCs w:val="24"/>
         </w:rPr>
         <w:drawing>
-          <wp:anchor distT="0" distB="0" distL="114300" distR="114300" simplePos="0" relativeHeight="251669504" behindDoc="0" locked="0" layoutInCell="1" allowOverlap="1" wp14:anchorId="047002B1" wp14:editId="2C32EC6B">
+          <wp:anchor distT="0" distB="0" distL="114300" distR="114300" simplePos="0" relativeHeight="251669504" behindDoc="0" locked="0" layoutInCell="1" allowOverlap="1" wp14:anchorId="047002B1" wp14:editId="6AC24BFA">
             <wp:simplePos x="0" y="0"/>
             <wp:positionH relativeFrom="column">
-              <wp:posOffset>544078</wp:posOffset>
+              <wp:posOffset>695960</wp:posOffset>
             </wp:positionH>
             <wp:positionV relativeFrom="paragraph">
-              <wp:posOffset>120478</wp:posOffset>
+              <wp:posOffset>167640</wp:posOffset>
             </wp:positionV>
             <wp:extent cx="4067743" cy="4734586"/>
             <wp:effectExtent l="0" t="0" r="9525" b="8890"/>
@@ -6375,6 +6488,7 @@
           <w:sz w:val="24"/>
           <w:szCs w:val="24"/>
         </w:rPr>
+        <w:lastRenderedPageBreak/>
         <w:t xml:space="preserve">*Ejemplo de </w:t>
       </w:r>
       <w:proofErr w:type="spellStart"/>
@@ -6612,7 +6726,6 @@
           <w:sz w:val="24"/>
           <w:szCs w:val="24"/>
         </w:rPr>
-        <w:lastRenderedPageBreak/>
         <w:drawing>
           <wp:anchor distT="0" distB="0" distL="114300" distR="114300" simplePos="0" relativeHeight="251672576" behindDoc="0" locked="0" layoutInCell="1" allowOverlap="1" wp14:anchorId="7E1A0A5F" wp14:editId="1D68601C">
             <wp:simplePos x="0" y="0"/>
@@ -6850,6 +6963,7 @@
           <w:sz w:val="24"/>
           <w:szCs w:val="24"/>
         </w:rPr>
+        <w:lastRenderedPageBreak/>
         <w:t xml:space="preserve">Si hacemos clic en Iniciar </w:t>
       </w:r>
       <w:r>
@@ -7266,6 +7380,7 @@
           <w:sz w:val="24"/>
           <w:szCs w:val="24"/>
         </w:rPr>
+        <w:lastRenderedPageBreak/>
         <w:t xml:space="preserve">Rotación de </w:t>
       </w:r>
       <w:r>
@@ -7897,6 +8012,7 @@
           <w:sz w:val="26"/>
           <w:szCs w:val="26"/>
         </w:rPr>
+        <w:lastRenderedPageBreak/>
         <w:t>Red e IMS:</w:t>
       </w:r>
     </w:p>
@@ -8398,6 +8514,7 @@
           <w:sz w:val="24"/>
           <w:szCs w:val="24"/>
         </w:rPr>
+        <w:lastRenderedPageBreak/>
         <w:t>-Para la conexión por USB, asegúrese nuevamente que el cable USB esté correctamente conectado del móvil al pc.</w:t>
       </w:r>
     </w:p>
@@ -8769,6 +8886,7 @@
           <w:sz w:val="32"/>
           <w:szCs w:val="32"/>
         </w:rPr>
+        <w:lastRenderedPageBreak/>
         <w:t>Herramienta de Análisis Energético y Rendimiento</w:t>
       </w:r>
     </w:p>
@@ -8955,7 +9073,6 @@
           <w:sz w:val="24"/>
           <w:szCs w:val="24"/>
         </w:rPr>
-        <w:lastRenderedPageBreak/>
         <w:drawing>
           <wp:inline distT="0" distB="0" distL="0" distR="0" wp14:anchorId="70646CAA" wp14:editId="08FBC507">
             <wp:extent cx="5400040" cy="4538980"/>
@@ -9054,6 +9171,7 @@
           <w:sz w:val="24"/>
           <w:szCs w:val="24"/>
         </w:rPr>
+        <w:lastRenderedPageBreak/>
         <w:t xml:space="preserve">Introducir un </w:t>
       </w:r>
       <w:r>
@@ -9431,7 +9549,6 @@
           <w:sz w:val="24"/>
           <w:szCs w:val="24"/>
         </w:rPr>
-        <w:lastRenderedPageBreak/>
         <w:drawing>
           <wp:anchor distT="0" distB="0" distL="114300" distR="114300" simplePos="0" relativeHeight="251680768" behindDoc="0" locked="0" layoutInCell="1" allowOverlap="1" wp14:anchorId="7390B933" wp14:editId="1CA5E5B5">
             <wp:simplePos x="0" y="0"/>
@@ -10494,6 +10611,7 @@
           <w:sz w:val="24"/>
           <w:szCs w:val="24"/>
         </w:rPr>
+        <w:lastRenderedPageBreak/>
         <w:t>.</w:t>
       </w:r>
       <w:proofErr w:type="spellStart"/>
@@ -11256,6 +11374,20 @@
           <w:szCs w:val="24"/>
         </w:rPr>
       </w:pPr>
+    </w:p>
+    <w:p>
+      <w:pPr>
+        <w:tabs>
+          <w:tab w:val="left" w:pos="1329"/>
+        </w:tabs>
+        <w:jc w:val="both"/>
+        <w:rPr>
+          <w:rFonts w:cstheme="minorHAnsi"/>
+          <w:color w:val="4472C4" w:themeColor="accent1"/>
+          <w:sz w:val="24"/>
+          <w:szCs w:val="24"/>
+        </w:rPr>
+      </w:pPr>
       <w:r>
         <w:rPr>
           <w:rFonts w:cstheme="minorHAnsi"/>
@@ -11591,32 +11723,6 @@
         </w:tabs>
         <w:jc w:val="both"/>
         <w:rPr>
-          <w:rFonts w:cstheme="minorHAnsi"/>
-          <w:sz w:val="24"/>
-          <w:szCs w:val="24"/>
-        </w:rPr>
-      </w:pPr>
-    </w:p>
-    <w:p>
-      <w:pPr>
-        <w:tabs>
-          <w:tab w:val="left" w:pos="1021"/>
-        </w:tabs>
-        <w:jc w:val="both"/>
-        <w:rPr>
-          <w:rFonts w:cstheme="minorHAnsi"/>
-          <w:sz w:val="24"/>
-          <w:szCs w:val="24"/>
-        </w:rPr>
-      </w:pPr>
-    </w:p>
-    <w:p>
-      <w:pPr>
-        <w:tabs>
-          <w:tab w:val="left" w:pos="1021"/>
-        </w:tabs>
-        <w:jc w:val="both"/>
-        <w:rPr>
           <w:color w:val="002060"/>
           <w:sz w:val="32"/>
           <w:szCs w:val="32"/>
@@ -11826,9 +11932,9 @@
         </w:rPr>
         <w:lastRenderedPageBreak/>
         <w:drawing>
-          <wp:inline distT="0" distB="0" distL="0" distR="0" wp14:anchorId="5D3981AE" wp14:editId="779928F1">
-            <wp:extent cx="5400040" cy="3562350"/>
-            <wp:effectExtent l="0" t="0" r="0" b="0"/>
+          <wp:inline distT="0" distB="0" distL="0" distR="0" wp14:anchorId="5D3981AE" wp14:editId="1E70B33B">
+            <wp:extent cx="5255657" cy="3467100"/>
+            <wp:effectExtent l="0" t="0" r="2540" b="0"/>
             <wp:docPr id="591740170" name="Imagen 1"/>
             <wp:cNvGraphicFramePr>
               <a:graphicFrameLocks xmlns:a="http://schemas.openxmlformats.org/drawingml/2006/main" noChangeAspect="1"/>
@@ -11849,7 +11955,7 @@
                   <pic:spPr>
                     <a:xfrm>
                       <a:off x="0" y="0"/>
-                      <a:ext cx="5400040" cy="3562350"/>
+                      <a:ext cx="5280706" cy="3483624"/>
                     </a:xfrm>
                     <a:prstGeom prst="rect">
                       <a:avLst/>
@@ -12166,12 +12272,26 @@
           <w:szCs w:val="24"/>
         </w:rPr>
       </w:pPr>
-      <w:r>
-        <w:rPr>
-          <w:rFonts w:cstheme="minorHAnsi"/>
-          <w:sz w:val="24"/>
-          <w:szCs w:val="24"/>
-        </w:rPr>
+    </w:p>
+    <w:p>
+      <w:pPr>
+        <w:tabs>
+          <w:tab w:val="left" w:pos="1329"/>
+        </w:tabs>
+        <w:jc w:val="both"/>
+        <w:rPr>
+          <w:rFonts w:cstheme="minorHAnsi"/>
+          <w:sz w:val="24"/>
+          <w:szCs w:val="24"/>
+        </w:rPr>
+      </w:pPr>
+      <w:r>
+        <w:rPr>
+          <w:rFonts w:cstheme="minorHAnsi"/>
+          <w:sz w:val="24"/>
+          <w:szCs w:val="24"/>
+        </w:rPr>
+        <w:lastRenderedPageBreak/>
         <w:t>S</w:t>
       </w:r>
       <w:r>
@@ -12202,7 +12322,6 @@
           <w:sz w:val="24"/>
           <w:szCs w:val="24"/>
         </w:rPr>
-        <w:lastRenderedPageBreak/>
         <w:drawing>
           <wp:inline distT="0" distB="0" distL="0" distR="0" wp14:anchorId="3CA4F847" wp14:editId="389533CB">
             <wp:extent cx="5400040" cy="3042920"/>
@@ -12252,6 +12371,32 @@
           <w:szCs w:val="24"/>
         </w:rPr>
       </w:pPr>
+    </w:p>
+    <w:p>
+      <w:pPr>
+        <w:tabs>
+          <w:tab w:val="left" w:pos="1329"/>
+        </w:tabs>
+        <w:jc w:val="both"/>
+        <w:rPr>
+          <w:rFonts w:cstheme="minorHAnsi"/>
+          <w:sz w:val="24"/>
+          <w:szCs w:val="24"/>
+        </w:rPr>
+      </w:pPr>
+    </w:p>
+    <w:p>
+      <w:pPr>
+        <w:tabs>
+          <w:tab w:val="left" w:pos="1329"/>
+        </w:tabs>
+        <w:jc w:val="both"/>
+        <w:rPr>
+          <w:rFonts w:cstheme="minorHAnsi"/>
+          <w:sz w:val="24"/>
+          <w:szCs w:val="24"/>
+        </w:rPr>
+      </w:pPr>
       <w:r>
         <w:rPr>
           <w:rFonts w:cstheme="minorHAnsi"/>
@@ -12424,6 +12569,31 @@
           <w:szCs w:val="24"/>
         </w:rPr>
       </w:pPr>
+      <w:r>
+        <w:rPr>
+          <w:rFonts w:cstheme="minorHAnsi"/>
+          <w:sz w:val="24"/>
+          <w:szCs w:val="24"/>
+        </w:rPr>
+        <w:lastRenderedPageBreak/>
+        <w:t>Vemos como la información que no existe o es distinta aparece acentuada en amarillo</w:t>
+      </w:r>
+      <w:r>
+        <w:rPr>
+          <w:rFonts w:cstheme="minorHAnsi"/>
+          <w:sz w:val="24"/>
+          <w:szCs w:val="24"/>
+        </w:rPr>
+        <w:t>.</w:t>
+      </w:r>
+      <w:r>
+        <w:rPr>
+          <w:rFonts w:cstheme="minorHAnsi"/>
+          <w:sz w:val="24"/>
+          <w:szCs w:val="24"/>
+        </w:rPr>
+        <w:t xml:space="preserve"> </w:t>
+      </w:r>
     </w:p>
     <w:p>
       <w:pPr>
@@ -12437,40 +12607,6 @@
           <w:szCs w:val="24"/>
         </w:rPr>
       </w:pPr>
-    </w:p>
-    <w:p>
-      <w:pPr>
-        <w:tabs>
-          <w:tab w:val="left" w:pos="1329"/>
-        </w:tabs>
-        <w:jc w:val="both"/>
-        <w:rPr>
-          <w:rFonts w:cstheme="minorHAnsi"/>
-          <w:sz w:val="24"/>
-          <w:szCs w:val="24"/>
-        </w:rPr>
-      </w:pPr>
-      <w:r>
-        <w:rPr>
-          <w:rFonts w:cstheme="minorHAnsi"/>
-          <w:sz w:val="24"/>
-          <w:szCs w:val="24"/>
-        </w:rPr>
-        <w:t xml:space="preserve">Vemos como la información que no existe o es distinta aparece acentuada en amarillo </w:t>
-      </w:r>
-    </w:p>
-    <w:p>
-      <w:pPr>
-        <w:tabs>
-          <w:tab w:val="left" w:pos="1329"/>
-        </w:tabs>
-        <w:jc w:val="both"/>
-        <w:rPr>
-          <w:rFonts w:cstheme="minorHAnsi"/>
-          <w:sz w:val="24"/>
-          <w:szCs w:val="24"/>
-        </w:rPr>
-      </w:pPr>
       <w:r>
         <w:rPr>
           <w:rFonts w:cstheme="minorHAnsi"/>
@@ -12478,7 +12614,6 @@
           <w:sz w:val="24"/>
           <w:szCs w:val="24"/>
         </w:rPr>
-        <w:lastRenderedPageBreak/>
         <mc:AlternateContent>
           <mc:Choice Requires="wps">
             <w:drawing>
@@ -12807,8 +12942,35 @@
           <w:rFonts w:cstheme="minorHAnsi"/>
           <w:sz w:val="24"/>
           <w:szCs w:val="24"/>
-        </w:rPr>
-      </w:pPr>
+          <w:u w:val="single"/>
+        </w:rPr>
+      </w:pPr>
+      <w:r>
+        <w:rPr>
+          <w:rFonts w:cstheme="minorHAnsi"/>
+          <w:sz w:val="24"/>
+          <w:szCs w:val="24"/>
+        </w:rPr>
+        <w:t xml:space="preserve">Para poder localizar los </w:t>
+      </w:r>
+      <w:proofErr w:type="spellStart"/>
+      <w:r>
+        <w:rPr>
+          <w:rFonts w:cstheme="minorHAnsi"/>
+          <w:sz w:val="24"/>
+          <w:szCs w:val="24"/>
+        </w:rPr>
+        <w:t>APNs</w:t>
+      </w:r>
+      <w:proofErr w:type="spellEnd"/>
+      <w:r>
+        <w:rPr>
+          <w:rFonts w:cstheme="minorHAnsi"/>
+          <w:sz w:val="24"/>
+          <w:szCs w:val="24"/>
+        </w:rPr>
+        <w:t xml:space="preserve"> basta con hacer clic en el titulo de un APN del Excel y el XML colocará su correspondiente en la parte superior del panel.</w:t>
+      </w:r>
     </w:p>
     <w:p>
       <w:pPr>
@@ -12822,6 +12984,48 @@
           <w:szCs w:val="24"/>
         </w:rPr>
       </w:pPr>
+      <w:r>
+        <w:rPr>
+          <w:rFonts w:cstheme="minorHAnsi"/>
+          <w:sz w:val="24"/>
+          <w:szCs w:val="24"/>
+        </w:rPr>
+        <w:drawing>
+          <wp:inline distT="0" distB="0" distL="0" distR="0" wp14:anchorId="3783C14E" wp14:editId="13D21A2B">
+            <wp:extent cx="4570630" cy="1381125"/>
+            <wp:effectExtent l="0" t="0" r="1905" b="0"/>
+            <wp:docPr id="802205984" name="Imagen 1"/>
+            <wp:cNvGraphicFramePr>
+              <a:graphicFrameLocks xmlns:a="http://schemas.openxmlformats.org/drawingml/2006/main" noChangeAspect="1"/>
+            </wp:cNvGraphicFramePr>
+            <a:graphic xmlns:a="http://schemas.openxmlformats.org/drawingml/2006/main">
+              <a:graphicData uri="http://schemas.openxmlformats.org/drawingml/2006/picture">
+                <pic:pic xmlns:pic="http://schemas.openxmlformats.org/drawingml/2006/picture">
+                  <pic:nvPicPr>
+                    <pic:cNvPr id="802205984" name=""/>
+                    <pic:cNvPicPr/>
+                  </pic:nvPicPr>
+                  <pic:blipFill>
+                    <a:blip r:embed="rId71"/>
+                    <a:stretch>
+                      <a:fillRect/>
+                    </a:stretch>
+                  </pic:blipFill>
+                  <pic:spPr>
+                    <a:xfrm>
+                      <a:off x="0" y="0"/>
+                      <a:ext cx="4604777" cy="1391443"/>
+                    </a:xfrm>
+                    <a:prstGeom prst="rect">
+                      <a:avLst/>
+                    </a:prstGeom>
+                  </pic:spPr>
+                </pic:pic>
+              </a:graphicData>
+            </a:graphic>
+          </wp:inline>
+        </w:drawing>
+      </w:r>
     </w:p>
     <w:p>
       <w:pPr>
@@ -12835,6 +13039,31 @@
           <w:szCs w:val="24"/>
         </w:rPr>
       </w:pPr>
+      <w:r>
+        <w:rPr>
+          <w:rFonts w:cstheme="minorHAnsi"/>
+          <w:sz w:val="24"/>
+          <w:szCs w:val="24"/>
+        </w:rPr>
+        <w:lastRenderedPageBreak/>
+        <w:t xml:space="preserve">Controlaremos la edición del archivo mediante el panel de control que aparece </w:t>
+      </w:r>
+      <w:r>
+        <w:rPr>
+          <w:rFonts w:cstheme="minorHAnsi"/>
+          <w:sz w:val="24"/>
+          <w:szCs w:val="24"/>
+        </w:rPr>
+        <w:t>debajo</w:t>
+      </w:r>
+      <w:r>
+        <w:rPr>
+          <w:rFonts w:cstheme="minorHAnsi"/>
+          <w:sz w:val="24"/>
+          <w:szCs w:val="24"/>
+        </w:rPr>
+        <w:t xml:space="preserve"> del panel del Excel</w:t>
+      </w:r>
     </w:p>
     <w:p>
       <w:pPr>
@@ -12848,79 +13077,6 @@
           <w:szCs w:val="24"/>
         </w:rPr>
       </w:pPr>
-    </w:p>
-    <w:p>
-      <w:pPr>
-        <w:tabs>
-          <w:tab w:val="left" w:pos="1329"/>
-        </w:tabs>
-        <w:jc w:val="both"/>
-        <w:rPr>
-          <w:rFonts w:cstheme="minorHAnsi"/>
-          <w:sz w:val="24"/>
-          <w:szCs w:val="24"/>
-        </w:rPr>
-      </w:pPr>
-    </w:p>
-    <w:p>
-      <w:pPr>
-        <w:tabs>
-          <w:tab w:val="left" w:pos="1329"/>
-        </w:tabs>
-        <w:jc w:val="both"/>
-        <w:rPr>
-          <w:rFonts w:cstheme="minorHAnsi"/>
-          <w:sz w:val="24"/>
-          <w:szCs w:val="24"/>
-        </w:rPr>
-      </w:pPr>
-    </w:p>
-    <w:p>
-      <w:pPr>
-        <w:tabs>
-          <w:tab w:val="left" w:pos="1329"/>
-        </w:tabs>
-        <w:jc w:val="both"/>
-        <w:rPr>
-          <w:rFonts w:cstheme="minorHAnsi"/>
-          <w:sz w:val="24"/>
-          <w:szCs w:val="24"/>
-        </w:rPr>
-      </w:pPr>
-    </w:p>
-    <w:p>
-      <w:pPr>
-        <w:tabs>
-          <w:tab w:val="left" w:pos="1329"/>
-        </w:tabs>
-        <w:jc w:val="both"/>
-        <w:rPr>
-          <w:rFonts w:cstheme="minorHAnsi"/>
-          <w:sz w:val="24"/>
-          <w:szCs w:val="24"/>
-        </w:rPr>
-      </w:pPr>
-      <w:r>
-        <w:rPr>
-          <w:rFonts w:cstheme="minorHAnsi"/>
-          <w:sz w:val="24"/>
-          <w:szCs w:val="24"/>
-        </w:rPr>
-        <w:t>Controlaremos la edición del archivo mediante el panel de control que aparece encima del panel del Excel</w:t>
-      </w:r>
-    </w:p>
-    <w:p>
-      <w:pPr>
-        <w:tabs>
-          <w:tab w:val="left" w:pos="1329"/>
-        </w:tabs>
-        <w:jc w:val="both"/>
-        <w:rPr>
-          <w:rFonts w:cstheme="minorHAnsi"/>
-          <w:sz w:val="24"/>
-          <w:szCs w:val="24"/>
-        </w:rPr>
-      </w:pPr>
       <w:r>
         <w:rPr>
           <w:rFonts w:cstheme="minorHAnsi"/>
@@ -12928,11 +13084,10 @@
           <w:sz w:val="24"/>
           <w:szCs w:val="24"/>
         </w:rPr>
-        <w:lastRenderedPageBreak/>
         <w:drawing>
-          <wp:inline distT="0" distB="0" distL="0" distR="0" wp14:anchorId="42F55150" wp14:editId="0AD5FA7F">
-            <wp:extent cx="4572000" cy="4558019"/>
-            <wp:effectExtent l="0" t="0" r="0" b="0"/>
+          <wp:inline distT="0" distB="0" distL="0" distR="0" wp14:anchorId="42F55150" wp14:editId="3854169D">
+            <wp:extent cx="3971925" cy="3959779"/>
+            <wp:effectExtent l="0" t="0" r="0" b="3175"/>
             <wp:docPr id="88733176" name="Imagen 1"/>
             <wp:cNvGraphicFramePr>
               <a:graphicFrameLocks xmlns:a="http://schemas.openxmlformats.org/drawingml/2006/main" noChangeAspect="1"/>
@@ -12945,7 +13100,7 @@
                     <pic:cNvPicPr/>
                   </pic:nvPicPr>
                   <pic:blipFill>
-                    <a:blip r:embed="rId71"/>
+                    <a:blip r:embed="rId72"/>
                     <a:stretch>
                       <a:fillRect/>
                     </a:stretch>
@@ -12953,7 +13108,7 @@
                   <pic:spPr>
                     <a:xfrm>
                       <a:off x="0" y="0"/>
-                      <a:ext cx="4637757" cy="4623575"/>
+                      <a:ext cx="4043739" cy="4031373"/>
                     </a:xfrm>
                     <a:prstGeom prst="rect">
                       <a:avLst/>
@@ -13095,15 +13250,2001 @@
     <w:p>
       <w:pPr>
         <w:tabs>
+          <w:tab w:val="left" w:pos="1021"/>
+        </w:tabs>
+        <w:jc w:val="both"/>
+        <w:rPr>
+          <w:rFonts w:cstheme="minorHAnsi"/>
+          <w:sz w:val="24"/>
+          <w:szCs w:val="24"/>
+        </w:rPr>
+      </w:pPr>
+    </w:p>
+    <w:p>
+      <w:pPr>
+        <w:tabs>
+          <w:tab w:val="left" w:pos="1021"/>
+        </w:tabs>
+        <w:jc w:val="both"/>
+        <w:rPr>
+          <w:rFonts w:cstheme="minorHAnsi"/>
+          <w:sz w:val="24"/>
+          <w:szCs w:val="24"/>
+        </w:rPr>
+      </w:pPr>
+      <w:r>
+        <w:rPr>
+          <w:rFonts w:cstheme="minorHAnsi"/>
+          <w:sz w:val="24"/>
+          <w:szCs w:val="24"/>
+        </w:rPr>
+        <w:t>Al hacer algún cambio en el XML aparecerá un nuevo botón en el panel de control para poder visualizar esos últimos cambios:</w:t>
+      </w:r>
+    </w:p>
+    <w:p>
+      <w:pPr>
+        <w:tabs>
+          <w:tab w:val="left" w:pos="1021"/>
+        </w:tabs>
+        <w:jc w:val="both"/>
+        <w:rPr>
+          <w:color w:val="0070C0"/>
+          <w:sz w:val="26"/>
+          <w:szCs w:val="26"/>
+        </w:rPr>
+      </w:pPr>
+      <w:r>
+        <w:rPr>
+          <w:color w:val="0070C0"/>
+          <w:sz w:val="26"/>
+          <w:szCs w:val="26"/>
+        </w:rPr>
+        <w:lastRenderedPageBreak/>
+        <w:drawing>
+          <wp:inline distT="0" distB="0" distL="0" distR="0" wp14:anchorId="2B33DB91" wp14:editId="480CF44B">
+            <wp:extent cx="3924300" cy="4080736"/>
+            <wp:effectExtent l="0" t="0" r="0" b="0"/>
+            <wp:docPr id="200286314" name="Imagen 1"/>
+            <wp:cNvGraphicFramePr>
+              <a:graphicFrameLocks xmlns:a="http://schemas.openxmlformats.org/drawingml/2006/main" noChangeAspect="1"/>
+            </wp:cNvGraphicFramePr>
+            <a:graphic xmlns:a="http://schemas.openxmlformats.org/drawingml/2006/main">
+              <a:graphicData uri="http://schemas.openxmlformats.org/drawingml/2006/picture">
+                <pic:pic xmlns:pic="http://schemas.openxmlformats.org/drawingml/2006/picture">
+                  <pic:nvPicPr>
+                    <pic:cNvPr id="200286314" name=""/>
+                    <pic:cNvPicPr/>
+                  </pic:nvPicPr>
+                  <pic:blipFill>
+                    <a:blip r:embed="rId73"/>
+                    <a:stretch>
+                      <a:fillRect/>
+                    </a:stretch>
+                  </pic:blipFill>
+                  <pic:spPr>
+                    <a:xfrm>
+                      <a:off x="0" y="0"/>
+                      <a:ext cx="3931886" cy="4088624"/>
+                    </a:xfrm>
+                    <a:prstGeom prst="rect">
+                      <a:avLst/>
+                    </a:prstGeom>
+                  </pic:spPr>
+                </pic:pic>
+              </a:graphicData>
+            </a:graphic>
+          </wp:inline>
+        </w:drawing>
+      </w:r>
+    </w:p>
+    <w:p>
+      <w:pPr>
+        <w:tabs>
+          <w:tab w:val="left" w:pos="1021"/>
+        </w:tabs>
+        <w:jc w:val="both"/>
+        <w:rPr>
+          <w:rFonts w:cstheme="minorHAnsi"/>
+          <w:sz w:val="24"/>
+          <w:szCs w:val="24"/>
+        </w:rPr>
+      </w:pPr>
+      <w:r>
+        <w:rPr>
+          <w:rFonts w:cstheme="minorHAnsi"/>
+          <w:sz w:val="24"/>
+          <w:szCs w:val="24"/>
+        </w:rPr>
+        <w:t>Al hacer clic en el botón veremos como el operador del Excel cambia al anterior y en el XML se ve resaltado en color verde, los cambios añadidos al archivo y también un comentario informativo.</w:t>
+      </w:r>
+    </w:p>
+    <w:p>
+      <w:pPr>
+        <w:tabs>
+          <w:tab w:val="left" w:pos="1021"/>
+        </w:tabs>
+        <w:jc w:val="both"/>
+        <w:rPr>
+          <w:rFonts w:cstheme="minorHAnsi"/>
+          <w:sz w:val="24"/>
+          <w:szCs w:val="24"/>
+        </w:rPr>
+      </w:pPr>
+      <w:r>
+        <w:rPr>
+          <w:rFonts w:cstheme="minorHAnsi"/>
+          <w:sz w:val="24"/>
+          <w:szCs w:val="24"/>
+        </w:rPr>
+        <w:drawing>
+          <wp:inline distT="0" distB="0" distL="0" distR="0" wp14:anchorId="0504E894" wp14:editId="2C32068C">
+            <wp:extent cx="5400040" cy="2802255"/>
+            <wp:effectExtent l="0" t="0" r="0" b="0"/>
+            <wp:docPr id="152162507" name="Imagen 1"/>
+            <wp:cNvGraphicFramePr>
+              <a:graphicFrameLocks xmlns:a="http://schemas.openxmlformats.org/drawingml/2006/main" noChangeAspect="1"/>
+            </wp:cNvGraphicFramePr>
+            <a:graphic xmlns:a="http://schemas.openxmlformats.org/drawingml/2006/main">
+              <a:graphicData uri="http://schemas.openxmlformats.org/drawingml/2006/picture">
+                <pic:pic xmlns:pic="http://schemas.openxmlformats.org/drawingml/2006/picture">
+                  <pic:nvPicPr>
+                    <pic:cNvPr id="152162507" name=""/>
+                    <pic:cNvPicPr/>
+                  </pic:nvPicPr>
+                  <pic:blipFill>
+                    <a:blip r:embed="rId74"/>
+                    <a:stretch>
+                      <a:fillRect/>
+                    </a:stretch>
+                  </pic:blipFill>
+                  <pic:spPr>
+                    <a:xfrm>
+                      <a:off x="0" y="0"/>
+                      <a:ext cx="5400040" cy="2802255"/>
+                    </a:xfrm>
+                    <a:prstGeom prst="rect">
+                      <a:avLst/>
+                    </a:prstGeom>
+                  </pic:spPr>
+                </pic:pic>
+              </a:graphicData>
+            </a:graphic>
+          </wp:inline>
+        </w:drawing>
+      </w:r>
+    </w:p>
+    <w:p>
+      <w:pPr>
+        <w:tabs>
+          <w:tab w:val="left" w:pos="1021"/>
+        </w:tabs>
+        <w:jc w:val="both"/>
+        <w:rPr>
+          <w:rFonts w:cstheme="minorHAnsi"/>
+          <w:sz w:val="24"/>
+          <w:szCs w:val="24"/>
+        </w:rPr>
+      </w:pPr>
+      <w:r>
+        <w:rPr>
+          <w:rFonts w:cstheme="minorHAnsi"/>
+          <w:sz w:val="24"/>
+          <w:szCs w:val="24"/>
+        </w:rPr>
+        <w:t xml:space="preserve">Para volver al </w:t>
+      </w:r>
+      <w:r>
+        <w:rPr>
+          <w:rFonts w:cstheme="minorHAnsi"/>
+          <w:sz w:val="24"/>
+          <w:szCs w:val="24"/>
+        </w:rPr>
+        <w:t xml:space="preserve">flujo normal de la aplicación (al operador en el que estabas antes de pulsar el botón) solo será necesario hacerle un clic al botón de </w:t>
+      </w:r>
+      <w:r>
+        <w:rPr>
+          <w:rFonts w:cstheme="minorHAnsi"/>
+          <w:color w:val="70AD47" w:themeColor="accent6"/>
+          <w:sz w:val="24"/>
+          <w:szCs w:val="24"/>
+        </w:rPr>
+        <w:t>“VOLVER”</w:t>
+      </w:r>
+      <w:r>
+        <w:rPr>
+          <w:rFonts w:cstheme="minorHAnsi"/>
+          <w:sz w:val="24"/>
+          <w:szCs w:val="24"/>
+        </w:rPr>
+        <w:t>.</w:t>
+      </w:r>
+    </w:p>
+    <w:p>
+      <w:pPr>
+        <w:tabs>
+          <w:tab w:val="left" w:pos="1021"/>
+        </w:tabs>
+        <w:jc w:val="both"/>
+        <w:rPr>
+          <w:rFonts w:cstheme="minorHAnsi"/>
+          <w:sz w:val="24"/>
+          <w:szCs w:val="24"/>
+        </w:rPr>
+      </w:pPr>
+    </w:p>
+    <w:p>
+      <w:pPr>
+        <w:tabs>
+          <w:tab w:val="left" w:pos="1021"/>
+        </w:tabs>
+        <w:jc w:val="both"/>
+        <w:rPr>
+          <w:rFonts w:cstheme="minorHAnsi"/>
+          <w:sz w:val="24"/>
+          <w:szCs w:val="24"/>
+        </w:rPr>
+      </w:pPr>
+    </w:p>
+    <w:p>
+      <w:pPr>
+        <w:tabs>
+          <w:tab w:val="left" w:pos="1021"/>
+        </w:tabs>
+        <w:jc w:val="both"/>
+        <w:rPr>
+          <w:color w:val="0070C0"/>
+          <w:sz w:val="26"/>
+          <w:szCs w:val="26"/>
+        </w:rPr>
+      </w:pPr>
+      <w:r>
+        <w:rPr>
+          <w:color w:val="0070C0"/>
+          <w:sz w:val="26"/>
+          <w:szCs w:val="26"/>
+        </w:rPr>
+        <w:lastRenderedPageBreak/>
+        <w:t>C</w:t>
+      </w:r>
+      <w:r>
+        <w:rPr>
+          <w:color w:val="0070C0"/>
+          <w:sz w:val="26"/>
+          <w:szCs w:val="26"/>
+        </w:rPr>
+        <w:t>omparación entre 2 XML</w:t>
+      </w:r>
+    </w:p>
+    <w:p>
+      <w:pPr>
+        <w:tabs>
           <w:tab w:val="left" w:pos="1329"/>
         </w:tabs>
         <w:jc w:val="both"/>
         <w:rPr>
           <w:rFonts w:cstheme="minorHAnsi"/>
-          <w:sz w:val="24"/>
-          <w:szCs w:val="24"/>
-        </w:rPr>
-      </w:pPr>
+          <w:color w:val="000000" w:themeColor="text1"/>
+          <w:sz w:val="24"/>
+          <w:szCs w:val="24"/>
+        </w:rPr>
+      </w:pPr>
+      <w:r>
+        <w:rPr>
+          <w:rFonts w:cstheme="minorHAnsi"/>
+          <w:color w:val="000000" w:themeColor="text1"/>
+          <w:sz w:val="24"/>
+          <w:szCs w:val="24"/>
+        </w:rPr>
+        <w:t>Ahora para entrar a este nuevo comparador debe hacer clic en el desplegable y seleccionar la opción 2xml</w:t>
+      </w:r>
+      <w:r>
+        <w:rPr>
+          <w:rFonts w:cstheme="minorHAnsi"/>
+          <w:color w:val="000000" w:themeColor="text1"/>
+          <w:sz w:val="24"/>
+          <w:szCs w:val="24"/>
+        </w:rPr>
+        <w:t>s</w:t>
+      </w:r>
+    </w:p>
+    <w:p>
+      <w:pPr>
+        <w:tabs>
+          <w:tab w:val="left" w:pos="1329"/>
+        </w:tabs>
+        <w:jc w:val="center"/>
+        <w:rPr>
+          <w:rFonts w:cstheme="minorHAnsi"/>
+          <w:color w:val="1F3864" w:themeColor="accent1" w:themeShade="80"/>
+          <w:sz w:val="28"/>
+          <w:szCs w:val="28"/>
+        </w:rPr>
+      </w:pPr>
+      <w:r>
+        <w:rPr>
+          <w:rFonts w:cstheme="minorHAnsi"/>
+          <w:noProof/>
+          <w:color w:val="1F3864" w:themeColor="accent1" w:themeShade="80"/>
+          <w:sz w:val="28"/>
+          <w:szCs w:val="28"/>
+        </w:rPr>
+        <w:drawing>
+          <wp:inline distT="0" distB="0" distL="0" distR="0" wp14:anchorId="4ABD280D" wp14:editId="55B64E0B">
+            <wp:extent cx="3858163" cy="990738"/>
+            <wp:effectExtent l="0" t="0" r="9525" b="0"/>
+            <wp:docPr id="969354088" name="Imagen 1"/>
+            <wp:cNvGraphicFramePr>
+              <a:graphicFrameLocks xmlns:a="http://schemas.openxmlformats.org/drawingml/2006/main" noChangeAspect="1"/>
+            </wp:cNvGraphicFramePr>
+            <a:graphic xmlns:a="http://schemas.openxmlformats.org/drawingml/2006/main">
+              <a:graphicData uri="http://schemas.openxmlformats.org/drawingml/2006/picture">
+                <pic:pic xmlns:pic="http://schemas.openxmlformats.org/drawingml/2006/picture">
+                  <pic:nvPicPr>
+                    <pic:cNvPr id="969354088" name=""/>
+                    <pic:cNvPicPr/>
+                  </pic:nvPicPr>
+                  <pic:blipFill>
+                    <a:blip r:embed="rId75"/>
+                    <a:stretch>
+                      <a:fillRect/>
+                    </a:stretch>
+                  </pic:blipFill>
+                  <pic:spPr>
+                    <a:xfrm>
+                      <a:off x="0" y="0"/>
+                      <a:ext cx="3858163" cy="990738"/>
+                    </a:xfrm>
+                    <a:prstGeom prst="rect">
+                      <a:avLst/>
+                    </a:prstGeom>
+                  </pic:spPr>
+                </pic:pic>
+              </a:graphicData>
+            </a:graphic>
+          </wp:inline>
+        </w:drawing>
+      </w:r>
+    </w:p>
+    <w:p>
+      <w:pPr>
+        <w:tabs>
+          <w:tab w:val="left" w:pos="1329"/>
+        </w:tabs>
+        <w:rPr>
+          <w:rFonts w:cstheme="minorHAnsi"/>
+          <w:color w:val="000000" w:themeColor="text1"/>
+          <w:sz w:val="24"/>
+          <w:szCs w:val="24"/>
+        </w:rPr>
+      </w:pPr>
+      <w:r>
+        <w:rPr>
+          <w:rFonts w:cstheme="minorHAnsi"/>
+          <w:color w:val="000000" w:themeColor="text1"/>
+          <w:sz w:val="24"/>
+          <w:szCs w:val="24"/>
+        </w:rPr>
+        <w:t xml:space="preserve">Dentro de la nueva vista deberá cargar los 2 archivos </w:t>
+      </w:r>
+      <w:proofErr w:type="spellStart"/>
+      <w:r>
+        <w:rPr>
+          <w:rFonts w:cstheme="minorHAnsi"/>
+          <w:color w:val="000000" w:themeColor="text1"/>
+          <w:sz w:val="24"/>
+          <w:szCs w:val="24"/>
+        </w:rPr>
+        <w:t>xml</w:t>
+      </w:r>
+      <w:proofErr w:type="spellEnd"/>
+      <w:r>
+        <w:rPr>
+          <w:rFonts w:cstheme="minorHAnsi"/>
+          <w:color w:val="000000" w:themeColor="text1"/>
+          <w:sz w:val="24"/>
+          <w:szCs w:val="24"/>
+        </w:rPr>
+        <w:t xml:space="preserve"> a comparar, para eso debe hacer clic en seleccionar </w:t>
+      </w:r>
+      <w:proofErr w:type="spellStart"/>
+      <w:r>
+        <w:rPr>
+          <w:rFonts w:cstheme="minorHAnsi"/>
+          <w:color w:val="000000" w:themeColor="text1"/>
+          <w:sz w:val="24"/>
+          <w:szCs w:val="24"/>
+        </w:rPr>
+        <w:t>Xml</w:t>
+      </w:r>
+      <w:proofErr w:type="spellEnd"/>
+      <w:r>
+        <w:rPr>
+          <w:rFonts w:cstheme="minorHAnsi"/>
+          <w:color w:val="000000" w:themeColor="text1"/>
+          <w:sz w:val="24"/>
+          <w:szCs w:val="24"/>
+        </w:rPr>
+        <w:t>.</w:t>
+      </w:r>
+    </w:p>
+    <w:p>
+      <w:pPr>
+        <w:tabs>
+          <w:tab w:val="left" w:pos="1329"/>
+        </w:tabs>
+        <w:jc w:val="center"/>
+        <w:rPr>
+          <w:rFonts w:cstheme="minorHAnsi"/>
+          <w:color w:val="000000" w:themeColor="text1"/>
+          <w:sz w:val="24"/>
+          <w:szCs w:val="24"/>
+        </w:rPr>
+      </w:pPr>
+      <w:r>
+        <w:rPr>
+          <w:rFonts w:cstheme="minorHAnsi"/>
+          <w:noProof/>
+          <w:color w:val="000000" w:themeColor="text1"/>
+          <w:sz w:val="24"/>
+          <w:szCs w:val="24"/>
+        </w:rPr>
+        <w:drawing>
+          <wp:inline distT="0" distB="0" distL="0" distR="0" wp14:anchorId="4DDCD53C" wp14:editId="2BED4573">
+            <wp:extent cx="5292871" cy="421632"/>
+            <wp:effectExtent l="0" t="0" r="0" b="0"/>
+            <wp:docPr id="1467909978" name="Imagen 1"/>
+            <wp:cNvGraphicFramePr>
+              <a:graphicFrameLocks xmlns:a="http://schemas.openxmlformats.org/drawingml/2006/main" noChangeAspect="1"/>
+            </wp:cNvGraphicFramePr>
+            <a:graphic xmlns:a="http://schemas.openxmlformats.org/drawingml/2006/main">
+              <a:graphicData uri="http://schemas.openxmlformats.org/drawingml/2006/picture">
+                <pic:pic xmlns:pic="http://schemas.openxmlformats.org/drawingml/2006/picture">
+                  <pic:nvPicPr>
+                    <pic:cNvPr id="1467909978" name=""/>
+                    <pic:cNvPicPr/>
+                  </pic:nvPicPr>
+                  <pic:blipFill>
+                    <a:blip r:embed="rId76"/>
+                    <a:stretch>
+                      <a:fillRect/>
+                    </a:stretch>
+                  </pic:blipFill>
+                  <pic:spPr>
+                    <a:xfrm>
+                      <a:off x="0" y="0"/>
+                      <a:ext cx="5418880" cy="431670"/>
+                    </a:xfrm>
+                    <a:prstGeom prst="rect">
+                      <a:avLst/>
+                    </a:prstGeom>
+                  </pic:spPr>
+                </pic:pic>
+              </a:graphicData>
+            </a:graphic>
+          </wp:inline>
+        </w:drawing>
+      </w:r>
+    </w:p>
+    <w:p>
+      <w:pPr>
+        <w:tabs>
+          <w:tab w:val="left" w:pos="1329"/>
+        </w:tabs>
+        <w:rPr>
+          <w:rFonts w:cstheme="minorHAnsi"/>
+          <w:color w:val="000000" w:themeColor="text1"/>
+          <w:sz w:val="24"/>
+          <w:szCs w:val="24"/>
+        </w:rPr>
+      </w:pPr>
+      <w:r>
+        <w:rPr>
+          <w:rFonts w:cstheme="minorHAnsi"/>
+          <w:color w:val="000000" w:themeColor="text1"/>
+          <w:sz w:val="24"/>
+          <w:szCs w:val="24"/>
+        </w:rPr>
+        <w:t>A continuación, se abrirá el explorador de archivos, por defecto en la ruta de documentos, busque su archivo y pulse en abrir.</w:t>
+      </w:r>
+    </w:p>
+    <w:p>
+      <w:pPr>
+        <w:tabs>
+          <w:tab w:val="left" w:pos="1329"/>
+        </w:tabs>
+        <w:rPr>
+          <w:rFonts w:cstheme="minorHAnsi"/>
+          <w:color w:val="1F3864" w:themeColor="accent1" w:themeShade="80"/>
+          <w:sz w:val="24"/>
+          <w:szCs w:val="24"/>
+        </w:rPr>
+      </w:pPr>
+      <w:r>
+        <w:rPr>
+          <w:rFonts w:cstheme="minorHAnsi"/>
+          <w:color w:val="1F3864" w:themeColor="accent1" w:themeShade="80"/>
+          <w:sz w:val="24"/>
+          <w:szCs w:val="24"/>
+        </w:rPr>
+        <w:t>*</w:t>
+      </w:r>
+    </w:p>
+    <w:p>
+      <w:pPr>
+        <w:tabs>
+          <w:tab w:val="left" w:pos="1329"/>
+        </w:tabs>
+        <w:rPr>
+          <w:rFonts w:cstheme="minorHAnsi"/>
+          <w:color w:val="1F3864" w:themeColor="accent1" w:themeShade="80"/>
+          <w:sz w:val="28"/>
+          <w:szCs w:val="28"/>
+        </w:rPr>
+      </w:pPr>
+      <w:r>
+        <w:rPr>
+          <w:rFonts w:cstheme="minorHAnsi"/>
+          <w:noProof/>
+          <w:color w:val="1F3864" w:themeColor="accent1" w:themeShade="80"/>
+          <w:sz w:val="28"/>
+          <w:szCs w:val="28"/>
+        </w:rPr>
+        <w:drawing>
+          <wp:inline distT="0" distB="0" distL="0" distR="0" wp14:anchorId="488E20C6" wp14:editId="0F8C1729">
+            <wp:extent cx="5400040" cy="590550"/>
+            <wp:effectExtent l="0" t="0" r="0" b="0"/>
+            <wp:docPr id="570543318" name="Imagen 1"/>
+            <wp:cNvGraphicFramePr>
+              <a:graphicFrameLocks xmlns:a="http://schemas.openxmlformats.org/drawingml/2006/main" noChangeAspect="1"/>
+            </wp:cNvGraphicFramePr>
+            <a:graphic xmlns:a="http://schemas.openxmlformats.org/drawingml/2006/main">
+              <a:graphicData uri="http://schemas.openxmlformats.org/drawingml/2006/picture">
+                <pic:pic xmlns:pic="http://schemas.openxmlformats.org/drawingml/2006/picture">
+                  <pic:nvPicPr>
+                    <pic:cNvPr id="570543318" name=""/>
+                    <pic:cNvPicPr/>
+                  </pic:nvPicPr>
+                  <pic:blipFill>
+                    <a:blip r:embed="rId77"/>
+                    <a:stretch>
+                      <a:fillRect/>
+                    </a:stretch>
+                  </pic:blipFill>
+                  <pic:spPr>
+                    <a:xfrm>
+                      <a:off x="0" y="0"/>
+                      <a:ext cx="5400040" cy="590550"/>
+                    </a:xfrm>
+                    <a:prstGeom prst="rect">
+                      <a:avLst/>
+                    </a:prstGeom>
+                  </pic:spPr>
+                </pic:pic>
+              </a:graphicData>
+            </a:graphic>
+          </wp:inline>
+        </w:drawing>
+      </w:r>
+    </w:p>
+    <w:p>
+      <w:pPr>
+        <w:tabs>
+          <w:tab w:val="left" w:pos="1329"/>
+        </w:tabs>
+        <w:jc w:val="both"/>
+        <w:rPr>
+          <w:rFonts w:cstheme="minorHAnsi"/>
+          <w:b/>
+          <w:bCs/>
+          <w:color w:val="2F5496" w:themeColor="accent1" w:themeShade="BF"/>
+          <w:sz w:val="28"/>
+          <w:szCs w:val="28"/>
+        </w:rPr>
+      </w:pPr>
+    </w:p>
+    <w:p>
+      <w:pPr>
+        <w:tabs>
+          <w:tab w:val="left" w:pos="1329"/>
+        </w:tabs>
+        <w:jc w:val="center"/>
+        <w:rPr>
+          <w:rFonts w:cstheme="minorHAnsi"/>
+          <w:b/>
+          <w:bCs/>
+          <w:color w:val="2F5496" w:themeColor="accent1" w:themeShade="BF"/>
+          <w:sz w:val="28"/>
+          <w:szCs w:val="28"/>
+        </w:rPr>
+      </w:pPr>
+      <w:r>
+        <w:rPr>
+          <w:rFonts w:cstheme="minorHAnsi"/>
+          <w:b/>
+          <w:bCs/>
+          <w:noProof/>
+          <w:color w:val="2F5496" w:themeColor="accent1" w:themeShade="BF"/>
+          <w:sz w:val="28"/>
+          <w:szCs w:val="28"/>
+        </w:rPr>
+        <w:drawing>
+          <wp:inline distT="0" distB="0" distL="0" distR="0" wp14:anchorId="0C614176" wp14:editId="0A18FCE0">
+            <wp:extent cx="2907599" cy="527539"/>
+            <wp:effectExtent l="0" t="0" r="0" b="6350"/>
+            <wp:docPr id="641277851" name="Imagen 1"/>
+            <wp:cNvGraphicFramePr>
+              <a:graphicFrameLocks xmlns:a="http://schemas.openxmlformats.org/drawingml/2006/main" noChangeAspect="1"/>
+            </wp:cNvGraphicFramePr>
+            <a:graphic xmlns:a="http://schemas.openxmlformats.org/drawingml/2006/main">
+              <a:graphicData uri="http://schemas.openxmlformats.org/drawingml/2006/picture">
+                <pic:pic xmlns:pic="http://schemas.openxmlformats.org/drawingml/2006/picture">
+                  <pic:nvPicPr>
+                    <pic:cNvPr id="641277851" name=""/>
+                    <pic:cNvPicPr/>
+                  </pic:nvPicPr>
+                  <pic:blipFill>
+                    <a:blip r:embed="rId78"/>
+                    <a:stretch>
+                      <a:fillRect/>
+                    </a:stretch>
+                  </pic:blipFill>
+                  <pic:spPr>
+                    <a:xfrm>
+                      <a:off x="0" y="0"/>
+                      <a:ext cx="2919637" cy="529723"/>
+                    </a:xfrm>
+                    <a:prstGeom prst="rect">
+                      <a:avLst/>
+                    </a:prstGeom>
+                  </pic:spPr>
+                </pic:pic>
+              </a:graphicData>
+            </a:graphic>
+          </wp:inline>
+        </w:drawing>
+      </w:r>
+    </w:p>
+    <w:p>
+      <w:pPr>
+        <w:tabs>
+          <w:tab w:val="left" w:pos="1329"/>
+        </w:tabs>
+        <w:jc w:val="both"/>
+        <w:rPr>
+          <w:rFonts w:cstheme="minorHAnsi"/>
+          <w:color w:val="2F5496" w:themeColor="accent1" w:themeShade="BF"/>
+          <w:sz w:val="24"/>
+          <w:szCs w:val="24"/>
+        </w:rPr>
+      </w:pPr>
+    </w:p>
+    <w:p>
+      <w:pPr>
+        <w:tabs>
+          <w:tab w:val="left" w:pos="1329"/>
+        </w:tabs>
+        <w:jc w:val="both"/>
+        <w:rPr>
+          <w:rFonts w:cstheme="minorHAnsi"/>
+          <w:color w:val="2F5496" w:themeColor="accent1" w:themeShade="BF"/>
+          <w:sz w:val="24"/>
+          <w:szCs w:val="24"/>
+        </w:rPr>
+      </w:pPr>
+      <w:r>
+        <w:rPr>
+          <w:rFonts w:cstheme="minorHAnsi"/>
+          <w:color w:val="2F5496" w:themeColor="accent1" w:themeShade="BF"/>
+          <w:sz w:val="24"/>
+          <w:szCs w:val="24"/>
+        </w:rPr>
+        <w:t xml:space="preserve">La interfaz cargará información de las </w:t>
+      </w:r>
+      <w:proofErr w:type="spellStart"/>
+      <w:r>
+        <w:rPr>
+          <w:rFonts w:cstheme="minorHAnsi"/>
+          <w:color w:val="2F5496" w:themeColor="accent1" w:themeShade="BF"/>
+          <w:sz w:val="24"/>
+          <w:szCs w:val="24"/>
+        </w:rPr>
+        <w:t>APNs</w:t>
+      </w:r>
+      <w:proofErr w:type="spellEnd"/>
+      <w:r>
+        <w:rPr>
+          <w:rFonts w:cstheme="minorHAnsi"/>
+          <w:color w:val="2F5496" w:themeColor="accent1" w:themeShade="BF"/>
+          <w:sz w:val="24"/>
+          <w:szCs w:val="24"/>
+        </w:rPr>
+        <w:t xml:space="preserve"> que encuentre distintos entre el archivo 2 y el archivo 1 en una</w:t>
+      </w:r>
+    </w:p>
+    <w:p>
+      <w:pPr>
+        <w:tabs>
+          <w:tab w:val="left" w:pos="1329"/>
+        </w:tabs>
+        <w:jc w:val="both"/>
+        <w:rPr>
+          <w:rFonts w:cstheme="minorHAnsi"/>
+          <w:color w:val="2F5496" w:themeColor="accent1" w:themeShade="BF"/>
+          <w:sz w:val="24"/>
+          <w:szCs w:val="24"/>
+        </w:rPr>
+      </w:pPr>
+      <w:r>
+        <w:rPr>
+          <w:rFonts w:cstheme="minorHAnsi"/>
+          <w:noProof/>
+          <w:color w:val="2F5496" w:themeColor="accent1" w:themeShade="BF"/>
+          <w:sz w:val="24"/>
+          <w:szCs w:val="24"/>
+        </w:rPr>
+        <w:drawing>
+          <wp:anchor distT="0" distB="0" distL="114300" distR="114300" simplePos="0" relativeHeight="251705344" behindDoc="0" locked="0" layoutInCell="1" allowOverlap="1" wp14:anchorId="7BA9C8E8" wp14:editId="3B8D5A94">
+            <wp:simplePos x="0" y="0"/>
+            <wp:positionH relativeFrom="column">
+              <wp:posOffset>-332789</wp:posOffset>
+            </wp:positionH>
+            <wp:positionV relativeFrom="paragraph">
+              <wp:posOffset>306314</wp:posOffset>
+            </wp:positionV>
+            <wp:extent cx="6171663" cy="2895334"/>
+            <wp:effectExtent l="0" t="0" r="635" b="635"/>
+            <wp:wrapNone/>
+            <wp:docPr id="1542411163" name="Imagen 1"/>
+            <wp:cNvGraphicFramePr>
+              <a:graphicFrameLocks xmlns:a="http://schemas.openxmlformats.org/drawingml/2006/main" noChangeAspect="1"/>
+            </wp:cNvGraphicFramePr>
+            <a:graphic xmlns:a="http://schemas.openxmlformats.org/drawingml/2006/main">
+              <a:graphicData uri="http://schemas.openxmlformats.org/drawingml/2006/picture">
+                <pic:pic xmlns:pic="http://schemas.openxmlformats.org/drawingml/2006/picture">
+                  <pic:nvPicPr>
+                    <pic:cNvPr id="1542411163" name=""/>
+                    <pic:cNvPicPr/>
+                  </pic:nvPicPr>
+                  <pic:blipFill>
+                    <a:blip r:embed="rId79">
+                      <a:extLst>
+                        <a:ext uri="{28A0092B-C50C-407E-A947-70E740481C1C}">
+                          <a14:useLocalDpi xmlns:a14="http://schemas.microsoft.com/office/drawing/2010/main" val="0"/>
+                        </a:ext>
+                      </a:extLst>
+                    </a:blip>
+                    <a:stretch>
+                      <a:fillRect/>
+                    </a:stretch>
+                  </pic:blipFill>
+                  <pic:spPr>
+                    <a:xfrm>
+                      <a:off x="0" y="0"/>
+                      <a:ext cx="6175596" cy="2897179"/>
+                    </a:xfrm>
+                    <a:prstGeom prst="rect">
+                      <a:avLst/>
+                    </a:prstGeom>
+                  </pic:spPr>
+                </pic:pic>
+              </a:graphicData>
+            </a:graphic>
+            <wp14:sizeRelH relativeFrom="margin">
+              <wp14:pctWidth>0</wp14:pctWidth>
+            </wp14:sizeRelH>
+          </wp:anchor>
+        </w:drawing>
+      </w:r>
+    </w:p>
+    <w:p>
+      <w:pPr>
+        <w:tabs>
+          <w:tab w:val="left" w:pos="1329"/>
+        </w:tabs>
+        <w:rPr>
+          <w:rFonts w:cstheme="minorHAnsi"/>
+          <w:color w:val="2F5496" w:themeColor="accent1" w:themeShade="BF"/>
+          <w:sz w:val="24"/>
+          <w:szCs w:val="24"/>
+        </w:rPr>
+      </w:pPr>
+    </w:p>
+    <w:p>
+      <w:pPr>
+        <w:tabs>
+          <w:tab w:val="left" w:pos="1329"/>
+        </w:tabs>
+        <w:jc w:val="both"/>
+        <w:rPr>
+          <w:rFonts w:cstheme="minorHAnsi"/>
+          <w:color w:val="2F5496" w:themeColor="accent1" w:themeShade="BF"/>
+          <w:sz w:val="24"/>
+          <w:szCs w:val="24"/>
+        </w:rPr>
+      </w:pPr>
+    </w:p>
+    <w:p>
+      <w:pPr>
+        <w:rPr>
+          <w:rFonts w:cstheme="minorHAnsi"/>
+          <w:sz w:val="24"/>
+          <w:szCs w:val="24"/>
+        </w:rPr>
+      </w:pPr>
+    </w:p>
+    <w:p>
+      <w:pPr>
+        <w:rPr>
+          <w:rFonts w:cstheme="minorHAnsi"/>
+          <w:sz w:val="24"/>
+          <w:szCs w:val="24"/>
+        </w:rPr>
+      </w:pPr>
+    </w:p>
+    <w:p>
+      <w:pPr>
+        <w:rPr>
+          <w:rFonts w:cstheme="minorHAnsi"/>
+          <w:sz w:val="24"/>
+          <w:szCs w:val="24"/>
+        </w:rPr>
+      </w:pPr>
+    </w:p>
+    <w:p>
+      <w:pPr>
+        <w:rPr>
+          <w:rFonts w:cstheme="minorHAnsi"/>
+          <w:sz w:val="24"/>
+          <w:szCs w:val="24"/>
+        </w:rPr>
+      </w:pPr>
+    </w:p>
+    <w:p>
+      <w:pPr>
+        <w:rPr>
+          <w:rFonts w:cstheme="minorHAnsi"/>
+          <w:sz w:val="24"/>
+          <w:szCs w:val="24"/>
+        </w:rPr>
+      </w:pPr>
+    </w:p>
+    <w:p>
+      <w:pPr>
+        <w:tabs>
+          <w:tab w:val="left" w:pos="1606"/>
+        </w:tabs>
+        <w:rPr>
+          <w:rFonts w:cstheme="minorHAnsi"/>
+          <w:sz w:val="24"/>
+          <w:szCs w:val="24"/>
+        </w:rPr>
+      </w:pPr>
+      <w:r>
+        <w:rPr>
+          <w:rFonts w:cstheme="minorHAnsi"/>
+          <w:sz w:val="24"/>
+          <w:szCs w:val="24"/>
+        </w:rPr>
+        <w:lastRenderedPageBreak/>
+        <w:t xml:space="preserve">Si sale una celda en blanco como en el ejemplo significa que el atributo no existe en uno de los 2 archivos en este caso el </w:t>
+      </w:r>
+      <w:r>
+        <w:rPr>
+          <w:rFonts w:cstheme="minorHAnsi"/>
+          <w:b/>
+          <w:bCs/>
+          <w:sz w:val="24"/>
+          <w:szCs w:val="24"/>
+        </w:rPr>
+        <w:t xml:space="preserve">archivo 2 </w:t>
+      </w:r>
+      <w:r>
+        <w:rPr>
+          <w:rFonts w:cstheme="minorHAnsi"/>
+          <w:sz w:val="24"/>
+          <w:szCs w:val="24"/>
+        </w:rPr>
+        <w:t xml:space="preserve">no contiene el atributo </w:t>
+      </w:r>
+      <w:proofErr w:type="spellStart"/>
+      <w:r>
+        <w:rPr>
+          <w:rFonts w:cstheme="minorHAnsi"/>
+          <w:sz w:val="24"/>
+          <w:szCs w:val="24"/>
+        </w:rPr>
+        <w:t>port</w:t>
+      </w:r>
+      <w:proofErr w:type="spellEnd"/>
+      <w:r>
+        <w:rPr>
+          <w:rFonts w:cstheme="minorHAnsi"/>
+          <w:sz w:val="24"/>
+          <w:szCs w:val="24"/>
+        </w:rPr>
+        <w:t xml:space="preserve">, así que el programa lo ignorará, conservando el atributo con su respectivo valor del archivo original, en este caso </w:t>
+      </w:r>
+      <w:proofErr w:type="spellStart"/>
+      <w:r>
+        <w:rPr>
+          <w:rFonts w:cstheme="minorHAnsi"/>
+          <w:b/>
+          <w:bCs/>
+          <w:sz w:val="24"/>
+          <w:szCs w:val="24"/>
+        </w:rPr>
+        <w:t>port</w:t>
+      </w:r>
+      <w:proofErr w:type="spellEnd"/>
+      <w:r>
+        <w:rPr>
+          <w:rFonts w:cstheme="minorHAnsi"/>
+          <w:b/>
+          <w:bCs/>
+          <w:sz w:val="24"/>
+          <w:szCs w:val="24"/>
+        </w:rPr>
+        <w:t>=”8000”</w:t>
+      </w:r>
+    </w:p>
+    <w:p>
+      <w:pPr>
+        <w:tabs>
+          <w:tab w:val="left" w:pos="1606"/>
+        </w:tabs>
+        <w:rPr>
+          <w:rFonts w:cstheme="minorHAnsi"/>
+          <w:sz w:val="24"/>
+          <w:szCs w:val="24"/>
+        </w:rPr>
+      </w:pPr>
+      <w:r>
+        <w:rPr>
+          <w:rFonts w:cstheme="minorHAnsi"/>
+          <w:noProof/>
+          <w:sz w:val="24"/>
+          <w:szCs w:val="24"/>
+        </w:rPr>
+        <w:drawing>
+          <wp:anchor distT="0" distB="0" distL="114300" distR="114300" simplePos="0" relativeHeight="251706368" behindDoc="0" locked="0" layoutInCell="1" allowOverlap="1" wp14:anchorId="38D8A1A1" wp14:editId="69BD6A5D">
+            <wp:simplePos x="0" y="0"/>
+            <wp:positionH relativeFrom="column">
+              <wp:posOffset>-69068</wp:posOffset>
+            </wp:positionH>
+            <wp:positionV relativeFrom="paragraph">
+              <wp:posOffset>31359</wp:posOffset>
+            </wp:positionV>
+            <wp:extent cx="5400040" cy="963930"/>
+            <wp:effectExtent l="0" t="0" r="0" b="7620"/>
+            <wp:wrapNone/>
+            <wp:docPr id="724349554" name="Imagen 1"/>
+            <wp:cNvGraphicFramePr>
+              <a:graphicFrameLocks xmlns:a="http://schemas.openxmlformats.org/drawingml/2006/main" noChangeAspect="1"/>
+            </wp:cNvGraphicFramePr>
+            <a:graphic xmlns:a="http://schemas.openxmlformats.org/drawingml/2006/main">
+              <a:graphicData uri="http://schemas.openxmlformats.org/drawingml/2006/picture">
+                <pic:pic xmlns:pic="http://schemas.openxmlformats.org/drawingml/2006/picture">
+                  <pic:nvPicPr>
+                    <pic:cNvPr id="724349554" name=""/>
+                    <pic:cNvPicPr/>
+                  </pic:nvPicPr>
+                  <pic:blipFill>
+                    <a:blip r:embed="rId80">
+                      <a:extLst>
+                        <a:ext uri="{28A0092B-C50C-407E-A947-70E740481C1C}">
+                          <a14:useLocalDpi xmlns:a14="http://schemas.microsoft.com/office/drawing/2010/main" val="0"/>
+                        </a:ext>
+                      </a:extLst>
+                    </a:blip>
+                    <a:stretch>
+                      <a:fillRect/>
+                    </a:stretch>
+                  </pic:blipFill>
+                  <pic:spPr>
+                    <a:xfrm>
+                      <a:off x="0" y="0"/>
+                      <a:ext cx="5400040" cy="963930"/>
+                    </a:xfrm>
+                    <a:prstGeom prst="rect">
+                      <a:avLst/>
+                    </a:prstGeom>
+                  </pic:spPr>
+                </pic:pic>
+              </a:graphicData>
+            </a:graphic>
+          </wp:anchor>
+        </w:drawing>
+      </w:r>
+    </w:p>
+    <w:p>
+      <w:pPr>
+        <w:rPr>
+          <w:rFonts w:cstheme="minorHAnsi"/>
+          <w:sz w:val="24"/>
+          <w:szCs w:val="24"/>
+        </w:rPr>
+      </w:pPr>
+    </w:p>
+    <w:p>
+      <w:pPr>
+        <w:rPr>
+          <w:rFonts w:cstheme="minorHAnsi"/>
+          <w:sz w:val="24"/>
+          <w:szCs w:val="24"/>
+        </w:rPr>
+      </w:pPr>
+    </w:p>
+    <w:p>
+      <w:pPr>
+        <w:rPr>
+          <w:rFonts w:cstheme="minorHAnsi"/>
+          <w:sz w:val="24"/>
+          <w:szCs w:val="24"/>
+        </w:rPr>
+      </w:pPr>
+    </w:p>
+    <w:p>
+      <w:pPr>
+        <w:tabs>
+          <w:tab w:val="left" w:pos="1398"/>
+        </w:tabs>
+        <w:rPr>
+          <w:rFonts w:cstheme="minorHAnsi"/>
+          <w:sz w:val="24"/>
+          <w:szCs w:val="24"/>
+        </w:rPr>
+      </w:pPr>
+      <w:r>
+        <w:rPr>
+          <w:rFonts w:cstheme="minorHAnsi"/>
+          <w:noProof/>
+          <w:sz w:val="24"/>
+          <w:szCs w:val="24"/>
+        </w:rPr>
+        <w:drawing>
+          <wp:anchor distT="0" distB="0" distL="114300" distR="114300" simplePos="0" relativeHeight="251707392" behindDoc="0" locked="0" layoutInCell="1" allowOverlap="1" wp14:anchorId="22A65990" wp14:editId="62C6B2BE">
+            <wp:simplePos x="0" y="0"/>
+            <wp:positionH relativeFrom="margin">
+              <wp:align>left</wp:align>
+            </wp:positionH>
+            <wp:positionV relativeFrom="paragraph">
+              <wp:posOffset>738065</wp:posOffset>
+            </wp:positionV>
+            <wp:extent cx="5717167" cy="562708"/>
+            <wp:effectExtent l="0" t="0" r="0" b="8890"/>
+            <wp:wrapNone/>
+            <wp:docPr id="1943886225" name="Imagen 1"/>
+            <wp:cNvGraphicFramePr>
+              <a:graphicFrameLocks xmlns:a="http://schemas.openxmlformats.org/drawingml/2006/main" noChangeAspect="1"/>
+            </wp:cNvGraphicFramePr>
+            <a:graphic xmlns:a="http://schemas.openxmlformats.org/drawingml/2006/main">
+              <a:graphicData uri="http://schemas.openxmlformats.org/drawingml/2006/picture">
+                <pic:pic xmlns:pic="http://schemas.openxmlformats.org/drawingml/2006/picture">
+                  <pic:nvPicPr>
+                    <pic:cNvPr id="1943886225" name=""/>
+                    <pic:cNvPicPr/>
+                  </pic:nvPicPr>
+                  <pic:blipFill>
+                    <a:blip r:embed="rId81">
+                      <a:extLst>
+                        <a:ext uri="{28A0092B-C50C-407E-A947-70E740481C1C}">
+                          <a14:useLocalDpi xmlns:a14="http://schemas.microsoft.com/office/drawing/2010/main" val="0"/>
+                        </a:ext>
+                      </a:extLst>
+                    </a:blip>
+                    <a:stretch>
+                      <a:fillRect/>
+                    </a:stretch>
+                  </pic:blipFill>
+                  <pic:spPr>
+                    <a:xfrm>
+                      <a:off x="0" y="0"/>
+                      <a:ext cx="5717167" cy="562708"/>
+                    </a:xfrm>
+                    <a:prstGeom prst="rect">
+                      <a:avLst/>
+                    </a:prstGeom>
+                  </pic:spPr>
+                </pic:pic>
+              </a:graphicData>
+            </a:graphic>
+            <wp14:sizeRelH relativeFrom="margin">
+              <wp14:pctWidth>0</wp14:pctWidth>
+            </wp14:sizeRelH>
+            <wp14:sizeRelV relativeFrom="margin">
+              <wp14:pctHeight>0</wp14:pctHeight>
+            </wp14:sizeRelV>
+          </wp:anchor>
+        </w:drawing>
+      </w:r>
+      <w:r>
+        <w:rPr>
+          <w:rFonts w:cstheme="minorHAnsi"/>
+          <w:sz w:val="24"/>
+          <w:szCs w:val="24"/>
+        </w:rPr>
+        <w:t xml:space="preserve">Si en cambio la celda está vacía en la columna </w:t>
+      </w:r>
+      <w:r>
+        <w:rPr>
+          <w:rFonts w:cstheme="minorHAnsi"/>
+          <w:b/>
+          <w:bCs/>
+          <w:sz w:val="24"/>
+          <w:szCs w:val="24"/>
+        </w:rPr>
+        <w:t>original,</w:t>
+      </w:r>
+      <w:r>
+        <w:rPr>
+          <w:rFonts w:cstheme="minorHAnsi"/>
+          <w:sz w:val="24"/>
+          <w:szCs w:val="24"/>
+        </w:rPr>
+        <w:t xml:space="preserve"> significa que el atributo está presente en el </w:t>
+      </w:r>
+      <w:r>
+        <w:rPr>
+          <w:rFonts w:cstheme="minorHAnsi"/>
+          <w:b/>
+          <w:bCs/>
+          <w:sz w:val="24"/>
+          <w:szCs w:val="24"/>
+        </w:rPr>
+        <w:t>archivo 2</w:t>
+      </w:r>
+      <w:r>
+        <w:rPr>
+          <w:rFonts w:cstheme="minorHAnsi"/>
+          <w:sz w:val="24"/>
+          <w:szCs w:val="24"/>
+        </w:rPr>
+        <w:t xml:space="preserve"> y el programa añadirá ese nuevo atributo con su respectivo valor:</w:t>
+      </w:r>
+    </w:p>
+    <w:p>
+      <w:pPr>
+        <w:rPr>
+          <w:rFonts w:cstheme="minorHAnsi"/>
+          <w:sz w:val="24"/>
+          <w:szCs w:val="24"/>
+        </w:rPr>
+      </w:pPr>
+    </w:p>
+    <w:p>
+      <w:pPr>
+        <w:rPr>
+          <w:rFonts w:cstheme="minorHAnsi"/>
+          <w:sz w:val="24"/>
+          <w:szCs w:val="24"/>
+        </w:rPr>
+      </w:pPr>
+    </w:p>
+    <w:p>
+      <w:pPr>
+        <w:rPr>
+          <w:rFonts w:cstheme="minorHAnsi"/>
+          <w:sz w:val="24"/>
+          <w:szCs w:val="24"/>
+        </w:rPr>
+      </w:pPr>
+    </w:p>
+    <w:p>
+      <w:pPr>
+        <w:rPr>
+          <w:rFonts w:cstheme="minorHAnsi"/>
+          <w:sz w:val="24"/>
+          <w:szCs w:val="24"/>
+        </w:rPr>
+      </w:pPr>
+      <w:r>
+        <w:rPr>
+          <w:rFonts w:cstheme="minorHAnsi"/>
+          <w:sz w:val="24"/>
+          <w:szCs w:val="24"/>
+        </w:rPr>
+        <w:t>Para revisar las diferencias actuales entre los 2 archivos manualmente, pulse Abrir en VS Code</w:t>
+      </w:r>
+    </w:p>
+    <w:p>
+      <w:pPr>
+        <w:rPr>
+          <w:rFonts w:cstheme="minorHAnsi"/>
+          <w:sz w:val="24"/>
+          <w:szCs w:val="24"/>
+        </w:rPr>
+      </w:pPr>
+    </w:p>
+    <w:p>
+      <w:pPr>
+        <w:jc w:val="center"/>
+        <w:rPr>
+          <w:rFonts w:cstheme="minorHAnsi"/>
+          <w:sz w:val="24"/>
+          <w:szCs w:val="24"/>
+        </w:rPr>
+      </w:pPr>
+      <w:r>
+        <w:rPr>
+          <w:rFonts w:cstheme="minorHAnsi"/>
+          <w:noProof/>
+          <w:sz w:val="24"/>
+          <w:szCs w:val="24"/>
+        </w:rPr>
+        <w:drawing>
+          <wp:inline distT="0" distB="0" distL="0" distR="0" wp14:anchorId="7BC3FD29" wp14:editId="28D3FB71">
+            <wp:extent cx="3362794" cy="885949"/>
+            <wp:effectExtent l="0" t="0" r="0" b="9525"/>
+            <wp:docPr id="683902950" name="Imagen 1"/>
+            <wp:cNvGraphicFramePr>
+              <a:graphicFrameLocks xmlns:a="http://schemas.openxmlformats.org/drawingml/2006/main" noChangeAspect="1"/>
+            </wp:cNvGraphicFramePr>
+            <a:graphic xmlns:a="http://schemas.openxmlformats.org/drawingml/2006/main">
+              <a:graphicData uri="http://schemas.openxmlformats.org/drawingml/2006/picture">
+                <pic:pic xmlns:pic="http://schemas.openxmlformats.org/drawingml/2006/picture">
+                  <pic:nvPicPr>
+                    <pic:cNvPr id="683902950" name=""/>
+                    <pic:cNvPicPr/>
+                  </pic:nvPicPr>
+                  <pic:blipFill>
+                    <a:blip r:embed="rId82"/>
+                    <a:stretch>
+                      <a:fillRect/>
+                    </a:stretch>
+                  </pic:blipFill>
+                  <pic:spPr>
+                    <a:xfrm>
+                      <a:off x="0" y="0"/>
+                      <a:ext cx="3362794" cy="885949"/>
+                    </a:xfrm>
+                    <a:prstGeom prst="rect">
+                      <a:avLst/>
+                    </a:prstGeom>
+                  </pic:spPr>
+                </pic:pic>
+              </a:graphicData>
+            </a:graphic>
+          </wp:inline>
+        </w:drawing>
+      </w:r>
+    </w:p>
+    <w:p>
+      <w:pPr>
+        <w:rPr>
+          <w:rFonts w:cstheme="minorHAnsi"/>
+          <w:sz w:val="24"/>
+          <w:szCs w:val="24"/>
+        </w:rPr>
+      </w:pPr>
+      <w:r>
+        <w:rPr>
+          <w:rFonts w:cstheme="minorHAnsi"/>
+          <w:sz w:val="24"/>
+          <w:szCs w:val="24"/>
+        </w:rPr>
+        <w:t>Esto abrirá el editor con ambos archivos en pantalla dividida:</w:t>
+      </w:r>
+    </w:p>
+    <w:p>
+      <w:pPr>
+        <w:jc w:val="center"/>
+        <w:rPr>
+          <w:rFonts w:cstheme="minorHAnsi"/>
+          <w:sz w:val="24"/>
+          <w:szCs w:val="24"/>
+        </w:rPr>
+      </w:pPr>
+      <w:r>
+        <w:rPr>
+          <w:rFonts w:cstheme="minorHAnsi"/>
+          <w:noProof/>
+          <w:sz w:val="24"/>
+          <w:szCs w:val="24"/>
+        </w:rPr>
+        <w:drawing>
+          <wp:inline distT="0" distB="0" distL="0" distR="0" wp14:anchorId="6761E71B" wp14:editId="31EBD478">
+            <wp:extent cx="5583115" cy="2572934"/>
+            <wp:effectExtent l="0" t="0" r="0" b="0"/>
+            <wp:docPr id="483576476" name="Imagen 1"/>
+            <wp:cNvGraphicFramePr>
+              <a:graphicFrameLocks xmlns:a="http://schemas.openxmlformats.org/drawingml/2006/main" noChangeAspect="1"/>
+            </wp:cNvGraphicFramePr>
+            <a:graphic xmlns:a="http://schemas.openxmlformats.org/drawingml/2006/main">
+              <a:graphicData uri="http://schemas.openxmlformats.org/drawingml/2006/picture">
+                <pic:pic xmlns:pic="http://schemas.openxmlformats.org/drawingml/2006/picture">
+                  <pic:nvPicPr>
+                    <pic:cNvPr id="483576476" name=""/>
+                    <pic:cNvPicPr/>
+                  </pic:nvPicPr>
+                  <pic:blipFill>
+                    <a:blip r:embed="rId83"/>
+                    <a:stretch>
+                      <a:fillRect/>
+                    </a:stretch>
+                  </pic:blipFill>
+                  <pic:spPr>
+                    <a:xfrm>
+                      <a:off x="0" y="0"/>
+                      <a:ext cx="5585309" cy="2573945"/>
+                    </a:xfrm>
+                    <a:prstGeom prst="rect">
+                      <a:avLst/>
+                    </a:prstGeom>
+                  </pic:spPr>
+                </pic:pic>
+              </a:graphicData>
+            </a:graphic>
+          </wp:inline>
+        </w:drawing>
+      </w:r>
+    </w:p>
+    <w:p>
+      <w:pPr>
+        <w:rPr>
+          <w:rFonts w:cstheme="minorHAnsi"/>
+          <w:sz w:val="24"/>
+          <w:szCs w:val="24"/>
+        </w:rPr>
+      </w:pPr>
+    </w:p>
+    <w:p>
+      <w:pPr>
+        <w:rPr>
+          <w:rFonts w:cstheme="minorHAnsi"/>
+          <w:sz w:val="24"/>
+          <w:szCs w:val="24"/>
+        </w:rPr>
+      </w:pPr>
+      <w:r>
+        <w:rPr>
+          <w:rFonts w:cstheme="minorHAnsi"/>
+          <w:sz w:val="24"/>
+          <w:szCs w:val="24"/>
+        </w:rPr>
+        <w:lastRenderedPageBreak/>
+        <w:t xml:space="preserve">Luego de revisar las diferencias, puede pulsar en exportar </w:t>
+      </w:r>
+      <w:proofErr w:type="spellStart"/>
+      <w:r>
+        <w:rPr>
+          <w:rFonts w:cstheme="minorHAnsi"/>
+          <w:sz w:val="24"/>
+          <w:szCs w:val="24"/>
+        </w:rPr>
+        <w:t>xml</w:t>
+      </w:r>
+      <w:proofErr w:type="spellEnd"/>
+      <w:r>
+        <w:rPr>
+          <w:rFonts w:cstheme="minorHAnsi"/>
+          <w:sz w:val="24"/>
+          <w:szCs w:val="24"/>
+        </w:rPr>
+        <w:t xml:space="preserve"> parcheado, donde el programa se encargará de generar un nuevo archivo con los campos de las </w:t>
+      </w:r>
+      <w:proofErr w:type="spellStart"/>
+      <w:r>
+        <w:rPr>
+          <w:rFonts w:cstheme="minorHAnsi"/>
+          <w:sz w:val="24"/>
+          <w:szCs w:val="24"/>
+        </w:rPr>
+        <w:t>apns</w:t>
+      </w:r>
+      <w:proofErr w:type="spellEnd"/>
+      <w:r>
+        <w:rPr>
+          <w:rFonts w:cstheme="minorHAnsi"/>
+          <w:sz w:val="24"/>
+          <w:szCs w:val="24"/>
+        </w:rPr>
+        <w:t xml:space="preserve"> modificados y en caso de haber agregado nuevas </w:t>
+      </w:r>
+      <w:proofErr w:type="spellStart"/>
+      <w:r>
+        <w:rPr>
+          <w:rFonts w:cstheme="minorHAnsi"/>
+          <w:sz w:val="24"/>
+          <w:szCs w:val="24"/>
+        </w:rPr>
+        <w:t>apns</w:t>
+      </w:r>
+      <w:proofErr w:type="spellEnd"/>
+      <w:r>
+        <w:rPr>
+          <w:rFonts w:cstheme="minorHAnsi"/>
+          <w:sz w:val="24"/>
+          <w:szCs w:val="24"/>
+        </w:rPr>
+        <w:t xml:space="preserve"> se pondrán debajo de todo, marcados con comentarios.</w:t>
+      </w:r>
+    </w:p>
+    <w:p>
+      <w:pPr>
+        <w:rPr>
+          <w:rFonts w:cstheme="minorHAnsi"/>
+          <w:sz w:val="24"/>
+          <w:szCs w:val="24"/>
+        </w:rPr>
+      </w:pPr>
+      <w:r>
+        <w:rPr>
+          <w:rFonts w:cstheme="minorHAnsi"/>
+          <w:sz w:val="24"/>
+          <w:szCs w:val="24"/>
+        </w:rPr>
+        <w:t>-Al finalizar la exportación aparecerá un pop up con la confirmación de la exportación y tendrá la opción de abrir el archivo exportado directamente desde ahí en el VS Code.</w:t>
+      </w:r>
+    </w:p>
+    <w:p>
+      <w:pPr>
+        <w:rPr>
+          <w:rFonts w:cstheme="minorHAnsi"/>
+          <w:sz w:val="24"/>
+          <w:szCs w:val="24"/>
+        </w:rPr>
+      </w:pPr>
+      <w:r>
+        <w:rPr>
+          <w:rFonts w:cstheme="minorHAnsi"/>
+          <w:noProof/>
+          <w:sz w:val="24"/>
+          <w:szCs w:val="24"/>
+        </w:rPr>
+        <w:drawing>
+          <wp:anchor distT="0" distB="0" distL="114300" distR="114300" simplePos="0" relativeHeight="251708416" behindDoc="0" locked="0" layoutInCell="1" allowOverlap="1" wp14:anchorId="3F42DB62" wp14:editId="02E705A3">
+            <wp:simplePos x="0" y="0"/>
+            <wp:positionH relativeFrom="column">
+              <wp:posOffset>716377</wp:posOffset>
+            </wp:positionH>
+            <wp:positionV relativeFrom="paragraph">
+              <wp:posOffset>139163</wp:posOffset>
+            </wp:positionV>
+            <wp:extent cx="3658111" cy="1924319"/>
+            <wp:effectExtent l="0" t="0" r="0" b="0"/>
+            <wp:wrapNone/>
+            <wp:docPr id="1963771096" name="Imagen 1"/>
+            <wp:cNvGraphicFramePr>
+              <a:graphicFrameLocks xmlns:a="http://schemas.openxmlformats.org/drawingml/2006/main" noChangeAspect="1"/>
+            </wp:cNvGraphicFramePr>
+            <a:graphic xmlns:a="http://schemas.openxmlformats.org/drawingml/2006/main">
+              <a:graphicData uri="http://schemas.openxmlformats.org/drawingml/2006/picture">
+                <pic:pic xmlns:pic="http://schemas.openxmlformats.org/drawingml/2006/picture">
+                  <pic:nvPicPr>
+                    <pic:cNvPr id="1963771096" name=""/>
+                    <pic:cNvPicPr/>
+                  </pic:nvPicPr>
+                  <pic:blipFill>
+                    <a:blip r:embed="rId84">
+                      <a:extLst>
+                        <a:ext uri="{28A0092B-C50C-407E-A947-70E740481C1C}">
+                          <a14:useLocalDpi xmlns:a14="http://schemas.microsoft.com/office/drawing/2010/main" val="0"/>
+                        </a:ext>
+                      </a:extLst>
+                    </a:blip>
+                    <a:stretch>
+                      <a:fillRect/>
+                    </a:stretch>
+                  </pic:blipFill>
+                  <pic:spPr>
+                    <a:xfrm>
+                      <a:off x="0" y="0"/>
+                      <a:ext cx="3658111" cy="1924319"/>
+                    </a:xfrm>
+                    <a:prstGeom prst="rect">
+                      <a:avLst/>
+                    </a:prstGeom>
+                  </pic:spPr>
+                </pic:pic>
+              </a:graphicData>
+            </a:graphic>
+          </wp:anchor>
+        </w:drawing>
+      </w:r>
+    </w:p>
+    <w:p>
+      <w:pPr>
+        <w:rPr>
+          <w:rFonts w:cstheme="minorHAnsi"/>
+          <w:sz w:val="24"/>
+          <w:szCs w:val="24"/>
+        </w:rPr>
+      </w:pPr>
+    </w:p>
+    <w:p>
+      <w:pPr>
+        <w:rPr>
+          <w:rFonts w:cstheme="minorHAnsi"/>
+          <w:sz w:val="24"/>
+          <w:szCs w:val="24"/>
+        </w:rPr>
+      </w:pPr>
+    </w:p>
+    <w:p>
+      <w:pPr>
+        <w:rPr>
+          <w:rFonts w:cstheme="minorHAnsi"/>
+          <w:sz w:val="24"/>
+          <w:szCs w:val="24"/>
+        </w:rPr>
+      </w:pPr>
+    </w:p>
+    <w:p>
+      <w:pPr>
+        <w:rPr>
+          <w:rFonts w:cstheme="minorHAnsi"/>
+          <w:sz w:val="24"/>
+          <w:szCs w:val="24"/>
+        </w:rPr>
+      </w:pPr>
+    </w:p>
+    <w:p>
+      <w:pPr>
+        <w:rPr>
+          <w:rFonts w:cstheme="minorHAnsi"/>
+          <w:sz w:val="24"/>
+          <w:szCs w:val="24"/>
+        </w:rPr>
+      </w:pPr>
+    </w:p>
+    <w:p>
+      <w:pPr>
+        <w:rPr>
+          <w:rFonts w:cstheme="minorHAnsi"/>
+          <w:sz w:val="24"/>
+          <w:szCs w:val="24"/>
+        </w:rPr>
+      </w:pPr>
+    </w:p>
+    <w:p>
+      <w:pPr>
+        <w:rPr>
+          <w:rFonts w:cstheme="minorHAnsi"/>
+          <w:sz w:val="24"/>
+          <w:szCs w:val="24"/>
+        </w:rPr>
+      </w:pPr>
+    </w:p>
+    <w:p>
+      <w:pPr>
+        <w:rPr>
+          <w:rFonts w:cstheme="minorHAnsi"/>
+          <w:sz w:val="24"/>
+          <w:szCs w:val="24"/>
+        </w:rPr>
+      </w:pPr>
+      <w:r>
+        <w:rPr>
+          <w:rFonts w:cstheme="minorHAnsi"/>
+          <w:sz w:val="24"/>
+          <w:szCs w:val="24"/>
+        </w:rPr>
+        <w:t>Ejemplo de visualización de archivo exportado con comentarios:</w:t>
+      </w:r>
+    </w:p>
+    <w:p>
+      <w:pPr>
+        <w:rPr>
+          <w:rFonts w:cstheme="minorHAnsi"/>
+          <w:sz w:val="24"/>
+          <w:szCs w:val="24"/>
+        </w:rPr>
+      </w:pPr>
+      <w:r>
+        <w:rPr>
+          <w:rFonts w:cstheme="minorHAnsi"/>
+          <w:noProof/>
+          <w:sz w:val="24"/>
+          <w:szCs w:val="24"/>
+        </w:rPr>
+        <w:drawing>
+          <wp:inline distT="0" distB="0" distL="0" distR="0" wp14:anchorId="73CFF92E" wp14:editId="0C97580C">
+            <wp:extent cx="5400040" cy="2609850"/>
+            <wp:effectExtent l="0" t="0" r="0" b="0"/>
+            <wp:docPr id="1487449891" name="Imagen 1"/>
+            <wp:cNvGraphicFramePr>
+              <a:graphicFrameLocks xmlns:a="http://schemas.openxmlformats.org/drawingml/2006/main" noChangeAspect="1"/>
+            </wp:cNvGraphicFramePr>
+            <a:graphic xmlns:a="http://schemas.openxmlformats.org/drawingml/2006/main">
+              <a:graphicData uri="http://schemas.openxmlformats.org/drawingml/2006/picture">
+                <pic:pic xmlns:pic="http://schemas.openxmlformats.org/drawingml/2006/picture">
+                  <pic:nvPicPr>
+                    <pic:cNvPr id="1487449891" name=""/>
+                    <pic:cNvPicPr/>
+                  </pic:nvPicPr>
+                  <pic:blipFill>
+                    <a:blip r:embed="rId85"/>
+                    <a:stretch>
+                      <a:fillRect/>
+                    </a:stretch>
+                  </pic:blipFill>
+                  <pic:spPr>
+                    <a:xfrm>
+                      <a:off x="0" y="0"/>
+                      <a:ext cx="5400040" cy="2609850"/>
+                    </a:xfrm>
+                    <a:prstGeom prst="rect">
+                      <a:avLst/>
+                    </a:prstGeom>
+                  </pic:spPr>
+                </pic:pic>
+              </a:graphicData>
+            </a:graphic>
+          </wp:inline>
+        </w:drawing>
+      </w:r>
+    </w:p>
+    <w:p>
+      <w:pPr>
+        <w:rPr>
+          <w:rFonts w:cstheme="minorHAnsi"/>
+          <w:sz w:val="24"/>
+          <w:szCs w:val="24"/>
+        </w:rPr>
+      </w:pPr>
+    </w:p>
+    <w:p>
+      <w:pPr>
+        <w:rPr>
+          <w:rFonts w:cstheme="minorHAnsi"/>
+          <w:sz w:val="24"/>
+          <w:szCs w:val="24"/>
+        </w:rPr>
+      </w:pPr>
+      <w:r>
+        <w:rPr>
+          <w:rFonts w:cstheme="minorHAnsi"/>
+          <w:noProof/>
+          <w:sz w:val="24"/>
+          <w:szCs w:val="24"/>
+        </w:rPr>
+        <w:lastRenderedPageBreak/>
+        <w:drawing>
+          <wp:inline distT="0" distB="0" distL="0" distR="0" wp14:anchorId="251971FE" wp14:editId="5C36E880">
+            <wp:extent cx="5400040" cy="2274570"/>
+            <wp:effectExtent l="0" t="0" r="0" b="0"/>
+            <wp:docPr id="1155058374" name="Imagen 1"/>
+            <wp:cNvGraphicFramePr>
+              <a:graphicFrameLocks xmlns:a="http://schemas.openxmlformats.org/drawingml/2006/main" noChangeAspect="1"/>
+            </wp:cNvGraphicFramePr>
+            <a:graphic xmlns:a="http://schemas.openxmlformats.org/drawingml/2006/main">
+              <a:graphicData uri="http://schemas.openxmlformats.org/drawingml/2006/picture">
+                <pic:pic xmlns:pic="http://schemas.openxmlformats.org/drawingml/2006/picture">
+                  <pic:nvPicPr>
+                    <pic:cNvPr id="1155058374" name=""/>
+                    <pic:cNvPicPr/>
+                  </pic:nvPicPr>
+                  <pic:blipFill>
+                    <a:blip r:embed="rId86"/>
+                    <a:stretch>
+                      <a:fillRect/>
+                    </a:stretch>
+                  </pic:blipFill>
+                  <pic:spPr>
+                    <a:xfrm>
+                      <a:off x="0" y="0"/>
+                      <a:ext cx="5400040" cy="2274570"/>
+                    </a:xfrm>
+                    <a:prstGeom prst="rect">
+                      <a:avLst/>
+                    </a:prstGeom>
+                  </pic:spPr>
+                </pic:pic>
+              </a:graphicData>
+            </a:graphic>
+          </wp:inline>
+        </w:drawing>
+      </w:r>
+    </w:p>
+    <w:p>
+      <w:pPr>
+        <w:rPr>
+          <w:rFonts w:cstheme="minorHAnsi"/>
+          <w:sz w:val="24"/>
+          <w:szCs w:val="24"/>
+        </w:rPr>
+      </w:pPr>
+      <w:r>
+        <w:rPr>
+          <w:rFonts w:cstheme="minorHAnsi"/>
+          <w:sz w:val="24"/>
+          <w:szCs w:val="24"/>
+        </w:rPr>
+        <w:t xml:space="preserve">Para cargar nuevos archivos, primero deberá vaciar la información que muestra la tabla haciendo clic en limpiar </w:t>
+      </w:r>
+    </w:p>
+    <w:p>
+      <w:pPr>
+        <w:rPr>
+          <w:rFonts w:cstheme="minorHAnsi"/>
+          <w:sz w:val="24"/>
+          <w:szCs w:val="24"/>
+        </w:rPr>
+      </w:pPr>
+    </w:p>
+    <w:p>
+      <w:pPr>
+        <w:jc w:val="center"/>
+        <w:rPr>
+          <w:rFonts w:cstheme="minorHAnsi"/>
+          <w:sz w:val="24"/>
+          <w:szCs w:val="24"/>
+        </w:rPr>
+      </w:pPr>
+      <w:r>
+        <w:rPr>
+          <w:rFonts w:cstheme="minorHAnsi"/>
+          <w:noProof/>
+          <w:sz w:val="24"/>
+          <w:szCs w:val="24"/>
+        </w:rPr>
+        <w:drawing>
+          <wp:inline distT="0" distB="0" distL="0" distR="0" wp14:anchorId="41825E6D" wp14:editId="416D52F7">
+            <wp:extent cx="2086266" cy="657317"/>
+            <wp:effectExtent l="0" t="0" r="0" b="9525"/>
+            <wp:docPr id="1379315573" name="Imagen 1"/>
+            <wp:cNvGraphicFramePr>
+              <a:graphicFrameLocks xmlns:a="http://schemas.openxmlformats.org/drawingml/2006/main" noChangeAspect="1"/>
+            </wp:cNvGraphicFramePr>
+            <a:graphic xmlns:a="http://schemas.openxmlformats.org/drawingml/2006/main">
+              <a:graphicData uri="http://schemas.openxmlformats.org/drawingml/2006/picture">
+                <pic:pic xmlns:pic="http://schemas.openxmlformats.org/drawingml/2006/picture">
+                  <pic:nvPicPr>
+                    <pic:cNvPr id="1379315573" name=""/>
+                    <pic:cNvPicPr/>
+                  </pic:nvPicPr>
+                  <pic:blipFill>
+                    <a:blip r:embed="rId87"/>
+                    <a:stretch>
+                      <a:fillRect/>
+                    </a:stretch>
+                  </pic:blipFill>
+                  <pic:spPr>
+                    <a:xfrm>
+                      <a:off x="0" y="0"/>
+                      <a:ext cx="2086266" cy="657317"/>
+                    </a:xfrm>
+                    <a:prstGeom prst="rect">
+                      <a:avLst/>
+                    </a:prstGeom>
+                  </pic:spPr>
+                </pic:pic>
+              </a:graphicData>
+            </a:graphic>
+          </wp:inline>
+        </w:drawing>
+      </w:r>
+    </w:p>
+    <w:p>
+      <w:pPr>
+        <w:rPr>
+          <w:rFonts w:cstheme="minorHAnsi"/>
+          <w:sz w:val="24"/>
+          <w:szCs w:val="24"/>
+        </w:rPr>
+      </w:pPr>
+      <w:r>
+        <w:rPr>
+          <w:rFonts w:cstheme="minorHAnsi"/>
+          <w:sz w:val="24"/>
+          <w:szCs w:val="24"/>
+        </w:rPr>
+        <w:t xml:space="preserve">Al cargar un archivo que ha sido exportado anteriormente, el programa eliminará automáticamente todos los comentarios generados en exportaciones previas (los que indican </w:t>
+      </w:r>
+      <w:proofErr w:type="spellStart"/>
+      <w:r>
+        <w:rPr>
+          <w:rFonts w:cstheme="minorHAnsi"/>
+          <w:sz w:val="24"/>
+          <w:szCs w:val="24"/>
+        </w:rPr>
+        <w:t>APNs</w:t>
+      </w:r>
+      <w:proofErr w:type="spellEnd"/>
+      <w:r>
+        <w:rPr>
+          <w:rFonts w:cstheme="minorHAnsi"/>
+          <w:sz w:val="24"/>
+          <w:szCs w:val="24"/>
+        </w:rPr>
+        <w:t xml:space="preserve"> modificados y nuevos). De esta forma se garantiza que, al realizar una nueva comparación o exportación, el archivo se procesa como si fuera un XML limpio, evitando que comentarios antiguos interfieran con los nuevos cambios y asegurando que el resultado final refleje únicamente las diferencias reales entre los archivos cargados.</w:t>
+      </w:r>
+    </w:p>
+    <w:p>
+      <w:pPr>
+        <w:rPr>
+          <w:rFonts w:cstheme="minorHAnsi"/>
+          <w:color w:val="4472C4" w:themeColor="accent1"/>
+          <w:sz w:val="18"/>
+          <w:szCs w:val="18"/>
+        </w:rPr>
+      </w:pPr>
+      <w:r>
+        <w:rPr>
+          <w:rFonts w:cstheme="minorHAnsi"/>
+          <w:noProof/>
+          <w:sz w:val="18"/>
+          <w:szCs w:val="18"/>
+        </w:rPr>
+        <w:drawing>
+          <wp:anchor distT="0" distB="0" distL="114300" distR="114300" simplePos="0" relativeHeight="251709440" behindDoc="0" locked="0" layoutInCell="1" allowOverlap="1" wp14:anchorId="1A149FA1" wp14:editId="243CAB6C">
+            <wp:simplePos x="0" y="0"/>
+            <wp:positionH relativeFrom="column">
+              <wp:posOffset>2954899</wp:posOffset>
+            </wp:positionH>
+            <wp:positionV relativeFrom="paragraph">
+              <wp:posOffset>313153</wp:posOffset>
+            </wp:positionV>
+            <wp:extent cx="2762250" cy="514350"/>
+            <wp:effectExtent l="0" t="0" r="0" b="0"/>
+            <wp:wrapNone/>
+            <wp:docPr id="643108090" name="Imagen 1"/>
+            <wp:cNvGraphicFramePr>
+              <a:graphicFrameLocks xmlns:a="http://schemas.openxmlformats.org/drawingml/2006/main" noChangeAspect="1"/>
+            </wp:cNvGraphicFramePr>
+            <a:graphic xmlns:a="http://schemas.openxmlformats.org/drawingml/2006/main">
+              <a:graphicData uri="http://schemas.openxmlformats.org/drawingml/2006/picture">
+                <pic:pic xmlns:pic="http://schemas.openxmlformats.org/drawingml/2006/picture">
+                  <pic:nvPicPr>
+                    <pic:cNvPr id="643108090" name=""/>
+                    <pic:cNvPicPr/>
+                  </pic:nvPicPr>
+                  <pic:blipFill>
+                    <a:blip r:embed="rId88">
+                      <a:extLst>
+                        <a:ext uri="{28A0092B-C50C-407E-A947-70E740481C1C}">
+                          <a14:useLocalDpi xmlns:a14="http://schemas.microsoft.com/office/drawing/2010/main" val="0"/>
+                        </a:ext>
+                      </a:extLst>
+                    </a:blip>
+                    <a:stretch>
+                      <a:fillRect/>
+                    </a:stretch>
+                  </pic:blipFill>
+                  <pic:spPr>
+                    <a:xfrm>
+                      <a:off x="0" y="0"/>
+                      <a:ext cx="2762250" cy="514350"/>
+                    </a:xfrm>
+                    <a:prstGeom prst="rect">
+                      <a:avLst/>
+                    </a:prstGeom>
+                  </pic:spPr>
+                </pic:pic>
+              </a:graphicData>
+            </a:graphic>
+          </wp:anchor>
+        </w:drawing>
+      </w:r>
+      <w:r>
+        <w:rPr>
+          <w:rFonts w:cstheme="minorHAnsi"/>
+          <w:noProof/>
+          <w:sz w:val="18"/>
+          <w:szCs w:val="18"/>
+        </w:rPr>
+        <w:drawing>
+          <wp:anchor distT="0" distB="0" distL="114300" distR="114300" simplePos="0" relativeHeight="251710464" behindDoc="0" locked="0" layoutInCell="1" allowOverlap="1" wp14:anchorId="46891019" wp14:editId="133B5BF6">
+            <wp:simplePos x="0" y="0"/>
+            <wp:positionH relativeFrom="margin">
+              <wp:align>left</wp:align>
+            </wp:positionH>
+            <wp:positionV relativeFrom="paragraph">
+              <wp:posOffset>347394</wp:posOffset>
+            </wp:positionV>
+            <wp:extent cx="2724150" cy="465992"/>
+            <wp:effectExtent l="0" t="0" r="0" b="0"/>
+            <wp:wrapNone/>
+            <wp:docPr id="580974567" name="Imagen 1"/>
+            <wp:cNvGraphicFramePr>
+              <a:graphicFrameLocks xmlns:a="http://schemas.openxmlformats.org/drawingml/2006/main" noChangeAspect="1"/>
+            </wp:cNvGraphicFramePr>
+            <a:graphic xmlns:a="http://schemas.openxmlformats.org/drawingml/2006/main">
+              <a:graphicData uri="http://schemas.openxmlformats.org/drawingml/2006/picture">
+                <pic:pic xmlns:pic="http://schemas.openxmlformats.org/drawingml/2006/picture">
+                  <pic:nvPicPr>
+                    <pic:cNvPr id="580974567" name=""/>
+                    <pic:cNvPicPr/>
+                  </pic:nvPicPr>
+                  <pic:blipFill>
+                    <a:blip r:embed="rId89">
+                      <a:extLst>
+                        <a:ext uri="{28A0092B-C50C-407E-A947-70E740481C1C}">
+                          <a14:useLocalDpi xmlns:a14="http://schemas.microsoft.com/office/drawing/2010/main" val="0"/>
+                        </a:ext>
+                      </a:extLst>
+                    </a:blip>
+                    <a:stretch>
+                      <a:fillRect/>
+                    </a:stretch>
+                  </pic:blipFill>
+                  <pic:spPr>
+                    <a:xfrm>
+                      <a:off x="0" y="0"/>
+                      <a:ext cx="2724150" cy="465992"/>
+                    </a:xfrm>
+                    <a:prstGeom prst="rect">
+                      <a:avLst/>
+                    </a:prstGeom>
+                  </pic:spPr>
+                </pic:pic>
+              </a:graphicData>
+            </a:graphic>
+            <wp14:sizeRelV relativeFrom="margin">
+              <wp14:pctHeight>0</wp14:pctHeight>
+            </wp14:sizeRelV>
+          </wp:anchor>
+        </w:drawing>
+      </w:r>
+      <w:r>
+        <w:rPr>
+          <w:rFonts w:cstheme="minorHAnsi"/>
+          <w:sz w:val="18"/>
+          <w:szCs w:val="18"/>
+        </w:rPr>
+        <w:t>Archivo:</w:t>
+      </w:r>
+      <w:r>
+        <w:rPr>
+          <w:rFonts w:cstheme="minorHAnsi"/>
+          <w:sz w:val="24"/>
+          <w:szCs w:val="24"/>
+        </w:rPr>
+        <w:t xml:space="preserve"> </w:t>
+      </w:r>
+      <w:r>
+        <w:rPr>
+          <w:rFonts w:cstheme="minorHAnsi"/>
+          <w:color w:val="4472C4" w:themeColor="accent1"/>
+          <w:sz w:val="18"/>
+          <w:szCs w:val="18"/>
+        </w:rPr>
+        <w:t>apns-conf_F780_SW20260330_parcheado_v1</w:t>
+      </w:r>
+      <w:r>
+        <w:rPr>
+          <w:rFonts w:cstheme="minorHAnsi"/>
+          <w:color w:val="4472C4" w:themeColor="accent1"/>
+          <w:sz w:val="18"/>
+          <w:szCs w:val="18"/>
+        </w:rPr>
+        <w:t xml:space="preserve">    </w:t>
+      </w:r>
+      <w:r>
+        <w:rPr>
+          <w:rFonts w:cstheme="minorHAnsi"/>
+          <w:color w:val="4472C4" w:themeColor="accent1"/>
+          <w:sz w:val="18"/>
+          <w:szCs w:val="18"/>
+        </w:rPr>
+        <w:t xml:space="preserve"> </w:t>
+      </w:r>
+      <w:r>
+        <w:rPr>
+          <w:rFonts w:cstheme="minorHAnsi"/>
+          <w:color w:val="4472C4" w:themeColor="accent1"/>
+          <w:sz w:val="18"/>
+          <w:szCs w:val="18"/>
+        </w:rPr>
+        <w:t xml:space="preserve">        </w:t>
+      </w:r>
+      <w:r>
+        <w:rPr>
+          <w:rFonts w:cstheme="minorHAnsi"/>
+          <w:sz w:val="18"/>
+          <w:szCs w:val="18"/>
+        </w:rPr>
+        <w:t xml:space="preserve">Archivo: </w:t>
+      </w:r>
+      <w:r>
+        <w:rPr>
+          <w:rFonts w:cstheme="minorHAnsi"/>
+          <w:color w:val="4472C4" w:themeColor="accent1"/>
+          <w:sz w:val="18"/>
+          <w:szCs w:val="18"/>
+        </w:rPr>
+        <w:t>apnsconf_F780_SW20260330_parcheado_v2</w:t>
+      </w:r>
     </w:p>
     <w:sectPr>
       <w:pgSz w:w="11906" w:h="16838"/>

</xml_diff>

<commit_message>
Manual de Usuario actualizado para la versión 1.2.0
</commit_message>
<xml_diff>
--- a/doc/Manual De Usuario.docx
+++ b/doc/Manual De Usuario.docx
@@ -303,7 +303,7 @@
           <w:szCs w:val="24"/>
         </w:rPr>
         <w:drawing>
-          <wp:inline distT="0" distB="0" distL="0" distR="0" wp14:anchorId="698E36EB" wp14:editId="70C6A0B8">
+          <wp:inline distT="0" distB="0" distL="0" distR="0" wp14:anchorId="698E36EB" wp14:editId="3F4797C1">
             <wp:extent cx="5400040" cy="2348948"/>
             <wp:effectExtent l="0" t="0" r="0" b="0"/>
             <wp:docPr id="1508712064" name="Imagen 2"/>
@@ -3507,7 +3507,7 @@
           <w:sz w:val="24"/>
           <w:szCs w:val="24"/>
         </w:rPr>
-        <w:t xml:space="preserve"> automatizados al dispositivo conectado en ese momento. En la lista de pasos podremos ver algunas que vienen por defecto para hacer una prueba rápida, si desea puede quitar los pasos por defecto haciendo clic en el botón de limpiar que se encuentra debajo de la lista.</w:t>
+        <w:t xml:space="preserve"> automatizados al dispositivo conectado en ese momento.</w:t>
       </w:r>
     </w:p>
     <w:p>
@@ -3523,25 +3523,47 @@
       </w:pPr>
       <w:r>
         <w:rPr>
-          <w:rFonts w:cstheme="minorHAnsi"/>
-          <w:sz w:val="24"/>
-          <w:szCs w:val="24"/>
-        </w:rPr>
-        <w:t xml:space="preserve">a) </w:t>
-      </w:r>
-      <w:r>
-        <w:rPr>
-          <w:sz w:val="24"/>
-          <w:szCs w:val="24"/>
-        </w:rPr>
-        <w:t xml:space="preserve">A continuación puede añadir nuevos pasos pulsando en los iconos </w:t>
-      </w:r>
-      <w:r>
-        <w:rPr>
-          <w:sz w:val="24"/>
-          <w:szCs w:val="24"/>
-        </w:rPr>
-        <w:t>de cualquiera de los apartados Conectividad &amp; Red Y Pruebas de Hardware.</w:t>
+          <w:sz w:val="24"/>
+          <w:szCs w:val="24"/>
+        </w:rPr>
+        <w:t xml:space="preserve">A </w:t>
+      </w:r>
+      <w:proofErr w:type="gramStart"/>
+      <w:r>
+        <w:rPr>
+          <w:sz w:val="24"/>
+          <w:szCs w:val="24"/>
+        </w:rPr>
+        <w:t>continuación</w:t>
+      </w:r>
+      <w:proofErr w:type="gramEnd"/>
+      <w:r>
+        <w:rPr>
+          <w:sz w:val="24"/>
+          <w:szCs w:val="24"/>
+        </w:rPr>
+        <w:t xml:space="preserve"> puede añadir nuevos pasos pulsando en los iconos </w:t>
+      </w:r>
+      <w:r>
+        <w:rPr>
+          <w:sz w:val="24"/>
+          <w:szCs w:val="24"/>
+        </w:rPr>
+        <w:t>de cualquiera de los apartados</w:t>
+      </w:r>
+      <w:r>
+        <w:rPr>
+          <w:sz w:val="24"/>
+          <w:szCs w:val="24"/>
+        </w:rPr>
+        <w:t>, pruebas de software y hardware</w:t>
+      </w:r>
+      <w:r>
+        <w:rPr>
+          <w:sz w:val="24"/>
+          <w:szCs w:val="24"/>
+        </w:rPr>
+        <w:t>.</w:t>
       </w:r>
     </w:p>
     <w:p>
@@ -3551,82 +3573,34 @@
         </w:tabs>
         <w:jc w:val="both"/>
         <w:rPr>
-          <w:rFonts w:cstheme="minorHAnsi"/>
-          <w:b/>
-          <w:bCs/>
-          <w:sz w:val="24"/>
-          <w:szCs w:val="24"/>
-        </w:rPr>
-      </w:pPr>
-      <w:proofErr w:type="gramStart"/>
-      <w:r>
-        <w:rPr>
-          <w:rFonts w:cstheme="minorHAnsi"/>
-          <w:b/>
-          <w:bCs/>
-          <w:sz w:val="24"/>
-          <w:szCs w:val="24"/>
-        </w:rPr>
-        <w:t>Importante!!</w:t>
-      </w:r>
-      <w:proofErr w:type="gramEnd"/>
-      <w:r>
-        <w:rPr>
-          <w:rFonts w:cstheme="minorHAnsi"/>
-          <w:b/>
-          <w:bCs/>
-          <w:sz w:val="24"/>
-          <w:szCs w:val="24"/>
-        </w:rPr>
-        <w:t xml:space="preserve"> Para probar la vibración del dispositivo, éste debe ser </w:t>
-      </w:r>
-      <w:proofErr w:type="spellStart"/>
-      <w:r>
-        <w:rPr>
-          <w:rFonts w:cstheme="minorHAnsi"/>
-          <w:b/>
-          <w:bCs/>
-          <w:sz w:val="24"/>
-          <w:szCs w:val="24"/>
-        </w:rPr>
-        <w:t>root</w:t>
-      </w:r>
-      <w:proofErr w:type="spellEnd"/>
-      <w:r>
-        <w:rPr>
-          <w:rFonts w:cstheme="minorHAnsi"/>
-          <w:b/>
-          <w:bCs/>
-          <w:sz w:val="24"/>
-          <w:szCs w:val="24"/>
-        </w:rPr>
-        <w:t>.</w:t>
-      </w:r>
+          <w:sz w:val="24"/>
+          <w:szCs w:val="24"/>
+        </w:rPr>
+      </w:pPr>
     </w:p>
     <w:p>
       <w:pPr>
         <w:tabs>
           <w:tab w:val="left" w:pos="2586"/>
         </w:tabs>
-        <w:jc w:val="both"/>
-        <w:rPr>
-          <w:rFonts w:cstheme="minorHAnsi"/>
-          <w:sz w:val="24"/>
-          <w:szCs w:val="24"/>
-        </w:rPr>
-      </w:pPr>
-      <w:r>
-        <w:rPr>
-          <w:rFonts w:cstheme="minorHAnsi"/>
-          <w:noProof/>
+        <w:jc w:val="center"/>
+        <w:rPr>
+          <w:rFonts w:cstheme="minorHAnsi"/>
+          <w:sz w:val="24"/>
+          <w:szCs w:val="24"/>
+        </w:rPr>
+      </w:pPr>
+      <w:r>
+        <w:rPr>
+          <w:rFonts w:cstheme="minorHAnsi"/>
           <w:sz w:val="24"/>
           <w:szCs w:val="24"/>
         </w:rPr>
         <w:drawing>
-          <wp:inline distT="0" distB="0" distL="0" distR="0" wp14:anchorId="0281EDD0" wp14:editId="4D8CEC80">
-            <wp:extent cx="4363059" cy="2276793"/>
-            <wp:effectExtent l="0" t="0" r="0" b="9525"/>
-            <wp:docPr id="944642028" name="Imagen 1"/>
+          <wp:inline distT="0" distB="0" distL="0" distR="0" wp14:anchorId="7902F001" wp14:editId="00BE4FD4">
+            <wp:extent cx="5058481" cy="2438740"/>
+            <wp:effectExtent l="0" t="0" r="8890" b="0"/>
+            <wp:docPr id="201896906" name="Imagen 1"/>
             <wp:cNvGraphicFramePr>
               <a:graphicFrameLocks xmlns:a="http://schemas.openxmlformats.org/drawingml/2006/main" noChangeAspect="1"/>
             </wp:cNvGraphicFramePr>
@@ -3634,7 +3608,7 @@
               <a:graphicData uri="http://schemas.openxmlformats.org/drawingml/2006/picture">
                 <pic:pic xmlns:pic="http://schemas.openxmlformats.org/drawingml/2006/picture">
                   <pic:nvPicPr>
-                    <pic:cNvPr id="944642028" name=""/>
+                    <pic:cNvPr id="201896906" name=""/>
                     <pic:cNvPicPr/>
                   </pic:nvPicPr>
                   <pic:blipFill>
@@ -3646,7 +3620,7 @@
                   <pic:spPr>
                     <a:xfrm>
                       <a:off x="0" y="0"/>
-                      <a:ext cx="4363059" cy="2276793"/>
+                      <a:ext cx="5058481" cy="2438740"/>
                     </a:xfrm>
                     <a:prstGeom prst="rect">
                       <a:avLst/>
@@ -3661,28 +3635,238 @@
     </w:p>
     <w:p>
       <w:pPr>
-        <w:jc w:val="both"/>
-        <w:rPr>
-          <w:rFonts w:cstheme="minorHAnsi"/>
-          <w:sz w:val="24"/>
-          <w:szCs w:val="24"/>
-        </w:rPr>
-      </w:pPr>
-    </w:p>
-    <w:p>
-      <w:pPr>
-        <w:jc w:val="both"/>
-        <w:rPr>
-          <w:sz w:val="24"/>
-          <w:szCs w:val="24"/>
-        </w:rPr>
-      </w:pPr>
-      <w:r>
-        <w:rPr>
-          <w:sz w:val="24"/>
-          <w:szCs w:val="24"/>
-        </w:rPr>
-        <w:t xml:space="preserve">b) Debe darle clic al botón de ejecutar </w:t>
+        <w:tabs>
+          <w:tab w:val="left" w:pos="2586"/>
+        </w:tabs>
+        <w:jc w:val="both"/>
+        <w:rPr>
+          <w:rFonts w:cstheme="minorHAnsi"/>
+          <w:sz w:val="24"/>
+          <w:szCs w:val="24"/>
+        </w:rPr>
+      </w:pPr>
+      <w:r>
+        <w:rPr>
+          <w:rFonts w:cstheme="minorHAnsi"/>
+          <w:sz w:val="24"/>
+          <w:szCs w:val="24"/>
+        </w:rPr>
+        <w:t xml:space="preserve">Se abrirá un </w:t>
+      </w:r>
+      <w:proofErr w:type="spellStart"/>
+      <w:r>
+        <w:rPr>
+          <w:rFonts w:cstheme="minorHAnsi"/>
+          <w:sz w:val="24"/>
+          <w:szCs w:val="24"/>
+        </w:rPr>
+        <w:t>PopUp</w:t>
+      </w:r>
+      <w:proofErr w:type="spellEnd"/>
+      <w:r>
+        <w:rPr>
+          <w:rFonts w:cstheme="minorHAnsi"/>
+          <w:sz w:val="24"/>
+          <w:szCs w:val="24"/>
+        </w:rPr>
+        <w:t xml:space="preserve">, en el que salen todas las pruebas relacionadas a ese bloque, y desde ahí se puede seleccionar todas las pruebas o seleccionar prueba a prueba. </w:t>
+      </w:r>
+    </w:p>
+    <w:p>
+      <w:pPr>
+        <w:jc w:val="center"/>
+        <w:rPr>
+          <w:rFonts w:cstheme="minorHAnsi"/>
+          <w:sz w:val="24"/>
+          <w:szCs w:val="24"/>
+        </w:rPr>
+      </w:pPr>
+      <w:r>
+        <w:rPr>
+          <w:rFonts w:cstheme="minorHAnsi"/>
+          <w:sz w:val="24"/>
+          <w:szCs w:val="24"/>
+        </w:rPr>
+        <w:drawing>
+          <wp:inline distT="0" distB="0" distL="0" distR="0" wp14:anchorId="6D2DE4A0" wp14:editId="281EBDAD">
+            <wp:extent cx="3472203" cy="3933825"/>
+            <wp:effectExtent l="0" t="0" r="0" b="0"/>
+            <wp:docPr id="1458471080" name="Imagen 1"/>
+            <wp:cNvGraphicFramePr>
+              <a:graphicFrameLocks xmlns:a="http://schemas.openxmlformats.org/drawingml/2006/main" noChangeAspect="1"/>
+            </wp:cNvGraphicFramePr>
+            <a:graphic xmlns:a="http://schemas.openxmlformats.org/drawingml/2006/main">
+              <a:graphicData uri="http://schemas.openxmlformats.org/drawingml/2006/picture">
+                <pic:pic xmlns:pic="http://schemas.openxmlformats.org/drawingml/2006/picture">
+                  <pic:nvPicPr>
+                    <pic:cNvPr id="1458471080" name=""/>
+                    <pic:cNvPicPr/>
+                  </pic:nvPicPr>
+                  <pic:blipFill>
+                    <a:blip r:embed="rId26"/>
+                    <a:stretch>
+                      <a:fillRect/>
+                    </a:stretch>
+                  </pic:blipFill>
+                  <pic:spPr>
+                    <a:xfrm>
+                      <a:off x="0" y="0"/>
+                      <a:ext cx="3485830" cy="3949264"/>
+                    </a:xfrm>
+                    <a:prstGeom prst="rect">
+                      <a:avLst/>
+                    </a:prstGeom>
+                  </pic:spPr>
+                </pic:pic>
+              </a:graphicData>
+            </a:graphic>
+          </wp:inline>
+        </w:drawing>
+      </w:r>
+    </w:p>
+    <w:p>
+      <w:pPr>
+        <w:jc w:val="both"/>
+        <w:rPr>
+          <w:rFonts w:cstheme="minorHAnsi"/>
+          <w:sz w:val="24"/>
+          <w:szCs w:val="24"/>
+        </w:rPr>
+      </w:pPr>
+      <w:r>
+        <w:rPr>
+          <w:rFonts w:cstheme="minorHAnsi"/>
+          <w:sz w:val="24"/>
+          <w:szCs w:val="24"/>
+        </w:rPr>
+        <w:lastRenderedPageBreak/>
+        <w:t xml:space="preserve">(Algunos </w:t>
+      </w:r>
+      <w:proofErr w:type="spellStart"/>
+      <w:r>
+        <w:rPr>
+          <w:rFonts w:cstheme="minorHAnsi"/>
+          <w:sz w:val="24"/>
+          <w:szCs w:val="24"/>
+        </w:rPr>
+        <w:t>PopUps</w:t>
+      </w:r>
+      <w:proofErr w:type="spellEnd"/>
+      <w:r>
+        <w:rPr>
+          <w:rFonts w:cstheme="minorHAnsi"/>
+          <w:sz w:val="24"/>
+          <w:szCs w:val="24"/>
+        </w:rPr>
+        <w:t xml:space="preserve"> pueden tener campos extra que p</w:t>
+      </w:r>
+      <w:r>
+        <w:rPr>
+          <w:rFonts w:cstheme="minorHAnsi"/>
+          <w:sz w:val="24"/>
+          <w:szCs w:val="24"/>
+        </w:rPr>
+        <w:t xml:space="preserve">iden información como número de teléfono, al darle a continuar se redirigirá automáticamente al </w:t>
+      </w:r>
+      <w:proofErr w:type="spellStart"/>
+      <w:r>
+        <w:rPr>
+          <w:rFonts w:cstheme="minorHAnsi"/>
+          <w:sz w:val="24"/>
+          <w:szCs w:val="24"/>
+        </w:rPr>
+        <w:t>PopUp</w:t>
+      </w:r>
+      <w:proofErr w:type="spellEnd"/>
+      <w:r>
+        <w:rPr>
+          <w:rFonts w:cstheme="minorHAnsi"/>
+          <w:sz w:val="24"/>
+          <w:szCs w:val="24"/>
+        </w:rPr>
+        <w:t xml:space="preserve"> de seleccionar pruebas</w:t>
+      </w:r>
+      <w:r>
+        <w:rPr>
+          <w:rFonts w:cstheme="minorHAnsi"/>
+          <w:sz w:val="24"/>
+          <w:szCs w:val="24"/>
+        </w:rPr>
+        <w:t>)</w:t>
+      </w:r>
+      <w:r>
+        <w:rPr>
+          <w:rFonts w:cstheme="minorHAnsi"/>
+          <w:sz w:val="24"/>
+          <w:szCs w:val="24"/>
+        </w:rPr>
+        <w:t>.</w:t>
+      </w:r>
+    </w:p>
+    <w:p>
+      <w:pPr>
+        <w:jc w:val="center"/>
+        <w:rPr>
+          <w:sz w:val="24"/>
+          <w:szCs w:val="24"/>
+        </w:rPr>
+      </w:pPr>
+      <w:r>
+        <w:rPr>
+          <w:sz w:val="24"/>
+          <w:szCs w:val="24"/>
+        </w:rPr>
+        <w:drawing>
+          <wp:inline distT="0" distB="0" distL="0" distR="0" wp14:anchorId="21304EE5" wp14:editId="16D90F09">
+            <wp:extent cx="3533775" cy="3581854"/>
+            <wp:effectExtent l="0" t="0" r="0" b="0"/>
+            <wp:docPr id="1726867179" name="Imagen 1"/>
+            <wp:cNvGraphicFramePr>
+              <a:graphicFrameLocks xmlns:a="http://schemas.openxmlformats.org/drawingml/2006/main" noChangeAspect="1"/>
+            </wp:cNvGraphicFramePr>
+            <a:graphic xmlns:a="http://schemas.openxmlformats.org/drawingml/2006/main">
+              <a:graphicData uri="http://schemas.openxmlformats.org/drawingml/2006/picture">
+                <pic:pic xmlns:pic="http://schemas.openxmlformats.org/drawingml/2006/picture">
+                  <pic:nvPicPr>
+                    <pic:cNvPr id="1726867179" name=""/>
+                    <pic:cNvPicPr/>
+                  </pic:nvPicPr>
+                  <pic:blipFill>
+                    <a:blip r:embed="rId27"/>
+                    <a:stretch>
+                      <a:fillRect/>
+                    </a:stretch>
+                  </pic:blipFill>
+                  <pic:spPr>
+                    <a:xfrm>
+                      <a:off x="0" y="0"/>
+                      <a:ext cx="3542306" cy="3590501"/>
+                    </a:xfrm>
+                    <a:prstGeom prst="rect">
+                      <a:avLst/>
+                    </a:prstGeom>
+                  </pic:spPr>
+                </pic:pic>
+              </a:graphicData>
+            </a:graphic>
+          </wp:inline>
+        </w:drawing>
+      </w:r>
+    </w:p>
+    <w:p>
+      <w:pPr>
+        <w:jc w:val="both"/>
+        <w:rPr>
+          <w:sz w:val="24"/>
+          <w:szCs w:val="24"/>
+        </w:rPr>
+      </w:pPr>
+      <w:r>
+        <w:rPr>
+          <w:sz w:val="24"/>
+          <w:szCs w:val="24"/>
+        </w:rPr>
+        <w:t>Después de darle al botón de Añadir al script todas las pruebas se acumularán en el panel. Y para ejecutarlas hay que hacer clic sobre el botón en la parte inferior</w:t>
       </w:r>
     </w:p>
     <w:p>
@@ -3725,7 +3909,7 @@
                     <pic:cNvPicPr/>
                   </pic:nvPicPr>
                   <pic:blipFill rotWithShape="1">
-                    <a:blip r:embed="rId26">
+                    <a:blip r:embed="rId28">
                       <a:extLst>
                         <a:ext uri="{28A0092B-C50C-407E-A947-70E740481C1C}">
                           <a14:useLocalDpi xmlns:a14="http://schemas.microsoft.com/office/drawing/2010/main" val="0"/>
@@ -3800,7 +3984,7 @@
           <w:sz w:val="24"/>
           <w:szCs w:val="24"/>
         </w:rPr>
-        <w:t xml:space="preserve">c) Al finalizar las pruebas puede exportarlas a </w:t>
+        <w:t xml:space="preserve">Al finalizar las pruebas puede exportarlas a </w:t>
       </w:r>
       <w:proofErr w:type="spellStart"/>
       <w:r>
@@ -3925,7 +4109,7 @@
                     <pic:cNvPicPr/>
                   </pic:nvPicPr>
                   <pic:blipFill>
-                    <a:blip r:embed="rId27">
+                    <a:blip r:embed="rId29">
                       <a:extLst>
                         <a:ext uri="{28A0092B-C50C-407E-A947-70E740481C1C}">
                           <a14:useLocalDpi xmlns:a14="http://schemas.microsoft.com/office/drawing/2010/main" val="0"/>
@@ -4015,7 +4199,7 @@
                     <pic:cNvPicPr/>
                   </pic:nvPicPr>
                   <pic:blipFill>
-                    <a:blip r:embed="rId28">
+                    <a:blip r:embed="rId30">
                       <a:extLst>
                         <a:ext uri="{28A0092B-C50C-407E-A947-70E740481C1C}">
                           <a14:useLocalDpi xmlns:a14="http://schemas.microsoft.com/office/drawing/2010/main" val="0"/>
@@ -4135,7 +4319,7 @@
                     <pic:cNvPicPr/>
                   </pic:nvPicPr>
                   <pic:blipFill>
-                    <a:blip r:embed="rId29"/>
+                    <a:blip r:embed="rId31"/>
                     <a:stretch>
                       <a:fillRect/>
                     </a:stretch>
@@ -4163,6 +4347,67 @@
         </w:tabs>
         <w:jc w:val="both"/>
         <w:rPr>
+          <w:color w:val="0070C0"/>
+          <w:sz w:val="26"/>
+          <w:szCs w:val="26"/>
+        </w:rPr>
+      </w:pPr>
+      <w:r>
+        <w:rPr>
+          <w:color w:val="0070C0"/>
+          <w:sz w:val="26"/>
+          <w:szCs w:val="26"/>
+        </w:rPr>
+        <w:t xml:space="preserve">- </w:t>
+      </w:r>
+      <w:r>
+        <w:rPr>
+          <w:color w:val="0070C0"/>
+          <w:sz w:val="26"/>
+          <w:szCs w:val="26"/>
+        </w:rPr>
+        <w:t>Modo Express</w:t>
+      </w:r>
+    </w:p>
+    <w:p>
+      <w:pPr>
+        <w:tabs>
+          <w:tab w:val="left" w:pos="1215"/>
+        </w:tabs>
+        <w:jc w:val="both"/>
+        <w:rPr>
+          <w:rFonts w:cstheme="minorHAnsi"/>
+          <w:noProof/>
+          <w:sz w:val="24"/>
+          <w:szCs w:val="24"/>
+        </w:rPr>
+      </w:pPr>
+      <w:r>
+        <w:rPr>
+          <w:rFonts w:cstheme="minorHAnsi"/>
+          <w:noProof/>
+          <w:sz w:val="24"/>
+          <w:szCs w:val="24"/>
+        </w:rPr>
+        <w:t xml:space="preserve">Se </w:t>
+      </w:r>
+      <w:r>
+        <w:rPr>
+          <w:rFonts w:cstheme="minorHAnsi"/>
+          <w:noProof/>
+          <w:sz w:val="24"/>
+          <w:szCs w:val="24"/>
+        </w:rPr>
+        <w:t>puede activar el modo express dándole al botón situado en la parte superior del panel de pruebas. Con este modo activado el PopUp de seleccianar pruebas solo mostrará las que formen parte de la IOT Express.</w:t>
+      </w:r>
+    </w:p>
+    <w:p>
+      <w:pPr>
+        <w:tabs>
+          <w:tab w:val="left" w:pos="1215"/>
+        </w:tabs>
+        <w:jc w:val="center"/>
+        <w:rPr>
           <w:rFonts w:cstheme="minorHAnsi"/>
           <w:b/>
           <w:bCs/>
@@ -4182,7 +4427,41 @@
           <w:sz w:val="28"/>
           <w:szCs w:val="28"/>
         </w:rPr>
-        <w:t>Configurar Prueba de llamada</w:t>
+        <w:drawing>
+          <wp:inline distT="0" distB="0" distL="0" distR="0" wp14:anchorId="74A61C00" wp14:editId="02407EC3">
+            <wp:extent cx="4210050" cy="1103532"/>
+            <wp:effectExtent l="0" t="0" r="0" b="1905"/>
+            <wp:docPr id="1761949973" name="Imagen 1"/>
+            <wp:cNvGraphicFramePr>
+              <a:graphicFrameLocks xmlns:a="http://schemas.openxmlformats.org/drawingml/2006/main" noChangeAspect="1"/>
+            </wp:cNvGraphicFramePr>
+            <a:graphic xmlns:a="http://schemas.openxmlformats.org/drawingml/2006/main">
+              <a:graphicData uri="http://schemas.openxmlformats.org/drawingml/2006/picture">
+                <pic:pic xmlns:pic="http://schemas.openxmlformats.org/drawingml/2006/picture">
+                  <pic:nvPicPr>
+                    <pic:cNvPr id="1761949973" name=""/>
+                    <pic:cNvPicPr/>
+                  </pic:nvPicPr>
+                  <pic:blipFill>
+                    <a:blip r:embed="rId32"/>
+                    <a:stretch>
+                      <a:fillRect/>
+                    </a:stretch>
+                  </pic:blipFill>
+                  <pic:spPr>
+                    <a:xfrm>
+                      <a:off x="0" y="0"/>
+                      <a:ext cx="4241215" cy="1111701"/>
+                    </a:xfrm>
+                    <a:prstGeom prst="rect">
+                      <a:avLst/>
+                    </a:prstGeom>
+                  </pic:spPr>
+                </pic:pic>
+              </a:graphicData>
+            </a:graphic>
+          </wp:inline>
+        </w:drawing>
       </w:r>
     </w:p>
     <w:p>
@@ -4191,39 +4470,67 @@
           <w:tab w:val="left" w:pos="1215"/>
         </w:tabs>
         <w:jc w:val="both"/>
-        <w:rPr>
-          <w:rFonts w:cstheme="minorHAnsi"/>
-          <w:noProof/>
-          <w:sz w:val="24"/>
-          <w:szCs w:val="24"/>
-        </w:rPr>
-      </w:pPr>
-      <w:r>
-        <w:rPr>
-          <w:rFonts w:cstheme="minorHAnsi"/>
-          <w:noProof/>
-          <w:sz w:val="24"/>
-          <w:szCs w:val="24"/>
-        </w:rPr>
-        <w:t>Patra la prueba de llamada tenemos 2 opciones para configurar, llamada Masiva y Llamada entre 2 dispositivos:</w:t>
-      </w:r>
-    </w:p>
-    <w:p>
-      <w:pPr>
-        <w:tabs>
-          <w:tab w:val="left" w:pos="1215"/>
-        </w:tabs>
-        <w:jc w:val="center"/>
         <w:rPr>
           <w:rFonts w:cstheme="minorHAnsi"/>
           <w:b/>
           <w:bCs/>
           <w:noProof/>
-          <w:sz w:val="24"/>
-          <w:szCs w:val="24"/>
-        </w:rPr>
-      </w:pPr>
-      <w:r>
+          <w:color w:val="1F3864" w:themeColor="accent1" w:themeShade="80"/>
+          <w:sz w:val="28"/>
+          <w:szCs w:val="28"/>
+        </w:rPr>
+      </w:pPr>
+    </w:p>
+    <w:p>
+      <w:pPr>
+        <w:tabs>
+          <w:tab w:val="left" w:pos="1215"/>
+        </w:tabs>
+        <w:jc w:val="both"/>
+        <w:rPr>
+          <w:color w:val="002060"/>
+          <w:sz w:val="32"/>
+          <w:szCs w:val="32"/>
+        </w:rPr>
+      </w:pPr>
+      <w:r>
+        <w:rPr>
+          <w:color w:val="002060"/>
+          <w:sz w:val="32"/>
+          <w:szCs w:val="32"/>
+        </w:rPr>
+        <w:t>Configurar Prueba de llamada</w:t>
+      </w:r>
+    </w:p>
+    <w:p>
+      <w:pPr>
+        <w:tabs>
+          <w:tab w:val="left" w:pos="1215"/>
+        </w:tabs>
+        <w:jc w:val="both"/>
+        <w:rPr>
+          <w:rFonts w:cstheme="minorHAnsi"/>
+          <w:noProof/>
+          <w:sz w:val="24"/>
+          <w:szCs w:val="24"/>
+        </w:rPr>
+      </w:pPr>
+      <w:r>
+        <w:rPr>
+          <w:rFonts w:cstheme="minorHAnsi"/>
+          <w:noProof/>
+          <w:sz w:val="24"/>
+          <w:szCs w:val="24"/>
+        </w:rPr>
+        <w:t>Patra la prueba de llamada tenemos 2 opciones para configurar, llamada Masiva y Llamada entre 2 dispositivos:</w:t>
+      </w:r>
+    </w:p>
+    <w:p>
+      <w:pPr>
+        <w:tabs>
+          <w:tab w:val="left" w:pos="1215"/>
+        </w:tabs>
+        <w:jc w:val="center"/>
         <w:rPr>
           <w:rFonts w:cstheme="minorHAnsi"/>
           <w:b/>
@@ -4232,10 +4539,20 @@
           <w:sz w:val="24"/>
           <w:szCs w:val="24"/>
         </w:rPr>
+      </w:pPr>
+      <w:r>
+        <w:rPr>
+          <w:rFonts w:cstheme="minorHAnsi"/>
+          <w:b/>
+          <w:bCs/>
+          <w:noProof/>
+          <w:sz w:val="24"/>
+          <w:szCs w:val="24"/>
+        </w:rPr>
         <w:drawing>
-          <wp:inline distT="0" distB="0" distL="0" distR="0" wp14:anchorId="54232C94" wp14:editId="64721AFB">
-            <wp:extent cx="3305175" cy="5581650"/>
-            <wp:effectExtent l="0" t="0" r="9525" b="0"/>
+          <wp:inline distT="0" distB="0" distL="0" distR="0" wp14:anchorId="54232C94" wp14:editId="3D16ABA7">
+            <wp:extent cx="2581275" cy="4359157"/>
+            <wp:effectExtent l="0" t="0" r="0" b="3810"/>
             <wp:docPr id="711835372" name="Imagen 1"/>
             <wp:cNvGraphicFramePr>
               <a:graphicFrameLocks xmlns:a="http://schemas.openxmlformats.org/drawingml/2006/main" noChangeAspect="1"/>
@@ -4248,7 +4565,7 @@
                     <pic:cNvPicPr/>
                   </pic:nvPicPr>
                   <pic:blipFill>
-                    <a:blip r:embed="rId30"/>
+                    <a:blip r:embed="rId33"/>
                     <a:stretch>
                       <a:fillRect/>
                     </a:stretch>
@@ -4256,7 +4573,7 @@
                   <pic:spPr>
                     <a:xfrm>
                       <a:off x="0" y="0"/>
-                      <a:ext cx="3317784" cy="5602944"/>
+                      <a:ext cx="2601534" cy="4393369"/>
                     </a:xfrm>
                     <a:prstGeom prst="rect">
                       <a:avLst/>
@@ -4360,7 +4677,6 @@
           <w:sz w:val="24"/>
           <w:szCs w:val="24"/>
         </w:rPr>
-        <w:lastRenderedPageBreak/>
         <w:t>Llamada entre 2 Dispositivos</w:t>
       </w:r>
       <w:r>
@@ -4409,7 +4725,7 @@
                     <pic:cNvPicPr/>
                   </pic:nvPicPr>
                   <pic:blipFill>
-                    <a:blip r:embed="rId31"/>
+                    <a:blip r:embed="rId34"/>
                     <a:stretch>
                       <a:fillRect/>
                     </a:stretch>
@@ -4621,7 +4937,7 @@
                     <pic:cNvPicPr/>
                   </pic:nvPicPr>
                   <pic:blipFill>
-                    <a:blip r:embed="rId32"/>
+                    <a:blip r:embed="rId35"/>
                     <a:stretch>
                       <a:fillRect/>
                     </a:stretch>
@@ -4662,6 +4978,7 @@
           <w:sz w:val="28"/>
           <w:szCs w:val="28"/>
         </w:rPr>
+        <w:lastRenderedPageBreak/>
         <w:drawing>
           <wp:anchor distT="0" distB="0" distL="114300" distR="114300" simplePos="0" relativeHeight="251696128" behindDoc="0" locked="0" layoutInCell="1" allowOverlap="1" wp14:anchorId="7BFD1E09" wp14:editId="75269A0F">
             <wp:simplePos x="0" y="0"/>
@@ -4686,7 +5003,7 @@
                     <pic:cNvPicPr/>
                   </pic:nvPicPr>
                   <pic:blipFill>
-                    <a:blip r:embed="rId33">
+                    <a:blip r:embed="rId36">
                       <a:extLst>
                         <a:ext uri="{28A0092B-C50C-407E-A947-70E740481C1C}">
                           <a14:useLocalDpi xmlns:a14="http://schemas.microsoft.com/office/drawing/2010/main" val="0"/>
@@ -4887,7 +5204,7 @@
                     <pic:cNvPicPr/>
                   </pic:nvPicPr>
                   <pic:blipFill>
-                    <a:blip r:embed="rId34"/>
+                    <a:blip r:embed="rId37"/>
                     <a:stretch>
                       <a:fillRect/>
                     </a:stretch>
@@ -5096,7 +5413,7 @@
                     <pic:cNvPicPr/>
                   </pic:nvPicPr>
                   <pic:blipFill>
-                    <a:blip r:embed="rId35"/>
+                    <a:blip r:embed="rId38"/>
                     <a:stretch>
                       <a:fillRect/>
                     </a:stretch>
@@ -5198,7 +5515,7 @@
                     <pic:cNvPicPr/>
                   </pic:nvPicPr>
                   <pic:blipFill rotWithShape="1">
-                    <a:blip r:embed="rId36"/>
+                    <a:blip r:embed="rId39"/>
                     <a:srcRect l="652"/>
                     <a:stretch>
                       <a:fillRect/>
@@ -5295,7 +5612,7 @@
                     <pic:cNvPicPr/>
                   </pic:nvPicPr>
                   <pic:blipFill>
-                    <a:blip r:embed="rId37"/>
+                    <a:blip r:embed="rId40"/>
                     <a:stretch>
                       <a:fillRect/>
                     </a:stretch>
@@ -5488,7 +5805,7 @@
                     <pic:cNvPicPr/>
                   </pic:nvPicPr>
                   <pic:blipFill>
-                    <a:blip r:embed="rId38"/>
+                    <a:blip r:embed="rId41"/>
                     <a:stretch>
                       <a:fillRect/>
                     </a:stretch>
@@ -5794,7 +6111,7 @@
                     <pic:cNvPicPr/>
                   </pic:nvPicPr>
                   <pic:blipFill rotWithShape="1">
-                    <a:blip r:embed="rId39">
+                    <a:blip r:embed="rId42">
                       <a:extLst>
                         <a:ext uri="{28A0092B-C50C-407E-A947-70E740481C1C}">
                           <a14:useLocalDpi xmlns:a14="http://schemas.microsoft.com/office/drawing/2010/main" val="0"/>
@@ -6085,7 +6402,7 @@
                     <pic:cNvPicPr/>
                   </pic:nvPicPr>
                   <pic:blipFill>
-                    <a:blip r:embed="rId40">
+                    <a:blip r:embed="rId43">
                       <a:extLst>
                         <a:ext uri="{28A0092B-C50C-407E-A947-70E740481C1C}">
                           <a14:useLocalDpi xmlns:a14="http://schemas.microsoft.com/office/drawing/2010/main" val="0"/>
@@ -6367,7 +6684,7 @@
                     <pic:cNvPicPr/>
                   </pic:nvPicPr>
                   <pic:blipFill>
-                    <a:blip r:embed="rId41">
+                    <a:blip r:embed="rId44">
                       <a:extLst>
                         <a:ext uri="{28A0092B-C50C-407E-A947-70E740481C1C}">
                           <a14:useLocalDpi xmlns:a14="http://schemas.microsoft.com/office/drawing/2010/main" val="0"/>
@@ -6548,7 +6865,7 @@
                     <pic:cNvPicPr/>
                   </pic:nvPicPr>
                   <pic:blipFill>
-                    <a:blip r:embed="rId42">
+                    <a:blip r:embed="rId45">
                       <a:extLst>
                         <a:ext uri="{28A0092B-C50C-407E-A947-70E740481C1C}">
                           <a14:useLocalDpi xmlns:a14="http://schemas.microsoft.com/office/drawing/2010/main" val="0"/>
@@ -6750,7 +7067,7 @@
                     <pic:cNvPicPr/>
                   </pic:nvPicPr>
                   <pic:blipFill>
-                    <a:blip r:embed="rId43">
+                    <a:blip r:embed="rId46">
                       <a:extLst>
                         <a:ext uri="{28A0092B-C50C-407E-A947-70E740481C1C}">
                           <a14:useLocalDpi xmlns:a14="http://schemas.microsoft.com/office/drawing/2010/main" val="0"/>
@@ -7058,7 +7375,7 @@
                     <pic:cNvPicPr/>
                   </pic:nvPicPr>
                   <pic:blipFill>
-                    <a:blip r:embed="rId44">
+                    <a:blip r:embed="rId47">
                       <a:extLst>
                         <a:ext uri="{28A0092B-C50C-407E-A947-70E740481C1C}">
                           <a14:useLocalDpi xmlns:a14="http://schemas.microsoft.com/office/drawing/2010/main" val="0"/>
@@ -7566,7 +7883,7 @@
                     <pic:cNvPicPr/>
                   </pic:nvPicPr>
                   <pic:blipFill>
-                    <a:blip r:embed="rId45">
+                    <a:blip r:embed="rId48">
                       <a:extLst>
                         <a:ext uri="{28A0092B-C50C-407E-A947-70E740481C1C}">
                           <a14:useLocalDpi xmlns:a14="http://schemas.microsoft.com/office/drawing/2010/main" val="0"/>
@@ -7678,7 +7995,7 @@
                     <pic:cNvPicPr/>
                   </pic:nvPicPr>
                   <pic:blipFill>
-                    <a:blip r:embed="rId46">
+                    <a:blip r:embed="rId49">
                       <a:extLst>
                         <a:ext uri="{28A0092B-C50C-407E-A947-70E740481C1C}">
                           <a14:useLocalDpi xmlns:a14="http://schemas.microsoft.com/office/drawing/2010/main" val="0"/>
@@ -7771,7 +8088,7 @@
                     <pic:cNvPicPr/>
                   </pic:nvPicPr>
                   <pic:blipFill rotWithShape="1">
-                    <a:blip r:embed="rId47">
+                    <a:blip r:embed="rId50">
                       <a:extLst>
                         <a:ext uri="{28A0092B-C50C-407E-A947-70E740481C1C}">
                           <a14:useLocalDpi xmlns:a14="http://schemas.microsoft.com/office/drawing/2010/main" val="0"/>
@@ -8143,7 +8460,7 @@
                     <pic:cNvPicPr/>
                   </pic:nvPicPr>
                   <pic:blipFill>
-                    <a:blip r:embed="rId48">
+                    <a:blip r:embed="rId51">
                       <a:extLst>
                         <a:ext uri="{28A0092B-C50C-407E-A947-70E740481C1C}">
                           <a14:useLocalDpi xmlns:a14="http://schemas.microsoft.com/office/drawing/2010/main" val="0"/>
@@ -8574,7 +8891,7 @@
                     <pic:cNvPicPr/>
                   </pic:nvPicPr>
                   <pic:blipFill>
-                    <a:blip r:embed="rId49">
+                    <a:blip r:embed="rId52">
                       <a:extLst>
                         <a:ext uri="{28A0092B-C50C-407E-A947-70E740481C1C}">
                           <a14:useLocalDpi xmlns:a14="http://schemas.microsoft.com/office/drawing/2010/main" val="0"/>
@@ -8983,7 +9300,7 @@
                     <pic:cNvPicPr/>
                   </pic:nvPicPr>
                   <pic:blipFill>
-                    <a:blip r:embed="rId50"/>
+                    <a:blip r:embed="rId53"/>
                     <a:stretch>
                       <a:fillRect/>
                     </a:stretch>
@@ -9089,7 +9406,7 @@
                     <pic:cNvPicPr/>
                   </pic:nvPicPr>
                   <pic:blipFill>
-                    <a:blip r:embed="rId51"/>
+                    <a:blip r:embed="rId54"/>
                     <a:stretch>
                       <a:fillRect/>
                     </a:stretch>
@@ -9382,7 +9699,7 @@
                     <pic:cNvPicPr/>
                   </pic:nvPicPr>
                   <pic:blipFill>
-                    <a:blip r:embed="rId52">
+                    <a:blip r:embed="rId55">
                       <a:extLst>
                         <a:ext uri="{28A0092B-C50C-407E-A947-70E740481C1C}">
                           <a14:useLocalDpi xmlns:a14="http://schemas.microsoft.com/office/drawing/2010/main" val="0"/>
@@ -9573,7 +9890,7 @@
                     <pic:cNvPicPr/>
                   </pic:nvPicPr>
                   <pic:blipFill>
-                    <a:blip r:embed="rId53">
+                    <a:blip r:embed="rId56">
                       <a:extLst>
                         <a:ext uri="{28A0092B-C50C-407E-A947-70E740481C1C}">
                           <a14:useLocalDpi xmlns:a14="http://schemas.microsoft.com/office/drawing/2010/main" val="0"/>
@@ -9885,7 +10202,7 @@
                     <pic:cNvPicPr/>
                   </pic:nvPicPr>
                   <pic:blipFill>
-                    <a:blip r:embed="rId54">
+                    <a:blip r:embed="rId57">
                       <a:extLst>
                         <a:ext uri="{28A0092B-C50C-407E-A947-70E740481C1C}">
                           <a14:useLocalDpi xmlns:a14="http://schemas.microsoft.com/office/drawing/2010/main" val="0"/>
@@ -10058,7 +10375,7 @@
                     <pic:cNvPicPr/>
                   </pic:nvPicPr>
                   <pic:blipFill>
-                    <a:blip r:embed="rId55">
+                    <a:blip r:embed="rId58">
                       <a:extLst>
                         <a:ext uri="{28A0092B-C50C-407E-A947-70E740481C1C}">
                           <a14:useLocalDpi xmlns:a14="http://schemas.microsoft.com/office/drawing/2010/main" val="0"/>
@@ -10220,7 +10537,7 @@
                     <pic:cNvPicPr/>
                   </pic:nvPicPr>
                   <pic:blipFill>
-                    <a:blip r:embed="rId56">
+                    <a:blip r:embed="rId59">
                       <a:extLst>
                         <a:ext uri="{28A0092B-C50C-407E-A947-70E740481C1C}">
                           <a14:useLocalDpi xmlns:a14="http://schemas.microsoft.com/office/drawing/2010/main" val="0"/>
@@ -10749,7 +11066,7 @@
                     <pic:cNvPicPr/>
                   </pic:nvPicPr>
                   <pic:blipFill rotWithShape="1">
-                    <a:blip r:embed="rId57">
+                    <a:blip r:embed="rId60">
                       <a:extLst>
                         <a:ext uri="{28A0092B-C50C-407E-A947-70E740481C1C}">
                           <a14:useLocalDpi xmlns:a14="http://schemas.microsoft.com/office/drawing/2010/main" val="0"/>
@@ -10969,7 +11286,7 @@
                     <pic:cNvPicPr/>
                   </pic:nvPicPr>
                   <pic:blipFill>
-                    <a:blip r:embed="rId58">
+                    <a:blip r:embed="rId61">
                       <a:extLst>
                         <a:ext uri="{28A0092B-C50C-407E-A947-70E740481C1C}">
                           <a14:useLocalDpi xmlns:a14="http://schemas.microsoft.com/office/drawing/2010/main" val="0"/>
@@ -11236,7 +11553,7 @@
                     <pic:cNvPicPr/>
                   </pic:nvPicPr>
                   <pic:blipFill>
-                    <a:blip r:embed="rId59">
+                    <a:blip r:embed="rId62">
                       <a:extLst>
                         <a:ext uri="{28A0092B-C50C-407E-A947-70E740481C1C}">
                           <a14:useLocalDpi xmlns:a14="http://schemas.microsoft.com/office/drawing/2010/main" val="0"/>
@@ -11533,7 +11850,7 @@
                     <pic:cNvPicPr/>
                   </pic:nvPicPr>
                   <pic:blipFill>
-                    <a:blip r:embed="rId60">
+                    <a:blip r:embed="rId63">
                       <a:extLst>
                         <a:ext uri="{28A0092B-C50C-407E-A947-70E740481C1C}">
                           <a14:useLocalDpi xmlns:a14="http://schemas.microsoft.com/office/drawing/2010/main" val="0"/>
@@ -11650,7 +11967,7 @@
                     <pic:cNvPicPr/>
                   </pic:nvPicPr>
                   <pic:blipFill>
-                    <a:blip r:embed="rId61">
+                    <a:blip r:embed="rId64">
                       <a:extLst>
                         <a:ext uri="{28A0092B-C50C-407E-A947-70E740481C1C}">
                           <a14:useLocalDpi xmlns:a14="http://schemas.microsoft.com/office/drawing/2010/main" val="0"/>
@@ -11827,7 +12144,7 @@
                     <pic:cNvPicPr/>
                   </pic:nvPicPr>
                   <pic:blipFill>
-                    <a:blip r:embed="rId62"/>
+                    <a:blip r:embed="rId65"/>
                     <a:stretch>
                       <a:fillRect/>
                     </a:stretch>
@@ -11947,7 +12264,7 @@
                     <pic:cNvPicPr/>
                   </pic:nvPicPr>
                   <pic:blipFill>
-                    <a:blip r:embed="rId63"/>
+                    <a:blip r:embed="rId66"/>
                     <a:stretch>
                       <a:fillRect/>
                     </a:stretch>
@@ -12042,7 +12359,7 @@
                     <pic:cNvPicPr/>
                   </pic:nvPicPr>
                   <pic:blipFill>
-                    <a:blip r:embed="rId64"/>
+                    <a:blip r:embed="rId67"/>
                     <a:stretch>
                       <a:fillRect/>
                     </a:stretch>
@@ -12174,7 +12491,7 @@
                     <pic:cNvPicPr/>
                   </pic:nvPicPr>
                   <pic:blipFill>
-                    <a:blip r:embed="rId65"/>
+                    <a:blip r:embed="rId68"/>
                     <a:stretch>
                       <a:fillRect/>
                     </a:stretch>
@@ -12338,7 +12655,7 @@
                     <pic:cNvPicPr/>
                   </pic:nvPicPr>
                   <pic:blipFill>
-                    <a:blip r:embed="rId66"/>
+                    <a:blip r:embed="rId69"/>
                     <a:stretch>
                       <a:fillRect/>
                     </a:stretch>
@@ -12441,7 +12758,7 @@
                     <pic:cNvPicPr/>
                   </pic:nvPicPr>
                   <pic:blipFill>
-                    <a:blip r:embed="rId67"/>
+                    <a:blip r:embed="rId70"/>
                     <a:stretch>
                       <a:fillRect/>
                     </a:stretch>
@@ -12536,7 +12853,7 @@
                     <pic:cNvPicPr/>
                   </pic:nvPicPr>
                   <pic:blipFill>
-                    <a:blip r:embed="rId68"/>
+                    <a:blip r:embed="rId71"/>
                     <a:stretch>
                       <a:fillRect/>
                     </a:stretch>
@@ -12816,7 +13133,7 @@
                     <pic:cNvPicPr/>
                   </pic:nvPicPr>
                   <pic:blipFill>
-                    <a:blip r:embed="rId69"/>
+                    <a:blip r:embed="rId72"/>
                     <a:stretch>
                       <a:fillRect/>
                     </a:stretch>
@@ -12911,7 +13228,7 @@
                     <pic:cNvPicPr/>
                   </pic:nvPicPr>
                   <pic:blipFill>
-                    <a:blip r:embed="rId70"/>
+                    <a:blip r:embed="rId73"/>
                     <a:stretch>
                       <a:fillRect/>
                     </a:stretch>
@@ -12987,6 +13304,7 @@
       <w:r>
         <w:rPr>
           <w:rFonts w:cstheme="minorHAnsi"/>
+          <w:noProof/>
           <w:sz w:val="24"/>
           <w:szCs w:val="24"/>
         </w:rPr>
@@ -13006,7 +13324,7 @@
                     <pic:cNvPicPr/>
                   </pic:nvPicPr>
                   <pic:blipFill>
-                    <a:blip r:embed="rId71"/>
+                    <a:blip r:embed="rId74"/>
                     <a:stretch>
                       <a:fillRect/>
                     </a:stretch>
@@ -13100,7 +13418,7 @@
                     <pic:cNvPicPr/>
                   </pic:nvPicPr>
                   <pic:blipFill>
-                    <a:blip r:embed="rId72"/>
+                    <a:blip r:embed="rId75"/>
                     <a:stretch>
                       <a:fillRect/>
                     </a:stretch>
@@ -13295,6 +13613,7 @@
       </w:pPr>
       <w:r>
         <w:rPr>
+          <w:noProof/>
           <w:color w:val="0070C0"/>
           <w:sz w:val="26"/>
           <w:szCs w:val="26"/>
@@ -13316,7 +13635,7 @@
                     <pic:cNvPicPr/>
                   </pic:nvPicPr>
                   <pic:blipFill>
-                    <a:blip r:embed="rId73"/>
+                    <a:blip r:embed="rId76"/>
                     <a:stretch>
                       <a:fillRect/>
                     </a:stretch>
@@ -13373,6 +13692,7 @@
       <w:r>
         <w:rPr>
           <w:rFonts w:cstheme="minorHAnsi"/>
+          <w:noProof/>
           <w:sz w:val="24"/>
           <w:szCs w:val="24"/>
         </w:rPr>
@@ -13392,7 +13712,7 @@
                     <pic:cNvPicPr/>
                   </pic:nvPicPr>
                   <pic:blipFill>
-                    <a:blip r:embed="rId74"/>
+                    <a:blip r:embed="rId77"/>
                     <a:stretch>
                       <a:fillRect/>
                     </a:stretch>
@@ -13584,7 +13904,7 @@
                     <pic:cNvPicPr/>
                   </pic:nvPicPr>
                   <pic:blipFill>
-                    <a:blip r:embed="rId75"/>
+                    <a:blip r:embed="rId78"/>
                     <a:stretch>
                       <a:fillRect/>
                     </a:stretch>
@@ -13704,7 +14024,7 @@
                     <pic:cNvPicPr/>
                   </pic:nvPicPr>
                   <pic:blipFill>
-                    <a:blip r:embed="rId76"/>
+                    <a:blip r:embed="rId79"/>
                     <a:stretch>
                       <a:fillRect/>
                     </a:stretch>
@@ -13805,7 +14125,7 @@
                     <pic:cNvPicPr/>
                   </pic:nvPicPr>
                   <pic:blipFill>
-                    <a:blip r:embed="rId77"/>
+                    <a:blip r:embed="rId80"/>
                     <a:stretch>
                       <a:fillRect/>
                     </a:stretch>
@@ -13883,7 +14203,7 @@
                     <pic:cNvPicPr/>
                   </pic:nvPicPr>
                   <pic:blipFill>
-                    <a:blip r:embed="rId78"/>
+                    <a:blip r:embed="rId81"/>
                     <a:stretch>
                       <a:fillRect/>
                     </a:stretch>
@@ -14006,7 +14326,7 @@
                     <pic:cNvPicPr/>
                   </pic:nvPicPr>
                   <pic:blipFill>
-                    <a:blip r:embed="rId79">
+                    <a:blip r:embed="rId82">
                       <a:extLst>
                         <a:ext uri="{28A0092B-C50C-407E-A947-70E740481C1C}">
                           <a14:useLocalDpi xmlns:a14="http://schemas.microsoft.com/office/drawing/2010/main" val="0"/>
@@ -14229,7 +14549,7 @@
                     <pic:cNvPicPr/>
                   </pic:nvPicPr>
                   <pic:blipFill>
-                    <a:blip r:embed="rId80">
+                    <a:blip r:embed="rId83">
                       <a:extLst>
                         <a:ext uri="{28A0092B-C50C-407E-A947-70E740481C1C}">
                           <a14:useLocalDpi xmlns:a14="http://schemas.microsoft.com/office/drawing/2010/main" val="0"/>
@@ -14325,7 +14645,7 @@
                     <pic:cNvPicPr/>
                   </pic:nvPicPr>
                   <pic:blipFill>
-                    <a:blip r:embed="rId81">
+                    <a:blip r:embed="rId84">
                       <a:extLst>
                         <a:ext uri="{28A0092B-C50C-407E-A947-70E740481C1C}">
                           <a14:useLocalDpi xmlns:a14="http://schemas.microsoft.com/office/drawing/2010/main" val="0"/>
@@ -14487,7 +14807,7 @@
                     <pic:cNvPicPr/>
                   </pic:nvPicPr>
                   <pic:blipFill>
-                    <a:blip r:embed="rId82"/>
+                    <a:blip r:embed="rId85"/>
                     <a:stretch>
                       <a:fillRect/>
                     </a:stretch>
@@ -14557,7 +14877,7 @@
                     <pic:cNvPicPr/>
                   </pic:nvPicPr>
                   <pic:blipFill>
-                    <a:blip r:embed="rId83"/>
+                    <a:blip r:embed="rId86"/>
                     <a:stretch>
                       <a:fillRect/>
                     </a:stretch>
@@ -14715,7 +15035,7 @@
                     <pic:cNvPicPr/>
                   </pic:nvPicPr>
                   <pic:blipFill>
-                    <a:blip r:embed="rId84">
+                    <a:blip r:embed="rId87">
                       <a:extLst>
                         <a:ext uri="{28A0092B-C50C-407E-A947-70E740481C1C}">
                           <a14:useLocalDpi xmlns:a14="http://schemas.microsoft.com/office/drawing/2010/main" val="0"/>
@@ -14853,7 +15173,7 @@
                     <pic:cNvPicPr/>
                   </pic:nvPicPr>
                   <pic:blipFill>
-                    <a:blip r:embed="rId85"/>
+                    <a:blip r:embed="rId88"/>
                     <a:stretch>
                       <a:fillRect/>
                     </a:stretch>
@@ -14915,7 +15235,7 @@
                     <pic:cNvPicPr/>
                   </pic:nvPicPr>
                   <pic:blipFill>
-                    <a:blip r:embed="rId86"/>
+                    <a:blip r:embed="rId89"/>
                     <a:stretch>
                       <a:fillRect/>
                     </a:stretch>
@@ -14994,7 +15314,7 @@
                     <pic:cNvPicPr/>
                   </pic:nvPicPr>
                   <pic:blipFill>
-                    <a:blip r:embed="rId87"/>
+                    <a:blip r:embed="rId90"/>
                     <a:stretch>
                       <a:fillRect/>
                     </a:stretch>
@@ -15090,7 +15410,7 @@
                     <pic:cNvPicPr/>
                   </pic:nvPicPr>
                   <pic:blipFill>
-                    <a:blip r:embed="rId88">
+                    <a:blip r:embed="rId91">
                       <a:extLst>
                         <a:ext uri="{28A0092B-C50C-407E-A947-70E740481C1C}">
                           <a14:useLocalDpi xmlns:a14="http://schemas.microsoft.com/office/drawing/2010/main" val="0"/>
@@ -15147,7 +15467,7 @@
                     <pic:cNvPicPr/>
                   </pic:nvPicPr>
                   <pic:blipFill>
-                    <a:blip r:embed="rId89">
+                    <a:blip r:embed="rId92">
                       <a:extLst>
                         <a:ext uri="{28A0092B-C50C-407E-A947-70E740481C1C}">
                           <a14:useLocalDpi xmlns:a14="http://schemas.microsoft.com/office/drawing/2010/main" val="0"/>

</xml_diff>